<commit_message>
fix(build): bo ngat trang thua sau phan cuoi (dong bo tu main f4fc17a)
Quyen mon hoc 44 -> 43 trang, trang cuoi co noi dung. PAGEREF 37/37 khac 0,
mailto 0, patch kieu du. Cap nhat so trang o README (banner nhanh) va
nop/README. Deck khong doi noi dung nen giu nguyen byte.
</commit_message>
<xml_diff>
--- a/docs/papers/mon-hoc/thesis-full.docx
+++ b/docs/papers/mon-hoc/thesis-full.docx
@@ -148,7 +148,7 @@
         <w:pStyle w:val="Heading1"/>
       </w:pPr>
       <w:bookmarkStart w:id="0" w:name="đồ-án-môn-học"/>
-      <w:bookmarkStart w:id="1" w:name="_Toc239319796"/>
+      <w:bookmarkStart w:id="1" w:name="_Toc239321546"/>
       <w:r>
         <w:t>Đ</w:t>
       </w:r>
@@ -220,7 +220,7 @@
         <w:pStyle w:val="Heading1"/>
       </w:pPr>
       <w:bookmarkStart w:id="4" w:name="Xbe958ce37c6a089ac9bdc99dada4ec5e2c0f7da"/>
-      <w:bookmarkStart w:id="5" w:name="_Toc239319797"/>
+      <w:bookmarkStart w:id="5" w:name="_Toc239321547"/>
       <w:bookmarkEnd w:id="0"/>
       <w:bookmarkEnd w:id="3"/>
       <w:r>
@@ -659,7 +659,7 @@
     </w:p>
     <w:p>
       <w:r>
-        <w:pict w14:anchorId="5B48843A">
+        <w:pict w14:anchorId="12C22E57">
           <v:rect id="_x0000_i1025" style="width:0;height:1.5pt" o:hralign="center" o:hrstd="t" o:hr="t"/>
         </w:pict>
       </w:r>
@@ -669,7 +669,7 @@
         <w:pStyle w:val="Heading2"/>
       </w:pPr>
       <w:bookmarkStart w:id="6" w:name="mục-lục"/>
-      <w:bookmarkStart w:id="7" w:name="_Toc239319798"/>
+      <w:bookmarkStart w:id="7" w:name="_Toc239321548"/>
       <w:r>
         <w:t>M</w:t>
       </w:r>
@@ -709,7 +709,7 @@
       <w:r>
         <w:fldChar w:fldCharType="separate"/>
       </w:r>
-      <w:hyperlink w:anchor="_Toc239319796" w:history="1">
+      <w:hyperlink w:anchor="_Toc239321546" w:history="1">
         <w:r>
           <w:rPr>
             <w:rStyle w:val="Hyperlink"/>
@@ -736,7 +736,7 @@
             <w:noProof/>
             <w:webHidden/>
           </w:rPr>
-          <w:instrText xml:space="preserve"> PAGEREF _Toc239319796 \h </w:instrText>
+          <w:instrText xml:space="preserve"> PAGEREF _Toc239321546 \h </w:instrText>
         </w:r>
         <w:r>
           <w:rPr>
@@ -780,7 +780,7 @@
           <w14:ligatures w14:val="standardContextual"/>
         </w:rPr>
       </w:pPr>
-      <w:hyperlink w:anchor="_Toc239319797" w:history="1">
+      <w:hyperlink w:anchor="_Toc239321547" w:history="1">
         <w:r>
           <w:rPr>
             <w:rStyle w:val="Hyperlink"/>
@@ -807,7 +807,7 @@
             <w:noProof/>
             <w:webHidden/>
           </w:rPr>
-          <w:instrText xml:space="preserve"> PAGEREF _Toc239319797 \h </w:instrText>
+          <w:instrText xml:space="preserve"> PAGEREF _Toc239321547 \h </w:instrText>
         </w:r>
         <w:r>
           <w:rPr>
@@ -851,7 +851,7 @@
           <w14:ligatures w14:val="standardContextual"/>
         </w:rPr>
       </w:pPr>
-      <w:hyperlink w:anchor="_Toc239319798" w:history="1">
+      <w:hyperlink w:anchor="_Toc239321548" w:history="1">
         <w:r>
           <w:rPr>
             <w:rStyle w:val="Hyperlink"/>
@@ -878,7 +878,7 @@
             <w:noProof/>
             <w:webHidden/>
           </w:rPr>
-          <w:instrText xml:space="preserve"> PAGEREF _Toc239319798 \h </w:instrText>
+          <w:instrText xml:space="preserve"> PAGEREF _Toc239321548 \h </w:instrText>
         </w:r>
         <w:r>
           <w:rPr>
@@ -922,7 +922,7 @@
           <w14:ligatures w14:val="standardContextual"/>
         </w:rPr>
       </w:pPr>
-      <w:hyperlink w:anchor="_Toc239319799" w:history="1">
+      <w:hyperlink w:anchor="_Toc239321549" w:history="1">
         <w:r>
           <w:rPr>
             <w:rStyle w:val="Hyperlink"/>
@@ -949,7 +949,7 @@
             <w:noProof/>
             <w:webHidden/>
           </w:rPr>
-          <w:instrText xml:space="preserve"> PAGEREF _Toc239319799 \h </w:instrText>
+          <w:instrText xml:space="preserve"> PAGEREF _Toc239321549 \h </w:instrText>
         </w:r>
         <w:r>
           <w:rPr>
@@ -993,7 +993,7 @@
           <w14:ligatures w14:val="standardContextual"/>
         </w:rPr>
       </w:pPr>
-      <w:hyperlink w:anchor="_Toc239319800" w:history="1">
+      <w:hyperlink w:anchor="_Toc239321550" w:history="1">
         <w:r>
           <w:rPr>
             <w:rStyle w:val="Hyperlink"/>
@@ -1020,7 +1020,7 @@
             <w:noProof/>
             <w:webHidden/>
           </w:rPr>
-          <w:instrText xml:space="preserve"> PAGEREF _Toc239319800 \h </w:instrText>
+          <w:instrText xml:space="preserve"> PAGEREF _Toc239321550 \h </w:instrText>
         </w:r>
         <w:r>
           <w:rPr>
@@ -1064,7 +1064,7 @@
           <w14:ligatures w14:val="standardContextual"/>
         </w:rPr>
       </w:pPr>
-      <w:hyperlink w:anchor="_Toc239319801" w:history="1">
+      <w:hyperlink w:anchor="_Toc239321551" w:history="1">
         <w:r>
           <w:rPr>
             <w:rStyle w:val="Hyperlink"/>
@@ -1091,7 +1091,7 @@
             <w:noProof/>
             <w:webHidden/>
           </w:rPr>
-          <w:instrText xml:space="preserve"> PAGEREF _Toc239319801 \h </w:instrText>
+          <w:instrText xml:space="preserve"> PAGEREF _Toc239321551 \h </w:instrText>
         </w:r>
         <w:r>
           <w:rPr>
@@ -1135,7 +1135,7 @@
           <w14:ligatures w14:val="standardContextual"/>
         </w:rPr>
       </w:pPr>
-      <w:hyperlink w:anchor="_Toc239319802" w:history="1">
+      <w:hyperlink w:anchor="_Toc239321552" w:history="1">
         <w:r>
           <w:rPr>
             <w:rStyle w:val="Hyperlink"/>
@@ -1162,7 +1162,7 @@
             <w:noProof/>
             <w:webHidden/>
           </w:rPr>
-          <w:instrText xml:space="preserve"> PAGEREF _Toc239319802 \h </w:instrText>
+          <w:instrText xml:space="preserve"> PAGEREF _Toc239321552 \h </w:instrText>
         </w:r>
         <w:r>
           <w:rPr>
@@ -1206,7 +1206,7 @@
           <w14:ligatures w14:val="standardContextual"/>
         </w:rPr>
       </w:pPr>
-      <w:hyperlink w:anchor="_Toc239319803" w:history="1">
+      <w:hyperlink w:anchor="_Toc239321553" w:history="1">
         <w:r>
           <w:rPr>
             <w:rStyle w:val="Hyperlink"/>
@@ -1233,7 +1233,7 @@
             <w:noProof/>
             <w:webHidden/>
           </w:rPr>
-          <w:instrText xml:space="preserve"> PAGEREF _Toc239319803 \h </w:instrText>
+          <w:instrText xml:space="preserve"> PAGEREF _Toc239321553 \h </w:instrText>
         </w:r>
         <w:r>
           <w:rPr>
@@ -1277,7 +1277,7 @@
           <w14:ligatures w14:val="standardContextual"/>
         </w:rPr>
       </w:pPr>
-      <w:hyperlink w:anchor="_Toc239319804" w:history="1">
+      <w:hyperlink w:anchor="_Toc239321554" w:history="1">
         <w:r>
           <w:rPr>
             <w:rStyle w:val="Hyperlink"/>
@@ -1304,7 +1304,7 @@
             <w:noProof/>
             <w:webHidden/>
           </w:rPr>
-          <w:instrText xml:space="preserve"> PAGEREF _Toc239319804 \h </w:instrText>
+          <w:instrText xml:space="preserve"> PAGEREF _Toc239321554 \h </w:instrText>
         </w:r>
         <w:r>
           <w:rPr>
@@ -1348,7 +1348,7 @@
           <w14:ligatures w14:val="standardContextual"/>
         </w:rPr>
       </w:pPr>
-      <w:hyperlink w:anchor="_Toc239319805" w:history="1">
+      <w:hyperlink w:anchor="_Toc239321555" w:history="1">
         <w:r>
           <w:rPr>
             <w:rStyle w:val="Hyperlink"/>
@@ -1375,7 +1375,7 @@
             <w:noProof/>
             <w:webHidden/>
           </w:rPr>
-          <w:instrText xml:space="preserve"> PAGEREF _Toc239319805 \h </w:instrText>
+          <w:instrText xml:space="preserve"> PAGEREF _Toc239321555 \h </w:instrText>
         </w:r>
         <w:r>
           <w:rPr>
@@ -1419,7 +1419,7 @@
           <w14:ligatures w14:val="standardContextual"/>
         </w:rPr>
       </w:pPr>
-      <w:hyperlink w:anchor="_Toc239319806" w:history="1">
+      <w:hyperlink w:anchor="_Toc239321556" w:history="1">
         <w:r>
           <w:rPr>
             <w:rStyle w:val="Hyperlink"/>
@@ -1446,7 +1446,7 @@
             <w:noProof/>
             <w:webHidden/>
           </w:rPr>
-          <w:instrText xml:space="preserve"> PAGEREF _Toc239319806 \h </w:instrText>
+          <w:instrText xml:space="preserve"> PAGEREF _Toc239321556 \h </w:instrText>
         </w:r>
         <w:r>
           <w:rPr>
@@ -1490,7 +1490,7 @@
           <w14:ligatures w14:val="standardContextual"/>
         </w:rPr>
       </w:pPr>
-      <w:hyperlink w:anchor="_Toc239319807" w:history="1">
+      <w:hyperlink w:anchor="_Toc239321557" w:history="1">
         <w:r>
           <w:rPr>
             <w:rStyle w:val="Hyperlink"/>
@@ -1517,7 +1517,7 @@
             <w:noProof/>
             <w:webHidden/>
           </w:rPr>
-          <w:instrText xml:space="preserve"> PAGEREF _Toc239319807 \h </w:instrText>
+          <w:instrText xml:space="preserve"> PAGEREF _Toc239321557 \h </w:instrText>
         </w:r>
         <w:r>
           <w:rPr>
@@ -1561,7 +1561,7 @@
           <w14:ligatures w14:val="standardContextual"/>
         </w:rPr>
       </w:pPr>
-      <w:hyperlink w:anchor="_Toc239319808" w:history="1">
+      <w:hyperlink w:anchor="_Toc239321558" w:history="1">
         <w:r>
           <w:rPr>
             <w:rStyle w:val="Hyperlink"/>
@@ -1588,7 +1588,7 @@
             <w:noProof/>
             <w:webHidden/>
           </w:rPr>
-          <w:instrText xml:space="preserve"> PAGEREF _Toc239319808 \h </w:instrText>
+          <w:instrText xml:space="preserve"> PAGEREF _Toc239321558 \h </w:instrText>
         </w:r>
         <w:r>
           <w:rPr>
@@ -1632,7 +1632,7 @@
           <w14:ligatures w14:val="standardContextual"/>
         </w:rPr>
       </w:pPr>
-      <w:hyperlink w:anchor="_Toc239319809" w:history="1">
+      <w:hyperlink w:anchor="_Toc239321559" w:history="1">
         <w:r>
           <w:rPr>
             <w:rStyle w:val="Hyperlink"/>
@@ -1659,7 +1659,7 @@
             <w:noProof/>
             <w:webHidden/>
           </w:rPr>
-          <w:instrText xml:space="preserve"> PAGEREF _Toc239319809 \h </w:instrText>
+          <w:instrText xml:space="preserve"> PAGEREF _Toc239321559 \h </w:instrText>
         </w:r>
         <w:r>
           <w:rPr>
@@ -1703,7 +1703,7 @@
           <w14:ligatures w14:val="standardContextual"/>
         </w:rPr>
       </w:pPr>
-      <w:hyperlink w:anchor="_Toc239319810" w:history="1">
+      <w:hyperlink w:anchor="_Toc239321560" w:history="1">
         <w:r>
           <w:rPr>
             <w:rStyle w:val="Hyperlink"/>
@@ -1730,7 +1730,7 @@
             <w:noProof/>
             <w:webHidden/>
           </w:rPr>
-          <w:instrText xml:space="preserve"> PAGEREF _Toc239319810 \h </w:instrText>
+          <w:instrText xml:space="preserve"> PAGEREF _Toc239321560 \h </w:instrText>
         </w:r>
         <w:r>
           <w:rPr>
@@ -1774,7 +1774,7 @@
           <w14:ligatures w14:val="standardContextual"/>
         </w:rPr>
       </w:pPr>
-      <w:hyperlink w:anchor="_Toc239319811" w:history="1">
+      <w:hyperlink w:anchor="_Toc239321561" w:history="1">
         <w:r>
           <w:rPr>
             <w:rStyle w:val="Hyperlink"/>
@@ -1801,7 +1801,7 @@
             <w:noProof/>
             <w:webHidden/>
           </w:rPr>
-          <w:instrText xml:space="preserve"> PAGEREF _Toc239319811 \h </w:instrText>
+          <w:instrText xml:space="preserve"> PAGEREF _Toc239321561 \h </w:instrText>
         </w:r>
         <w:r>
           <w:rPr>
@@ -1845,7 +1845,7 @@
           <w14:ligatures w14:val="standardContextual"/>
         </w:rPr>
       </w:pPr>
-      <w:hyperlink w:anchor="_Toc239319812" w:history="1">
+      <w:hyperlink w:anchor="_Toc239321562" w:history="1">
         <w:r>
           <w:rPr>
             <w:rStyle w:val="Hyperlink"/>
@@ -1872,7 +1872,7 @@
             <w:noProof/>
             <w:webHidden/>
           </w:rPr>
-          <w:instrText xml:space="preserve"> PAGEREF _Toc239319812 \h </w:instrText>
+          <w:instrText xml:space="preserve"> PAGEREF _Toc239321562 \h </w:instrText>
         </w:r>
         <w:r>
           <w:rPr>
@@ -1916,7 +1916,7 @@
           <w14:ligatures w14:val="standardContextual"/>
         </w:rPr>
       </w:pPr>
-      <w:hyperlink w:anchor="_Toc239319813" w:history="1">
+      <w:hyperlink w:anchor="_Toc239321563" w:history="1">
         <w:r>
           <w:rPr>
             <w:rStyle w:val="Hyperlink"/>
@@ -1943,7 +1943,7 @@
             <w:noProof/>
             <w:webHidden/>
           </w:rPr>
-          <w:instrText xml:space="preserve"> PAGEREF _Toc239319813 \h </w:instrText>
+          <w:instrText xml:space="preserve"> PAGEREF _Toc239321563 \h </w:instrText>
         </w:r>
         <w:r>
           <w:rPr>
@@ -1987,7 +1987,7 @@
           <w14:ligatures w14:val="standardContextual"/>
         </w:rPr>
       </w:pPr>
-      <w:hyperlink w:anchor="_Toc239319814" w:history="1">
+      <w:hyperlink w:anchor="_Toc239321564" w:history="1">
         <w:r>
           <w:rPr>
             <w:rStyle w:val="Hyperlink"/>
@@ -2014,7 +2014,7 @@
             <w:noProof/>
             <w:webHidden/>
           </w:rPr>
-          <w:instrText xml:space="preserve"> PAGEREF _Toc239319814 \h </w:instrText>
+          <w:instrText xml:space="preserve"> PAGEREF _Toc239321564 \h </w:instrText>
         </w:r>
         <w:r>
           <w:rPr>
@@ -2058,7 +2058,7 @@
           <w14:ligatures w14:val="standardContextual"/>
         </w:rPr>
       </w:pPr>
-      <w:hyperlink w:anchor="_Toc239319815" w:history="1">
+      <w:hyperlink w:anchor="_Toc239321565" w:history="1">
         <w:r>
           <w:rPr>
             <w:rStyle w:val="Hyperlink"/>
@@ -2085,7 +2085,7 @@
             <w:noProof/>
             <w:webHidden/>
           </w:rPr>
-          <w:instrText xml:space="preserve"> PAGEREF _Toc239319815 \h </w:instrText>
+          <w:instrText xml:space="preserve"> PAGEREF _Toc239321565 \h </w:instrText>
         </w:r>
         <w:r>
           <w:rPr>
@@ -2129,7 +2129,7 @@
           <w14:ligatures w14:val="standardContextual"/>
         </w:rPr>
       </w:pPr>
-      <w:hyperlink w:anchor="_Toc239319816" w:history="1">
+      <w:hyperlink w:anchor="_Toc239321566" w:history="1">
         <w:r>
           <w:rPr>
             <w:rStyle w:val="Hyperlink"/>
@@ -2156,7 +2156,7 @@
             <w:noProof/>
             <w:webHidden/>
           </w:rPr>
-          <w:instrText xml:space="preserve"> PAGEREF _Toc239319816 \h </w:instrText>
+          <w:instrText xml:space="preserve"> PAGEREF _Toc239321566 \h </w:instrText>
         </w:r>
         <w:r>
           <w:rPr>
@@ -2200,7 +2200,7 @@
           <w14:ligatures w14:val="standardContextual"/>
         </w:rPr>
       </w:pPr>
-      <w:hyperlink w:anchor="_Toc239319817" w:history="1">
+      <w:hyperlink w:anchor="_Toc239321567" w:history="1">
         <w:r>
           <w:rPr>
             <w:rStyle w:val="Hyperlink"/>
@@ -2227,7 +2227,7 @@
             <w:noProof/>
             <w:webHidden/>
           </w:rPr>
-          <w:instrText xml:space="preserve"> PAGEREF _Toc239319817 \h </w:instrText>
+          <w:instrText xml:space="preserve"> PAGEREF _Toc239321567 \h </w:instrText>
         </w:r>
         <w:r>
           <w:rPr>
@@ -2271,7 +2271,7 @@
           <w14:ligatures w14:val="standardContextual"/>
         </w:rPr>
       </w:pPr>
-      <w:hyperlink w:anchor="_Toc239319818" w:history="1">
+      <w:hyperlink w:anchor="_Toc239321568" w:history="1">
         <w:r>
           <w:rPr>
             <w:rStyle w:val="Hyperlink"/>
@@ -2298,7 +2298,7 @@
             <w:noProof/>
             <w:webHidden/>
           </w:rPr>
-          <w:instrText xml:space="preserve"> PAGEREF _Toc239319818 \h </w:instrText>
+          <w:instrText xml:space="preserve"> PAGEREF _Toc239321568 \h </w:instrText>
         </w:r>
         <w:r>
           <w:rPr>
@@ -2342,7 +2342,7 @@
           <w14:ligatures w14:val="standardContextual"/>
         </w:rPr>
       </w:pPr>
-      <w:hyperlink w:anchor="_Toc239319819" w:history="1">
+      <w:hyperlink w:anchor="_Toc239321569" w:history="1">
         <w:r>
           <w:rPr>
             <w:rStyle w:val="Hyperlink"/>
@@ -2369,7 +2369,7 @@
             <w:noProof/>
             <w:webHidden/>
           </w:rPr>
-          <w:instrText xml:space="preserve"> PAGEREF _Toc239319819 \h </w:instrText>
+          <w:instrText xml:space="preserve"> PAGEREF _Toc239321569 \h </w:instrText>
         </w:r>
         <w:r>
           <w:rPr>
@@ -2413,7 +2413,7 @@
           <w14:ligatures w14:val="standardContextual"/>
         </w:rPr>
       </w:pPr>
-      <w:hyperlink w:anchor="_Toc239319820" w:history="1">
+      <w:hyperlink w:anchor="_Toc239321570" w:history="1">
         <w:r>
           <w:rPr>
             <w:rStyle w:val="Hyperlink"/>
@@ -2440,7 +2440,7 @@
             <w:noProof/>
             <w:webHidden/>
           </w:rPr>
-          <w:instrText xml:space="preserve"> PAGEREF _Toc239319820 \h </w:instrText>
+          <w:instrText xml:space="preserve"> PAGEREF _Toc239321570 \h </w:instrText>
         </w:r>
         <w:r>
           <w:rPr>
@@ -2484,7 +2484,7 @@
           <w14:ligatures w14:val="standardContextual"/>
         </w:rPr>
       </w:pPr>
-      <w:hyperlink w:anchor="_Toc239319821" w:history="1">
+      <w:hyperlink w:anchor="_Toc239321571" w:history="1">
         <w:r>
           <w:rPr>
             <w:rStyle w:val="Hyperlink"/>
@@ -2511,7 +2511,7 @@
             <w:noProof/>
             <w:webHidden/>
           </w:rPr>
-          <w:instrText xml:space="preserve"> PAGEREF _Toc239319821 \h </w:instrText>
+          <w:instrText xml:space="preserve"> PAGEREF _Toc239321571 \h </w:instrText>
         </w:r>
         <w:r>
           <w:rPr>
@@ -2555,7 +2555,7 @@
           <w14:ligatures w14:val="standardContextual"/>
         </w:rPr>
       </w:pPr>
-      <w:hyperlink w:anchor="_Toc239319822" w:history="1">
+      <w:hyperlink w:anchor="_Toc239321572" w:history="1">
         <w:r>
           <w:rPr>
             <w:rStyle w:val="Hyperlink"/>
@@ -2582,7 +2582,7 @@
             <w:noProof/>
             <w:webHidden/>
           </w:rPr>
-          <w:instrText xml:space="preserve"> PAGEREF _Toc239319822 \h </w:instrText>
+          <w:instrText xml:space="preserve"> PAGEREF _Toc239321572 \h </w:instrText>
         </w:r>
         <w:r>
           <w:rPr>
@@ -2626,7 +2626,7 @@
           <w14:ligatures w14:val="standardContextual"/>
         </w:rPr>
       </w:pPr>
-      <w:hyperlink w:anchor="_Toc239319823" w:history="1">
+      <w:hyperlink w:anchor="_Toc239321573" w:history="1">
         <w:r>
           <w:rPr>
             <w:rStyle w:val="Hyperlink"/>
@@ -2653,7 +2653,7 @@
             <w:noProof/>
             <w:webHidden/>
           </w:rPr>
-          <w:instrText xml:space="preserve"> PAGEREF _Toc239319823 \h </w:instrText>
+          <w:instrText xml:space="preserve"> PAGEREF _Toc239321573 \h </w:instrText>
         </w:r>
         <w:r>
           <w:rPr>
@@ -2697,7 +2697,7 @@
           <w14:ligatures w14:val="standardContextual"/>
         </w:rPr>
       </w:pPr>
-      <w:hyperlink w:anchor="_Toc239319824" w:history="1">
+      <w:hyperlink w:anchor="_Toc239321574" w:history="1">
         <w:r>
           <w:rPr>
             <w:rStyle w:val="Hyperlink"/>
@@ -2724,7 +2724,7 @@
             <w:noProof/>
             <w:webHidden/>
           </w:rPr>
-          <w:instrText xml:space="preserve"> PAGEREF _Toc239319824 \h </w:instrText>
+          <w:instrText xml:space="preserve"> PAGEREF _Toc239321574 \h </w:instrText>
         </w:r>
         <w:r>
           <w:rPr>
@@ -2768,7 +2768,7 @@
           <w14:ligatures w14:val="standardContextual"/>
         </w:rPr>
       </w:pPr>
-      <w:hyperlink w:anchor="_Toc239319825" w:history="1">
+      <w:hyperlink w:anchor="_Toc239321575" w:history="1">
         <w:r>
           <w:rPr>
             <w:rStyle w:val="Hyperlink"/>
@@ -2795,7 +2795,7 @@
             <w:noProof/>
             <w:webHidden/>
           </w:rPr>
-          <w:instrText xml:space="preserve"> PAGEREF _Toc239319825 \h </w:instrText>
+          <w:instrText xml:space="preserve"> PAGEREF _Toc239321575 \h </w:instrText>
         </w:r>
         <w:r>
           <w:rPr>
@@ -2839,7 +2839,7 @@
           <w14:ligatures w14:val="standardContextual"/>
         </w:rPr>
       </w:pPr>
-      <w:hyperlink w:anchor="_Toc239319826" w:history="1">
+      <w:hyperlink w:anchor="_Toc239321576" w:history="1">
         <w:r>
           <w:rPr>
             <w:rStyle w:val="Hyperlink"/>
@@ -2866,7 +2866,7 @@
             <w:noProof/>
             <w:webHidden/>
           </w:rPr>
-          <w:instrText xml:space="preserve"> PAGEREF _Toc239319826 \h </w:instrText>
+          <w:instrText xml:space="preserve"> PAGEREF _Toc239321576 \h </w:instrText>
         </w:r>
         <w:r>
           <w:rPr>
@@ -2910,7 +2910,7 @@
           <w14:ligatures w14:val="standardContextual"/>
         </w:rPr>
       </w:pPr>
-      <w:hyperlink w:anchor="_Toc239319827" w:history="1">
+      <w:hyperlink w:anchor="_Toc239321577" w:history="1">
         <w:r>
           <w:rPr>
             <w:rStyle w:val="Hyperlink"/>
@@ -2937,7 +2937,7 @@
             <w:noProof/>
             <w:webHidden/>
           </w:rPr>
-          <w:instrText xml:space="preserve"> PAGEREF _Toc239319827 \h </w:instrText>
+          <w:instrText xml:space="preserve"> PAGEREF _Toc239321577 \h </w:instrText>
         </w:r>
         <w:r>
           <w:rPr>
@@ -2981,7 +2981,7 @@
           <w14:ligatures w14:val="standardContextual"/>
         </w:rPr>
       </w:pPr>
-      <w:hyperlink w:anchor="_Toc239319828" w:history="1">
+      <w:hyperlink w:anchor="_Toc239321578" w:history="1">
         <w:r>
           <w:rPr>
             <w:rStyle w:val="Hyperlink"/>
@@ -3008,7 +3008,7 @@
             <w:noProof/>
             <w:webHidden/>
           </w:rPr>
-          <w:instrText xml:space="preserve"> PAGEREF _Toc239319828 \h </w:instrText>
+          <w:instrText xml:space="preserve"> PAGEREF _Toc239321578 \h </w:instrText>
         </w:r>
         <w:r>
           <w:rPr>
@@ -3052,7 +3052,7 @@
           <w14:ligatures w14:val="standardContextual"/>
         </w:rPr>
       </w:pPr>
-      <w:hyperlink w:anchor="_Toc239319829" w:history="1">
+      <w:hyperlink w:anchor="_Toc239321579" w:history="1">
         <w:r>
           <w:rPr>
             <w:rStyle w:val="Hyperlink"/>
@@ -3079,7 +3079,7 @@
             <w:noProof/>
             <w:webHidden/>
           </w:rPr>
-          <w:instrText xml:space="preserve"> PAGEREF _Toc239319829 \h </w:instrText>
+          <w:instrText xml:space="preserve"> PAGEREF _Toc239321579 \h </w:instrText>
         </w:r>
         <w:r>
           <w:rPr>
@@ -3123,7 +3123,7 @@
           <w14:ligatures w14:val="standardContextual"/>
         </w:rPr>
       </w:pPr>
-      <w:hyperlink w:anchor="_Toc239319830" w:history="1">
+      <w:hyperlink w:anchor="_Toc239321580" w:history="1">
         <w:r>
           <w:rPr>
             <w:rStyle w:val="Hyperlink"/>
@@ -3150,7 +3150,7 @@
             <w:noProof/>
             <w:webHidden/>
           </w:rPr>
-          <w:instrText xml:space="preserve"> PAGEREF _Toc239319830 \h </w:instrText>
+          <w:instrText xml:space="preserve"> PAGEREF _Toc239321580 \h </w:instrText>
         </w:r>
         <w:r>
           <w:rPr>
@@ -3194,7 +3194,7 @@
           <w14:ligatures w14:val="standardContextual"/>
         </w:rPr>
       </w:pPr>
-      <w:hyperlink w:anchor="_Toc239319831" w:history="1">
+      <w:hyperlink w:anchor="_Toc239321581" w:history="1">
         <w:r>
           <w:rPr>
             <w:rStyle w:val="Hyperlink"/>
@@ -3221,7 +3221,7 @@
             <w:noProof/>
             <w:webHidden/>
           </w:rPr>
-          <w:instrText xml:space="preserve"> PAGEREF _Toc239319831 \h </w:instrText>
+          <w:instrText xml:space="preserve"> PAGEREF _Toc239321581 \h </w:instrText>
         </w:r>
         <w:r>
           <w:rPr>
@@ -3265,7 +3265,7 @@
           <w14:ligatures w14:val="standardContextual"/>
         </w:rPr>
       </w:pPr>
-      <w:hyperlink w:anchor="_Toc239319832" w:history="1">
+      <w:hyperlink w:anchor="_Toc239321582" w:history="1">
         <w:r>
           <w:rPr>
             <w:rStyle w:val="Hyperlink"/>
@@ -3292,7 +3292,7 @@
             <w:noProof/>
             <w:webHidden/>
           </w:rPr>
-          <w:instrText xml:space="preserve"> PAGEREF _Toc239319832 \h </w:instrText>
+          <w:instrText xml:space="preserve"> PAGEREF _Toc239321582 \h </w:instrText>
         </w:r>
         <w:r>
           <w:rPr>
@@ -3338,7 +3338,7 @@
         <w:pStyle w:val="Heading1"/>
       </w:pPr>
       <w:bookmarkStart w:id="8" w:name="chương-1-giới-thiệu"/>
-      <w:bookmarkStart w:id="9" w:name="_Toc239319799"/>
+      <w:bookmarkStart w:id="9" w:name="_Toc239321549"/>
       <w:bookmarkEnd w:id="4"/>
       <w:bookmarkEnd w:id="6"/>
       <w:r>
@@ -3363,7 +3363,7 @@
         <w:pStyle w:val="Heading2"/>
       </w:pPr>
       <w:bookmarkStart w:id="10" w:name="X7d99df2d9d0c5141050eb9941026463f4c8ea2b"/>
-      <w:bookmarkStart w:id="11" w:name="_Toc239319800"/>
+      <w:bookmarkStart w:id="11" w:name="_Toc239321550"/>
       <w:r>
         <w:t>1.1. Đ</w:t>
       </w:r>
@@ -5213,7 +5213,7 @@
         <w:pStyle w:val="Heading2"/>
       </w:pPr>
       <w:bookmarkStart w:id="12" w:name="X60021b7b958505251ec70bd32e2bac9f8a0361c"/>
-      <w:bookmarkStart w:id="13" w:name="_Toc239319801"/>
+      <w:bookmarkStart w:id="13" w:name="_Toc239321551"/>
       <w:bookmarkEnd w:id="10"/>
       <w:r>
         <w:t>1.2. M</w:t>
@@ -7159,7 +7159,7 @@
         <w:pStyle w:val="Heading2"/>
       </w:pPr>
       <w:bookmarkStart w:id="17" w:name="X03724c88a1b7da9b434cf0a8db5356690a4bb71"/>
-      <w:bookmarkStart w:id="18" w:name="_Toc239319802"/>
+      <w:bookmarkStart w:id="18" w:name="_Toc239321552"/>
       <w:bookmarkEnd w:id="12"/>
       <w:bookmarkEnd w:id="16"/>
       <w:r>
@@ -8964,7 +8964,7 @@
         <w:pStyle w:val="Heading1"/>
       </w:pPr>
       <w:bookmarkStart w:id="20" w:name="chương-2-cơ-sở-lý-thuyết"/>
-      <w:bookmarkStart w:id="21" w:name="_Toc239319803"/>
+      <w:bookmarkStart w:id="21" w:name="_Toc239321553"/>
       <w:bookmarkEnd w:id="8"/>
       <w:bookmarkEnd w:id="17"/>
       <w:r>
@@ -9261,7 +9261,7 @@
         <w:pStyle w:val="Heading2"/>
       </w:pPr>
       <w:bookmarkStart w:id="22" w:name="X2256001523e16d112c59df938522f140b8b988e"/>
-      <w:bookmarkStart w:id="23" w:name="_Toc239319804"/>
+      <w:bookmarkStart w:id="23" w:name="_Toc239321554"/>
       <w:r>
         <w:t>2.1. Quy chu</w:t>
       </w:r>
@@ -13940,7 +13940,7 @@
         <w:pStyle w:val="Heading2"/>
       </w:pPr>
       <w:bookmarkStart w:id="30" w:name="Xb21b4f0690a73e92e2a35192cb39315a0956521"/>
-      <w:bookmarkStart w:id="31" w:name="_Toc239319805"/>
+      <w:bookmarkStart w:id="31" w:name="_Toc239321555"/>
       <w:bookmarkEnd w:id="22"/>
       <w:bookmarkEnd w:id="28"/>
       <w:r>
@@ -19180,7 +19180,7 @@
         <w:pStyle w:val="Heading2"/>
       </w:pPr>
       <w:bookmarkStart w:id="38" w:name="X8ff52f1334e3f0e382caf7ffa1b7096a981291c"/>
-      <w:bookmarkStart w:id="39" w:name="_Toc239319806"/>
+      <w:bookmarkStart w:id="39" w:name="_Toc239321556"/>
       <w:bookmarkEnd w:id="30"/>
       <w:bookmarkEnd w:id="37"/>
       <w:r>
@@ -19459,7 +19459,7 @@
           <w:noProof/>
         </w:rPr>
         <w:drawing>
-          <wp:inline distT="0" distB="0" distL="0" distR="0" wp14:anchorId="0805838F" wp14:editId="5694BA4C">
+          <wp:inline distT="0" distB="0" distL="0" distR="0" wp14:anchorId="3E7868D1" wp14:editId="2C59F005">
             <wp:extent cx="5334000" cy="1435553"/>
             <wp:effectExtent l="0" t="0" r="0" b="0"/>
             <wp:docPr id="37" name="Picture"/>
@@ -20921,7 +20921,7 @@
         <w:pStyle w:val="Heading2"/>
       </w:pPr>
       <w:bookmarkStart w:id="43" w:name="X1a77f36e16d4ad267b00eabe7cf793e1dbe08e9"/>
-      <w:bookmarkStart w:id="44" w:name="_Toc239319807"/>
+      <w:bookmarkStart w:id="44" w:name="_Toc239321557"/>
       <w:bookmarkEnd w:id="38"/>
       <w:bookmarkEnd w:id="42"/>
       <w:r>
@@ -22091,7 +22091,7 @@
           <w:noProof/>
         </w:rPr>
         <w:drawing>
-          <wp:inline distT="0" distB="0" distL="0" distR="0" wp14:anchorId="22BBDC0A" wp14:editId="1BF52ABA">
+          <wp:inline distT="0" distB="0" distL="0" distR="0" wp14:anchorId="1159BE58" wp14:editId="3AE7F73B">
             <wp:extent cx="5334000" cy="2884362"/>
             <wp:effectExtent l="0" t="0" r="0" b="0"/>
             <wp:docPr id="44" name="Picture"/>
@@ -22357,7 +22357,7 @@
           <w:noProof/>
         </w:rPr>
         <w:drawing>
-          <wp:inline distT="0" distB="0" distL="0" distR="0" wp14:anchorId="2774D2CD" wp14:editId="47C7C2E9">
+          <wp:inline distT="0" distB="0" distL="0" distR="0" wp14:anchorId="7004744A" wp14:editId="75EE1D43">
             <wp:extent cx="5334000" cy="632732"/>
             <wp:effectExtent l="0" t="0" r="0" b="0"/>
             <wp:docPr id="49" name="Picture"/>
@@ -24260,7 +24260,7 @@
         <w:pStyle w:val="Heading1"/>
       </w:pPr>
       <w:bookmarkStart w:id="50" w:name="chương-3-thiết-kế-và-cài-đặt"/>
-      <w:bookmarkStart w:id="51" w:name="_Toc239319808"/>
+      <w:bookmarkStart w:id="51" w:name="_Toc239321558"/>
       <w:bookmarkEnd w:id="20"/>
       <w:bookmarkEnd w:id="43"/>
       <w:bookmarkEnd w:id="49"/>
@@ -24292,7 +24292,7 @@
         <w:pStyle w:val="Heading2"/>
       </w:pPr>
       <w:bookmarkStart w:id="52" w:name="X21a22cc9b66dca004f2960f37df13c53a04e97b"/>
-      <w:bookmarkStart w:id="53" w:name="_Toc239319809"/>
+      <w:bookmarkStart w:id="53" w:name="_Toc239321559"/>
       <w:r>
         <w:t>3.1. Ki</w:t>
       </w:r>
@@ -24384,7 +24384,7 @@
           <w:noProof/>
         </w:rPr>
         <w:drawing>
-          <wp:inline distT="0" distB="0" distL="0" distR="0" wp14:anchorId="558D4693" wp14:editId="27D95EC1">
+          <wp:inline distT="0" distB="0" distL="0" distR="0" wp14:anchorId="4AE58036" wp14:editId="61746E9B">
             <wp:extent cx="5334000" cy="401410"/>
             <wp:effectExtent l="0" t="0" r="0" b="0"/>
             <wp:docPr id="57" name="Picture"/>
@@ -26053,7 +26053,7 @@
         <w:pStyle w:val="Heading2"/>
       </w:pPr>
       <w:bookmarkStart w:id="55" w:name="X1f307d8f8c73bce8db8683c986faea6c8ea66a3"/>
-      <w:bookmarkStart w:id="56" w:name="_Toc239319810"/>
+      <w:bookmarkStart w:id="56" w:name="_Toc239321560"/>
       <w:bookmarkEnd w:id="52"/>
       <w:r>
         <w:t>3.2. Xây d</w:t>
@@ -26120,7 +26120,7 @@
           <w:noProof/>
         </w:rPr>
         <w:drawing>
-          <wp:inline distT="0" distB="0" distL="0" distR="0" wp14:anchorId="5914D46C" wp14:editId="0F2629ED">
+          <wp:inline distT="0" distB="0" distL="0" distR="0" wp14:anchorId="4AC42C17" wp14:editId="62DC4AE4">
             <wp:extent cx="5334000" cy="802821"/>
             <wp:effectExtent l="0" t="0" r="0" b="0"/>
             <wp:docPr id="62" name="Picture"/>
@@ -30232,7 +30232,7 @@
         <w:pStyle w:val="Heading2"/>
       </w:pPr>
       <w:bookmarkStart w:id="62" w:name="X6a397cb1739f1ec0a8c9714808f79a5ce1fbf6f"/>
-      <w:bookmarkStart w:id="63" w:name="_Toc239319811"/>
+      <w:bookmarkStart w:id="63" w:name="_Toc239321561"/>
       <w:bookmarkEnd w:id="55"/>
       <w:bookmarkEnd w:id="61"/>
       <w:r>
@@ -31798,7 +31798,7 @@
         <w:pStyle w:val="Heading2"/>
       </w:pPr>
       <w:bookmarkStart w:id="65" w:name="X9c2c9b365086d10c999a46e4942f14d73b6baa5"/>
-      <w:bookmarkStart w:id="66" w:name="_Toc239319812"/>
+      <w:bookmarkStart w:id="66" w:name="_Toc239321562"/>
       <w:bookmarkEnd w:id="62"/>
       <w:r>
         <w:t>3.4. Kh</w:t>
@@ -33369,7 +33369,7 @@
           <w:noProof/>
         </w:rPr>
         <w:drawing>
-          <wp:inline distT="0" distB="0" distL="0" distR="0" wp14:anchorId="462311C9" wp14:editId="4A6E17B2">
+          <wp:inline distT="0" distB="0" distL="0" distR="0" wp14:anchorId="3831F32E" wp14:editId="6F4B0A31">
             <wp:extent cx="5334000" cy="8969712"/>
             <wp:effectExtent l="0" t="0" r="0" b="0"/>
             <wp:docPr id="73" name="Picture"/>
@@ -40743,7 +40743,7 @@
         <w:pStyle w:val="Heading2"/>
       </w:pPr>
       <w:bookmarkStart w:id="75" w:name="Xb17945b5d9374e5087c2c96ace1685ff00e2e22"/>
-      <w:bookmarkStart w:id="76" w:name="_Toc239319813"/>
+      <w:bookmarkStart w:id="76" w:name="_Toc239321563"/>
       <w:bookmarkEnd w:id="65"/>
       <w:bookmarkEnd w:id="74"/>
       <w:r>
@@ -42116,7 +42116,7 @@
         <w:pStyle w:val="Heading2"/>
       </w:pPr>
       <w:bookmarkStart w:id="77" w:name="Xfad7df3f963ac0b8ebfe8cf87d7c64fa075f760"/>
-      <w:bookmarkStart w:id="78" w:name="_Toc239319814"/>
+      <w:bookmarkStart w:id="78" w:name="_Toc239321564"/>
       <w:bookmarkEnd w:id="75"/>
       <w:r>
         <w:t>3.6. B</w:t>
@@ -42162,7 +42162,7 @@
           <w:noProof/>
         </w:rPr>
         <w:drawing>
-          <wp:inline distT="0" distB="0" distL="0" distR="0" wp14:anchorId="7C8FF308" wp14:editId="396B8546">
+          <wp:inline distT="0" distB="0" distL="0" distR="0" wp14:anchorId="2CD2FBE1" wp14:editId="3515A6CE">
             <wp:extent cx="5334000" cy="1217839"/>
             <wp:effectExtent l="0" t="0" r="0" b="0"/>
             <wp:docPr id="86" name="Picture"/>
@@ -44940,7 +44940,7 @@
         <w:pStyle w:val="Heading2"/>
       </w:pPr>
       <w:bookmarkStart w:id="80" w:name="X9b5467225f237e4ee44d60f7d236cbdfdaa1e07"/>
-      <w:bookmarkStart w:id="81" w:name="_Toc239319815"/>
+      <w:bookmarkStart w:id="81" w:name="_Toc239321565"/>
       <w:bookmarkEnd w:id="77"/>
       <w:r>
         <w:t xml:space="preserve">3.7. </w:t>
@@ -45060,7 +45060,7 @@
           <w:noProof/>
         </w:rPr>
         <w:drawing>
-          <wp:inline distT="0" distB="0" distL="0" distR="0" wp14:anchorId="6CE4A292" wp14:editId="1A3DBA92">
+          <wp:inline distT="0" distB="0" distL="0" distR="0" wp14:anchorId="1AACEBEE" wp14:editId="76E3BAB0">
             <wp:extent cx="5334000" cy="5953125"/>
             <wp:effectExtent l="0" t="0" r="0" b="0"/>
             <wp:docPr id="91" name="Picture"/>
@@ -46167,7 +46167,7 @@
         <w:pStyle w:val="Heading1"/>
       </w:pPr>
       <w:bookmarkStart w:id="83" w:name="chương-4-thực-nghiệm-và-đánh-giá"/>
-      <w:bookmarkStart w:id="84" w:name="_Toc239319816"/>
+      <w:bookmarkStart w:id="84" w:name="_Toc239321566"/>
       <w:bookmarkEnd w:id="50"/>
       <w:bookmarkEnd w:id="80"/>
       <w:r>
@@ -46192,7 +46192,7 @@
         <w:pStyle w:val="Heading2"/>
       </w:pPr>
       <w:bookmarkStart w:id="85" w:name="X43cb4672f728ce1df4f211c1d18360135f0c40b"/>
-      <w:bookmarkStart w:id="86" w:name="_Toc239319817"/>
+      <w:bookmarkStart w:id="86" w:name="_Toc239321567"/>
       <w:r>
         <w:t>4.1. Môi trư</w:t>
       </w:r>
@@ -47814,7 +47814,7 @@
         <w:pStyle w:val="Heading2"/>
       </w:pPr>
       <w:bookmarkStart w:id="87" w:name="Xe48430b60e6d2b1022368eb4316c1fe9f53411f"/>
-      <w:bookmarkStart w:id="88" w:name="_Toc239319818"/>
+      <w:bookmarkStart w:id="88" w:name="_Toc239321568"/>
       <w:bookmarkEnd w:id="85"/>
       <w:r>
         <w:t>4.2. K</w:t>
@@ -51352,7 +51352,7 @@
         <w:pStyle w:val="Heading2"/>
       </w:pPr>
       <w:bookmarkStart w:id="95" w:name="X09b724f0b907c7f652c2569c27ef1d5728c277c"/>
-      <w:bookmarkStart w:id="96" w:name="_Toc239319819"/>
+      <w:bookmarkStart w:id="96" w:name="_Toc239321569"/>
       <w:bookmarkEnd w:id="87"/>
       <w:bookmarkEnd w:id="93"/>
       <w:r>
@@ -53624,7 +53624,7 @@
           <w:noProof/>
         </w:rPr>
         <w:drawing>
-          <wp:inline distT="0" distB="0" distL="0" distR="0" wp14:anchorId="4D2B2C82" wp14:editId="0C575D48">
+          <wp:inline distT="0" distB="0" distL="0" distR="0" wp14:anchorId="197DD8BE" wp14:editId="0BF0AC98">
             <wp:extent cx="5334000" cy="2883855"/>
             <wp:effectExtent l="0" t="0" r="0" b="0"/>
             <wp:docPr id="108" name="Picture"/>
@@ -59730,7 +59730,7 @@
         <w:pStyle w:val="Heading2"/>
       </w:pPr>
       <w:bookmarkStart w:id="106" w:name="X0c205a3fd5474e5e1d380a3735df7543f97f059"/>
-      <w:bookmarkStart w:id="107" w:name="_Toc239319820"/>
+      <w:bookmarkStart w:id="107" w:name="_Toc239321570"/>
       <w:bookmarkEnd w:id="95"/>
       <w:bookmarkEnd w:id="104"/>
       <w:r>
@@ -63122,7 +63122,7 @@
         <w:pStyle w:val="Heading2"/>
       </w:pPr>
       <w:bookmarkStart w:id="113" w:name="X8f4b2c0e55e8764a0677cdfa39e96dbe6822859"/>
-      <w:bookmarkStart w:id="114" w:name="_Toc239319821"/>
+      <w:bookmarkStart w:id="114" w:name="_Toc239321571"/>
       <w:bookmarkEnd w:id="106"/>
       <w:bookmarkEnd w:id="112"/>
       <w:r>
@@ -66268,7 +66268,7 @@
         <w:pStyle w:val="Heading2"/>
       </w:pPr>
       <w:bookmarkStart w:id="120" w:name="X7468ed9f095dd0192ebc5de940dc44b5cd3e099"/>
-      <w:bookmarkStart w:id="121" w:name="_Toc239319822"/>
+      <w:bookmarkStart w:id="121" w:name="_Toc239321572"/>
       <w:bookmarkEnd w:id="113"/>
       <w:bookmarkEnd w:id="118"/>
       <w:r>
@@ -68129,7 +68129,7 @@
           <w:noProof/>
         </w:rPr>
         <w:drawing>
-          <wp:inline distT="0" distB="0" distL="0" distR="0" wp14:anchorId="0EA255C5" wp14:editId="04C12C67">
+          <wp:inline distT="0" distB="0" distL="0" distR="0" wp14:anchorId="2B1A0635" wp14:editId="206CE191">
             <wp:extent cx="5334000" cy="3317670"/>
             <wp:effectExtent l="0" t="0" r="0" b="0"/>
             <wp:docPr id="131" name="Picture"/>
@@ -69142,7 +69142,7 @@
         <w:pStyle w:val="Heading2"/>
       </w:pPr>
       <w:bookmarkStart w:id="124" w:name="X88e1c26a6581f7bd1dbdb2c85ae6116c5ba8393"/>
-      <w:bookmarkStart w:id="125" w:name="_Toc239319823"/>
+      <w:bookmarkStart w:id="125" w:name="_Toc239321573"/>
       <w:bookmarkEnd w:id="120"/>
       <w:r>
         <w:t>4.7. Các y</w:t>
@@ -70994,7 +70994,7 @@
         <w:pStyle w:val="Heading1"/>
       </w:pPr>
       <w:bookmarkStart w:id="127" w:name="chương-5-kết-luận-và-hướng-phát-triển"/>
-      <w:bookmarkStart w:id="128" w:name="_Toc239319824"/>
+      <w:bookmarkStart w:id="128" w:name="_Toc239321574"/>
       <w:bookmarkEnd w:id="83"/>
       <w:bookmarkEnd w:id="124"/>
       <w:r>
@@ -71031,7 +71031,7 @@
         <w:pStyle w:val="Heading2"/>
       </w:pPr>
       <w:bookmarkStart w:id="129" w:name="Xcefa088882d41b38c21b7b5b44c738cb5564fbb"/>
-      <w:bookmarkStart w:id="130" w:name="_Toc239319825"/>
+      <w:bookmarkStart w:id="130" w:name="_Toc239321575"/>
       <w:r>
         <w:t>5.1. K</w:t>
       </w:r>
@@ -73761,7 +73761,7 @@
         <w:pStyle w:val="Heading2"/>
       </w:pPr>
       <w:bookmarkStart w:id="132" w:name="Xe79f58ab8ce7b6f148c68a374118dd9eaec1a1c"/>
-      <w:bookmarkStart w:id="133" w:name="_Toc239319826"/>
+      <w:bookmarkStart w:id="133" w:name="_Toc239321576"/>
       <w:bookmarkEnd w:id="129"/>
       <w:r>
         <w:t>5.2. H</w:t>
@@ -75201,7 +75201,7 @@
         <w:pStyle w:val="Heading2"/>
       </w:pPr>
       <w:bookmarkStart w:id="135" w:name="X66db71c9020c40cf46e490c5c37ad244e2b7594"/>
-      <w:bookmarkStart w:id="136" w:name="_Toc239319827"/>
+      <w:bookmarkStart w:id="136" w:name="_Toc239321577"/>
       <w:bookmarkEnd w:id="132"/>
       <w:r>
         <w:t>5.3. Hư</w:t>
@@ -76792,7 +76792,7 @@
         <w:pStyle w:val="Heading2"/>
       </w:pPr>
       <w:bookmarkStart w:id="138" w:name="Xe5a2fe3dfcd4681648271b7ddc344b106e48b3b"/>
-      <w:bookmarkStart w:id="139" w:name="_Toc239319828"/>
+      <w:bookmarkStart w:id="139" w:name="_Toc239321578"/>
       <w:bookmarkEnd w:id="135"/>
       <w:r>
         <w:t>5.4. K</w:t>
@@ -77715,7 +77715,7 @@
         <w:pStyle w:val="Heading1"/>
       </w:pPr>
       <w:bookmarkStart w:id="140" w:name="tài-liệu-tham-khảo"/>
-      <w:bookmarkStart w:id="141" w:name="_Toc239319829"/>
+      <w:bookmarkStart w:id="141" w:name="_Toc239321579"/>
       <w:bookmarkEnd w:id="127"/>
       <w:bookmarkEnd w:id="138"/>
       <w:r>
@@ -78741,7 +78741,7 @@
         <w:pStyle w:val="Heading1"/>
       </w:pPr>
       <w:bookmarkStart w:id="142" w:name="phụ-lục"/>
-      <w:bookmarkStart w:id="143" w:name="_Toc239319830"/>
+      <w:bookmarkStart w:id="143" w:name="_Toc239321580"/>
       <w:bookmarkEnd w:id="140"/>
       <w:r>
         <w:t>PH</w:t>
@@ -78765,7 +78765,7 @@
         <w:pStyle w:val="Heading2"/>
       </w:pPr>
       <w:bookmarkStart w:id="144" w:name="phụ-lục-a-cấu-hình-và-siêu-tham-số"/>
-      <w:bookmarkStart w:id="145" w:name="_Toc239319831"/>
+      <w:bookmarkStart w:id="145" w:name="_Toc239321581"/>
       <w:r>
         <w:t>Ph</w:t>
       </w:r>
@@ -80985,7 +80985,7 @@
         <w:pStyle w:val="Heading2"/>
       </w:pPr>
       <w:bookmarkStart w:id="149" w:name="phụ-lục-b-hướng-dẫn-cài-đặt-và-chạy"/>
-      <w:bookmarkStart w:id="150" w:name="_Toc239319832"/>
+      <w:bookmarkStart w:id="150" w:name="_Toc239321582"/>
       <w:bookmarkEnd w:id="144"/>
       <w:bookmarkEnd w:id="148"/>
       <w:r>
@@ -82532,11 +82532,6 @@
       </w:r>
       <w:r>
         <w:t>c.</w:t>
-      </w:r>
-    </w:p>
-    <w:p>
-      <w:r>
-        <w:br w:type="page"/>
       </w:r>
       <w:bookmarkEnd w:id="142"/>
       <w:bookmarkEnd w:id="149"/>
@@ -82559,7 +82554,7 @@
   <w:abstractNum w:abstractNumId="0" w15:restartNumberingAfterBreak="0">
     <w:nsid w:val="0000A990"/>
     <w:multiLevelType w:val="multilevel"/>
-    <w:tmpl w:val="C53E850E"/>
+    <w:tmpl w:val="1A2681D0"/>
     <w:lvl w:ilvl="0">
       <w:numFmt w:val="bullet"/>
       <w:lvlText w:val=" "/>
@@ -82636,7 +82631,7 @@
   <w:abstractNum w:abstractNumId="1" w15:restartNumberingAfterBreak="0">
     <w:nsid w:val="0000A991"/>
     <w:multiLevelType w:val="multilevel"/>
-    <w:tmpl w:val="9BEC5E28"/>
+    <w:tmpl w:val="22987B86"/>
     <w:lvl w:ilvl="0">
       <w:numFmt w:val="bullet"/>
       <w:lvlText w:val=""/>
@@ -82740,7 +82735,7 @@
   <w:abstractNum w:abstractNumId="2" w15:restartNumberingAfterBreak="0">
     <w:nsid w:val="00A99411"/>
     <w:multiLevelType w:val="multilevel"/>
-    <w:tmpl w:val="11C049E0"/>
+    <w:tmpl w:val="58260D92"/>
     <w:lvl w:ilvl="0">
       <w:start w:val="1"/>
       <w:numFmt w:val="decimal"/>
@@ -82823,10 +82818,10 @@
       </w:pPr>
     </w:lvl>
   </w:abstractNum>
-  <w:num w:numId="1" w16cid:durableId="1524637403">
+  <w:num w:numId="1" w16cid:durableId="175004881">
     <w:abstractNumId w:val="0"/>
   </w:num>
-  <w:num w:numId="2" w16cid:durableId="484056210">
+  <w:num w:numId="2" w16cid:durableId="1471170006">
     <w:abstractNumId w:val="2"/>
     <w:lvlOverride w:ilvl="0">
       <w:startOverride w:val="1"/>
@@ -82856,22 +82851,22 @@
       <w:startOverride w:val="1"/>
     </w:lvlOverride>
   </w:num>
-  <w:num w:numId="3" w16cid:durableId="552624234">
+  <w:num w:numId="3" w16cid:durableId="20210991">
     <w:abstractNumId w:val="1"/>
   </w:num>
-  <w:num w:numId="4" w16cid:durableId="190462174">
+  <w:num w:numId="4" w16cid:durableId="1050691987">
     <w:abstractNumId w:val="1"/>
   </w:num>
-  <w:num w:numId="5" w16cid:durableId="706610279">
+  <w:num w:numId="5" w16cid:durableId="1737703971">
     <w:abstractNumId w:val="1"/>
   </w:num>
-  <w:num w:numId="6" w16cid:durableId="1865512353">
+  <w:num w:numId="6" w16cid:durableId="1597202216">
     <w:abstractNumId w:val="1"/>
   </w:num>
-  <w:num w:numId="7" w16cid:durableId="869150454">
+  <w:num w:numId="7" w16cid:durableId="35007844">
     <w:abstractNumId w:val="1"/>
   </w:num>
-  <w:num w:numId="8" w16cid:durableId="935602629">
+  <w:num w:numId="8" w16cid:durableId="1861116492">
     <w:abstractNumId w:val="1"/>
   </w:num>
 </w:numbering>
@@ -84108,7 +84103,7 @@
     <w:next w:val="Normal"/>
     <w:autoRedefine/>
     <w:uiPriority w:val="39"/>
-    <w:rsid w:val="00B21368"/>
+    <w:rsid w:val="005D60A6"/>
     <w:pPr>
       <w:spacing w:after="100"/>
     </w:pPr>
@@ -84119,7 +84114,7 @@
     <w:next w:val="Normal"/>
     <w:autoRedefine/>
     <w:uiPriority w:val="39"/>
-    <w:rsid w:val="00B21368"/>
+    <w:rsid w:val="005D60A6"/>
     <w:pPr>
       <w:spacing w:after="100"/>
       <w:ind w:left="240"/>

</xml_diff>

<commit_message>
fix(mon-hoc): dien GV va du 4 sinh vien nhom mon hoc len bia + slide + README
Trang bia con nguyen cho giu «dien ten giang vien phu trach mon» — theo
thong tin nguoi thuc hien cung cap: GV ThS. Cap Pham Dinh Thang, va nhom
mon hoc gom BON sinh vien (khac nhom DATN 2 nguoi):
  25410004 Pham Nguyen The Chau · 25410006 Nguyen Cong Hau
  25410007 Nguyen Minh Hieu     · 25410013 Pham Cong Thanh

Sua o ba noi: bia quyen (01-front-matter), dong tac gia slide bia (tach
2 dong cho khoi tran), va README nhanh. Dung + xuat lai: PDF 40 trang,
bia du 4 MSSV + GV, 0 placeholder; check_slides 16 slide 0 loi.
</commit_message>
<xml_diff>
--- a/docs/papers/mon-hoc/thesis-full.docx
+++ b/docs/papers/mon-hoc/thesis-full.docx
@@ -148,7 +148,7 @@
         <w:pStyle w:val="Heading1"/>
       </w:pPr>
       <w:bookmarkStart w:id="0" w:name="đồ-án-môn-học"/>
-      <w:bookmarkStart w:id="1" w:name="_Toc239335492"/>
+      <w:bookmarkStart w:id="1" w:name="_Toc239335761"/>
       <w:r>
         <w:t>Đ</w:t>
       </w:r>
@@ -220,7 +220,7 @@
         <w:pStyle w:val="Heading1"/>
       </w:pPr>
       <w:bookmarkStart w:id="4" w:name="Xbe958ce37c6a089ac9bdc99dada4ec5e2c0f7da"/>
-      <w:bookmarkStart w:id="5" w:name="_Toc239335493"/>
+      <w:bookmarkStart w:id="5" w:name="_Toc239335762"/>
       <w:bookmarkEnd w:id="0"/>
       <w:bookmarkEnd w:id="3"/>
       <w:r>
@@ -301,7 +301,7 @@
       </w:tblPr>
       <w:tblGrid>
         <w:gridCol w:w="2233"/>
-        <w:gridCol w:w="3525"/>
+        <w:gridCol w:w="4026"/>
       </w:tblGrid>
       <w:tr>
         <w:trPr>
@@ -403,17 +403,45 @@
                 <w:b/>
                 <w:bCs/>
               </w:rPr>
-              <w:t>m Công Thành</w:t>
-            </w:r>
-            <w:r>
-              <w:t xml:space="preserve"> — MSSV </w:t>
+              <w:t>m Nguy</w:t>
             </w:r>
             <w:r>
               <w:rPr>
                 <w:b/>
                 <w:bCs/>
               </w:rPr>
-              <w:t>25410013</w:t>
+              <w:t>ễ</w:t>
+            </w:r>
+            <w:r>
+              <w:rPr>
+                <w:b/>
+                <w:bCs/>
+              </w:rPr>
+              <w:t>n Th</w:t>
+            </w:r>
+            <w:r>
+              <w:rPr>
+                <w:b/>
+                <w:bCs/>
+              </w:rPr>
+              <w:t>ế</w:t>
+            </w:r>
+            <w:r>
+              <w:rPr>
+                <w:b/>
+                <w:bCs/>
+              </w:rPr>
+              <w:t xml:space="preserve"> Châu</w:t>
+            </w:r>
+            <w:r>
+              <w:t xml:space="preserve"> — MSSV </w:t>
+            </w:r>
+            <w:r>
+              <w:rPr>
+                <w:b/>
+                <w:bCs/>
+              </w:rPr>
+              <w:t>25410004</w:t>
             </w:r>
           </w:p>
         </w:tc>
@@ -456,6 +484,73 @@
                 <w:b/>
                 <w:bCs/>
               </w:rPr>
+              <w:t>n Công H</w:t>
+            </w:r>
+            <w:r>
+              <w:rPr>
+                <w:b/>
+                <w:bCs/>
+              </w:rPr>
+              <w:t>ậ</w:t>
+            </w:r>
+            <w:r>
+              <w:rPr>
+                <w:b/>
+                <w:bCs/>
+              </w:rPr>
+              <w:t>u</w:t>
+            </w:r>
+            <w:r>
+              <w:t xml:space="preserve"> — MSSV </w:t>
+            </w:r>
+            <w:r>
+              <w:rPr>
+                <w:b/>
+                <w:bCs/>
+              </w:rPr>
+              <w:t>25410006</w:t>
+            </w:r>
+          </w:p>
+        </w:tc>
+      </w:tr>
+      <w:tr>
+        <w:tc>
+          <w:tcPr>
+            <w:tcW w:w="0" w:type="auto"/>
+          </w:tcPr>
+          <w:p>
+            <w:pPr>
+              <w:pStyle w:val="Compact"/>
+            </w:pPr>
+          </w:p>
+        </w:tc>
+        <w:tc>
+          <w:tcPr>
+            <w:tcW w:w="0" w:type="auto"/>
+          </w:tcPr>
+          <w:p>
+            <w:pPr>
+              <w:pStyle w:val="Compact"/>
+            </w:pPr>
+            <w:r>
+              <w:rPr>
+                <w:b/>
+                <w:bCs/>
+              </w:rPr>
+              <w:t>Nguy</w:t>
+            </w:r>
+            <w:r>
+              <w:rPr>
+                <w:b/>
+                <w:bCs/>
+              </w:rPr>
+              <w:t>ễ</w:t>
+            </w:r>
+            <w:r>
+              <w:rPr>
+                <w:b/>
+                <w:bCs/>
+              </w:rPr>
               <w:t>n Minh Hi</w:t>
             </w:r>
             <w:r>
@@ -481,6 +576,59 @@
                 <w:bCs/>
               </w:rPr>
               <w:t>25410007</w:t>
+            </w:r>
+          </w:p>
+        </w:tc>
+      </w:tr>
+      <w:tr>
+        <w:tc>
+          <w:tcPr>
+            <w:tcW w:w="0" w:type="auto"/>
+          </w:tcPr>
+          <w:p>
+            <w:pPr>
+              <w:pStyle w:val="Compact"/>
+            </w:pPr>
+          </w:p>
+        </w:tc>
+        <w:tc>
+          <w:tcPr>
+            <w:tcW w:w="0" w:type="auto"/>
+          </w:tcPr>
+          <w:p>
+            <w:pPr>
+              <w:pStyle w:val="Compact"/>
+            </w:pPr>
+            <w:r>
+              <w:rPr>
+                <w:b/>
+                <w:bCs/>
+              </w:rPr>
+              <w:t>Ph</w:t>
+            </w:r>
+            <w:r>
+              <w:rPr>
+                <w:b/>
+                <w:bCs/>
+              </w:rPr>
+              <w:t>ạ</w:t>
+            </w:r>
+            <w:r>
+              <w:rPr>
+                <w:b/>
+                <w:bCs/>
+              </w:rPr>
+              <w:t>m Công Thành</w:t>
+            </w:r>
+            <w:r>
+              <w:t xml:space="preserve"> — MSSV </w:t>
+            </w:r>
+            <w:r>
+              <w:rPr>
+                <w:b/>
+                <w:bCs/>
+              </w:rPr>
+              <w:t>25410013</w:t>
             </w:r>
           </w:p>
         </w:tc>
@@ -602,25 +750,13 @@
               <w:pStyle w:val="Compact"/>
             </w:pPr>
             <w:r>
-              <w:t>«đi</w:t>
-            </w:r>
-            <w:r>
-              <w:t>ề</w:t>
-            </w:r>
-            <w:r>
-              <w:t>n tên gi</w:t>
-            </w:r>
-            <w:r>
-              <w:t>ả</w:t>
-            </w:r>
-            <w:r>
-              <w:t>ng viên ph</w:t>
-            </w:r>
-            <w:r>
-              <w:t>ụ</w:t>
-            </w:r>
-            <w:r>
-              <w:t xml:space="preserve"> trách môn»</w:t>
+              <w:t>ThS. Cáp Ph</w:t>
+            </w:r>
+            <w:r>
+              <w:t>ạ</w:t>
+            </w:r>
+            <w:r>
+              <w:t>m Đình Thăng</w:t>
             </w:r>
           </w:p>
         </w:tc>
@@ -659,7 +795,7 @@
     </w:p>
     <w:p>
       <w:r>
-        <w:pict w14:anchorId="11B4FC1D">
+        <w:pict w14:anchorId="67610572">
           <v:rect id="_x0000_i1025" style="width:0;height:1.5pt" o:hralign="center" o:hrstd="t" o:hr="t"/>
         </w:pict>
       </w:r>
@@ -669,7 +805,7 @@
         <w:pStyle w:val="Heading2"/>
       </w:pPr>
       <w:bookmarkStart w:id="6" w:name="mục-lục"/>
-      <w:bookmarkStart w:id="7" w:name="_Toc239335494"/>
+      <w:bookmarkStart w:id="7" w:name="_Toc239335763"/>
       <w:r>
         <w:t>M</w:t>
       </w:r>
@@ -709,7 +845,7 @@
       <w:r>
         <w:fldChar w:fldCharType="separate"/>
       </w:r>
-      <w:hyperlink w:anchor="_Toc239335492" w:history="1">
+      <w:hyperlink w:anchor="_Toc239335761" w:history="1">
         <w:r>
           <w:rPr>
             <w:rStyle w:val="Hyperlink"/>
@@ -736,7 +872,7 @@
             <w:noProof/>
             <w:webHidden/>
           </w:rPr>
-          <w:instrText xml:space="preserve"> PAGEREF _Toc239335492 \h </w:instrText>
+          <w:instrText xml:space="preserve"> PAGEREF _Toc239335761 \h </w:instrText>
         </w:r>
         <w:r>
           <w:rPr>
@@ -780,7 +916,7 @@
           <w14:ligatures w14:val="standardContextual"/>
         </w:rPr>
       </w:pPr>
-      <w:hyperlink w:anchor="_Toc239335493" w:history="1">
+      <w:hyperlink w:anchor="_Toc239335762" w:history="1">
         <w:r>
           <w:rPr>
             <w:rStyle w:val="Hyperlink"/>
@@ -807,7 +943,7 @@
             <w:noProof/>
             <w:webHidden/>
           </w:rPr>
-          <w:instrText xml:space="preserve"> PAGEREF _Toc239335493 \h </w:instrText>
+          <w:instrText xml:space="preserve"> PAGEREF _Toc239335762 \h </w:instrText>
         </w:r>
         <w:r>
           <w:rPr>
@@ -851,7 +987,7 @@
           <w14:ligatures w14:val="standardContextual"/>
         </w:rPr>
       </w:pPr>
-      <w:hyperlink w:anchor="_Toc239335494" w:history="1">
+      <w:hyperlink w:anchor="_Toc239335763" w:history="1">
         <w:r>
           <w:rPr>
             <w:rStyle w:val="Hyperlink"/>
@@ -878,7 +1014,7 @@
             <w:noProof/>
             <w:webHidden/>
           </w:rPr>
-          <w:instrText xml:space="preserve"> PAGEREF _Toc239335494 \h </w:instrText>
+          <w:instrText xml:space="preserve"> PAGEREF _Toc239335763 \h </w:instrText>
         </w:r>
         <w:r>
           <w:rPr>
@@ -922,7 +1058,7 @@
           <w14:ligatures w14:val="standardContextual"/>
         </w:rPr>
       </w:pPr>
-      <w:hyperlink w:anchor="_Toc239335495" w:history="1">
+      <w:hyperlink w:anchor="_Toc239335764" w:history="1">
         <w:r>
           <w:rPr>
             <w:rStyle w:val="Hyperlink"/>
@@ -949,7 +1085,7 @@
             <w:noProof/>
             <w:webHidden/>
           </w:rPr>
-          <w:instrText xml:space="preserve"> PAGEREF _Toc239335495 \h </w:instrText>
+          <w:instrText xml:space="preserve"> PAGEREF _Toc239335764 \h </w:instrText>
         </w:r>
         <w:r>
           <w:rPr>
@@ -993,7 +1129,7 @@
           <w14:ligatures w14:val="standardContextual"/>
         </w:rPr>
       </w:pPr>
-      <w:hyperlink w:anchor="_Toc239335496" w:history="1">
+      <w:hyperlink w:anchor="_Toc239335765" w:history="1">
         <w:r>
           <w:rPr>
             <w:rStyle w:val="Hyperlink"/>
@@ -1020,7 +1156,7 @@
             <w:noProof/>
             <w:webHidden/>
           </w:rPr>
-          <w:instrText xml:space="preserve"> PAGEREF _Toc239335496 \h </w:instrText>
+          <w:instrText xml:space="preserve"> PAGEREF _Toc239335765 \h </w:instrText>
         </w:r>
         <w:r>
           <w:rPr>
@@ -1064,7 +1200,7 @@
           <w14:ligatures w14:val="standardContextual"/>
         </w:rPr>
       </w:pPr>
-      <w:hyperlink w:anchor="_Toc239335497" w:history="1">
+      <w:hyperlink w:anchor="_Toc239335766" w:history="1">
         <w:r>
           <w:rPr>
             <w:rStyle w:val="Hyperlink"/>
@@ -1091,7 +1227,7 @@
             <w:noProof/>
             <w:webHidden/>
           </w:rPr>
-          <w:instrText xml:space="preserve"> PAGEREF _Toc239335497 \h </w:instrText>
+          <w:instrText xml:space="preserve"> PAGEREF _Toc239335766 \h </w:instrText>
         </w:r>
         <w:r>
           <w:rPr>
@@ -1135,7 +1271,7 @@
           <w14:ligatures w14:val="standardContextual"/>
         </w:rPr>
       </w:pPr>
-      <w:hyperlink w:anchor="_Toc239335498" w:history="1">
+      <w:hyperlink w:anchor="_Toc239335767" w:history="1">
         <w:r>
           <w:rPr>
             <w:rStyle w:val="Hyperlink"/>
@@ -1162,7 +1298,7 @@
             <w:noProof/>
             <w:webHidden/>
           </w:rPr>
-          <w:instrText xml:space="preserve"> PAGEREF _Toc239335498 \h </w:instrText>
+          <w:instrText xml:space="preserve"> PAGEREF _Toc239335767 \h </w:instrText>
         </w:r>
         <w:r>
           <w:rPr>
@@ -1206,7 +1342,7 @@
           <w14:ligatures w14:val="standardContextual"/>
         </w:rPr>
       </w:pPr>
-      <w:hyperlink w:anchor="_Toc239335499" w:history="1">
+      <w:hyperlink w:anchor="_Toc239335768" w:history="1">
         <w:r>
           <w:rPr>
             <w:rStyle w:val="Hyperlink"/>
@@ -1233,7 +1369,7 @@
             <w:noProof/>
             <w:webHidden/>
           </w:rPr>
-          <w:instrText xml:space="preserve"> PAGEREF _Toc239335499 \h </w:instrText>
+          <w:instrText xml:space="preserve"> PAGEREF _Toc239335768 \h </w:instrText>
         </w:r>
         <w:r>
           <w:rPr>
@@ -1277,7 +1413,7 @@
           <w14:ligatures w14:val="standardContextual"/>
         </w:rPr>
       </w:pPr>
-      <w:hyperlink w:anchor="_Toc239335500" w:history="1">
+      <w:hyperlink w:anchor="_Toc239335769" w:history="1">
         <w:r>
           <w:rPr>
             <w:rStyle w:val="Hyperlink"/>
@@ -1304,7 +1440,7 @@
             <w:noProof/>
             <w:webHidden/>
           </w:rPr>
-          <w:instrText xml:space="preserve"> PAGEREF _Toc239335500 \h </w:instrText>
+          <w:instrText xml:space="preserve"> PAGEREF _Toc239335769 \h </w:instrText>
         </w:r>
         <w:r>
           <w:rPr>
@@ -1348,7 +1484,7 @@
           <w14:ligatures w14:val="standardContextual"/>
         </w:rPr>
       </w:pPr>
-      <w:hyperlink w:anchor="_Toc239335501" w:history="1">
+      <w:hyperlink w:anchor="_Toc239335770" w:history="1">
         <w:r>
           <w:rPr>
             <w:rStyle w:val="Hyperlink"/>
@@ -1375,7 +1511,7 @@
             <w:noProof/>
             <w:webHidden/>
           </w:rPr>
-          <w:instrText xml:space="preserve"> PAGEREF _Toc239335501 \h </w:instrText>
+          <w:instrText xml:space="preserve"> PAGEREF _Toc239335770 \h </w:instrText>
         </w:r>
         <w:r>
           <w:rPr>
@@ -1419,7 +1555,7 @@
           <w14:ligatures w14:val="standardContextual"/>
         </w:rPr>
       </w:pPr>
-      <w:hyperlink w:anchor="_Toc239335502" w:history="1">
+      <w:hyperlink w:anchor="_Toc239335771" w:history="1">
         <w:r>
           <w:rPr>
             <w:rStyle w:val="Hyperlink"/>
@@ -1446,7 +1582,7 @@
             <w:noProof/>
             <w:webHidden/>
           </w:rPr>
-          <w:instrText xml:space="preserve"> PAGEREF _Toc239335502 \h </w:instrText>
+          <w:instrText xml:space="preserve"> PAGEREF _Toc239335771 \h </w:instrText>
         </w:r>
         <w:r>
           <w:rPr>
@@ -1490,7 +1626,7 @@
           <w14:ligatures w14:val="standardContextual"/>
         </w:rPr>
       </w:pPr>
-      <w:hyperlink w:anchor="_Toc239335503" w:history="1">
+      <w:hyperlink w:anchor="_Toc239335772" w:history="1">
         <w:r>
           <w:rPr>
             <w:rStyle w:val="Hyperlink"/>
@@ -1517,7 +1653,7 @@
             <w:noProof/>
             <w:webHidden/>
           </w:rPr>
-          <w:instrText xml:space="preserve"> PAGEREF _Toc239335503 \h </w:instrText>
+          <w:instrText xml:space="preserve"> PAGEREF _Toc239335772 \h </w:instrText>
         </w:r>
         <w:r>
           <w:rPr>
@@ -1561,7 +1697,7 @@
           <w14:ligatures w14:val="standardContextual"/>
         </w:rPr>
       </w:pPr>
-      <w:hyperlink w:anchor="_Toc239335504" w:history="1">
+      <w:hyperlink w:anchor="_Toc239335773" w:history="1">
         <w:r>
           <w:rPr>
             <w:rStyle w:val="Hyperlink"/>
@@ -1588,7 +1724,7 @@
             <w:noProof/>
             <w:webHidden/>
           </w:rPr>
-          <w:instrText xml:space="preserve"> PAGEREF _Toc239335504 \h </w:instrText>
+          <w:instrText xml:space="preserve"> PAGEREF _Toc239335773 \h </w:instrText>
         </w:r>
         <w:r>
           <w:rPr>
@@ -1632,7 +1768,7 @@
           <w14:ligatures w14:val="standardContextual"/>
         </w:rPr>
       </w:pPr>
-      <w:hyperlink w:anchor="_Toc239335505" w:history="1">
+      <w:hyperlink w:anchor="_Toc239335774" w:history="1">
         <w:r>
           <w:rPr>
             <w:rStyle w:val="Hyperlink"/>
@@ -1659,7 +1795,7 @@
             <w:noProof/>
             <w:webHidden/>
           </w:rPr>
-          <w:instrText xml:space="preserve"> PAGEREF _Toc239335505 \h </w:instrText>
+          <w:instrText xml:space="preserve"> PAGEREF _Toc239335774 \h </w:instrText>
         </w:r>
         <w:r>
           <w:rPr>
@@ -1703,7 +1839,7 @@
           <w14:ligatures w14:val="standardContextual"/>
         </w:rPr>
       </w:pPr>
-      <w:hyperlink w:anchor="_Toc239335506" w:history="1">
+      <w:hyperlink w:anchor="_Toc239335775" w:history="1">
         <w:r>
           <w:rPr>
             <w:rStyle w:val="Hyperlink"/>
@@ -1730,7 +1866,7 @@
             <w:noProof/>
             <w:webHidden/>
           </w:rPr>
-          <w:instrText xml:space="preserve"> PAGEREF _Toc239335506 \h </w:instrText>
+          <w:instrText xml:space="preserve"> PAGEREF _Toc239335775 \h </w:instrText>
         </w:r>
         <w:r>
           <w:rPr>
@@ -1774,7 +1910,7 @@
           <w14:ligatures w14:val="standardContextual"/>
         </w:rPr>
       </w:pPr>
-      <w:hyperlink w:anchor="_Toc239335507" w:history="1">
+      <w:hyperlink w:anchor="_Toc239335776" w:history="1">
         <w:r>
           <w:rPr>
             <w:rStyle w:val="Hyperlink"/>
@@ -1801,7 +1937,7 @@
             <w:noProof/>
             <w:webHidden/>
           </w:rPr>
-          <w:instrText xml:space="preserve"> PAGEREF _Toc239335507 \h </w:instrText>
+          <w:instrText xml:space="preserve"> PAGEREF _Toc239335776 \h </w:instrText>
         </w:r>
         <w:r>
           <w:rPr>
@@ -1845,7 +1981,7 @@
           <w14:ligatures w14:val="standardContextual"/>
         </w:rPr>
       </w:pPr>
-      <w:hyperlink w:anchor="_Toc239335508" w:history="1">
+      <w:hyperlink w:anchor="_Toc239335777" w:history="1">
         <w:r>
           <w:rPr>
             <w:rStyle w:val="Hyperlink"/>
@@ -1872,7 +2008,7 @@
             <w:noProof/>
             <w:webHidden/>
           </w:rPr>
-          <w:instrText xml:space="preserve"> PAGEREF _Toc239335508 \h </w:instrText>
+          <w:instrText xml:space="preserve"> PAGEREF _Toc239335777 \h </w:instrText>
         </w:r>
         <w:r>
           <w:rPr>
@@ -1916,7 +2052,7 @@
           <w14:ligatures w14:val="standardContextual"/>
         </w:rPr>
       </w:pPr>
-      <w:hyperlink w:anchor="_Toc239335509" w:history="1">
+      <w:hyperlink w:anchor="_Toc239335778" w:history="1">
         <w:r>
           <w:rPr>
             <w:rStyle w:val="Hyperlink"/>
@@ -1943,7 +2079,7 @@
             <w:noProof/>
             <w:webHidden/>
           </w:rPr>
-          <w:instrText xml:space="preserve"> PAGEREF _Toc239335509 \h </w:instrText>
+          <w:instrText xml:space="preserve"> PAGEREF _Toc239335778 \h </w:instrText>
         </w:r>
         <w:r>
           <w:rPr>
@@ -1987,7 +2123,7 @@
           <w14:ligatures w14:val="standardContextual"/>
         </w:rPr>
       </w:pPr>
-      <w:hyperlink w:anchor="_Toc239335510" w:history="1">
+      <w:hyperlink w:anchor="_Toc239335779" w:history="1">
         <w:r>
           <w:rPr>
             <w:rStyle w:val="Hyperlink"/>
@@ -2014,7 +2150,7 @@
             <w:noProof/>
             <w:webHidden/>
           </w:rPr>
-          <w:instrText xml:space="preserve"> PAGEREF _Toc239335510 \h </w:instrText>
+          <w:instrText xml:space="preserve"> PAGEREF _Toc239335779 \h </w:instrText>
         </w:r>
         <w:r>
           <w:rPr>
@@ -2058,7 +2194,7 @@
           <w14:ligatures w14:val="standardContextual"/>
         </w:rPr>
       </w:pPr>
-      <w:hyperlink w:anchor="_Toc239335511" w:history="1">
+      <w:hyperlink w:anchor="_Toc239335780" w:history="1">
         <w:r>
           <w:rPr>
             <w:rStyle w:val="Hyperlink"/>
@@ -2085,7 +2221,7 @@
             <w:noProof/>
             <w:webHidden/>
           </w:rPr>
-          <w:instrText xml:space="preserve"> PAGEREF _Toc239335511 \h </w:instrText>
+          <w:instrText xml:space="preserve"> PAGEREF _Toc239335780 \h </w:instrText>
         </w:r>
         <w:r>
           <w:rPr>
@@ -2129,7 +2265,7 @@
           <w14:ligatures w14:val="standardContextual"/>
         </w:rPr>
       </w:pPr>
-      <w:hyperlink w:anchor="_Toc239335512" w:history="1">
+      <w:hyperlink w:anchor="_Toc239335781" w:history="1">
         <w:r>
           <w:rPr>
             <w:rStyle w:val="Hyperlink"/>
@@ -2156,7 +2292,7 @@
             <w:noProof/>
             <w:webHidden/>
           </w:rPr>
-          <w:instrText xml:space="preserve"> PAGEREF _Toc239335512 \h </w:instrText>
+          <w:instrText xml:space="preserve"> PAGEREF _Toc239335781 \h </w:instrText>
         </w:r>
         <w:r>
           <w:rPr>
@@ -2200,7 +2336,7 @@
           <w14:ligatures w14:val="standardContextual"/>
         </w:rPr>
       </w:pPr>
-      <w:hyperlink w:anchor="_Toc239335513" w:history="1">
+      <w:hyperlink w:anchor="_Toc239335782" w:history="1">
         <w:r>
           <w:rPr>
             <w:rStyle w:val="Hyperlink"/>
@@ -2227,7 +2363,7 @@
             <w:noProof/>
             <w:webHidden/>
           </w:rPr>
-          <w:instrText xml:space="preserve"> PAGEREF _Toc239335513 \h </w:instrText>
+          <w:instrText xml:space="preserve"> PAGEREF _Toc239335782 \h </w:instrText>
         </w:r>
         <w:r>
           <w:rPr>
@@ -2271,7 +2407,7 @@
           <w14:ligatures w14:val="standardContextual"/>
         </w:rPr>
       </w:pPr>
-      <w:hyperlink w:anchor="_Toc239335514" w:history="1">
+      <w:hyperlink w:anchor="_Toc239335783" w:history="1">
         <w:r>
           <w:rPr>
             <w:rStyle w:val="Hyperlink"/>
@@ -2298,7 +2434,7 @@
             <w:noProof/>
             <w:webHidden/>
           </w:rPr>
-          <w:instrText xml:space="preserve"> PAGEREF _Toc239335514 \h </w:instrText>
+          <w:instrText xml:space="preserve"> PAGEREF _Toc239335783 \h </w:instrText>
         </w:r>
         <w:r>
           <w:rPr>
@@ -2342,7 +2478,7 @@
           <w14:ligatures w14:val="standardContextual"/>
         </w:rPr>
       </w:pPr>
-      <w:hyperlink w:anchor="_Toc239335515" w:history="1">
+      <w:hyperlink w:anchor="_Toc239335784" w:history="1">
         <w:r>
           <w:rPr>
             <w:rStyle w:val="Hyperlink"/>
@@ -2369,7 +2505,7 @@
             <w:noProof/>
             <w:webHidden/>
           </w:rPr>
-          <w:instrText xml:space="preserve"> PAGEREF _Toc239335515 \h </w:instrText>
+          <w:instrText xml:space="preserve"> PAGEREF _Toc239335784 \h </w:instrText>
         </w:r>
         <w:r>
           <w:rPr>
@@ -2413,7 +2549,7 @@
           <w14:ligatures w14:val="standardContextual"/>
         </w:rPr>
       </w:pPr>
-      <w:hyperlink w:anchor="_Toc239335516" w:history="1">
+      <w:hyperlink w:anchor="_Toc239335785" w:history="1">
         <w:r>
           <w:rPr>
             <w:rStyle w:val="Hyperlink"/>
@@ -2440,7 +2576,7 @@
             <w:noProof/>
             <w:webHidden/>
           </w:rPr>
-          <w:instrText xml:space="preserve"> PAGEREF _Toc239335516 \h </w:instrText>
+          <w:instrText xml:space="preserve"> PAGEREF _Toc239335785 \h </w:instrText>
         </w:r>
         <w:r>
           <w:rPr>
@@ -2484,7 +2620,7 @@
           <w14:ligatures w14:val="standardContextual"/>
         </w:rPr>
       </w:pPr>
-      <w:hyperlink w:anchor="_Toc239335517" w:history="1">
+      <w:hyperlink w:anchor="_Toc239335786" w:history="1">
         <w:r>
           <w:rPr>
             <w:rStyle w:val="Hyperlink"/>
@@ -2511,7 +2647,7 @@
             <w:noProof/>
             <w:webHidden/>
           </w:rPr>
-          <w:instrText xml:space="preserve"> PAGEREF _Toc239335517 \h </w:instrText>
+          <w:instrText xml:space="preserve"> PAGEREF _Toc239335786 \h </w:instrText>
         </w:r>
         <w:r>
           <w:rPr>
@@ -2555,7 +2691,7 @@
           <w14:ligatures w14:val="standardContextual"/>
         </w:rPr>
       </w:pPr>
-      <w:hyperlink w:anchor="_Toc239335518" w:history="1">
+      <w:hyperlink w:anchor="_Toc239335787" w:history="1">
         <w:r>
           <w:rPr>
             <w:rStyle w:val="Hyperlink"/>
@@ -2582,7 +2718,7 @@
             <w:noProof/>
             <w:webHidden/>
           </w:rPr>
-          <w:instrText xml:space="preserve"> PAGEREF _Toc239335518 \h </w:instrText>
+          <w:instrText xml:space="preserve"> PAGEREF _Toc239335787 \h </w:instrText>
         </w:r>
         <w:r>
           <w:rPr>
@@ -2626,7 +2762,7 @@
           <w14:ligatures w14:val="standardContextual"/>
         </w:rPr>
       </w:pPr>
-      <w:hyperlink w:anchor="_Toc239335519" w:history="1">
+      <w:hyperlink w:anchor="_Toc239335788" w:history="1">
         <w:r>
           <w:rPr>
             <w:rStyle w:val="Hyperlink"/>
@@ -2653,7 +2789,7 @@
             <w:noProof/>
             <w:webHidden/>
           </w:rPr>
-          <w:instrText xml:space="preserve"> PAGEREF _Toc239335519 \h </w:instrText>
+          <w:instrText xml:space="preserve"> PAGEREF _Toc239335788 \h </w:instrText>
         </w:r>
         <w:r>
           <w:rPr>
@@ -2697,7 +2833,7 @@
           <w14:ligatures w14:val="standardContextual"/>
         </w:rPr>
       </w:pPr>
-      <w:hyperlink w:anchor="_Toc239335520" w:history="1">
+      <w:hyperlink w:anchor="_Toc239335789" w:history="1">
         <w:r>
           <w:rPr>
             <w:rStyle w:val="Hyperlink"/>
@@ -2724,7 +2860,7 @@
             <w:noProof/>
             <w:webHidden/>
           </w:rPr>
-          <w:instrText xml:space="preserve"> PAGEREF _Toc239335520 \h </w:instrText>
+          <w:instrText xml:space="preserve"> PAGEREF _Toc239335789 \h </w:instrText>
         </w:r>
         <w:r>
           <w:rPr>
@@ -2768,7 +2904,7 @@
           <w14:ligatures w14:val="standardContextual"/>
         </w:rPr>
       </w:pPr>
-      <w:hyperlink w:anchor="_Toc239335521" w:history="1">
+      <w:hyperlink w:anchor="_Toc239335790" w:history="1">
         <w:r>
           <w:rPr>
             <w:rStyle w:val="Hyperlink"/>
@@ -2795,7 +2931,7 @@
             <w:noProof/>
             <w:webHidden/>
           </w:rPr>
-          <w:instrText xml:space="preserve"> PAGEREF _Toc239335521 \h </w:instrText>
+          <w:instrText xml:space="preserve"> PAGEREF _Toc239335790 \h </w:instrText>
         </w:r>
         <w:r>
           <w:rPr>
@@ -2839,7 +2975,7 @@
           <w14:ligatures w14:val="standardContextual"/>
         </w:rPr>
       </w:pPr>
-      <w:hyperlink w:anchor="_Toc239335522" w:history="1">
+      <w:hyperlink w:anchor="_Toc239335791" w:history="1">
         <w:r>
           <w:rPr>
             <w:rStyle w:val="Hyperlink"/>
@@ -2866,7 +3002,7 @@
             <w:noProof/>
             <w:webHidden/>
           </w:rPr>
-          <w:instrText xml:space="preserve"> PAGEREF _Toc239335522 \h </w:instrText>
+          <w:instrText xml:space="preserve"> PAGEREF _Toc239335791 \h </w:instrText>
         </w:r>
         <w:r>
           <w:rPr>
@@ -2910,7 +3046,7 @@
           <w14:ligatures w14:val="standardContextual"/>
         </w:rPr>
       </w:pPr>
-      <w:hyperlink w:anchor="_Toc239335523" w:history="1">
+      <w:hyperlink w:anchor="_Toc239335792" w:history="1">
         <w:r>
           <w:rPr>
             <w:rStyle w:val="Hyperlink"/>
@@ -2937,7 +3073,7 @@
             <w:noProof/>
             <w:webHidden/>
           </w:rPr>
-          <w:instrText xml:space="preserve"> PAGEREF _Toc239335523 \h </w:instrText>
+          <w:instrText xml:space="preserve"> PAGEREF _Toc239335792 \h </w:instrText>
         </w:r>
         <w:r>
           <w:rPr>
@@ -2981,7 +3117,7 @@
           <w14:ligatures w14:val="standardContextual"/>
         </w:rPr>
       </w:pPr>
-      <w:hyperlink w:anchor="_Toc239335524" w:history="1">
+      <w:hyperlink w:anchor="_Toc239335793" w:history="1">
         <w:r>
           <w:rPr>
             <w:rStyle w:val="Hyperlink"/>
@@ -3008,7 +3144,7 @@
             <w:noProof/>
             <w:webHidden/>
           </w:rPr>
-          <w:instrText xml:space="preserve"> PAGEREF _Toc239335524 \h </w:instrText>
+          <w:instrText xml:space="preserve"> PAGEREF _Toc239335793 \h </w:instrText>
         </w:r>
         <w:r>
           <w:rPr>
@@ -3052,7 +3188,7 @@
           <w14:ligatures w14:val="standardContextual"/>
         </w:rPr>
       </w:pPr>
-      <w:hyperlink w:anchor="_Toc239335525" w:history="1">
+      <w:hyperlink w:anchor="_Toc239335794" w:history="1">
         <w:r>
           <w:rPr>
             <w:rStyle w:val="Hyperlink"/>
@@ -3079,7 +3215,7 @@
             <w:noProof/>
             <w:webHidden/>
           </w:rPr>
-          <w:instrText xml:space="preserve"> PAGEREF _Toc239335525 \h </w:instrText>
+          <w:instrText xml:space="preserve"> PAGEREF _Toc239335794 \h </w:instrText>
         </w:r>
         <w:r>
           <w:rPr>
@@ -3123,7 +3259,7 @@
           <w14:ligatures w14:val="standardContextual"/>
         </w:rPr>
       </w:pPr>
-      <w:hyperlink w:anchor="_Toc239335526" w:history="1">
+      <w:hyperlink w:anchor="_Toc239335795" w:history="1">
         <w:r>
           <w:rPr>
             <w:rStyle w:val="Hyperlink"/>
@@ -3150,7 +3286,7 @@
             <w:noProof/>
             <w:webHidden/>
           </w:rPr>
-          <w:instrText xml:space="preserve"> PAGEREF _Toc239335526 \h </w:instrText>
+          <w:instrText xml:space="preserve"> PAGEREF _Toc239335795 \h </w:instrText>
         </w:r>
         <w:r>
           <w:rPr>
@@ -3194,7 +3330,7 @@
           <w14:ligatures w14:val="standardContextual"/>
         </w:rPr>
       </w:pPr>
-      <w:hyperlink w:anchor="_Toc239335527" w:history="1">
+      <w:hyperlink w:anchor="_Toc239335796" w:history="1">
         <w:r>
           <w:rPr>
             <w:rStyle w:val="Hyperlink"/>
@@ -3221,7 +3357,7 @@
             <w:noProof/>
             <w:webHidden/>
           </w:rPr>
-          <w:instrText xml:space="preserve"> PAGEREF _Toc239335527 \h </w:instrText>
+          <w:instrText xml:space="preserve"> PAGEREF _Toc239335796 \h </w:instrText>
         </w:r>
         <w:r>
           <w:rPr>
@@ -3265,7 +3401,7 @@
           <w14:ligatures w14:val="standardContextual"/>
         </w:rPr>
       </w:pPr>
-      <w:hyperlink w:anchor="_Toc239335528" w:history="1">
+      <w:hyperlink w:anchor="_Toc239335797" w:history="1">
         <w:r>
           <w:rPr>
             <w:rStyle w:val="Hyperlink"/>
@@ -3292,7 +3428,7 @@
             <w:noProof/>
             <w:webHidden/>
           </w:rPr>
-          <w:instrText xml:space="preserve"> PAGEREF _Toc239335528 \h </w:instrText>
+          <w:instrText xml:space="preserve"> PAGEREF _Toc239335797 \h </w:instrText>
         </w:r>
         <w:r>
           <w:rPr>
@@ -3338,7 +3474,7 @@
         <w:pStyle w:val="Heading1"/>
       </w:pPr>
       <w:bookmarkStart w:id="8" w:name="chương-1-giới-thiệu"/>
-      <w:bookmarkStart w:id="9" w:name="_Toc239335495"/>
+      <w:bookmarkStart w:id="9" w:name="_Toc239335764"/>
       <w:bookmarkEnd w:id="4"/>
       <w:bookmarkEnd w:id="6"/>
       <w:r>
@@ -3363,7 +3499,7 @@
         <w:pStyle w:val="Heading2"/>
       </w:pPr>
       <w:bookmarkStart w:id="10" w:name="X7d99df2d9d0c5141050eb9941026463f4c8ea2b"/>
-      <w:bookmarkStart w:id="11" w:name="_Toc239335496"/>
+      <w:bookmarkStart w:id="11" w:name="_Toc239335765"/>
       <w:r>
         <w:t>1.1. Đ</w:t>
       </w:r>
@@ -5213,7 +5349,7 @@
         <w:pStyle w:val="Heading2"/>
       </w:pPr>
       <w:bookmarkStart w:id="12" w:name="X60021b7b958505251ec70bd32e2bac9f8a0361c"/>
-      <w:bookmarkStart w:id="13" w:name="_Toc239335497"/>
+      <w:bookmarkStart w:id="13" w:name="_Toc239335766"/>
       <w:bookmarkEnd w:id="10"/>
       <w:r>
         <w:t>1.2. M</w:t>
@@ -7159,7 +7295,7 @@
         <w:pStyle w:val="Heading2"/>
       </w:pPr>
       <w:bookmarkStart w:id="17" w:name="X03724c88a1b7da9b434cf0a8db5356690a4bb71"/>
-      <w:bookmarkStart w:id="18" w:name="_Toc239335498"/>
+      <w:bookmarkStart w:id="18" w:name="_Toc239335767"/>
       <w:bookmarkEnd w:id="12"/>
       <w:bookmarkEnd w:id="16"/>
       <w:r>
@@ -8964,7 +9100,7 @@
         <w:pStyle w:val="Heading1"/>
       </w:pPr>
       <w:bookmarkStart w:id="20" w:name="chương-2-cơ-sở-lý-thuyết"/>
-      <w:bookmarkStart w:id="21" w:name="_Toc239335499"/>
+      <w:bookmarkStart w:id="21" w:name="_Toc239335768"/>
       <w:bookmarkEnd w:id="8"/>
       <w:bookmarkEnd w:id="17"/>
       <w:r>
@@ -9261,7 +9397,7 @@
         <w:pStyle w:val="Heading2"/>
       </w:pPr>
       <w:bookmarkStart w:id="22" w:name="X2256001523e16d112c59df938522f140b8b988e"/>
-      <w:bookmarkStart w:id="23" w:name="_Toc239335500"/>
+      <w:bookmarkStart w:id="23" w:name="_Toc239335769"/>
       <w:r>
         <w:t>2.1. Quy chu</w:t>
       </w:r>
@@ -13940,7 +14076,7 @@
         <w:pStyle w:val="Heading2"/>
       </w:pPr>
       <w:bookmarkStart w:id="30" w:name="Xb21b4f0690a73e92e2a35192cb39315a0956521"/>
-      <w:bookmarkStart w:id="31" w:name="_Toc239335501"/>
+      <w:bookmarkStart w:id="31" w:name="_Toc239335770"/>
       <w:bookmarkEnd w:id="22"/>
       <w:bookmarkEnd w:id="28"/>
       <w:r>
@@ -19180,7 +19316,7 @@
         <w:pStyle w:val="Heading2"/>
       </w:pPr>
       <w:bookmarkStart w:id="38" w:name="X8ff52f1334e3f0e382caf7ffa1b7096a981291c"/>
-      <w:bookmarkStart w:id="39" w:name="_Toc239335502"/>
+      <w:bookmarkStart w:id="39" w:name="_Toc239335771"/>
       <w:bookmarkEnd w:id="30"/>
       <w:bookmarkEnd w:id="37"/>
       <w:r>
@@ -19459,7 +19595,7 @@
           <w:noProof/>
         </w:rPr>
         <w:drawing>
-          <wp:inline distT="0" distB="0" distL="0" distR="0" wp14:anchorId="67389D67" wp14:editId="01FB7374">
+          <wp:inline distT="0" distB="0" distL="0" distR="0" wp14:anchorId="101ADDEE" wp14:editId="71C09C12">
             <wp:extent cx="5334000" cy="1435553"/>
             <wp:effectExtent l="0" t="0" r="0" b="0"/>
             <wp:docPr id="37" name="Picture"/>
@@ -20921,7 +21057,7 @@
         <w:pStyle w:val="Heading2"/>
       </w:pPr>
       <w:bookmarkStart w:id="43" w:name="X1a77f36e16d4ad267b00eabe7cf793e1dbe08e9"/>
-      <w:bookmarkStart w:id="44" w:name="_Toc239335503"/>
+      <w:bookmarkStart w:id="44" w:name="_Toc239335772"/>
       <w:bookmarkEnd w:id="38"/>
       <w:bookmarkEnd w:id="42"/>
       <w:r>
@@ -22091,7 +22227,7 @@
           <w:noProof/>
         </w:rPr>
         <w:drawing>
-          <wp:inline distT="0" distB="0" distL="0" distR="0" wp14:anchorId="2688E65C" wp14:editId="6CFA1A42">
+          <wp:inline distT="0" distB="0" distL="0" distR="0" wp14:anchorId="0530499E" wp14:editId="2884D53E">
             <wp:extent cx="5334000" cy="2884362"/>
             <wp:effectExtent l="0" t="0" r="0" b="0"/>
             <wp:docPr id="44" name="Picture"/>
@@ -22357,7 +22493,7 @@
           <w:noProof/>
         </w:rPr>
         <w:drawing>
-          <wp:inline distT="0" distB="0" distL="0" distR="0" wp14:anchorId="51CE47B8" wp14:editId="71A22D7D">
+          <wp:inline distT="0" distB="0" distL="0" distR="0" wp14:anchorId="0AF570C3" wp14:editId="04F39607">
             <wp:extent cx="5334000" cy="632732"/>
             <wp:effectExtent l="0" t="0" r="0" b="0"/>
             <wp:docPr id="49" name="Picture"/>
@@ -24260,7 +24396,7 @@
         <w:pStyle w:val="Heading1"/>
       </w:pPr>
       <w:bookmarkStart w:id="50" w:name="chương-3-thiết-kế-và-cài-đặt"/>
-      <w:bookmarkStart w:id="51" w:name="_Toc239335504"/>
+      <w:bookmarkStart w:id="51" w:name="_Toc239335773"/>
       <w:bookmarkEnd w:id="20"/>
       <w:bookmarkEnd w:id="43"/>
       <w:bookmarkEnd w:id="49"/>
@@ -24292,7 +24428,7 @@
         <w:pStyle w:val="Heading2"/>
       </w:pPr>
       <w:bookmarkStart w:id="52" w:name="X21a22cc9b66dca004f2960f37df13c53a04e97b"/>
-      <w:bookmarkStart w:id="53" w:name="_Toc239335505"/>
+      <w:bookmarkStart w:id="53" w:name="_Toc239335774"/>
       <w:r>
         <w:t>3.1. Ki</w:t>
       </w:r>
@@ -24384,7 +24520,7 @@
           <w:noProof/>
         </w:rPr>
         <w:drawing>
-          <wp:inline distT="0" distB="0" distL="0" distR="0" wp14:anchorId="75B817D5" wp14:editId="3277374C">
+          <wp:inline distT="0" distB="0" distL="0" distR="0" wp14:anchorId="0FCF2BF7" wp14:editId="19D656A9">
             <wp:extent cx="5334000" cy="401410"/>
             <wp:effectExtent l="0" t="0" r="0" b="0"/>
             <wp:docPr id="57" name="Picture"/>
@@ -26053,7 +26189,7 @@
         <w:pStyle w:val="Heading2"/>
       </w:pPr>
       <w:bookmarkStart w:id="55" w:name="X1f307d8f8c73bce8db8683c986faea6c8ea66a3"/>
-      <w:bookmarkStart w:id="56" w:name="_Toc239335506"/>
+      <w:bookmarkStart w:id="56" w:name="_Toc239335775"/>
       <w:bookmarkEnd w:id="52"/>
       <w:r>
         <w:t>3.2. Xây d</w:t>
@@ -26120,7 +26256,7 @@
           <w:noProof/>
         </w:rPr>
         <w:drawing>
-          <wp:inline distT="0" distB="0" distL="0" distR="0" wp14:anchorId="22912E43" wp14:editId="36A8770A">
+          <wp:inline distT="0" distB="0" distL="0" distR="0" wp14:anchorId="4EC74026" wp14:editId="4CF4D8D5">
             <wp:extent cx="5334000" cy="802821"/>
             <wp:effectExtent l="0" t="0" r="0" b="0"/>
             <wp:docPr id="62" name="Picture"/>
@@ -30232,7 +30368,7 @@
         <w:pStyle w:val="Heading2"/>
       </w:pPr>
       <w:bookmarkStart w:id="62" w:name="X6a397cb1739f1ec0a8c9714808f79a5ce1fbf6f"/>
-      <w:bookmarkStart w:id="63" w:name="_Toc239335507"/>
+      <w:bookmarkStart w:id="63" w:name="_Toc239335776"/>
       <w:bookmarkEnd w:id="55"/>
       <w:bookmarkEnd w:id="61"/>
       <w:r>
@@ -31798,7 +31934,7 @@
         <w:pStyle w:val="Heading2"/>
       </w:pPr>
       <w:bookmarkStart w:id="65" w:name="X9c2c9b365086d10c999a46e4942f14d73b6baa5"/>
-      <w:bookmarkStart w:id="66" w:name="_Toc239335508"/>
+      <w:bookmarkStart w:id="66" w:name="_Toc239335777"/>
       <w:bookmarkEnd w:id="62"/>
       <w:r>
         <w:t>3.4. Kh</w:t>
@@ -32582,7 +32718,7 @@
           <w:noProof/>
         </w:rPr>
         <w:drawing>
-          <wp:inline distT="0" distB="0" distL="0" distR="0" wp14:anchorId="77EB8509" wp14:editId="215B9246">
+          <wp:inline distT="0" distB="0" distL="0" distR="0" wp14:anchorId="682F33DA" wp14:editId="75E50F2E">
             <wp:extent cx="5334000" cy="8969712"/>
             <wp:effectExtent l="0" t="0" r="0" b="0"/>
             <wp:docPr id="73" name="Picture"/>
@@ -38531,7 +38667,7 @@
         <w:pStyle w:val="Heading2"/>
       </w:pPr>
       <w:bookmarkStart w:id="75" w:name="Xb17945b5d9374e5087c2c96ace1685ff00e2e22"/>
-      <w:bookmarkStart w:id="76" w:name="_Toc239335509"/>
+      <w:bookmarkStart w:id="76" w:name="_Toc239335778"/>
       <w:bookmarkEnd w:id="65"/>
       <w:bookmarkEnd w:id="74"/>
       <w:r>
@@ -39901,7 +40037,7 @@
         <w:pStyle w:val="Heading2"/>
       </w:pPr>
       <w:bookmarkStart w:id="77" w:name="Xfad7df3f963ac0b8ebfe8cf87d7c64fa075f760"/>
-      <w:bookmarkStart w:id="78" w:name="_Toc239335510"/>
+      <w:bookmarkStart w:id="78" w:name="_Toc239335779"/>
       <w:bookmarkEnd w:id="75"/>
       <w:r>
         <w:t>3.6. B</w:t>
@@ -39947,7 +40083,7 @@
           <w:noProof/>
         </w:rPr>
         <w:drawing>
-          <wp:inline distT="0" distB="0" distL="0" distR="0" wp14:anchorId="51073F67" wp14:editId="1E182032">
+          <wp:inline distT="0" distB="0" distL="0" distR="0" wp14:anchorId="6F844182" wp14:editId="3FD20459">
             <wp:extent cx="5334000" cy="1217839"/>
             <wp:effectExtent l="0" t="0" r="0" b="0"/>
             <wp:docPr id="86" name="Picture"/>
@@ -42728,7 +42864,7 @@
         <w:pStyle w:val="Heading2"/>
       </w:pPr>
       <w:bookmarkStart w:id="80" w:name="X9b5467225f237e4ee44d60f7d236cbdfdaa1e07"/>
-      <w:bookmarkStart w:id="81" w:name="_Toc239335511"/>
+      <w:bookmarkStart w:id="81" w:name="_Toc239335780"/>
       <w:bookmarkEnd w:id="77"/>
       <w:r>
         <w:t xml:space="preserve">3.7. </w:t>
@@ -42848,7 +42984,7 @@
           <w:noProof/>
         </w:rPr>
         <w:drawing>
-          <wp:inline distT="0" distB="0" distL="0" distR="0" wp14:anchorId="1E97E679" wp14:editId="44716E4C">
+          <wp:inline distT="0" distB="0" distL="0" distR="0" wp14:anchorId="76FDA85D" wp14:editId="7C30F669">
             <wp:extent cx="5334000" cy="5953125"/>
             <wp:effectExtent l="0" t="0" r="0" b="0"/>
             <wp:docPr id="91" name="Picture"/>
@@ -43958,7 +44094,7 @@
         <w:pStyle w:val="Heading1"/>
       </w:pPr>
       <w:bookmarkStart w:id="83" w:name="chương-4-thực-nghiệm-và-đánh-giá"/>
-      <w:bookmarkStart w:id="84" w:name="_Toc239335512"/>
+      <w:bookmarkStart w:id="84" w:name="_Toc239335781"/>
       <w:bookmarkEnd w:id="50"/>
       <w:bookmarkEnd w:id="80"/>
       <w:r>
@@ -43983,7 +44119,7 @@
         <w:pStyle w:val="Heading2"/>
       </w:pPr>
       <w:bookmarkStart w:id="85" w:name="X43cb4672f728ce1df4f211c1d18360135f0c40b"/>
-      <w:bookmarkStart w:id="86" w:name="_Toc239335513"/>
+      <w:bookmarkStart w:id="86" w:name="_Toc239335782"/>
       <w:r>
         <w:t>4.1. Môi trư</w:t>
       </w:r>
@@ -45605,7 +45741,7 @@
         <w:pStyle w:val="Heading2"/>
       </w:pPr>
       <w:bookmarkStart w:id="87" w:name="Xe48430b60e6d2b1022368eb4316c1fe9f53411f"/>
-      <w:bookmarkStart w:id="88" w:name="_Toc239335514"/>
+      <w:bookmarkStart w:id="88" w:name="_Toc239335783"/>
       <w:bookmarkEnd w:id="85"/>
       <w:r>
         <w:t>4.2. K</w:t>
@@ -49140,7 +49276,7 @@
         <w:pStyle w:val="Heading2"/>
       </w:pPr>
       <w:bookmarkStart w:id="95" w:name="X09b724f0b907c7f652c2569c27ef1d5728c277c"/>
-      <w:bookmarkStart w:id="96" w:name="_Toc239335515"/>
+      <w:bookmarkStart w:id="96" w:name="_Toc239335784"/>
       <w:bookmarkEnd w:id="87"/>
       <w:bookmarkEnd w:id="93"/>
       <w:r>
@@ -51412,7 +51548,7 @@
           <w:noProof/>
         </w:rPr>
         <w:drawing>
-          <wp:inline distT="0" distB="0" distL="0" distR="0" wp14:anchorId="4EA1383E" wp14:editId="19F78C2D">
+          <wp:inline distT="0" distB="0" distL="0" distR="0" wp14:anchorId="7D6A1972" wp14:editId="6A5F1BA1">
             <wp:extent cx="5334000" cy="2883855"/>
             <wp:effectExtent l="0" t="0" r="0" b="0"/>
             <wp:docPr id="108" name="Picture"/>
@@ -56190,7 +56326,7 @@
         <w:pStyle w:val="Heading2"/>
       </w:pPr>
       <w:bookmarkStart w:id="106" w:name="X0c205a3fd5474e5e1d380a3735df7543f97f059"/>
-      <w:bookmarkStart w:id="107" w:name="_Toc239335516"/>
+      <w:bookmarkStart w:id="107" w:name="_Toc239335785"/>
       <w:bookmarkEnd w:id="95"/>
       <w:bookmarkEnd w:id="104"/>
       <w:r>
@@ -59135,7 +59271,7 @@
         <w:pStyle w:val="Heading2"/>
       </w:pPr>
       <w:bookmarkStart w:id="113" w:name="X8f4b2c0e55e8764a0677cdfa39e96dbe6822859"/>
-      <w:bookmarkStart w:id="114" w:name="_Toc239335517"/>
+      <w:bookmarkStart w:id="114" w:name="_Toc239335786"/>
       <w:bookmarkEnd w:id="106"/>
       <w:bookmarkEnd w:id="112"/>
       <w:r>
@@ -62278,7 +62414,7 @@
         <w:pStyle w:val="Heading2"/>
       </w:pPr>
       <w:bookmarkStart w:id="120" w:name="X7468ed9f095dd0192ebc5de940dc44b5cd3e099"/>
-      <w:bookmarkStart w:id="121" w:name="_Toc239335518"/>
+      <w:bookmarkStart w:id="121" w:name="_Toc239335787"/>
       <w:bookmarkEnd w:id="113"/>
       <w:bookmarkEnd w:id="118"/>
       <w:r>
@@ -64139,7 +64275,7 @@
           <w:noProof/>
         </w:rPr>
         <w:drawing>
-          <wp:inline distT="0" distB="0" distL="0" distR="0" wp14:anchorId="48C9522B" wp14:editId="6E6221D2">
+          <wp:inline distT="0" distB="0" distL="0" distR="0" wp14:anchorId="5DB3DB02" wp14:editId="57E5CEAA">
             <wp:extent cx="5334000" cy="3317670"/>
             <wp:effectExtent l="0" t="0" r="0" b="0"/>
             <wp:docPr id="131" name="Picture"/>
@@ -64871,7 +65007,7 @@
         <w:pStyle w:val="Heading2"/>
       </w:pPr>
       <w:bookmarkStart w:id="124" w:name="X88e1c26a6581f7bd1dbdb2c85ae6116c5ba8393"/>
-      <w:bookmarkStart w:id="125" w:name="_Toc239335519"/>
+      <w:bookmarkStart w:id="125" w:name="_Toc239335788"/>
       <w:bookmarkEnd w:id="120"/>
       <w:r>
         <w:t>4.7. Các y</w:t>
@@ -66726,7 +66862,7 @@
         <w:pStyle w:val="Heading1"/>
       </w:pPr>
       <w:bookmarkStart w:id="127" w:name="chương-5-kết-luận-và-hướng-phát-triển"/>
-      <w:bookmarkStart w:id="128" w:name="_Toc239335520"/>
+      <w:bookmarkStart w:id="128" w:name="_Toc239335789"/>
       <w:bookmarkEnd w:id="83"/>
       <w:bookmarkEnd w:id="124"/>
       <w:r>
@@ -66763,7 +66899,7 @@
         <w:pStyle w:val="Heading2"/>
       </w:pPr>
       <w:bookmarkStart w:id="129" w:name="Xcefa088882d41b38c21b7b5b44c738cb5564fbb"/>
-      <w:bookmarkStart w:id="130" w:name="_Toc239335521"/>
+      <w:bookmarkStart w:id="130" w:name="_Toc239335790"/>
       <w:r>
         <w:t>5.1. K</w:t>
       </w:r>
@@ -68264,7 +68400,7 @@
         <w:pStyle w:val="Heading2"/>
       </w:pPr>
       <w:bookmarkStart w:id="132" w:name="Xe79f58ab8ce7b6f148c68a374118dd9eaec1a1c"/>
-      <w:bookmarkStart w:id="133" w:name="_Toc239335522"/>
+      <w:bookmarkStart w:id="133" w:name="_Toc239335791"/>
       <w:bookmarkEnd w:id="129"/>
       <w:r>
         <w:t>5.2. H</w:t>
@@ -69701,7 +69837,7 @@
         <w:pStyle w:val="Heading2"/>
       </w:pPr>
       <w:bookmarkStart w:id="135" w:name="X66db71c9020c40cf46e490c5c37ad244e2b7594"/>
-      <w:bookmarkStart w:id="136" w:name="_Toc239335523"/>
+      <w:bookmarkStart w:id="136" w:name="_Toc239335792"/>
       <w:bookmarkEnd w:id="132"/>
       <w:r>
         <w:t>5.3. Hư</w:t>
@@ -71289,7 +71425,7 @@
         <w:pStyle w:val="Heading2"/>
       </w:pPr>
       <w:bookmarkStart w:id="138" w:name="Xe5a2fe3dfcd4681648271b7ddc344b106e48b3b"/>
-      <w:bookmarkStart w:id="139" w:name="_Toc239335524"/>
+      <w:bookmarkStart w:id="139" w:name="_Toc239335793"/>
       <w:bookmarkEnd w:id="135"/>
       <w:r>
         <w:t>5.4. K</w:t>
@@ -72215,7 +72351,7 @@
         <w:pStyle w:val="Heading1"/>
       </w:pPr>
       <w:bookmarkStart w:id="140" w:name="tài-liệu-tham-khảo"/>
-      <w:bookmarkStart w:id="141" w:name="_Toc239335525"/>
+      <w:bookmarkStart w:id="141" w:name="_Toc239335794"/>
       <w:bookmarkEnd w:id="127"/>
       <w:bookmarkEnd w:id="138"/>
       <w:r>
@@ -73244,7 +73380,7 @@
         <w:pStyle w:val="Heading1"/>
       </w:pPr>
       <w:bookmarkStart w:id="142" w:name="phụ-lục"/>
-      <w:bookmarkStart w:id="143" w:name="_Toc239335526"/>
+      <w:bookmarkStart w:id="143" w:name="_Toc239335795"/>
       <w:bookmarkEnd w:id="140"/>
       <w:r>
         <w:t>PH</w:t>
@@ -73268,7 +73404,7 @@
         <w:pStyle w:val="Heading2"/>
       </w:pPr>
       <w:bookmarkStart w:id="144" w:name="phụ-lục-a-cấu-hình-và-siêu-tham-số"/>
-      <w:bookmarkStart w:id="145" w:name="_Toc239335527"/>
+      <w:bookmarkStart w:id="145" w:name="_Toc239335796"/>
       <w:r>
         <w:t>Ph</w:t>
       </w:r>
@@ -75488,7 +75624,7 @@
         <w:pStyle w:val="Heading2"/>
       </w:pPr>
       <w:bookmarkStart w:id="149" w:name="phụ-lục-b-hướng-dẫn-cài-đặt-và-chạy"/>
-      <w:bookmarkStart w:id="150" w:name="_Toc239335528"/>
+      <w:bookmarkStart w:id="150" w:name="_Toc239335797"/>
       <w:bookmarkEnd w:id="144"/>
       <w:bookmarkEnd w:id="148"/>
       <w:r>
@@ -77057,7 +77193,7 @@
   <w:abstractNum w:abstractNumId="0" w15:restartNumberingAfterBreak="0">
     <w:nsid w:val="0000A990"/>
     <w:multiLevelType w:val="multilevel"/>
-    <w:tmpl w:val="A13857D4"/>
+    <w:tmpl w:val="5AACE3F6"/>
     <w:lvl w:ilvl="0">
       <w:numFmt w:val="bullet"/>
       <w:lvlText w:val=" "/>
@@ -77134,7 +77270,7 @@
   <w:abstractNum w:abstractNumId="1" w15:restartNumberingAfterBreak="0">
     <w:nsid w:val="0000A991"/>
     <w:multiLevelType w:val="multilevel"/>
-    <w:tmpl w:val="2E361A56"/>
+    <w:tmpl w:val="6DF02C1C"/>
     <w:lvl w:ilvl="0">
       <w:numFmt w:val="bullet"/>
       <w:lvlText w:val=""/>
@@ -77238,7 +77374,7 @@
   <w:abstractNum w:abstractNumId="2" w15:restartNumberingAfterBreak="0">
     <w:nsid w:val="00A99411"/>
     <w:multiLevelType w:val="multilevel"/>
-    <w:tmpl w:val="E514AC88"/>
+    <w:tmpl w:val="2334F70C"/>
     <w:lvl w:ilvl="0">
       <w:start w:val="1"/>
       <w:numFmt w:val="decimal"/>
@@ -77321,10 +77457,10 @@
       </w:pPr>
     </w:lvl>
   </w:abstractNum>
-  <w:num w:numId="1" w16cid:durableId="348869595">
+  <w:num w:numId="1" w16cid:durableId="772475117">
     <w:abstractNumId w:val="0"/>
   </w:num>
-  <w:num w:numId="2" w16cid:durableId="853424971">
+  <w:num w:numId="2" w16cid:durableId="644897484">
     <w:abstractNumId w:val="2"/>
     <w:lvlOverride w:ilvl="0">
       <w:startOverride w:val="1"/>
@@ -77354,22 +77490,22 @@
       <w:startOverride w:val="1"/>
     </w:lvlOverride>
   </w:num>
-  <w:num w:numId="3" w16cid:durableId="1302420048">
+  <w:num w:numId="3" w16cid:durableId="227350168">
     <w:abstractNumId w:val="1"/>
   </w:num>
-  <w:num w:numId="4" w16cid:durableId="1391151158">
+  <w:num w:numId="4" w16cid:durableId="320275705">
     <w:abstractNumId w:val="1"/>
   </w:num>
-  <w:num w:numId="5" w16cid:durableId="989334681">
+  <w:num w:numId="5" w16cid:durableId="1140221393">
     <w:abstractNumId w:val="1"/>
   </w:num>
-  <w:num w:numId="6" w16cid:durableId="1334458498">
+  <w:num w:numId="6" w16cid:durableId="1156845879">
     <w:abstractNumId w:val="1"/>
   </w:num>
-  <w:num w:numId="7" w16cid:durableId="680401739">
+  <w:num w:numId="7" w16cid:durableId="890312753">
     <w:abstractNumId w:val="1"/>
   </w:num>
-  <w:num w:numId="8" w16cid:durableId="1895774421">
+  <w:num w:numId="8" w16cid:durableId="1649482611">
     <w:abstractNumId w:val="2"/>
     <w:lvlOverride w:ilvl="0">
       <w:startOverride w:val="1"/>
@@ -77399,7 +77535,7 @@
       <w:startOverride w:val="1"/>
     </w:lvlOverride>
   </w:num>
-  <w:num w:numId="9" w16cid:durableId="1861160266">
+  <w:num w:numId="9" w16cid:durableId="2093894507">
     <w:abstractNumId w:val="1"/>
   </w:num>
 </w:numbering>
@@ -78636,7 +78772,7 @@
     <w:next w:val="Normal"/>
     <w:autoRedefine/>
     <w:uiPriority w:val="39"/>
-    <w:rsid w:val="00502AE2"/>
+    <w:rsid w:val="007B2554"/>
     <w:pPr>
       <w:spacing w:after="100"/>
     </w:pPr>
@@ -78647,7 +78783,7 @@
     <w:next w:val="Normal"/>
     <w:autoRedefine/>
     <w:uiPriority w:val="39"/>
-    <w:rsid w:val="00502AE2"/>
+    <w:rsid w:val="007B2554"/>
     <w:pPr>
       <w:spacing w:after="100"/>
       <w:ind w:left="240"/>

</xml_diff>

<commit_message>
docs(mon-hoc): 4.3.3 noi ro phep thay bang da ap vao ban ban giao
Cau ket "Huong cai thien: thay bang suy doan bang bang trich tu ma tran"
doc nhu viec CHUA lam — trong khi cau hinh ban giao DA dung bang trich tu
ma tran do duoc (vong hieu chinh 5, sinh ra chinh S1 = 0,7701). Cau hoi
phan bien "sao khong dung bang moi luon?" vi the se danh trung mot cau
viet sai lech, khong phai mot lo hong that.

Sua: 4.3.3 ghi ro hai muc vuot nguong da thay ngay (+53 bien dung, 0 hong
— dung cau hinh ban giao), nam cap con lai thang duoi 10 lan nen chua bat
mac dinh, tro ve huong phat trien so 2 (muc 5.3). Doi chieu khop 3.6c va
5.3, khong doi so lieu nao.

Kem: 4.3.4 them "2.801 vung bien" vao cau thiet ke thi nghiem de bon dieu
kien cung-du-lieu / cung-pipeline / chi-thay-OCR / cung-2.801-bien nam
tron trong mot cau, phong cau hoi "co bug hay sai cau hinh khong".

Kiem: refs 0 chet, PDF 40 trang, PAGEREF nguyen.
</commit_message>
<xml_diff>
--- a/docs/papers/mon-hoc/thesis-full.docx
+++ b/docs/papers/mon-hoc/thesis-full.docx
@@ -148,7 +148,7 @@
         <w:pStyle w:val="Heading1"/>
       </w:pPr>
       <w:bookmarkStart w:id="0" w:name="đồ-án-môn-học"/>
-      <w:bookmarkStart w:id="1" w:name="_Toc239335761"/>
+      <w:bookmarkStart w:id="1" w:name="_Toc239336132"/>
       <w:r>
         <w:t>Đ</w:t>
       </w:r>
@@ -220,7 +220,7 @@
         <w:pStyle w:val="Heading1"/>
       </w:pPr>
       <w:bookmarkStart w:id="4" w:name="Xbe958ce37c6a089ac9bdc99dada4ec5e2c0f7da"/>
-      <w:bookmarkStart w:id="5" w:name="_Toc239335762"/>
+      <w:bookmarkStart w:id="5" w:name="_Toc239336133"/>
       <w:bookmarkEnd w:id="0"/>
       <w:bookmarkEnd w:id="3"/>
       <w:r>
@@ -795,7 +795,7 @@
     </w:p>
     <w:p>
       <w:r>
-        <w:pict w14:anchorId="67610572">
+        <w:pict w14:anchorId="35C4D72C">
           <v:rect id="_x0000_i1025" style="width:0;height:1.5pt" o:hralign="center" o:hrstd="t" o:hr="t"/>
         </w:pict>
       </w:r>
@@ -805,7 +805,7 @@
         <w:pStyle w:val="Heading2"/>
       </w:pPr>
       <w:bookmarkStart w:id="6" w:name="mục-lục"/>
-      <w:bookmarkStart w:id="7" w:name="_Toc239335763"/>
+      <w:bookmarkStart w:id="7" w:name="_Toc239336134"/>
       <w:r>
         <w:t>M</w:t>
       </w:r>
@@ -845,7 +845,7 @@
       <w:r>
         <w:fldChar w:fldCharType="separate"/>
       </w:r>
-      <w:hyperlink w:anchor="_Toc239335761" w:history="1">
+      <w:hyperlink w:anchor="_Toc239336132" w:history="1">
         <w:r>
           <w:rPr>
             <w:rStyle w:val="Hyperlink"/>
@@ -872,7 +872,7 @@
             <w:noProof/>
             <w:webHidden/>
           </w:rPr>
-          <w:instrText xml:space="preserve"> PAGEREF _Toc239335761 \h </w:instrText>
+          <w:instrText xml:space="preserve"> PAGEREF _Toc239336132 \h </w:instrText>
         </w:r>
         <w:r>
           <w:rPr>
@@ -916,7 +916,7 @@
           <w14:ligatures w14:val="standardContextual"/>
         </w:rPr>
       </w:pPr>
-      <w:hyperlink w:anchor="_Toc239335762" w:history="1">
+      <w:hyperlink w:anchor="_Toc239336133" w:history="1">
         <w:r>
           <w:rPr>
             <w:rStyle w:val="Hyperlink"/>
@@ -943,7 +943,7 @@
             <w:noProof/>
             <w:webHidden/>
           </w:rPr>
-          <w:instrText xml:space="preserve"> PAGEREF _Toc239335762 \h </w:instrText>
+          <w:instrText xml:space="preserve"> PAGEREF _Toc239336133 \h </w:instrText>
         </w:r>
         <w:r>
           <w:rPr>
@@ -987,7 +987,7 @@
           <w14:ligatures w14:val="standardContextual"/>
         </w:rPr>
       </w:pPr>
-      <w:hyperlink w:anchor="_Toc239335763" w:history="1">
+      <w:hyperlink w:anchor="_Toc239336134" w:history="1">
         <w:r>
           <w:rPr>
             <w:rStyle w:val="Hyperlink"/>
@@ -1014,7 +1014,7 @@
             <w:noProof/>
             <w:webHidden/>
           </w:rPr>
-          <w:instrText xml:space="preserve"> PAGEREF _Toc239335763 \h </w:instrText>
+          <w:instrText xml:space="preserve"> PAGEREF _Toc239336134 \h </w:instrText>
         </w:r>
         <w:r>
           <w:rPr>
@@ -1058,7 +1058,7 @@
           <w14:ligatures w14:val="standardContextual"/>
         </w:rPr>
       </w:pPr>
-      <w:hyperlink w:anchor="_Toc239335764" w:history="1">
+      <w:hyperlink w:anchor="_Toc239336135" w:history="1">
         <w:r>
           <w:rPr>
             <w:rStyle w:val="Hyperlink"/>
@@ -1085,7 +1085,7 @@
             <w:noProof/>
             <w:webHidden/>
           </w:rPr>
-          <w:instrText xml:space="preserve"> PAGEREF _Toc239335764 \h </w:instrText>
+          <w:instrText xml:space="preserve"> PAGEREF _Toc239336135 \h </w:instrText>
         </w:r>
         <w:r>
           <w:rPr>
@@ -1129,7 +1129,7 @@
           <w14:ligatures w14:val="standardContextual"/>
         </w:rPr>
       </w:pPr>
-      <w:hyperlink w:anchor="_Toc239335765" w:history="1">
+      <w:hyperlink w:anchor="_Toc239336136" w:history="1">
         <w:r>
           <w:rPr>
             <w:rStyle w:val="Hyperlink"/>
@@ -1156,7 +1156,7 @@
             <w:noProof/>
             <w:webHidden/>
           </w:rPr>
-          <w:instrText xml:space="preserve"> PAGEREF _Toc239335765 \h </w:instrText>
+          <w:instrText xml:space="preserve"> PAGEREF _Toc239336136 \h </w:instrText>
         </w:r>
         <w:r>
           <w:rPr>
@@ -1200,7 +1200,7 @@
           <w14:ligatures w14:val="standardContextual"/>
         </w:rPr>
       </w:pPr>
-      <w:hyperlink w:anchor="_Toc239335766" w:history="1">
+      <w:hyperlink w:anchor="_Toc239336137" w:history="1">
         <w:r>
           <w:rPr>
             <w:rStyle w:val="Hyperlink"/>
@@ -1227,7 +1227,7 @@
             <w:noProof/>
             <w:webHidden/>
           </w:rPr>
-          <w:instrText xml:space="preserve"> PAGEREF _Toc239335766 \h </w:instrText>
+          <w:instrText xml:space="preserve"> PAGEREF _Toc239336137 \h </w:instrText>
         </w:r>
         <w:r>
           <w:rPr>
@@ -1271,7 +1271,7 @@
           <w14:ligatures w14:val="standardContextual"/>
         </w:rPr>
       </w:pPr>
-      <w:hyperlink w:anchor="_Toc239335767" w:history="1">
+      <w:hyperlink w:anchor="_Toc239336138" w:history="1">
         <w:r>
           <w:rPr>
             <w:rStyle w:val="Hyperlink"/>
@@ -1298,7 +1298,7 @@
             <w:noProof/>
             <w:webHidden/>
           </w:rPr>
-          <w:instrText xml:space="preserve"> PAGEREF _Toc239335767 \h </w:instrText>
+          <w:instrText xml:space="preserve"> PAGEREF _Toc239336138 \h </w:instrText>
         </w:r>
         <w:r>
           <w:rPr>
@@ -1342,7 +1342,7 @@
           <w14:ligatures w14:val="standardContextual"/>
         </w:rPr>
       </w:pPr>
-      <w:hyperlink w:anchor="_Toc239335768" w:history="1">
+      <w:hyperlink w:anchor="_Toc239336139" w:history="1">
         <w:r>
           <w:rPr>
             <w:rStyle w:val="Hyperlink"/>
@@ -1369,7 +1369,7 @@
             <w:noProof/>
             <w:webHidden/>
           </w:rPr>
-          <w:instrText xml:space="preserve"> PAGEREF _Toc239335768 \h </w:instrText>
+          <w:instrText xml:space="preserve"> PAGEREF _Toc239336139 \h </w:instrText>
         </w:r>
         <w:r>
           <w:rPr>
@@ -1413,7 +1413,7 @@
           <w14:ligatures w14:val="standardContextual"/>
         </w:rPr>
       </w:pPr>
-      <w:hyperlink w:anchor="_Toc239335769" w:history="1">
+      <w:hyperlink w:anchor="_Toc239336140" w:history="1">
         <w:r>
           <w:rPr>
             <w:rStyle w:val="Hyperlink"/>
@@ -1440,7 +1440,7 @@
             <w:noProof/>
             <w:webHidden/>
           </w:rPr>
-          <w:instrText xml:space="preserve"> PAGEREF _Toc239335769 \h </w:instrText>
+          <w:instrText xml:space="preserve"> PAGEREF _Toc239336140 \h </w:instrText>
         </w:r>
         <w:r>
           <w:rPr>
@@ -1484,7 +1484,7 @@
           <w14:ligatures w14:val="standardContextual"/>
         </w:rPr>
       </w:pPr>
-      <w:hyperlink w:anchor="_Toc239335770" w:history="1">
+      <w:hyperlink w:anchor="_Toc239336141" w:history="1">
         <w:r>
           <w:rPr>
             <w:rStyle w:val="Hyperlink"/>
@@ -1511,7 +1511,7 @@
             <w:noProof/>
             <w:webHidden/>
           </w:rPr>
-          <w:instrText xml:space="preserve"> PAGEREF _Toc239335770 \h </w:instrText>
+          <w:instrText xml:space="preserve"> PAGEREF _Toc239336141 \h </w:instrText>
         </w:r>
         <w:r>
           <w:rPr>
@@ -1555,7 +1555,7 @@
           <w14:ligatures w14:val="standardContextual"/>
         </w:rPr>
       </w:pPr>
-      <w:hyperlink w:anchor="_Toc239335771" w:history="1">
+      <w:hyperlink w:anchor="_Toc239336142" w:history="1">
         <w:r>
           <w:rPr>
             <w:rStyle w:val="Hyperlink"/>
@@ -1582,7 +1582,7 @@
             <w:noProof/>
             <w:webHidden/>
           </w:rPr>
-          <w:instrText xml:space="preserve"> PAGEREF _Toc239335771 \h </w:instrText>
+          <w:instrText xml:space="preserve"> PAGEREF _Toc239336142 \h </w:instrText>
         </w:r>
         <w:r>
           <w:rPr>
@@ -1626,7 +1626,7 @@
           <w14:ligatures w14:val="standardContextual"/>
         </w:rPr>
       </w:pPr>
-      <w:hyperlink w:anchor="_Toc239335772" w:history="1">
+      <w:hyperlink w:anchor="_Toc239336143" w:history="1">
         <w:r>
           <w:rPr>
             <w:rStyle w:val="Hyperlink"/>
@@ -1653,7 +1653,7 @@
             <w:noProof/>
             <w:webHidden/>
           </w:rPr>
-          <w:instrText xml:space="preserve"> PAGEREF _Toc239335772 \h </w:instrText>
+          <w:instrText xml:space="preserve"> PAGEREF _Toc239336143 \h </w:instrText>
         </w:r>
         <w:r>
           <w:rPr>
@@ -1697,7 +1697,7 @@
           <w14:ligatures w14:val="standardContextual"/>
         </w:rPr>
       </w:pPr>
-      <w:hyperlink w:anchor="_Toc239335773" w:history="1">
+      <w:hyperlink w:anchor="_Toc239336144" w:history="1">
         <w:r>
           <w:rPr>
             <w:rStyle w:val="Hyperlink"/>
@@ -1724,7 +1724,7 @@
             <w:noProof/>
             <w:webHidden/>
           </w:rPr>
-          <w:instrText xml:space="preserve"> PAGEREF _Toc239335773 \h </w:instrText>
+          <w:instrText xml:space="preserve"> PAGEREF _Toc239336144 \h </w:instrText>
         </w:r>
         <w:r>
           <w:rPr>
@@ -1768,7 +1768,7 @@
           <w14:ligatures w14:val="standardContextual"/>
         </w:rPr>
       </w:pPr>
-      <w:hyperlink w:anchor="_Toc239335774" w:history="1">
+      <w:hyperlink w:anchor="_Toc239336145" w:history="1">
         <w:r>
           <w:rPr>
             <w:rStyle w:val="Hyperlink"/>
@@ -1795,7 +1795,7 @@
             <w:noProof/>
             <w:webHidden/>
           </w:rPr>
-          <w:instrText xml:space="preserve"> PAGEREF _Toc239335774 \h </w:instrText>
+          <w:instrText xml:space="preserve"> PAGEREF _Toc239336145 \h </w:instrText>
         </w:r>
         <w:r>
           <w:rPr>
@@ -1839,7 +1839,7 @@
           <w14:ligatures w14:val="standardContextual"/>
         </w:rPr>
       </w:pPr>
-      <w:hyperlink w:anchor="_Toc239335775" w:history="1">
+      <w:hyperlink w:anchor="_Toc239336146" w:history="1">
         <w:r>
           <w:rPr>
             <w:rStyle w:val="Hyperlink"/>
@@ -1866,7 +1866,7 @@
             <w:noProof/>
             <w:webHidden/>
           </w:rPr>
-          <w:instrText xml:space="preserve"> PAGEREF _Toc239335775 \h </w:instrText>
+          <w:instrText xml:space="preserve"> PAGEREF _Toc239336146 \h </w:instrText>
         </w:r>
         <w:r>
           <w:rPr>
@@ -1910,7 +1910,7 @@
           <w14:ligatures w14:val="standardContextual"/>
         </w:rPr>
       </w:pPr>
-      <w:hyperlink w:anchor="_Toc239335776" w:history="1">
+      <w:hyperlink w:anchor="_Toc239336147" w:history="1">
         <w:r>
           <w:rPr>
             <w:rStyle w:val="Hyperlink"/>
@@ -1937,7 +1937,7 @@
             <w:noProof/>
             <w:webHidden/>
           </w:rPr>
-          <w:instrText xml:space="preserve"> PAGEREF _Toc239335776 \h </w:instrText>
+          <w:instrText xml:space="preserve"> PAGEREF _Toc239336147 \h </w:instrText>
         </w:r>
         <w:r>
           <w:rPr>
@@ -1981,7 +1981,7 @@
           <w14:ligatures w14:val="standardContextual"/>
         </w:rPr>
       </w:pPr>
-      <w:hyperlink w:anchor="_Toc239335777" w:history="1">
+      <w:hyperlink w:anchor="_Toc239336148" w:history="1">
         <w:r>
           <w:rPr>
             <w:rStyle w:val="Hyperlink"/>
@@ -2008,7 +2008,7 @@
             <w:noProof/>
             <w:webHidden/>
           </w:rPr>
-          <w:instrText xml:space="preserve"> PAGEREF _Toc239335777 \h </w:instrText>
+          <w:instrText xml:space="preserve"> PAGEREF _Toc239336148 \h </w:instrText>
         </w:r>
         <w:r>
           <w:rPr>
@@ -2052,7 +2052,7 @@
           <w14:ligatures w14:val="standardContextual"/>
         </w:rPr>
       </w:pPr>
-      <w:hyperlink w:anchor="_Toc239335778" w:history="1">
+      <w:hyperlink w:anchor="_Toc239336149" w:history="1">
         <w:r>
           <w:rPr>
             <w:rStyle w:val="Hyperlink"/>
@@ -2079,7 +2079,7 @@
             <w:noProof/>
             <w:webHidden/>
           </w:rPr>
-          <w:instrText xml:space="preserve"> PAGEREF _Toc239335778 \h </w:instrText>
+          <w:instrText xml:space="preserve"> PAGEREF _Toc239336149 \h </w:instrText>
         </w:r>
         <w:r>
           <w:rPr>
@@ -2123,7 +2123,7 @@
           <w14:ligatures w14:val="standardContextual"/>
         </w:rPr>
       </w:pPr>
-      <w:hyperlink w:anchor="_Toc239335779" w:history="1">
+      <w:hyperlink w:anchor="_Toc239336150" w:history="1">
         <w:r>
           <w:rPr>
             <w:rStyle w:val="Hyperlink"/>
@@ -2150,7 +2150,7 @@
             <w:noProof/>
             <w:webHidden/>
           </w:rPr>
-          <w:instrText xml:space="preserve"> PAGEREF _Toc239335779 \h </w:instrText>
+          <w:instrText xml:space="preserve"> PAGEREF _Toc239336150 \h </w:instrText>
         </w:r>
         <w:r>
           <w:rPr>
@@ -2194,7 +2194,7 @@
           <w14:ligatures w14:val="standardContextual"/>
         </w:rPr>
       </w:pPr>
-      <w:hyperlink w:anchor="_Toc239335780" w:history="1">
+      <w:hyperlink w:anchor="_Toc239336151" w:history="1">
         <w:r>
           <w:rPr>
             <w:rStyle w:val="Hyperlink"/>
@@ -2221,7 +2221,7 @@
             <w:noProof/>
             <w:webHidden/>
           </w:rPr>
-          <w:instrText xml:space="preserve"> PAGEREF _Toc239335780 \h </w:instrText>
+          <w:instrText xml:space="preserve"> PAGEREF _Toc239336151 \h </w:instrText>
         </w:r>
         <w:r>
           <w:rPr>
@@ -2265,7 +2265,7 @@
           <w14:ligatures w14:val="standardContextual"/>
         </w:rPr>
       </w:pPr>
-      <w:hyperlink w:anchor="_Toc239335781" w:history="1">
+      <w:hyperlink w:anchor="_Toc239336152" w:history="1">
         <w:r>
           <w:rPr>
             <w:rStyle w:val="Hyperlink"/>
@@ -2292,7 +2292,7 @@
             <w:noProof/>
             <w:webHidden/>
           </w:rPr>
-          <w:instrText xml:space="preserve"> PAGEREF _Toc239335781 \h </w:instrText>
+          <w:instrText xml:space="preserve"> PAGEREF _Toc239336152 \h </w:instrText>
         </w:r>
         <w:r>
           <w:rPr>
@@ -2336,7 +2336,7 @@
           <w14:ligatures w14:val="standardContextual"/>
         </w:rPr>
       </w:pPr>
-      <w:hyperlink w:anchor="_Toc239335782" w:history="1">
+      <w:hyperlink w:anchor="_Toc239336153" w:history="1">
         <w:r>
           <w:rPr>
             <w:rStyle w:val="Hyperlink"/>
@@ -2363,7 +2363,7 @@
             <w:noProof/>
             <w:webHidden/>
           </w:rPr>
-          <w:instrText xml:space="preserve"> PAGEREF _Toc239335782 \h </w:instrText>
+          <w:instrText xml:space="preserve"> PAGEREF _Toc239336153 \h </w:instrText>
         </w:r>
         <w:r>
           <w:rPr>
@@ -2407,7 +2407,7 @@
           <w14:ligatures w14:val="standardContextual"/>
         </w:rPr>
       </w:pPr>
-      <w:hyperlink w:anchor="_Toc239335783" w:history="1">
+      <w:hyperlink w:anchor="_Toc239336154" w:history="1">
         <w:r>
           <w:rPr>
             <w:rStyle w:val="Hyperlink"/>
@@ -2434,7 +2434,7 @@
             <w:noProof/>
             <w:webHidden/>
           </w:rPr>
-          <w:instrText xml:space="preserve"> PAGEREF _Toc239335783 \h </w:instrText>
+          <w:instrText xml:space="preserve"> PAGEREF _Toc239336154 \h </w:instrText>
         </w:r>
         <w:r>
           <w:rPr>
@@ -2478,7 +2478,7 @@
           <w14:ligatures w14:val="standardContextual"/>
         </w:rPr>
       </w:pPr>
-      <w:hyperlink w:anchor="_Toc239335784" w:history="1">
+      <w:hyperlink w:anchor="_Toc239336155" w:history="1">
         <w:r>
           <w:rPr>
             <w:rStyle w:val="Hyperlink"/>
@@ -2505,7 +2505,7 @@
             <w:noProof/>
             <w:webHidden/>
           </w:rPr>
-          <w:instrText xml:space="preserve"> PAGEREF _Toc239335784 \h </w:instrText>
+          <w:instrText xml:space="preserve"> PAGEREF _Toc239336155 \h </w:instrText>
         </w:r>
         <w:r>
           <w:rPr>
@@ -2549,7 +2549,7 @@
           <w14:ligatures w14:val="standardContextual"/>
         </w:rPr>
       </w:pPr>
-      <w:hyperlink w:anchor="_Toc239335785" w:history="1">
+      <w:hyperlink w:anchor="_Toc239336156" w:history="1">
         <w:r>
           <w:rPr>
             <w:rStyle w:val="Hyperlink"/>
@@ -2576,7 +2576,7 @@
             <w:noProof/>
             <w:webHidden/>
           </w:rPr>
-          <w:instrText xml:space="preserve"> PAGEREF _Toc239335785 \h </w:instrText>
+          <w:instrText xml:space="preserve"> PAGEREF _Toc239336156 \h </w:instrText>
         </w:r>
         <w:r>
           <w:rPr>
@@ -2620,7 +2620,7 @@
           <w14:ligatures w14:val="standardContextual"/>
         </w:rPr>
       </w:pPr>
-      <w:hyperlink w:anchor="_Toc239335786" w:history="1">
+      <w:hyperlink w:anchor="_Toc239336157" w:history="1">
         <w:r>
           <w:rPr>
             <w:rStyle w:val="Hyperlink"/>
@@ -2647,7 +2647,7 @@
             <w:noProof/>
             <w:webHidden/>
           </w:rPr>
-          <w:instrText xml:space="preserve"> PAGEREF _Toc239335786 \h </w:instrText>
+          <w:instrText xml:space="preserve"> PAGEREF _Toc239336157 \h </w:instrText>
         </w:r>
         <w:r>
           <w:rPr>
@@ -2691,7 +2691,7 @@
           <w14:ligatures w14:val="standardContextual"/>
         </w:rPr>
       </w:pPr>
-      <w:hyperlink w:anchor="_Toc239335787" w:history="1">
+      <w:hyperlink w:anchor="_Toc239336158" w:history="1">
         <w:r>
           <w:rPr>
             <w:rStyle w:val="Hyperlink"/>
@@ -2718,7 +2718,7 @@
             <w:noProof/>
             <w:webHidden/>
           </w:rPr>
-          <w:instrText xml:space="preserve"> PAGEREF _Toc239335787 \h </w:instrText>
+          <w:instrText xml:space="preserve"> PAGEREF _Toc239336158 \h </w:instrText>
         </w:r>
         <w:r>
           <w:rPr>
@@ -2762,7 +2762,7 @@
           <w14:ligatures w14:val="standardContextual"/>
         </w:rPr>
       </w:pPr>
-      <w:hyperlink w:anchor="_Toc239335788" w:history="1">
+      <w:hyperlink w:anchor="_Toc239336159" w:history="1">
         <w:r>
           <w:rPr>
             <w:rStyle w:val="Hyperlink"/>
@@ -2789,7 +2789,7 @@
             <w:noProof/>
             <w:webHidden/>
           </w:rPr>
-          <w:instrText xml:space="preserve"> PAGEREF _Toc239335788 \h </w:instrText>
+          <w:instrText xml:space="preserve"> PAGEREF _Toc239336159 \h </w:instrText>
         </w:r>
         <w:r>
           <w:rPr>
@@ -2833,7 +2833,7 @@
           <w14:ligatures w14:val="standardContextual"/>
         </w:rPr>
       </w:pPr>
-      <w:hyperlink w:anchor="_Toc239335789" w:history="1">
+      <w:hyperlink w:anchor="_Toc239336160" w:history="1">
         <w:r>
           <w:rPr>
             <w:rStyle w:val="Hyperlink"/>
@@ -2860,7 +2860,7 @@
             <w:noProof/>
             <w:webHidden/>
           </w:rPr>
-          <w:instrText xml:space="preserve"> PAGEREF _Toc239335789 \h </w:instrText>
+          <w:instrText xml:space="preserve"> PAGEREF _Toc239336160 \h </w:instrText>
         </w:r>
         <w:r>
           <w:rPr>
@@ -2904,7 +2904,7 @@
           <w14:ligatures w14:val="standardContextual"/>
         </w:rPr>
       </w:pPr>
-      <w:hyperlink w:anchor="_Toc239335790" w:history="1">
+      <w:hyperlink w:anchor="_Toc239336161" w:history="1">
         <w:r>
           <w:rPr>
             <w:rStyle w:val="Hyperlink"/>
@@ -2931,7 +2931,7 @@
             <w:noProof/>
             <w:webHidden/>
           </w:rPr>
-          <w:instrText xml:space="preserve"> PAGEREF _Toc239335790 \h </w:instrText>
+          <w:instrText xml:space="preserve"> PAGEREF _Toc239336161 \h </w:instrText>
         </w:r>
         <w:r>
           <w:rPr>
@@ -2975,7 +2975,7 @@
           <w14:ligatures w14:val="standardContextual"/>
         </w:rPr>
       </w:pPr>
-      <w:hyperlink w:anchor="_Toc239335791" w:history="1">
+      <w:hyperlink w:anchor="_Toc239336162" w:history="1">
         <w:r>
           <w:rPr>
             <w:rStyle w:val="Hyperlink"/>
@@ -3002,7 +3002,7 @@
             <w:noProof/>
             <w:webHidden/>
           </w:rPr>
-          <w:instrText xml:space="preserve"> PAGEREF _Toc239335791 \h </w:instrText>
+          <w:instrText xml:space="preserve"> PAGEREF _Toc239336162 \h </w:instrText>
         </w:r>
         <w:r>
           <w:rPr>
@@ -3046,7 +3046,7 @@
           <w14:ligatures w14:val="standardContextual"/>
         </w:rPr>
       </w:pPr>
-      <w:hyperlink w:anchor="_Toc239335792" w:history="1">
+      <w:hyperlink w:anchor="_Toc239336163" w:history="1">
         <w:r>
           <w:rPr>
             <w:rStyle w:val="Hyperlink"/>
@@ -3073,7 +3073,7 @@
             <w:noProof/>
             <w:webHidden/>
           </w:rPr>
-          <w:instrText xml:space="preserve"> PAGEREF _Toc239335792 \h </w:instrText>
+          <w:instrText xml:space="preserve"> PAGEREF _Toc239336163 \h </w:instrText>
         </w:r>
         <w:r>
           <w:rPr>
@@ -3117,7 +3117,7 @@
           <w14:ligatures w14:val="standardContextual"/>
         </w:rPr>
       </w:pPr>
-      <w:hyperlink w:anchor="_Toc239335793" w:history="1">
+      <w:hyperlink w:anchor="_Toc239336164" w:history="1">
         <w:r>
           <w:rPr>
             <w:rStyle w:val="Hyperlink"/>
@@ -3144,7 +3144,7 @@
             <w:noProof/>
             <w:webHidden/>
           </w:rPr>
-          <w:instrText xml:space="preserve"> PAGEREF _Toc239335793 \h </w:instrText>
+          <w:instrText xml:space="preserve"> PAGEREF _Toc239336164 \h </w:instrText>
         </w:r>
         <w:r>
           <w:rPr>
@@ -3188,7 +3188,7 @@
           <w14:ligatures w14:val="standardContextual"/>
         </w:rPr>
       </w:pPr>
-      <w:hyperlink w:anchor="_Toc239335794" w:history="1">
+      <w:hyperlink w:anchor="_Toc239336165" w:history="1">
         <w:r>
           <w:rPr>
             <w:rStyle w:val="Hyperlink"/>
@@ -3215,7 +3215,7 @@
             <w:noProof/>
             <w:webHidden/>
           </w:rPr>
-          <w:instrText xml:space="preserve"> PAGEREF _Toc239335794 \h </w:instrText>
+          <w:instrText xml:space="preserve"> PAGEREF _Toc239336165 \h </w:instrText>
         </w:r>
         <w:r>
           <w:rPr>
@@ -3259,7 +3259,7 @@
           <w14:ligatures w14:val="standardContextual"/>
         </w:rPr>
       </w:pPr>
-      <w:hyperlink w:anchor="_Toc239335795" w:history="1">
+      <w:hyperlink w:anchor="_Toc239336166" w:history="1">
         <w:r>
           <w:rPr>
             <w:rStyle w:val="Hyperlink"/>
@@ -3286,7 +3286,7 @@
             <w:noProof/>
             <w:webHidden/>
           </w:rPr>
-          <w:instrText xml:space="preserve"> PAGEREF _Toc239335795 \h </w:instrText>
+          <w:instrText xml:space="preserve"> PAGEREF _Toc239336166 \h </w:instrText>
         </w:r>
         <w:r>
           <w:rPr>
@@ -3330,7 +3330,7 @@
           <w14:ligatures w14:val="standardContextual"/>
         </w:rPr>
       </w:pPr>
-      <w:hyperlink w:anchor="_Toc239335796" w:history="1">
+      <w:hyperlink w:anchor="_Toc239336167" w:history="1">
         <w:r>
           <w:rPr>
             <w:rStyle w:val="Hyperlink"/>
@@ -3357,7 +3357,7 @@
             <w:noProof/>
             <w:webHidden/>
           </w:rPr>
-          <w:instrText xml:space="preserve"> PAGEREF _Toc239335796 \h </w:instrText>
+          <w:instrText xml:space="preserve"> PAGEREF _Toc239336167 \h </w:instrText>
         </w:r>
         <w:r>
           <w:rPr>
@@ -3401,7 +3401,7 @@
           <w14:ligatures w14:val="standardContextual"/>
         </w:rPr>
       </w:pPr>
-      <w:hyperlink w:anchor="_Toc239335797" w:history="1">
+      <w:hyperlink w:anchor="_Toc239336168" w:history="1">
         <w:r>
           <w:rPr>
             <w:rStyle w:val="Hyperlink"/>
@@ -3428,7 +3428,7 @@
             <w:noProof/>
             <w:webHidden/>
           </w:rPr>
-          <w:instrText xml:space="preserve"> PAGEREF _Toc239335797 \h </w:instrText>
+          <w:instrText xml:space="preserve"> PAGEREF _Toc239336168 \h </w:instrText>
         </w:r>
         <w:r>
           <w:rPr>
@@ -3474,7 +3474,7 @@
         <w:pStyle w:val="Heading1"/>
       </w:pPr>
       <w:bookmarkStart w:id="8" w:name="chương-1-giới-thiệu"/>
-      <w:bookmarkStart w:id="9" w:name="_Toc239335764"/>
+      <w:bookmarkStart w:id="9" w:name="_Toc239336135"/>
       <w:bookmarkEnd w:id="4"/>
       <w:bookmarkEnd w:id="6"/>
       <w:r>
@@ -3499,7 +3499,7 @@
         <w:pStyle w:val="Heading2"/>
       </w:pPr>
       <w:bookmarkStart w:id="10" w:name="X7d99df2d9d0c5141050eb9941026463f4c8ea2b"/>
-      <w:bookmarkStart w:id="11" w:name="_Toc239335765"/>
+      <w:bookmarkStart w:id="11" w:name="_Toc239336136"/>
       <w:r>
         <w:t>1.1. Đ</w:t>
       </w:r>
@@ -5349,7 +5349,7 @@
         <w:pStyle w:val="Heading2"/>
       </w:pPr>
       <w:bookmarkStart w:id="12" w:name="X60021b7b958505251ec70bd32e2bac9f8a0361c"/>
-      <w:bookmarkStart w:id="13" w:name="_Toc239335766"/>
+      <w:bookmarkStart w:id="13" w:name="_Toc239336137"/>
       <w:bookmarkEnd w:id="10"/>
       <w:r>
         <w:t>1.2. M</w:t>
@@ -7295,7 +7295,7 @@
         <w:pStyle w:val="Heading2"/>
       </w:pPr>
       <w:bookmarkStart w:id="17" w:name="X03724c88a1b7da9b434cf0a8db5356690a4bb71"/>
-      <w:bookmarkStart w:id="18" w:name="_Toc239335767"/>
+      <w:bookmarkStart w:id="18" w:name="_Toc239336138"/>
       <w:bookmarkEnd w:id="12"/>
       <w:bookmarkEnd w:id="16"/>
       <w:r>
@@ -9100,7 +9100,7 @@
         <w:pStyle w:val="Heading1"/>
       </w:pPr>
       <w:bookmarkStart w:id="20" w:name="chương-2-cơ-sở-lý-thuyết"/>
-      <w:bookmarkStart w:id="21" w:name="_Toc239335768"/>
+      <w:bookmarkStart w:id="21" w:name="_Toc239336139"/>
       <w:bookmarkEnd w:id="8"/>
       <w:bookmarkEnd w:id="17"/>
       <w:r>
@@ -9397,7 +9397,7 @@
         <w:pStyle w:val="Heading2"/>
       </w:pPr>
       <w:bookmarkStart w:id="22" w:name="X2256001523e16d112c59df938522f140b8b988e"/>
-      <w:bookmarkStart w:id="23" w:name="_Toc239335769"/>
+      <w:bookmarkStart w:id="23" w:name="_Toc239336140"/>
       <w:r>
         <w:t>2.1. Quy chu</w:t>
       </w:r>
@@ -14076,7 +14076,7 @@
         <w:pStyle w:val="Heading2"/>
       </w:pPr>
       <w:bookmarkStart w:id="30" w:name="Xb21b4f0690a73e92e2a35192cb39315a0956521"/>
-      <w:bookmarkStart w:id="31" w:name="_Toc239335770"/>
+      <w:bookmarkStart w:id="31" w:name="_Toc239336141"/>
       <w:bookmarkEnd w:id="22"/>
       <w:bookmarkEnd w:id="28"/>
       <w:r>
@@ -19316,7 +19316,7 @@
         <w:pStyle w:val="Heading2"/>
       </w:pPr>
       <w:bookmarkStart w:id="38" w:name="X8ff52f1334e3f0e382caf7ffa1b7096a981291c"/>
-      <w:bookmarkStart w:id="39" w:name="_Toc239335771"/>
+      <w:bookmarkStart w:id="39" w:name="_Toc239336142"/>
       <w:bookmarkEnd w:id="30"/>
       <w:bookmarkEnd w:id="37"/>
       <w:r>
@@ -19595,7 +19595,7 @@
           <w:noProof/>
         </w:rPr>
         <w:drawing>
-          <wp:inline distT="0" distB="0" distL="0" distR="0" wp14:anchorId="101ADDEE" wp14:editId="71C09C12">
+          <wp:inline distT="0" distB="0" distL="0" distR="0" wp14:anchorId="5B7F84F4" wp14:editId="461C79E7">
             <wp:extent cx="5334000" cy="1435553"/>
             <wp:effectExtent l="0" t="0" r="0" b="0"/>
             <wp:docPr id="37" name="Picture"/>
@@ -21057,7 +21057,7 @@
         <w:pStyle w:val="Heading2"/>
       </w:pPr>
       <w:bookmarkStart w:id="43" w:name="X1a77f36e16d4ad267b00eabe7cf793e1dbe08e9"/>
-      <w:bookmarkStart w:id="44" w:name="_Toc239335772"/>
+      <w:bookmarkStart w:id="44" w:name="_Toc239336143"/>
       <w:bookmarkEnd w:id="38"/>
       <w:bookmarkEnd w:id="42"/>
       <w:r>
@@ -22227,7 +22227,7 @@
           <w:noProof/>
         </w:rPr>
         <w:drawing>
-          <wp:inline distT="0" distB="0" distL="0" distR="0" wp14:anchorId="0530499E" wp14:editId="2884D53E">
+          <wp:inline distT="0" distB="0" distL="0" distR="0" wp14:anchorId="4D7D7706" wp14:editId="614BEE6E">
             <wp:extent cx="5334000" cy="2884362"/>
             <wp:effectExtent l="0" t="0" r="0" b="0"/>
             <wp:docPr id="44" name="Picture"/>
@@ -22493,7 +22493,7 @@
           <w:noProof/>
         </w:rPr>
         <w:drawing>
-          <wp:inline distT="0" distB="0" distL="0" distR="0" wp14:anchorId="0AF570C3" wp14:editId="04F39607">
+          <wp:inline distT="0" distB="0" distL="0" distR="0" wp14:anchorId="3906D637" wp14:editId="5654D72B">
             <wp:extent cx="5334000" cy="632732"/>
             <wp:effectExtent l="0" t="0" r="0" b="0"/>
             <wp:docPr id="49" name="Picture"/>
@@ -24396,7 +24396,7 @@
         <w:pStyle w:val="Heading1"/>
       </w:pPr>
       <w:bookmarkStart w:id="50" w:name="chương-3-thiết-kế-và-cài-đặt"/>
-      <w:bookmarkStart w:id="51" w:name="_Toc239335773"/>
+      <w:bookmarkStart w:id="51" w:name="_Toc239336144"/>
       <w:bookmarkEnd w:id="20"/>
       <w:bookmarkEnd w:id="43"/>
       <w:bookmarkEnd w:id="49"/>
@@ -24428,7 +24428,7 @@
         <w:pStyle w:val="Heading2"/>
       </w:pPr>
       <w:bookmarkStart w:id="52" w:name="X21a22cc9b66dca004f2960f37df13c53a04e97b"/>
-      <w:bookmarkStart w:id="53" w:name="_Toc239335774"/>
+      <w:bookmarkStart w:id="53" w:name="_Toc239336145"/>
       <w:r>
         <w:t>3.1. Ki</w:t>
       </w:r>
@@ -24520,7 +24520,7 @@
           <w:noProof/>
         </w:rPr>
         <w:drawing>
-          <wp:inline distT="0" distB="0" distL="0" distR="0" wp14:anchorId="0FCF2BF7" wp14:editId="19D656A9">
+          <wp:inline distT="0" distB="0" distL="0" distR="0" wp14:anchorId="0FCF68A3" wp14:editId="22EDEACA">
             <wp:extent cx="5334000" cy="401410"/>
             <wp:effectExtent l="0" t="0" r="0" b="0"/>
             <wp:docPr id="57" name="Picture"/>
@@ -26189,7 +26189,7 @@
         <w:pStyle w:val="Heading2"/>
       </w:pPr>
       <w:bookmarkStart w:id="55" w:name="X1f307d8f8c73bce8db8683c986faea6c8ea66a3"/>
-      <w:bookmarkStart w:id="56" w:name="_Toc239335775"/>
+      <w:bookmarkStart w:id="56" w:name="_Toc239336146"/>
       <w:bookmarkEnd w:id="52"/>
       <w:r>
         <w:t>3.2. Xây d</w:t>
@@ -26256,7 +26256,7 @@
           <w:noProof/>
         </w:rPr>
         <w:drawing>
-          <wp:inline distT="0" distB="0" distL="0" distR="0" wp14:anchorId="4EC74026" wp14:editId="4CF4D8D5">
+          <wp:inline distT="0" distB="0" distL="0" distR="0" wp14:anchorId="1C551C5B" wp14:editId="082D81CA">
             <wp:extent cx="5334000" cy="802821"/>
             <wp:effectExtent l="0" t="0" r="0" b="0"/>
             <wp:docPr id="62" name="Picture"/>
@@ -30368,7 +30368,7 @@
         <w:pStyle w:val="Heading2"/>
       </w:pPr>
       <w:bookmarkStart w:id="62" w:name="X6a397cb1739f1ec0a8c9714808f79a5ce1fbf6f"/>
-      <w:bookmarkStart w:id="63" w:name="_Toc239335776"/>
+      <w:bookmarkStart w:id="63" w:name="_Toc239336147"/>
       <w:bookmarkEnd w:id="55"/>
       <w:bookmarkEnd w:id="61"/>
       <w:r>
@@ -31934,7 +31934,7 @@
         <w:pStyle w:val="Heading2"/>
       </w:pPr>
       <w:bookmarkStart w:id="65" w:name="X9c2c9b365086d10c999a46e4942f14d73b6baa5"/>
-      <w:bookmarkStart w:id="66" w:name="_Toc239335777"/>
+      <w:bookmarkStart w:id="66" w:name="_Toc239336148"/>
       <w:bookmarkEnd w:id="62"/>
       <w:r>
         <w:t>3.4. Kh</w:t>
@@ -32718,7 +32718,7 @@
           <w:noProof/>
         </w:rPr>
         <w:drawing>
-          <wp:inline distT="0" distB="0" distL="0" distR="0" wp14:anchorId="682F33DA" wp14:editId="75E50F2E">
+          <wp:inline distT="0" distB="0" distL="0" distR="0" wp14:anchorId="54D8D4BC" wp14:editId="1D660C89">
             <wp:extent cx="5334000" cy="8969712"/>
             <wp:effectExtent l="0" t="0" r="0" b="0"/>
             <wp:docPr id="73" name="Picture"/>
@@ -38667,7 +38667,7 @@
         <w:pStyle w:val="Heading2"/>
       </w:pPr>
       <w:bookmarkStart w:id="75" w:name="Xb17945b5d9374e5087c2c96ace1685ff00e2e22"/>
-      <w:bookmarkStart w:id="76" w:name="_Toc239335778"/>
+      <w:bookmarkStart w:id="76" w:name="_Toc239336149"/>
       <w:bookmarkEnd w:id="65"/>
       <w:bookmarkEnd w:id="74"/>
       <w:r>
@@ -40037,7 +40037,7 @@
         <w:pStyle w:val="Heading2"/>
       </w:pPr>
       <w:bookmarkStart w:id="77" w:name="Xfad7df3f963ac0b8ebfe8cf87d7c64fa075f760"/>
-      <w:bookmarkStart w:id="78" w:name="_Toc239335779"/>
+      <w:bookmarkStart w:id="78" w:name="_Toc239336150"/>
       <w:bookmarkEnd w:id="75"/>
       <w:r>
         <w:t>3.6. B</w:t>
@@ -40083,7 +40083,7 @@
           <w:noProof/>
         </w:rPr>
         <w:drawing>
-          <wp:inline distT="0" distB="0" distL="0" distR="0" wp14:anchorId="6F844182" wp14:editId="3FD20459">
+          <wp:inline distT="0" distB="0" distL="0" distR="0" wp14:anchorId="6EFBAE3F" wp14:editId="485895DB">
             <wp:extent cx="5334000" cy="1217839"/>
             <wp:effectExtent l="0" t="0" r="0" b="0"/>
             <wp:docPr id="86" name="Picture"/>
@@ -42864,7 +42864,7 @@
         <w:pStyle w:val="Heading2"/>
       </w:pPr>
       <w:bookmarkStart w:id="80" w:name="X9b5467225f237e4ee44d60f7d236cbdfdaa1e07"/>
-      <w:bookmarkStart w:id="81" w:name="_Toc239335780"/>
+      <w:bookmarkStart w:id="81" w:name="_Toc239336151"/>
       <w:bookmarkEnd w:id="77"/>
       <w:r>
         <w:t xml:space="preserve">3.7. </w:t>
@@ -42984,7 +42984,7 @@
           <w:noProof/>
         </w:rPr>
         <w:drawing>
-          <wp:inline distT="0" distB="0" distL="0" distR="0" wp14:anchorId="76FDA85D" wp14:editId="7C30F669">
+          <wp:inline distT="0" distB="0" distL="0" distR="0" wp14:anchorId="0979CCDA" wp14:editId="20B475F4">
             <wp:extent cx="5334000" cy="5953125"/>
             <wp:effectExtent l="0" t="0" r="0" b="0"/>
             <wp:docPr id="91" name="Picture"/>
@@ -44094,7 +44094,7 @@
         <w:pStyle w:val="Heading1"/>
       </w:pPr>
       <w:bookmarkStart w:id="83" w:name="chương-4-thực-nghiệm-và-đánh-giá"/>
-      <w:bookmarkStart w:id="84" w:name="_Toc239335781"/>
+      <w:bookmarkStart w:id="84" w:name="_Toc239336152"/>
       <w:bookmarkEnd w:id="50"/>
       <w:bookmarkEnd w:id="80"/>
       <w:r>
@@ -44119,7 +44119,7 @@
         <w:pStyle w:val="Heading2"/>
       </w:pPr>
       <w:bookmarkStart w:id="85" w:name="X43cb4672f728ce1df4f211c1d18360135f0c40b"/>
-      <w:bookmarkStart w:id="86" w:name="_Toc239335782"/>
+      <w:bookmarkStart w:id="86" w:name="_Toc239336153"/>
       <w:r>
         <w:t>4.1. Môi trư</w:t>
       </w:r>
@@ -45741,7 +45741,7 @@
         <w:pStyle w:val="Heading2"/>
       </w:pPr>
       <w:bookmarkStart w:id="87" w:name="Xe48430b60e6d2b1022368eb4316c1fe9f53411f"/>
-      <w:bookmarkStart w:id="88" w:name="_Toc239335783"/>
+      <w:bookmarkStart w:id="88" w:name="_Toc239336154"/>
       <w:bookmarkEnd w:id="85"/>
       <w:r>
         <w:t>4.2. K</w:t>
@@ -49276,7 +49276,7 @@
         <w:pStyle w:val="Heading2"/>
       </w:pPr>
       <w:bookmarkStart w:id="95" w:name="X09b724f0b907c7f652c2569c27ef1d5728c277c"/>
-      <w:bookmarkStart w:id="96" w:name="_Toc239335784"/>
+      <w:bookmarkStart w:id="96" w:name="_Toc239336155"/>
       <w:bookmarkEnd w:id="87"/>
       <w:bookmarkEnd w:id="93"/>
       <w:r>
@@ -51548,7 +51548,7 @@
           <w:noProof/>
         </w:rPr>
         <w:drawing>
-          <wp:inline distT="0" distB="0" distL="0" distR="0" wp14:anchorId="7D6A1972" wp14:editId="6A5F1BA1">
+          <wp:inline distT="0" distB="0" distL="0" distR="0" wp14:anchorId="461DD24E" wp14:editId="0119CAD0">
             <wp:extent cx="5334000" cy="2883855"/>
             <wp:effectExtent l="0" t="0" r="0" b="0"/>
             <wp:docPr id="108" name="Picture"/>
@@ -54029,175 +54029,417 @@
         <w:pStyle w:val="BodyText"/>
       </w:pPr>
       <w:r>
-        <w:t>Hư</w:t>
+        <w:t>Phép thay th</w:t>
+      </w:r>
+      <w:r>
+        <w:t>ế</w:t>
+      </w:r>
+      <w:r>
+        <w:t xml:space="preserve"> </w:t>
+      </w:r>
+      <w:r>
+        <w:rPr>
+          <w:b/>
+          <w:bCs/>
+        </w:rPr>
+        <w:t>đã đư</w:t>
+      </w:r>
+      <w:r>
+        <w:rPr>
+          <w:b/>
+          <w:bCs/>
+        </w:rPr>
+        <w:t>ợ</w:t>
+      </w:r>
+      <w:r>
+        <w:rPr>
+          <w:b/>
+          <w:bCs/>
+        </w:rPr>
+        <w:t>c th</w:t>
+      </w:r>
+      <w:r>
+        <w:rPr>
+          <w:b/>
+          <w:bCs/>
+        </w:rPr>
+        <w:t>ự</w:t>
+      </w:r>
+      <w:r>
+        <w:rPr>
+          <w:b/>
+          <w:bCs/>
+        </w:rPr>
+        <w:t>c hi</w:t>
+      </w:r>
+      <w:r>
+        <w:rPr>
+          <w:b/>
+          <w:bCs/>
+        </w:rPr>
+        <w:t>ệ</w:t>
+      </w:r>
+      <w:r>
+        <w:rPr>
+          <w:b/>
+          <w:bCs/>
+        </w:rPr>
+        <w:t>n ngay trong vòng này</w:t>
+      </w:r>
+      <w:r>
+        <w:t xml:space="preserve"> cho nh</w:t>
+      </w:r>
+      <w:r>
+        <w:t>ữ</w:t>
+      </w:r>
+      <w:r>
+        <w:t>ng c</w:t>
+      </w:r>
+      <w:r>
+        <w:t>ặ</w:t>
+      </w:r>
+      <w:r>
+        <w:t>p đ</w:t>
+      </w:r>
+      <w:r>
+        <w:t>ủ</w:t>
+      </w:r>
+      <w:r>
+        <w:t xml:space="preserve"> b</w:t>
+      </w:r>
+      <w:r>
+        <w:t>ằ</w:t>
+      </w:r>
+      <w:r>
+        <w:t>ng ch</w:t>
+      </w:r>
+      <w:r>
+        <w:t>ứ</w:t>
+      </w:r>
+      <w:r>
+        <w:t>ng th</w:t>
+      </w:r>
+      <w:r>
+        <w:t>ố</w:t>
+      </w:r>
+      <w:r>
+        <w:t>ng kê: hai m</w:t>
+      </w:r>
+      <w:r>
+        <w:t>ụ</w:t>
+      </w:r>
+      <w:r>
+        <w:t>c vư</w:t>
+      </w:r>
+      <w:r>
+        <w:t>ợ</w:t>
+      </w:r>
+      <w:r>
+        <w:t>t ngư</w:t>
+      </w:r>
+      <w:r>
+        <w:t>ỡ</w:t>
+      </w:r>
+      <w:r>
+        <w:t>ng đư</w:t>
+      </w:r>
+      <w:r>
+        <w:t>ợ</w:t>
+      </w:r>
+      <w:r>
+        <w:t>c thay b</w:t>
+      </w:r>
+      <w:r>
+        <w:t>ằ</w:t>
+      </w:r>
+      <w:r>
+        <w:t>ng ánh x</w:t>
+      </w:r>
+      <w:r>
+        <w:t>ạ</w:t>
+      </w:r>
+      <w:r>
+        <w:t xml:space="preserve"> trích tr</w:t>
+      </w:r>
+      <w:r>
+        <w:t>ự</w:t>
+      </w:r>
+      <w:r>
+        <w:t>c ti</w:t>
+      </w:r>
+      <w:r>
+        <w:t>ế</w:t>
+      </w:r>
+      <w:r>
+        <w:t>p t</w:t>
+      </w:r>
+      <w:r>
+        <w:t>ừ</w:t>
+      </w:r>
+      <w:r>
+        <w:t xml:space="preserve"> ma tr</w:t>
+      </w:r>
+      <w:r>
+        <w:t>ậ</w:t>
+      </w:r>
+      <w:r>
+        <w:t>n đo đư</w:t>
+      </w:r>
+      <w:r>
+        <w:t>ợ</w:t>
+      </w:r>
+      <w:r>
+        <w:t xml:space="preserve">c, mua thêm </w:t>
+      </w:r>
+      <w:r>
+        <w:rPr>
+          <w:b/>
+          <w:bCs/>
+        </w:rPr>
+        <w:t>53 bi</w:t>
+      </w:r>
+      <w:r>
+        <w:rPr>
+          <w:b/>
+          <w:bCs/>
+        </w:rPr>
+        <w:t>ể</w:t>
+      </w:r>
+      <w:r>
+        <w:rPr>
+          <w:b/>
+          <w:bCs/>
+        </w:rPr>
+        <w:t>n đ</w:t>
+      </w:r>
+      <w:r>
+        <w:rPr>
+          <w:b/>
+          <w:bCs/>
+        </w:rPr>
+        <w:t>ọ</w:t>
+      </w:r>
+      <w:r>
+        <w:rPr>
+          <w:b/>
+          <w:bCs/>
+        </w:rPr>
+        <w:t>c đúng và 0 bi</w:t>
+      </w:r>
+      <w:r>
+        <w:rPr>
+          <w:b/>
+          <w:bCs/>
+        </w:rPr>
+        <w:t>ể</w:t>
+      </w:r>
+      <w:r>
+        <w:rPr>
+          <w:b/>
+          <w:bCs/>
+        </w:rPr>
+        <w:t>n h</w:t>
+      </w:r>
+      <w:r>
+        <w:rPr>
+          <w:b/>
+          <w:bCs/>
+        </w:rPr>
+        <w:t>ỏ</w:t>
+      </w:r>
+      <w:r>
+        <w:rPr>
+          <w:b/>
+          <w:bCs/>
+        </w:rPr>
+        <w:t>ng</w:t>
+      </w:r>
+      <w:r>
+        <w:t xml:space="preserve"> — đây chính là c</w:t>
+      </w:r>
+      <w:r>
+        <w:t>ấ</w:t>
+      </w:r>
+      <w:r>
+        <w:t>u hình bàn giao sinh ra S₁ = 0,7701. Năm c</w:t>
+      </w:r>
+      <w:r>
+        <w:t>ặ</w:t>
+      </w:r>
+      <w:r>
+        <w:t>p còn l</w:t>
+      </w:r>
+      <w:r>
+        <w:t>ạ</w:t>
+      </w:r>
+      <w:r>
+        <w:t>i th</w:t>
+      </w:r>
+      <w:r>
+        <w:t>ắ</w:t>
+      </w:r>
+      <w:r>
+        <w:t>ng dư</w:t>
       </w:r>
       <w:r>
         <w:t>ớ</w:t>
       </w:r>
       <w:r>
-        <w:t>ng c</w:t>
-      </w:r>
-      <w:r>
-        <w:t>ả</w:t>
-      </w:r>
-      <w:r>
-        <w:t>i thi</w:t>
+        <w:t>i 10 l</w:t>
+      </w:r>
+      <w:r>
+        <w:t>ầ</w:t>
+      </w:r>
+      <w:r>
+        <w:t xml:space="preserve">n nên </w:t>
+      </w:r>
+      <w:r>
+        <w:rPr>
+          <w:b/>
+          <w:bCs/>
+        </w:rPr>
+        <w:t>chưa đ</w:t>
+      </w:r>
+      <w:r>
+        <w:rPr>
+          <w:b/>
+          <w:bCs/>
+        </w:rPr>
+        <w:t>ủ</w:t>
+      </w:r>
+      <w:r>
+        <w:rPr>
+          <w:b/>
+          <w:bCs/>
+        </w:rPr>
+        <w:t xml:space="preserve"> cơ s</w:t>
+      </w:r>
+      <w:r>
+        <w:rPr>
+          <w:b/>
+          <w:bCs/>
+        </w:rPr>
+        <w:t>ở</w:t>
+      </w:r>
+      <w:r>
+        <w:rPr>
+          <w:b/>
+          <w:bCs/>
+        </w:rPr>
+        <w:t xml:space="preserve"> đ</w:t>
+      </w:r>
+      <w:r>
+        <w:rPr>
+          <w:b/>
+          <w:bCs/>
+        </w:rPr>
+        <w:t>ể</w:t>
+      </w:r>
+      <w:r>
+        <w:rPr>
+          <w:b/>
+          <w:bCs/>
+        </w:rPr>
+        <w:t xml:space="preserve"> b</w:t>
+      </w:r>
+      <w:r>
+        <w:rPr>
+          <w:b/>
+          <w:bCs/>
+        </w:rPr>
+        <w:t>ậ</w:t>
+      </w:r>
+      <w:r>
+        <w:rPr>
+          <w:b/>
+          <w:bCs/>
+        </w:rPr>
+        <w:t>t m</w:t>
+      </w:r>
+      <w:r>
+        <w:rPr>
+          <w:b/>
+          <w:bCs/>
+        </w:rPr>
+        <w:t>ặ</w:t>
+      </w:r>
+      <w:r>
+        <w:rPr>
+          <w:b/>
+          <w:bCs/>
+        </w:rPr>
+        <w:t>c đ</w:t>
+      </w:r>
+      <w:r>
+        <w:rPr>
+          <w:b/>
+          <w:bCs/>
+        </w:rPr>
+        <w:t>ị</w:t>
+      </w:r>
+      <w:r>
+        <w:rPr>
+          <w:b/>
+          <w:bCs/>
+        </w:rPr>
+        <w:t>nh</w:t>
+      </w:r>
+      <w:r>
+        <w:t>; chúng ch</w:t>
+      </w:r>
+      <w:r>
+        <w:t>ờ</w:t>
+      </w:r>
+      <w:r>
+        <w:t xml:space="preserve"> ng</w:t>
+      </w:r>
+      <w:r>
+        <w:t>ữ</w:t>
+      </w:r>
+      <w:r>
+        <w:t xml:space="preserve"> li</w:t>
       </w:r>
       <w:r>
         <w:t>ệ</w:t>
       </w:r>
       <w:r>
-        <w:t xml:space="preserve">n rõ ràng: </w:t>
-      </w:r>
-      <w:r>
-        <w:rPr>
-          <w:b/>
-          <w:bCs/>
-        </w:rPr>
-        <w:t>thay b</w:t>
-      </w:r>
-      <w:r>
-        <w:rPr>
-          <w:b/>
-          <w:bCs/>
-        </w:rPr>
-        <w:t>ả</w:t>
-      </w:r>
-      <w:r>
-        <w:rPr>
-          <w:b/>
-          <w:bCs/>
-        </w:rPr>
-        <w:t>ng suy đoán b</w:t>
-      </w:r>
-      <w:r>
-        <w:rPr>
-          <w:b/>
-          <w:bCs/>
-        </w:rPr>
-        <w:t>ằ</w:t>
-      </w:r>
-      <w:r>
-        <w:rPr>
-          <w:b/>
-          <w:bCs/>
-        </w:rPr>
-        <w:t>ng b</w:t>
-      </w:r>
-      <w:r>
-        <w:rPr>
-          <w:b/>
-          <w:bCs/>
-        </w:rPr>
-        <w:t>ả</w:t>
-      </w:r>
-      <w:r>
-        <w:rPr>
-          <w:b/>
-          <w:bCs/>
-        </w:rPr>
-        <w:t>ng trích tr</w:t>
-      </w:r>
-      <w:r>
-        <w:rPr>
-          <w:b/>
-          <w:bCs/>
-        </w:rPr>
-        <w:t>ự</w:t>
-      </w:r>
-      <w:r>
-        <w:rPr>
-          <w:b/>
-          <w:bCs/>
-        </w:rPr>
-        <w:t>c ti</w:t>
-      </w:r>
-      <w:r>
-        <w:rPr>
-          <w:b/>
-          <w:bCs/>
-        </w:rPr>
-        <w:t>ế</w:t>
-      </w:r>
-      <w:r>
-        <w:rPr>
-          <w:b/>
-          <w:bCs/>
-        </w:rPr>
-        <w:t>p t</w:t>
-      </w:r>
-      <w:r>
-        <w:rPr>
-          <w:b/>
-          <w:bCs/>
-        </w:rPr>
-        <w:t>ừ</w:t>
-      </w:r>
-      <w:r>
-        <w:rPr>
-          <w:b/>
-          <w:bCs/>
-        </w:rPr>
-        <w:t xml:space="preserve"> ma tr</w:t>
-      </w:r>
-      <w:r>
-        <w:rPr>
-          <w:b/>
-          <w:bCs/>
-        </w:rPr>
-        <w:t>ậ</w:t>
-      </w:r>
-      <w:r>
-        <w:rPr>
-          <w:b/>
-          <w:bCs/>
-        </w:rPr>
-        <w:t>n nh</w:t>
-      </w:r>
-      <w:r>
-        <w:rPr>
-          <w:b/>
-          <w:bCs/>
-        </w:rPr>
-        <w:t>ầ</w:t>
-      </w:r>
-      <w:r>
-        <w:rPr>
-          <w:b/>
-          <w:bCs/>
-        </w:rPr>
-        <w:t>m l</w:t>
-      </w:r>
-      <w:r>
-        <w:rPr>
-          <w:b/>
-          <w:bCs/>
-        </w:rPr>
-        <w:t>ẫ</w:t>
-      </w:r>
-      <w:r>
-        <w:rPr>
-          <w:b/>
-          <w:bCs/>
-        </w:rPr>
-        <w:t>n đo đư</w:t>
-      </w:r>
-      <w:r>
-        <w:rPr>
-          <w:b/>
-          <w:bCs/>
-        </w:rPr>
-        <w:t>ợ</w:t>
-      </w:r>
-      <w:r>
-        <w:rPr>
-          <w:b/>
-          <w:bCs/>
-        </w:rPr>
-        <w:t>c</w:t>
-      </w:r>
-      <w:r>
-        <w:t>. Đây là ví d</w:t>
+        <w:t>u l</w:t>
+      </w:r>
+      <w:r>
+        <w:t>ớ</w:t>
+      </w:r>
+      <w:r>
+        <w:t xml:space="preserve">n hơn </w:t>
+      </w:r>
+      <w:r>
+        <w:t>ở</w:t>
+      </w:r>
+      <w:r>
+        <w:t xml:space="preserve"> hư</w:t>
+      </w:r>
+      <w:r>
+        <w:t>ớ</w:t>
+      </w:r>
+      <w:r>
+        <w:t>ng phát tri</w:t>
+      </w:r>
+      <w:r>
+        <w:t>ể</w:t>
+      </w:r>
+      <w:r>
+        <w:t>n s</w:t>
+      </w:r>
+      <w:r>
+        <w:t>ố</w:t>
+      </w:r>
+      <w:r>
+        <w:t xml:space="preserve"> 2 (m</w:t>
+      </w:r>
+      <w:r>
+        <w:t>ụ</w:t>
+      </w:r>
+      <w:r>
+        <w:t>c 5.3). Đây là ví d</w:t>
       </w:r>
       <w:r>
         <w:t>ụ</w:t>
@@ -54460,10 +54702,7 @@
         <w:t>ng bao quanh</w:t>
       </w:r>
       <w:r>
-        <w:t xml:space="preserve"> </w:t>
-      </w:r>
-      <w:r>
-        <w:t>— sao đúng chu</w:t>
+        <w:t xml:space="preserve"> — sao đúng chu</w:t>
       </w:r>
       <w:r>
         <w:t>ỗ</w:t>
@@ -54534,21 +54773,21 @@
           <w:b/>
           <w:bCs/>
         </w:rPr>
-        <w:t xml:space="preserve">ng </w:t>
-      </w:r>
-      <w:r>
-        <w:rPr>
-          <w:b/>
-          <w:bCs/>
-        </w:rPr>
-        <w:t>ả</w:t>
-      </w:r>
-      <w:r>
-        <w:rPr>
-          <w:b/>
-          <w:bCs/>
-        </w:rPr>
-        <w:t>nh đã chu</w:t>
+        <w:t>ng 2.801 vùng bi</w:t>
+      </w:r>
+      <w:r>
+        <w:rPr>
+          <w:b/>
+          <w:bCs/>
+        </w:rPr>
+        <w:t>ể</w:t>
+      </w:r>
+      <w:r>
+        <w:rPr>
+          <w:b/>
+          <w:bCs/>
+        </w:rPr>
+        <w:t>n đã chu</w:t>
       </w:r>
       <w:r>
         <w:rPr>
@@ -55147,7 +55386,10 @@
         <w:t>n trong phép đo này</w:t>
       </w:r>
       <w:r>
-        <w:t xml:space="preserve"> — 68,87%, hơn EasyOCR 54,59 đi</w:t>
+        <w:t xml:space="preserve"> </w:t>
+      </w:r>
+      <w:r>
+        <w:t>— 68,87%, hơn EasyOCR 54,59 đi</w:t>
       </w:r>
       <w:r>
         <w:t>ể</w:t>
@@ -56266,7 +56508,10 @@
         <w:t xml:space="preserve"> ba</w:t>
       </w:r>
       <w:r>
-        <w:t xml:space="preserve"> (+5,14 · +3,93 · +0,68 đi</w:t>
+        <w:t xml:space="preserve"> </w:t>
+      </w:r>
+      <w:r>
+        <w:t>(+5,14 · +3,93 · +0,68 đi</w:t>
       </w:r>
       <w:r>
         <w:t>ể</w:t>
@@ -56326,7 +56571,7 @@
         <w:pStyle w:val="Heading2"/>
       </w:pPr>
       <w:bookmarkStart w:id="106" w:name="X0c205a3fd5474e5e1d380a3735df7543f97f059"/>
-      <w:bookmarkStart w:id="107" w:name="_Toc239335785"/>
+      <w:bookmarkStart w:id="107" w:name="_Toc239336156"/>
       <w:bookmarkEnd w:id="95"/>
       <w:bookmarkEnd w:id="104"/>
       <w:r>
@@ -59000,10 +59245,7 @@
         <w:t>c"</w:t>
       </w:r>
       <w:r>
-        <w:t xml:space="preserve"> </w:t>
-      </w:r>
-      <w:r>
-        <w:t>— không ph</w:t>
+        <w:t xml:space="preserve"> — không ph</w:t>
       </w:r>
       <w:r>
         <w:t>ả</w:t>
@@ -59271,7 +59513,7 @@
         <w:pStyle w:val="Heading2"/>
       </w:pPr>
       <w:bookmarkStart w:id="113" w:name="X8f4b2c0e55e8764a0677cdfa39e96dbe6822859"/>
-      <w:bookmarkStart w:id="114" w:name="_Toc239335786"/>
+      <w:bookmarkStart w:id="114" w:name="_Toc239336157"/>
       <w:bookmarkEnd w:id="106"/>
       <w:bookmarkEnd w:id="112"/>
       <w:r>
@@ -62414,7 +62656,7 @@
         <w:pStyle w:val="Heading2"/>
       </w:pPr>
       <w:bookmarkStart w:id="120" w:name="X7468ed9f095dd0192ebc5de940dc44b5cd3e099"/>
-      <w:bookmarkStart w:id="121" w:name="_Toc239335787"/>
+      <w:bookmarkStart w:id="121" w:name="_Toc239336158"/>
       <w:bookmarkEnd w:id="113"/>
       <w:bookmarkEnd w:id="118"/>
       <w:r>
@@ -64275,7 +64517,7 @@
           <w:noProof/>
         </w:rPr>
         <w:drawing>
-          <wp:inline distT="0" distB="0" distL="0" distR="0" wp14:anchorId="5DB3DB02" wp14:editId="57E5CEAA">
+          <wp:inline distT="0" distB="0" distL="0" distR="0" wp14:anchorId="5586442F" wp14:editId="1AF2A8E0">
             <wp:extent cx="5334000" cy="3317670"/>
             <wp:effectExtent l="0" t="0" r="0" b="0"/>
             <wp:docPr id="131" name="Picture"/>
@@ -65007,7 +65249,7 @@
         <w:pStyle w:val="Heading2"/>
       </w:pPr>
       <w:bookmarkStart w:id="124" w:name="X88e1c26a6581f7bd1dbdb2c85ae6116c5ba8393"/>
-      <w:bookmarkStart w:id="125" w:name="_Toc239335788"/>
+      <w:bookmarkStart w:id="125" w:name="_Toc239336159"/>
       <w:bookmarkEnd w:id="120"/>
       <w:r>
         <w:t>4.7. Các y</w:t>
@@ -66862,7 +67104,7 @@
         <w:pStyle w:val="Heading1"/>
       </w:pPr>
       <w:bookmarkStart w:id="127" w:name="chương-5-kết-luận-và-hướng-phát-triển"/>
-      <w:bookmarkStart w:id="128" w:name="_Toc239335789"/>
+      <w:bookmarkStart w:id="128" w:name="_Toc239336160"/>
       <w:bookmarkEnd w:id="83"/>
       <w:bookmarkEnd w:id="124"/>
       <w:r>
@@ -66899,7 +67141,7 @@
         <w:pStyle w:val="Heading2"/>
       </w:pPr>
       <w:bookmarkStart w:id="129" w:name="Xcefa088882d41b38c21b7b5b44c738cb5564fbb"/>
-      <w:bookmarkStart w:id="130" w:name="_Toc239335790"/>
+      <w:bookmarkStart w:id="130" w:name="_Toc239336161"/>
       <w:r>
         <w:t>5.1. K</w:t>
       </w:r>
@@ -68400,7 +68642,7 @@
         <w:pStyle w:val="Heading2"/>
       </w:pPr>
       <w:bookmarkStart w:id="132" w:name="Xe79f58ab8ce7b6f148c68a374118dd9eaec1a1c"/>
-      <w:bookmarkStart w:id="133" w:name="_Toc239335791"/>
+      <w:bookmarkStart w:id="133" w:name="_Toc239336162"/>
       <w:bookmarkEnd w:id="129"/>
       <w:r>
         <w:t>5.2. H</w:t>
@@ -69837,7 +70079,7 @@
         <w:pStyle w:val="Heading2"/>
       </w:pPr>
       <w:bookmarkStart w:id="135" w:name="X66db71c9020c40cf46e490c5c37ad244e2b7594"/>
-      <w:bookmarkStart w:id="136" w:name="_Toc239335792"/>
+      <w:bookmarkStart w:id="136" w:name="_Toc239336163"/>
       <w:bookmarkEnd w:id="132"/>
       <w:r>
         <w:t>5.3. Hư</w:t>
@@ -71425,7 +71667,7 @@
         <w:pStyle w:val="Heading2"/>
       </w:pPr>
       <w:bookmarkStart w:id="138" w:name="Xe5a2fe3dfcd4681648271b7ddc344b106e48b3b"/>
-      <w:bookmarkStart w:id="139" w:name="_Toc239335793"/>
+      <w:bookmarkStart w:id="139" w:name="_Toc239336164"/>
       <w:bookmarkEnd w:id="135"/>
       <w:r>
         <w:t>5.4. K</w:t>
@@ -72351,7 +72593,7 @@
         <w:pStyle w:val="Heading1"/>
       </w:pPr>
       <w:bookmarkStart w:id="140" w:name="tài-liệu-tham-khảo"/>
-      <w:bookmarkStart w:id="141" w:name="_Toc239335794"/>
+      <w:bookmarkStart w:id="141" w:name="_Toc239336165"/>
       <w:bookmarkEnd w:id="127"/>
       <w:bookmarkEnd w:id="138"/>
       <w:r>
@@ -73380,7 +73622,7 @@
         <w:pStyle w:val="Heading1"/>
       </w:pPr>
       <w:bookmarkStart w:id="142" w:name="phụ-lục"/>
-      <w:bookmarkStart w:id="143" w:name="_Toc239335795"/>
+      <w:bookmarkStart w:id="143" w:name="_Toc239336166"/>
       <w:bookmarkEnd w:id="140"/>
       <w:r>
         <w:t>PH</w:t>
@@ -73404,7 +73646,7 @@
         <w:pStyle w:val="Heading2"/>
       </w:pPr>
       <w:bookmarkStart w:id="144" w:name="phụ-lục-a-cấu-hình-và-siêu-tham-số"/>
-      <w:bookmarkStart w:id="145" w:name="_Toc239335796"/>
+      <w:bookmarkStart w:id="145" w:name="_Toc239336167"/>
       <w:r>
         <w:t>Ph</w:t>
       </w:r>
@@ -75624,7 +75866,7 @@
         <w:pStyle w:val="Heading2"/>
       </w:pPr>
       <w:bookmarkStart w:id="149" w:name="phụ-lục-b-hướng-dẫn-cài-đặt-và-chạy"/>
-      <w:bookmarkStart w:id="150" w:name="_Toc239335797"/>
+      <w:bookmarkStart w:id="150" w:name="_Toc239336168"/>
       <w:bookmarkEnd w:id="144"/>
       <w:bookmarkEnd w:id="148"/>
       <w:r>
@@ -77193,7 +77435,7 @@
   <w:abstractNum w:abstractNumId="0" w15:restartNumberingAfterBreak="0">
     <w:nsid w:val="0000A990"/>
     <w:multiLevelType w:val="multilevel"/>
-    <w:tmpl w:val="5AACE3F6"/>
+    <w:tmpl w:val="C15A0EFC"/>
     <w:lvl w:ilvl="0">
       <w:numFmt w:val="bullet"/>
       <w:lvlText w:val=" "/>
@@ -77270,7 +77512,7 @@
   <w:abstractNum w:abstractNumId="1" w15:restartNumberingAfterBreak="0">
     <w:nsid w:val="0000A991"/>
     <w:multiLevelType w:val="multilevel"/>
-    <w:tmpl w:val="6DF02C1C"/>
+    <w:tmpl w:val="9942E758"/>
     <w:lvl w:ilvl="0">
       <w:numFmt w:val="bullet"/>
       <w:lvlText w:val=""/>
@@ -77374,7 +77616,7 @@
   <w:abstractNum w:abstractNumId="2" w15:restartNumberingAfterBreak="0">
     <w:nsid w:val="00A99411"/>
     <w:multiLevelType w:val="multilevel"/>
-    <w:tmpl w:val="2334F70C"/>
+    <w:tmpl w:val="112C253C"/>
     <w:lvl w:ilvl="0">
       <w:start w:val="1"/>
       <w:numFmt w:val="decimal"/>
@@ -77457,10 +77699,10 @@
       </w:pPr>
     </w:lvl>
   </w:abstractNum>
-  <w:num w:numId="1" w16cid:durableId="772475117">
+  <w:num w:numId="1" w16cid:durableId="1920405495">
     <w:abstractNumId w:val="0"/>
   </w:num>
-  <w:num w:numId="2" w16cid:durableId="644897484">
+  <w:num w:numId="2" w16cid:durableId="821965933">
     <w:abstractNumId w:val="2"/>
     <w:lvlOverride w:ilvl="0">
       <w:startOverride w:val="1"/>
@@ -77490,22 +77732,22 @@
       <w:startOverride w:val="1"/>
     </w:lvlOverride>
   </w:num>
-  <w:num w:numId="3" w16cid:durableId="227350168">
+  <w:num w:numId="3" w16cid:durableId="1534224667">
     <w:abstractNumId w:val="1"/>
   </w:num>
-  <w:num w:numId="4" w16cid:durableId="320275705">
+  <w:num w:numId="4" w16cid:durableId="1992446712">
     <w:abstractNumId w:val="1"/>
   </w:num>
-  <w:num w:numId="5" w16cid:durableId="1140221393">
+  <w:num w:numId="5" w16cid:durableId="569117380">
     <w:abstractNumId w:val="1"/>
   </w:num>
-  <w:num w:numId="6" w16cid:durableId="1156845879">
+  <w:num w:numId="6" w16cid:durableId="1176074559">
     <w:abstractNumId w:val="1"/>
   </w:num>
-  <w:num w:numId="7" w16cid:durableId="890312753">
+  <w:num w:numId="7" w16cid:durableId="492182084">
     <w:abstractNumId w:val="1"/>
   </w:num>
-  <w:num w:numId="8" w16cid:durableId="1649482611">
+  <w:num w:numId="8" w16cid:durableId="778649968">
     <w:abstractNumId w:val="2"/>
     <w:lvlOverride w:ilvl="0">
       <w:startOverride w:val="1"/>
@@ -77535,7 +77777,7 @@
       <w:startOverride w:val="1"/>
     </w:lvlOverride>
   </w:num>
-  <w:num w:numId="9" w16cid:durableId="2093894507">
+  <w:num w:numId="9" w16cid:durableId="549147985">
     <w:abstractNumId w:val="1"/>
   </w:num>
 </w:numbering>
@@ -78772,7 +79014,7 @@
     <w:next w:val="Normal"/>
     <w:autoRedefine/>
     <w:uiPriority w:val="39"/>
-    <w:rsid w:val="007B2554"/>
+    <w:rsid w:val="00326B9B"/>
     <w:pPr>
       <w:spacing w:after="100"/>
     </w:pPr>
@@ -78783,7 +79025,7 @@
     <w:next w:val="Normal"/>
     <w:autoRedefine/>
     <w:uiPriority w:val="39"/>
-    <w:rsid w:val="007B2554"/>
+    <w:rsid w:val="00326B9B"/>
     <w:pPr>
       <w:spacing w:after="100"/>
       <w:ind w:left="240"/>

</xml_diff>

<commit_message>
docs(mon-hoc): dong bo slide 13/15 voi quyen; bo han che 5 da khep khoi Bang 5.2
1. Slide 15 huong #2 "Thay bang anh xa bang bang trich tu ma tran" doc nhu
   chua lam, trong khi 4.3.3 noi da thay mot phan. Doi thanh "Mo rong bang
   anh xa tu ma tran nham lan khi co them du lieu" + ghi chu vong dau da
   +53 bien, 5 cap con lai chua du bang chung — khop Bang 5.3 hang 2.
2. Bang 5.2: bo hang 5 (do tre p95 — da khep; "da khep sao con trong bang
   han che?"). Sau -> Nam han che, hang 6 -> 5; Bang 5.3 cot "Giai han che"
   2,6 -> 2,5 va huong 6 (tang toc) -> "—".
3. Slide 13 "mot trong hai suy sai chieu" mau thuan Bang 4.6 (ca hai cap
   duoc phu deu dung chieu). Kiem ma nguon plate_rules.py: TO_LETTER 1->L
   dung, TO_DIGIT L->4 (ban do, khong phai L->1). Cai sai la muc L->1 o vi
   tri chu so doan sai DICH; sua cau cho dung: "muc L->1 o vi tri chu so
   doan sai dich — do duoc L that ra la 4 (53 lan)".

Kiem: refs 0 chet, PDF 40 trang, PAGEREF nguyen, check_slides 16/0 loi.
</commit_message>
<xml_diff>
--- a/docs/papers/mon-hoc/thesis-full.docx
+++ b/docs/papers/mon-hoc/thesis-full.docx
@@ -148,7 +148,7 @@
         <w:pStyle w:val="Heading1"/>
       </w:pPr>
       <w:bookmarkStart w:id="0" w:name="đồ-án-môn-học"/>
-      <w:bookmarkStart w:id="1" w:name="_Toc239336132"/>
+      <w:bookmarkStart w:id="1" w:name="_Toc239336670"/>
       <w:r>
         <w:t>Đ</w:t>
       </w:r>
@@ -220,7 +220,7 @@
         <w:pStyle w:val="Heading1"/>
       </w:pPr>
       <w:bookmarkStart w:id="4" w:name="Xbe958ce37c6a089ac9bdc99dada4ec5e2c0f7da"/>
-      <w:bookmarkStart w:id="5" w:name="_Toc239336133"/>
+      <w:bookmarkStart w:id="5" w:name="_Toc239336671"/>
       <w:bookmarkEnd w:id="0"/>
       <w:bookmarkEnd w:id="3"/>
       <w:r>
@@ -795,7 +795,7 @@
     </w:p>
     <w:p>
       <w:r>
-        <w:pict w14:anchorId="35C4D72C">
+        <w:pict w14:anchorId="3462DBE1">
           <v:rect id="_x0000_i1025" style="width:0;height:1.5pt" o:hralign="center" o:hrstd="t" o:hr="t"/>
         </w:pict>
       </w:r>
@@ -805,7 +805,7 @@
         <w:pStyle w:val="Heading2"/>
       </w:pPr>
       <w:bookmarkStart w:id="6" w:name="mục-lục"/>
-      <w:bookmarkStart w:id="7" w:name="_Toc239336134"/>
+      <w:bookmarkStart w:id="7" w:name="_Toc239336672"/>
       <w:r>
         <w:t>M</w:t>
       </w:r>
@@ -845,7 +845,7 @@
       <w:r>
         <w:fldChar w:fldCharType="separate"/>
       </w:r>
-      <w:hyperlink w:anchor="_Toc239336132" w:history="1">
+      <w:hyperlink w:anchor="_Toc239336670" w:history="1">
         <w:r>
           <w:rPr>
             <w:rStyle w:val="Hyperlink"/>
@@ -872,7 +872,7 @@
             <w:noProof/>
             <w:webHidden/>
           </w:rPr>
-          <w:instrText xml:space="preserve"> PAGEREF _Toc239336132 \h </w:instrText>
+          <w:instrText xml:space="preserve"> PAGEREF _Toc239336670 \h </w:instrText>
         </w:r>
         <w:r>
           <w:rPr>
@@ -916,7 +916,7 @@
           <w14:ligatures w14:val="standardContextual"/>
         </w:rPr>
       </w:pPr>
-      <w:hyperlink w:anchor="_Toc239336133" w:history="1">
+      <w:hyperlink w:anchor="_Toc239336671" w:history="1">
         <w:r>
           <w:rPr>
             <w:rStyle w:val="Hyperlink"/>
@@ -943,7 +943,7 @@
             <w:noProof/>
             <w:webHidden/>
           </w:rPr>
-          <w:instrText xml:space="preserve"> PAGEREF _Toc239336133 \h </w:instrText>
+          <w:instrText xml:space="preserve"> PAGEREF _Toc239336671 \h </w:instrText>
         </w:r>
         <w:r>
           <w:rPr>
@@ -987,7 +987,7 @@
           <w14:ligatures w14:val="standardContextual"/>
         </w:rPr>
       </w:pPr>
-      <w:hyperlink w:anchor="_Toc239336134" w:history="1">
+      <w:hyperlink w:anchor="_Toc239336672" w:history="1">
         <w:r>
           <w:rPr>
             <w:rStyle w:val="Hyperlink"/>
@@ -1014,7 +1014,7 @@
             <w:noProof/>
             <w:webHidden/>
           </w:rPr>
-          <w:instrText xml:space="preserve"> PAGEREF _Toc239336134 \h </w:instrText>
+          <w:instrText xml:space="preserve"> PAGEREF _Toc239336672 \h </w:instrText>
         </w:r>
         <w:r>
           <w:rPr>
@@ -1058,7 +1058,7 @@
           <w14:ligatures w14:val="standardContextual"/>
         </w:rPr>
       </w:pPr>
-      <w:hyperlink w:anchor="_Toc239336135" w:history="1">
+      <w:hyperlink w:anchor="_Toc239336673" w:history="1">
         <w:r>
           <w:rPr>
             <w:rStyle w:val="Hyperlink"/>
@@ -1085,7 +1085,7 @@
             <w:noProof/>
             <w:webHidden/>
           </w:rPr>
-          <w:instrText xml:space="preserve"> PAGEREF _Toc239336135 \h </w:instrText>
+          <w:instrText xml:space="preserve"> PAGEREF _Toc239336673 \h </w:instrText>
         </w:r>
         <w:r>
           <w:rPr>
@@ -1129,7 +1129,7 @@
           <w14:ligatures w14:val="standardContextual"/>
         </w:rPr>
       </w:pPr>
-      <w:hyperlink w:anchor="_Toc239336136" w:history="1">
+      <w:hyperlink w:anchor="_Toc239336674" w:history="1">
         <w:r>
           <w:rPr>
             <w:rStyle w:val="Hyperlink"/>
@@ -1156,7 +1156,7 @@
             <w:noProof/>
             <w:webHidden/>
           </w:rPr>
-          <w:instrText xml:space="preserve"> PAGEREF _Toc239336136 \h </w:instrText>
+          <w:instrText xml:space="preserve"> PAGEREF _Toc239336674 \h </w:instrText>
         </w:r>
         <w:r>
           <w:rPr>
@@ -1200,7 +1200,7 @@
           <w14:ligatures w14:val="standardContextual"/>
         </w:rPr>
       </w:pPr>
-      <w:hyperlink w:anchor="_Toc239336137" w:history="1">
+      <w:hyperlink w:anchor="_Toc239336675" w:history="1">
         <w:r>
           <w:rPr>
             <w:rStyle w:val="Hyperlink"/>
@@ -1227,7 +1227,7 @@
             <w:noProof/>
             <w:webHidden/>
           </w:rPr>
-          <w:instrText xml:space="preserve"> PAGEREF _Toc239336137 \h </w:instrText>
+          <w:instrText xml:space="preserve"> PAGEREF _Toc239336675 \h </w:instrText>
         </w:r>
         <w:r>
           <w:rPr>
@@ -1271,7 +1271,7 @@
           <w14:ligatures w14:val="standardContextual"/>
         </w:rPr>
       </w:pPr>
-      <w:hyperlink w:anchor="_Toc239336138" w:history="1">
+      <w:hyperlink w:anchor="_Toc239336676" w:history="1">
         <w:r>
           <w:rPr>
             <w:rStyle w:val="Hyperlink"/>
@@ -1298,7 +1298,7 @@
             <w:noProof/>
             <w:webHidden/>
           </w:rPr>
-          <w:instrText xml:space="preserve"> PAGEREF _Toc239336138 \h </w:instrText>
+          <w:instrText xml:space="preserve"> PAGEREF _Toc239336676 \h </w:instrText>
         </w:r>
         <w:r>
           <w:rPr>
@@ -1342,7 +1342,7 @@
           <w14:ligatures w14:val="standardContextual"/>
         </w:rPr>
       </w:pPr>
-      <w:hyperlink w:anchor="_Toc239336139" w:history="1">
+      <w:hyperlink w:anchor="_Toc239336677" w:history="1">
         <w:r>
           <w:rPr>
             <w:rStyle w:val="Hyperlink"/>
@@ -1369,7 +1369,7 @@
             <w:noProof/>
             <w:webHidden/>
           </w:rPr>
-          <w:instrText xml:space="preserve"> PAGEREF _Toc239336139 \h </w:instrText>
+          <w:instrText xml:space="preserve"> PAGEREF _Toc239336677 \h </w:instrText>
         </w:r>
         <w:r>
           <w:rPr>
@@ -1413,7 +1413,7 @@
           <w14:ligatures w14:val="standardContextual"/>
         </w:rPr>
       </w:pPr>
-      <w:hyperlink w:anchor="_Toc239336140" w:history="1">
+      <w:hyperlink w:anchor="_Toc239336678" w:history="1">
         <w:r>
           <w:rPr>
             <w:rStyle w:val="Hyperlink"/>
@@ -1440,7 +1440,7 @@
             <w:noProof/>
             <w:webHidden/>
           </w:rPr>
-          <w:instrText xml:space="preserve"> PAGEREF _Toc239336140 \h </w:instrText>
+          <w:instrText xml:space="preserve"> PAGEREF _Toc239336678 \h </w:instrText>
         </w:r>
         <w:r>
           <w:rPr>
@@ -1484,7 +1484,7 @@
           <w14:ligatures w14:val="standardContextual"/>
         </w:rPr>
       </w:pPr>
-      <w:hyperlink w:anchor="_Toc239336141" w:history="1">
+      <w:hyperlink w:anchor="_Toc239336679" w:history="1">
         <w:r>
           <w:rPr>
             <w:rStyle w:val="Hyperlink"/>
@@ -1511,7 +1511,7 @@
             <w:noProof/>
             <w:webHidden/>
           </w:rPr>
-          <w:instrText xml:space="preserve"> PAGEREF _Toc239336141 \h </w:instrText>
+          <w:instrText xml:space="preserve"> PAGEREF _Toc239336679 \h </w:instrText>
         </w:r>
         <w:r>
           <w:rPr>
@@ -1555,7 +1555,7 @@
           <w14:ligatures w14:val="standardContextual"/>
         </w:rPr>
       </w:pPr>
-      <w:hyperlink w:anchor="_Toc239336142" w:history="1">
+      <w:hyperlink w:anchor="_Toc239336680" w:history="1">
         <w:r>
           <w:rPr>
             <w:rStyle w:val="Hyperlink"/>
@@ -1582,7 +1582,7 @@
             <w:noProof/>
             <w:webHidden/>
           </w:rPr>
-          <w:instrText xml:space="preserve"> PAGEREF _Toc239336142 \h </w:instrText>
+          <w:instrText xml:space="preserve"> PAGEREF _Toc239336680 \h </w:instrText>
         </w:r>
         <w:r>
           <w:rPr>
@@ -1626,7 +1626,7 @@
           <w14:ligatures w14:val="standardContextual"/>
         </w:rPr>
       </w:pPr>
-      <w:hyperlink w:anchor="_Toc239336143" w:history="1">
+      <w:hyperlink w:anchor="_Toc239336681" w:history="1">
         <w:r>
           <w:rPr>
             <w:rStyle w:val="Hyperlink"/>
@@ -1653,7 +1653,7 @@
             <w:noProof/>
             <w:webHidden/>
           </w:rPr>
-          <w:instrText xml:space="preserve"> PAGEREF _Toc239336143 \h </w:instrText>
+          <w:instrText xml:space="preserve"> PAGEREF _Toc239336681 \h </w:instrText>
         </w:r>
         <w:r>
           <w:rPr>
@@ -1697,7 +1697,7 @@
           <w14:ligatures w14:val="standardContextual"/>
         </w:rPr>
       </w:pPr>
-      <w:hyperlink w:anchor="_Toc239336144" w:history="1">
+      <w:hyperlink w:anchor="_Toc239336682" w:history="1">
         <w:r>
           <w:rPr>
             <w:rStyle w:val="Hyperlink"/>
@@ -1724,7 +1724,7 @@
             <w:noProof/>
             <w:webHidden/>
           </w:rPr>
-          <w:instrText xml:space="preserve"> PAGEREF _Toc239336144 \h </w:instrText>
+          <w:instrText xml:space="preserve"> PAGEREF _Toc239336682 \h </w:instrText>
         </w:r>
         <w:r>
           <w:rPr>
@@ -1768,7 +1768,7 @@
           <w14:ligatures w14:val="standardContextual"/>
         </w:rPr>
       </w:pPr>
-      <w:hyperlink w:anchor="_Toc239336145" w:history="1">
+      <w:hyperlink w:anchor="_Toc239336683" w:history="1">
         <w:r>
           <w:rPr>
             <w:rStyle w:val="Hyperlink"/>
@@ -1795,7 +1795,7 @@
             <w:noProof/>
             <w:webHidden/>
           </w:rPr>
-          <w:instrText xml:space="preserve"> PAGEREF _Toc239336145 \h </w:instrText>
+          <w:instrText xml:space="preserve"> PAGEREF _Toc239336683 \h </w:instrText>
         </w:r>
         <w:r>
           <w:rPr>
@@ -1839,7 +1839,7 @@
           <w14:ligatures w14:val="standardContextual"/>
         </w:rPr>
       </w:pPr>
-      <w:hyperlink w:anchor="_Toc239336146" w:history="1">
+      <w:hyperlink w:anchor="_Toc239336684" w:history="1">
         <w:r>
           <w:rPr>
             <w:rStyle w:val="Hyperlink"/>
@@ -1866,7 +1866,7 @@
             <w:noProof/>
             <w:webHidden/>
           </w:rPr>
-          <w:instrText xml:space="preserve"> PAGEREF _Toc239336146 \h </w:instrText>
+          <w:instrText xml:space="preserve"> PAGEREF _Toc239336684 \h </w:instrText>
         </w:r>
         <w:r>
           <w:rPr>
@@ -1910,7 +1910,7 @@
           <w14:ligatures w14:val="standardContextual"/>
         </w:rPr>
       </w:pPr>
-      <w:hyperlink w:anchor="_Toc239336147" w:history="1">
+      <w:hyperlink w:anchor="_Toc239336685" w:history="1">
         <w:r>
           <w:rPr>
             <w:rStyle w:val="Hyperlink"/>
@@ -1937,7 +1937,7 @@
             <w:noProof/>
             <w:webHidden/>
           </w:rPr>
-          <w:instrText xml:space="preserve"> PAGEREF _Toc239336147 \h </w:instrText>
+          <w:instrText xml:space="preserve"> PAGEREF _Toc239336685 \h </w:instrText>
         </w:r>
         <w:r>
           <w:rPr>
@@ -1981,7 +1981,7 @@
           <w14:ligatures w14:val="standardContextual"/>
         </w:rPr>
       </w:pPr>
-      <w:hyperlink w:anchor="_Toc239336148" w:history="1">
+      <w:hyperlink w:anchor="_Toc239336686" w:history="1">
         <w:r>
           <w:rPr>
             <w:rStyle w:val="Hyperlink"/>
@@ -2008,7 +2008,7 @@
             <w:noProof/>
             <w:webHidden/>
           </w:rPr>
-          <w:instrText xml:space="preserve"> PAGEREF _Toc239336148 \h </w:instrText>
+          <w:instrText xml:space="preserve"> PAGEREF _Toc239336686 \h </w:instrText>
         </w:r>
         <w:r>
           <w:rPr>
@@ -2052,7 +2052,7 @@
           <w14:ligatures w14:val="standardContextual"/>
         </w:rPr>
       </w:pPr>
-      <w:hyperlink w:anchor="_Toc239336149" w:history="1">
+      <w:hyperlink w:anchor="_Toc239336687" w:history="1">
         <w:r>
           <w:rPr>
             <w:rStyle w:val="Hyperlink"/>
@@ -2079,7 +2079,7 @@
             <w:noProof/>
             <w:webHidden/>
           </w:rPr>
-          <w:instrText xml:space="preserve"> PAGEREF _Toc239336149 \h </w:instrText>
+          <w:instrText xml:space="preserve"> PAGEREF _Toc239336687 \h </w:instrText>
         </w:r>
         <w:r>
           <w:rPr>
@@ -2123,7 +2123,7 @@
           <w14:ligatures w14:val="standardContextual"/>
         </w:rPr>
       </w:pPr>
-      <w:hyperlink w:anchor="_Toc239336150" w:history="1">
+      <w:hyperlink w:anchor="_Toc239336688" w:history="1">
         <w:r>
           <w:rPr>
             <w:rStyle w:val="Hyperlink"/>
@@ -2150,7 +2150,7 @@
             <w:noProof/>
             <w:webHidden/>
           </w:rPr>
-          <w:instrText xml:space="preserve"> PAGEREF _Toc239336150 \h </w:instrText>
+          <w:instrText xml:space="preserve"> PAGEREF _Toc239336688 \h </w:instrText>
         </w:r>
         <w:r>
           <w:rPr>
@@ -2194,7 +2194,7 @@
           <w14:ligatures w14:val="standardContextual"/>
         </w:rPr>
       </w:pPr>
-      <w:hyperlink w:anchor="_Toc239336151" w:history="1">
+      <w:hyperlink w:anchor="_Toc239336689" w:history="1">
         <w:r>
           <w:rPr>
             <w:rStyle w:val="Hyperlink"/>
@@ -2221,7 +2221,7 @@
             <w:noProof/>
             <w:webHidden/>
           </w:rPr>
-          <w:instrText xml:space="preserve"> PAGEREF _Toc239336151 \h </w:instrText>
+          <w:instrText xml:space="preserve"> PAGEREF _Toc239336689 \h </w:instrText>
         </w:r>
         <w:r>
           <w:rPr>
@@ -2265,7 +2265,7 @@
           <w14:ligatures w14:val="standardContextual"/>
         </w:rPr>
       </w:pPr>
-      <w:hyperlink w:anchor="_Toc239336152" w:history="1">
+      <w:hyperlink w:anchor="_Toc239336690" w:history="1">
         <w:r>
           <w:rPr>
             <w:rStyle w:val="Hyperlink"/>
@@ -2292,7 +2292,7 @@
             <w:noProof/>
             <w:webHidden/>
           </w:rPr>
-          <w:instrText xml:space="preserve"> PAGEREF _Toc239336152 \h </w:instrText>
+          <w:instrText xml:space="preserve"> PAGEREF _Toc239336690 \h </w:instrText>
         </w:r>
         <w:r>
           <w:rPr>
@@ -2336,7 +2336,7 @@
           <w14:ligatures w14:val="standardContextual"/>
         </w:rPr>
       </w:pPr>
-      <w:hyperlink w:anchor="_Toc239336153" w:history="1">
+      <w:hyperlink w:anchor="_Toc239336691" w:history="1">
         <w:r>
           <w:rPr>
             <w:rStyle w:val="Hyperlink"/>
@@ -2363,7 +2363,7 @@
             <w:noProof/>
             <w:webHidden/>
           </w:rPr>
-          <w:instrText xml:space="preserve"> PAGEREF _Toc239336153 \h </w:instrText>
+          <w:instrText xml:space="preserve"> PAGEREF _Toc239336691 \h </w:instrText>
         </w:r>
         <w:r>
           <w:rPr>
@@ -2407,7 +2407,7 @@
           <w14:ligatures w14:val="standardContextual"/>
         </w:rPr>
       </w:pPr>
-      <w:hyperlink w:anchor="_Toc239336154" w:history="1">
+      <w:hyperlink w:anchor="_Toc239336692" w:history="1">
         <w:r>
           <w:rPr>
             <w:rStyle w:val="Hyperlink"/>
@@ -2434,7 +2434,7 @@
             <w:noProof/>
             <w:webHidden/>
           </w:rPr>
-          <w:instrText xml:space="preserve"> PAGEREF _Toc239336154 \h </w:instrText>
+          <w:instrText xml:space="preserve"> PAGEREF _Toc239336692 \h </w:instrText>
         </w:r>
         <w:r>
           <w:rPr>
@@ -2478,7 +2478,7 @@
           <w14:ligatures w14:val="standardContextual"/>
         </w:rPr>
       </w:pPr>
-      <w:hyperlink w:anchor="_Toc239336155" w:history="1">
+      <w:hyperlink w:anchor="_Toc239336693" w:history="1">
         <w:r>
           <w:rPr>
             <w:rStyle w:val="Hyperlink"/>
@@ -2505,7 +2505,7 @@
             <w:noProof/>
             <w:webHidden/>
           </w:rPr>
-          <w:instrText xml:space="preserve"> PAGEREF _Toc239336155 \h </w:instrText>
+          <w:instrText xml:space="preserve"> PAGEREF _Toc239336693 \h </w:instrText>
         </w:r>
         <w:r>
           <w:rPr>
@@ -2549,7 +2549,7 @@
           <w14:ligatures w14:val="standardContextual"/>
         </w:rPr>
       </w:pPr>
-      <w:hyperlink w:anchor="_Toc239336156" w:history="1">
+      <w:hyperlink w:anchor="_Toc239336694" w:history="1">
         <w:r>
           <w:rPr>
             <w:rStyle w:val="Hyperlink"/>
@@ -2576,7 +2576,7 @@
             <w:noProof/>
             <w:webHidden/>
           </w:rPr>
-          <w:instrText xml:space="preserve"> PAGEREF _Toc239336156 \h </w:instrText>
+          <w:instrText xml:space="preserve"> PAGEREF _Toc239336694 \h </w:instrText>
         </w:r>
         <w:r>
           <w:rPr>
@@ -2620,7 +2620,7 @@
           <w14:ligatures w14:val="standardContextual"/>
         </w:rPr>
       </w:pPr>
-      <w:hyperlink w:anchor="_Toc239336157" w:history="1">
+      <w:hyperlink w:anchor="_Toc239336695" w:history="1">
         <w:r>
           <w:rPr>
             <w:rStyle w:val="Hyperlink"/>
@@ -2647,7 +2647,7 @@
             <w:noProof/>
             <w:webHidden/>
           </w:rPr>
-          <w:instrText xml:space="preserve"> PAGEREF _Toc239336157 \h </w:instrText>
+          <w:instrText xml:space="preserve"> PAGEREF _Toc239336695 \h </w:instrText>
         </w:r>
         <w:r>
           <w:rPr>
@@ -2691,7 +2691,7 @@
           <w14:ligatures w14:val="standardContextual"/>
         </w:rPr>
       </w:pPr>
-      <w:hyperlink w:anchor="_Toc239336158" w:history="1">
+      <w:hyperlink w:anchor="_Toc239336696" w:history="1">
         <w:r>
           <w:rPr>
             <w:rStyle w:val="Hyperlink"/>
@@ -2718,7 +2718,7 @@
             <w:noProof/>
             <w:webHidden/>
           </w:rPr>
-          <w:instrText xml:space="preserve"> PAGEREF _Toc239336158 \h </w:instrText>
+          <w:instrText xml:space="preserve"> PAGEREF _Toc239336696 \h </w:instrText>
         </w:r>
         <w:r>
           <w:rPr>
@@ -2762,7 +2762,7 @@
           <w14:ligatures w14:val="standardContextual"/>
         </w:rPr>
       </w:pPr>
-      <w:hyperlink w:anchor="_Toc239336159" w:history="1">
+      <w:hyperlink w:anchor="_Toc239336697" w:history="1">
         <w:r>
           <w:rPr>
             <w:rStyle w:val="Hyperlink"/>
@@ -2789,7 +2789,7 @@
             <w:noProof/>
             <w:webHidden/>
           </w:rPr>
-          <w:instrText xml:space="preserve"> PAGEREF _Toc239336159 \h </w:instrText>
+          <w:instrText xml:space="preserve"> PAGEREF _Toc239336697 \h </w:instrText>
         </w:r>
         <w:r>
           <w:rPr>
@@ -2833,7 +2833,7 @@
           <w14:ligatures w14:val="standardContextual"/>
         </w:rPr>
       </w:pPr>
-      <w:hyperlink w:anchor="_Toc239336160" w:history="1">
+      <w:hyperlink w:anchor="_Toc239336698" w:history="1">
         <w:r>
           <w:rPr>
             <w:rStyle w:val="Hyperlink"/>
@@ -2860,7 +2860,7 @@
             <w:noProof/>
             <w:webHidden/>
           </w:rPr>
-          <w:instrText xml:space="preserve"> PAGEREF _Toc239336160 \h </w:instrText>
+          <w:instrText xml:space="preserve"> PAGEREF _Toc239336698 \h </w:instrText>
         </w:r>
         <w:r>
           <w:rPr>
@@ -2904,7 +2904,7 @@
           <w14:ligatures w14:val="standardContextual"/>
         </w:rPr>
       </w:pPr>
-      <w:hyperlink w:anchor="_Toc239336161" w:history="1">
+      <w:hyperlink w:anchor="_Toc239336699" w:history="1">
         <w:r>
           <w:rPr>
             <w:rStyle w:val="Hyperlink"/>
@@ -2931,7 +2931,7 @@
             <w:noProof/>
             <w:webHidden/>
           </w:rPr>
-          <w:instrText xml:space="preserve"> PAGEREF _Toc239336161 \h </w:instrText>
+          <w:instrText xml:space="preserve"> PAGEREF _Toc239336699 \h </w:instrText>
         </w:r>
         <w:r>
           <w:rPr>
@@ -2975,7 +2975,7 @@
           <w14:ligatures w14:val="standardContextual"/>
         </w:rPr>
       </w:pPr>
-      <w:hyperlink w:anchor="_Toc239336162" w:history="1">
+      <w:hyperlink w:anchor="_Toc239336700" w:history="1">
         <w:r>
           <w:rPr>
             <w:rStyle w:val="Hyperlink"/>
@@ -3002,7 +3002,7 @@
             <w:noProof/>
             <w:webHidden/>
           </w:rPr>
-          <w:instrText xml:space="preserve"> PAGEREF _Toc239336162 \h </w:instrText>
+          <w:instrText xml:space="preserve"> PAGEREF _Toc239336700 \h </w:instrText>
         </w:r>
         <w:r>
           <w:rPr>
@@ -3046,7 +3046,7 @@
           <w14:ligatures w14:val="standardContextual"/>
         </w:rPr>
       </w:pPr>
-      <w:hyperlink w:anchor="_Toc239336163" w:history="1">
+      <w:hyperlink w:anchor="_Toc239336701" w:history="1">
         <w:r>
           <w:rPr>
             <w:rStyle w:val="Hyperlink"/>
@@ -3073,7 +3073,7 @@
             <w:noProof/>
             <w:webHidden/>
           </w:rPr>
-          <w:instrText xml:space="preserve"> PAGEREF _Toc239336163 \h </w:instrText>
+          <w:instrText xml:space="preserve"> PAGEREF _Toc239336701 \h </w:instrText>
         </w:r>
         <w:r>
           <w:rPr>
@@ -3117,7 +3117,7 @@
           <w14:ligatures w14:val="standardContextual"/>
         </w:rPr>
       </w:pPr>
-      <w:hyperlink w:anchor="_Toc239336164" w:history="1">
+      <w:hyperlink w:anchor="_Toc239336702" w:history="1">
         <w:r>
           <w:rPr>
             <w:rStyle w:val="Hyperlink"/>
@@ -3144,7 +3144,7 @@
             <w:noProof/>
             <w:webHidden/>
           </w:rPr>
-          <w:instrText xml:space="preserve"> PAGEREF _Toc239336164 \h </w:instrText>
+          <w:instrText xml:space="preserve"> PAGEREF _Toc239336702 \h </w:instrText>
         </w:r>
         <w:r>
           <w:rPr>
@@ -3188,7 +3188,7 @@
           <w14:ligatures w14:val="standardContextual"/>
         </w:rPr>
       </w:pPr>
-      <w:hyperlink w:anchor="_Toc239336165" w:history="1">
+      <w:hyperlink w:anchor="_Toc239336703" w:history="1">
         <w:r>
           <w:rPr>
             <w:rStyle w:val="Hyperlink"/>
@@ -3215,7 +3215,7 @@
             <w:noProof/>
             <w:webHidden/>
           </w:rPr>
-          <w:instrText xml:space="preserve"> PAGEREF _Toc239336165 \h </w:instrText>
+          <w:instrText xml:space="preserve"> PAGEREF _Toc239336703 \h </w:instrText>
         </w:r>
         <w:r>
           <w:rPr>
@@ -3259,7 +3259,7 @@
           <w14:ligatures w14:val="standardContextual"/>
         </w:rPr>
       </w:pPr>
-      <w:hyperlink w:anchor="_Toc239336166" w:history="1">
+      <w:hyperlink w:anchor="_Toc239336704" w:history="1">
         <w:r>
           <w:rPr>
             <w:rStyle w:val="Hyperlink"/>
@@ -3286,7 +3286,7 @@
             <w:noProof/>
             <w:webHidden/>
           </w:rPr>
-          <w:instrText xml:space="preserve"> PAGEREF _Toc239336166 \h </w:instrText>
+          <w:instrText xml:space="preserve"> PAGEREF _Toc239336704 \h </w:instrText>
         </w:r>
         <w:r>
           <w:rPr>
@@ -3330,7 +3330,7 @@
           <w14:ligatures w14:val="standardContextual"/>
         </w:rPr>
       </w:pPr>
-      <w:hyperlink w:anchor="_Toc239336167" w:history="1">
+      <w:hyperlink w:anchor="_Toc239336705" w:history="1">
         <w:r>
           <w:rPr>
             <w:rStyle w:val="Hyperlink"/>
@@ -3357,7 +3357,7 @@
             <w:noProof/>
             <w:webHidden/>
           </w:rPr>
-          <w:instrText xml:space="preserve"> PAGEREF _Toc239336167 \h </w:instrText>
+          <w:instrText xml:space="preserve"> PAGEREF _Toc239336705 \h </w:instrText>
         </w:r>
         <w:r>
           <w:rPr>
@@ -3401,7 +3401,7 @@
           <w14:ligatures w14:val="standardContextual"/>
         </w:rPr>
       </w:pPr>
-      <w:hyperlink w:anchor="_Toc239336168" w:history="1">
+      <w:hyperlink w:anchor="_Toc239336706" w:history="1">
         <w:r>
           <w:rPr>
             <w:rStyle w:val="Hyperlink"/>
@@ -3428,7 +3428,7 @@
             <w:noProof/>
             <w:webHidden/>
           </w:rPr>
-          <w:instrText xml:space="preserve"> PAGEREF _Toc239336168 \h </w:instrText>
+          <w:instrText xml:space="preserve"> PAGEREF _Toc239336706 \h </w:instrText>
         </w:r>
         <w:r>
           <w:rPr>
@@ -3474,7 +3474,7 @@
         <w:pStyle w:val="Heading1"/>
       </w:pPr>
       <w:bookmarkStart w:id="8" w:name="chương-1-giới-thiệu"/>
-      <w:bookmarkStart w:id="9" w:name="_Toc239336135"/>
+      <w:bookmarkStart w:id="9" w:name="_Toc239336673"/>
       <w:bookmarkEnd w:id="4"/>
       <w:bookmarkEnd w:id="6"/>
       <w:r>
@@ -3499,7 +3499,7 @@
         <w:pStyle w:val="Heading2"/>
       </w:pPr>
       <w:bookmarkStart w:id="10" w:name="X7d99df2d9d0c5141050eb9941026463f4c8ea2b"/>
-      <w:bookmarkStart w:id="11" w:name="_Toc239336136"/>
+      <w:bookmarkStart w:id="11" w:name="_Toc239336674"/>
       <w:r>
         <w:t>1.1. Đ</w:t>
       </w:r>
@@ -5349,7 +5349,7 @@
         <w:pStyle w:val="Heading2"/>
       </w:pPr>
       <w:bookmarkStart w:id="12" w:name="X60021b7b958505251ec70bd32e2bac9f8a0361c"/>
-      <w:bookmarkStart w:id="13" w:name="_Toc239336137"/>
+      <w:bookmarkStart w:id="13" w:name="_Toc239336675"/>
       <w:bookmarkEnd w:id="10"/>
       <w:r>
         <w:t>1.2. M</w:t>
@@ -7295,7 +7295,7 @@
         <w:pStyle w:val="Heading2"/>
       </w:pPr>
       <w:bookmarkStart w:id="17" w:name="X03724c88a1b7da9b434cf0a8db5356690a4bb71"/>
-      <w:bookmarkStart w:id="18" w:name="_Toc239336138"/>
+      <w:bookmarkStart w:id="18" w:name="_Toc239336676"/>
       <w:bookmarkEnd w:id="12"/>
       <w:bookmarkEnd w:id="16"/>
       <w:r>
@@ -9100,7 +9100,7 @@
         <w:pStyle w:val="Heading1"/>
       </w:pPr>
       <w:bookmarkStart w:id="20" w:name="chương-2-cơ-sở-lý-thuyết"/>
-      <w:bookmarkStart w:id="21" w:name="_Toc239336139"/>
+      <w:bookmarkStart w:id="21" w:name="_Toc239336677"/>
       <w:bookmarkEnd w:id="8"/>
       <w:bookmarkEnd w:id="17"/>
       <w:r>
@@ -9397,7 +9397,7 @@
         <w:pStyle w:val="Heading2"/>
       </w:pPr>
       <w:bookmarkStart w:id="22" w:name="X2256001523e16d112c59df938522f140b8b988e"/>
-      <w:bookmarkStart w:id="23" w:name="_Toc239336140"/>
+      <w:bookmarkStart w:id="23" w:name="_Toc239336678"/>
       <w:r>
         <w:t>2.1. Quy chu</w:t>
       </w:r>
@@ -14076,7 +14076,7 @@
         <w:pStyle w:val="Heading2"/>
       </w:pPr>
       <w:bookmarkStart w:id="30" w:name="Xb21b4f0690a73e92e2a35192cb39315a0956521"/>
-      <w:bookmarkStart w:id="31" w:name="_Toc239336141"/>
+      <w:bookmarkStart w:id="31" w:name="_Toc239336679"/>
       <w:bookmarkEnd w:id="22"/>
       <w:bookmarkEnd w:id="28"/>
       <w:r>
@@ -19316,7 +19316,7 @@
         <w:pStyle w:val="Heading2"/>
       </w:pPr>
       <w:bookmarkStart w:id="38" w:name="X8ff52f1334e3f0e382caf7ffa1b7096a981291c"/>
-      <w:bookmarkStart w:id="39" w:name="_Toc239336142"/>
+      <w:bookmarkStart w:id="39" w:name="_Toc239336680"/>
       <w:bookmarkEnd w:id="30"/>
       <w:bookmarkEnd w:id="37"/>
       <w:r>
@@ -19595,7 +19595,7 @@
           <w:noProof/>
         </w:rPr>
         <w:drawing>
-          <wp:inline distT="0" distB="0" distL="0" distR="0" wp14:anchorId="5B7F84F4" wp14:editId="461C79E7">
+          <wp:inline distT="0" distB="0" distL="0" distR="0" wp14:anchorId="4F9A19FC" wp14:editId="65E3AAD1">
             <wp:extent cx="5334000" cy="1435553"/>
             <wp:effectExtent l="0" t="0" r="0" b="0"/>
             <wp:docPr id="37" name="Picture"/>
@@ -21057,7 +21057,7 @@
         <w:pStyle w:val="Heading2"/>
       </w:pPr>
       <w:bookmarkStart w:id="43" w:name="X1a77f36e16d4ad267b00eabe7cf793e1dbe08e9"/>
-      <w:bookmarkStart w:id="44" w:name="_Toc239336143"/>
+      <w:bookmarkStart w:id="44" w:name="_Toc239336681"/>
       <w:bookmarkEnd w:id="38"/>
       <w:bookmarkEnd w:id="42"/>
       <w:r>
@@ -22227,7 +22227,7 @@
           <w:noProof/>
         </w:rPr>
         <w:drawing>
-          <wp:inline distT="0" distB="0" distL="0" distR="0" wp14:anchorId="4D7D7706" wp14:editId="614BEE6E">
+          <wp:inline distT="0" distB="0" distL="0" distR="0" wp14:anchorId="6A1CFEB2" wp14:editId="7563ECA5">
             <wp:extent cx="5334000" cy="2884362"/>
             <wp:effectExtent l="0" t="0" r="0" b="0"/>
             <wp:docPr id="44" name="Picture"/>
@@ -22493,7 +22493,7 @@
           <w:noProof/>
         </w:rPr>
         <w:drawing>
-          <wp:inline distT="0" distB="0" distL="0" distR="0" wp14:anchorId="3906D637" wp14:editId="5654D72B">
+          <wp:inline distT="0" distB="0" distL="0" distR="0" wp14:anchorId="157A6B0F" wp14:editId="1469CE55">
             <wp:extent cx="5334000" cy="632732"/>
             <wp:effectExtent l="0" t="0" r="0" b="0"/>
             <wp:docPr id="49" name="Picture"/>
@@ -24396,7 +24396,7 @@
         <w:pStyle w:val="Heading1"/>
       </w:pPr>
       <w:bookmarkStart w:id="50" w:name="chương-3-thiết-kế-và-cài-đặt"/>
-      <w:bookmarkStart w:id="51" w:name="_Toc239336144"/>
+      <w:bookmarkStart w:id="51" w:name="_Toc239336682"/>
       <w:bookmarkEnd w:id="20"/>
       <w:bookmarkEnd w:id="43"/>
       <w:bookmarkEnd w:id="49"/>
@@ -24428,7 +24428,7 @@
         <w:pStyle w:val="Heading2"/>
       </w:pPr>
       <w:bookmarkStart w:id="52" w:name="X21a22cc9b66dca004f2960f37df13c53a04e97b"/>
-      <w:bookmarkStart w:id="53" w:name="_Toc239336145"/>
+      <w:bookmarkStart w:id="53" w:name="_Toc239336683"/>
       <w:r>
         <w:t>3.1. Ki</w:t>
       </w:r>
@@ -24520,7 +24520,7 @@
           <w:noProof/>
         </w:rPr>
         <w:drawing>
-          <wp:inline distT="0" distB="0" distL="0" distR="0" wp14:anchorId="0FCF68A3" wp14:editId="22EDEACA">
+          <wp:inline distT="0" distB="0" distL="0" distR="0" wp14:anchorId="3A1D48FA" wp14:editId="10857E35">
             <wp:extent cx="5334000" cy="401410"/>
             <wp:effectExtent l="0" t="0" r="0" b="0"/>
             <wp:docPr id="57" name="Picture"/>
@@ -26189,7 +26189,7 @@
         <w:pStyle w:val="Heading2"/>
       </w:pPr>
       <w:bookmarkStart w:id="55" w:name="X1f307d8f8c73bce8db8683c986faea6c8ea66a3"/>
-      <w:bookmarkStart w:id="56" w:name="_Toc239336146"/>
+      <w:bookmarkStart w:id="56" w:name="_Toc239336684"/>
       <w:bookmarkEnd w:id="52"/>
       <w:r>
         <w:t>3.2. Xây d</w:t>
@@ -26256,7 +26256,7 @@
           <w:noProof/>
         </w:rPr>
         <w:drawing>
-          <wp:inline distT="0" distB="0" distL="0" distR="0" wp14:anchorId="1C551C5B" wp14:editId="082D81CA">
+          <wp:inline distT="0" distB="0" distL="0" distR="0" wp14:anchorId="6C47737E" wp14:editId="0C26AA7A">
             <wp:extent cx="5334000" cy="802821"/>
             <wp:effectExtent l="0" t="0" r="0" b="0"/>
             <wp:docPr id="62" name="Picture"/>
@@ -30368,7 +30368,7 @@
         <w:pStyle w:val="Heading2"/>
       </w:pPr>
       <w:bookmarkStart w:id="62" w:name="X6a397cb1739f1ec0a8c9714808f79a5ce1fbf6f"/>
-      <w:bookmarkStart w:id="63" w:name="_Toc239336147"/>
+      <w:bookmarkStart w:id="63" w:name="_Toc239336685"/>
       <w:bookmarkEnd w:id="55"/>
       <w:bookmarkEnd w:id="61"/>
       <w:r>
@@ -31934,7 +31934,7 @@
         <w:pStyle w:val="Heading2"/>
       </w:pPr>
       <w:bookmarkStart w:id="65" w:name="X9c2c9b365086d10c999a46e4942f14d73b6baa5"/>
-      <w:bookmarkStart w:id="66" w:name="_Toc239336148"/>
+      <w:bookmarkStart w:id="66" w:name="_Toc239336686"/>
       <w:bookmarkEnd w:id="62"/>
       <w:r>
         <w:t>3.4. Kh</w:t>
@@ -32718,7 +32718,7 @@
           <w:noProof/>
         </w:rPr>
         <w:drawing>
-          <wp:inline distT="0" distB="0" distL="0" distR="0" wp14:anchorId="54D8D4BC" wp14:editId="1D660C89">
+          <wp:inline distT="0" distB="0" distL="0" distR="0" wp14:anchorId="4266CDFB" wp14:editId="7CF8F0D8">
             <wp:extent cx="5334000" cy="8969712"/>
             <wp:effectExtent l="0" t="0" r="0" b="0"/>
             <wp:docPr id="73" name="Picture"/>
@@ -38667,7 +38667,7 @@
         <w:pStyle w:val="Heading2"/>
       </w:pPr>
       <w:bookmarkStart w:id="75" w:name="Xb17945b5d9374e5087c2c96ace1685ff00e2e22"/>
-      <w:bookmarkStart w:id="76" w:name="_Toc239336149"/>
+      <w:bookmarkStart w:id="76" w:name="_Toc239336687"/>
       <w:bookmarkEnd w:id="65"/>
       <w:bookmarkEnd w:id="74"/>
       <w:r>
@@ -40037,7 +40037,7 @@
         <w:pStyle w:val="Heading2"/>
       </w:pPr>
       <w:bookmarkStart w:id="77" w:name="Xfad7df3f963ac0b8ebfe8cf87d7c64fa075f760"/>
-      <w:bookmarkStart w:id="78" w:name="_Toc239336150"/>
+      <w:bookmarkStart w:id="78" w:name="_Toc239336688"/>
       <w:bookmarkEnd w:id="75"/>
       <w:r>
         <w:t>3.6. B</w:t>
@@ -40083,7 +40083,7 @@
           <w:noProof/>
         </w:rPr>
         <w:drawing>
-          <wp:inline distT="0" distB="0" distL="0" distR="0" wp14:anchorId="6EFBAE3F" wp14:editId="485895DB">
+          <wp:inline distT="0" distB="0" distL="0" distR="0" wp14:anchorId="753C866D" wp14:editId="2DFDFC75">
             <wp:extent cx="5334000" cy="1217839"/>
             <wp:effectExtent l="0" t="0" r="0" b="0"/>
             <wp:docPr id="86" name="Picture"/>
@@ -42864,7 +42864,7 @@
         <w:pStyle w:val="Heading2"/>
       </w:pPr>
       <w:bookmarkStart w:id="80" w:name="X9b5467225f237e4ee44d60f7d236cbdfdaa1e07"/>
-      <w:bookmarkStart w:id="81" w:name="_Toc239336151"/>
+      <w:bookmarkStart w:id="81" w:name="_Toc239336689"/>
       <w:bookmarkEnd w:id="77"/>
       <w:r>
         <w:t xml:space="preserve">3.7. </w:t>
@@ -42984,7 +42984,7 @@
           <w:noProof/>
         </w:rPr>
         <w:drawing>
-          <wp:inline distT="0" distB="0" distL="0" distR="0" wp14:anchorId="0979CCDA" wp14:editId="20B475F4">
+          <wp:inline distT="0" distB="0" distL="0" distR="0" wp14:anchorId="03CAEDE6" wp14:editId="1B15386B">
             <wp:extent cx="5334000" cy="5953125"/>
             <wp:effectExtent l="0" t="0" r="0" b="0"/>
             <wp:docPr id="91" name="Picture"/>
@@ -44094,7 +44094,7 @@
         <w:pStyle w:val="Heading1"/>
       </w:pPr>
       <w:bookmarkStart w:id="83" w:name="chương-4-thực-nghiệm-và-đánh-giá"/>
-      <w:bookmarkStart w:id="84" w:name="_Toc239336152"/>
+      <w:bookmarkStart w:id="84" w:name="_Toc239336690"/>
       <w:bookmarkEnd w:id="50"/>
       <w:bookmarkEnd w:id="80"/>
       <w:r>
@@ -44119,7 +44119,7 @@
         <w:pStyle w:val="Heading2"/>
       </w:pPr>
       <w:bookmarkStart w:id="85" w:name="X43cb4672f728ce1df4f211c1d18360135f0c40b"/>
-      <w:bookmarkStart w:id="86" w:name="_Toc239336153"/>
+      <w:bookmarkStart w:id="86" w:name="_Toc239336691"/>
       <w:r>
         <w:t>4.1. Môi trư</w:t>
       </w:r>
@@ -45741,7 +45741,7 @@
         <w:pStyle w:val="Heading2"/>
       </w:pPr>
       <w:bookmarkStart w:id="87" w:name="Xe48430b60e6d2b1022368eb4316c1fe9f53411f"/>
-      <w:bookmarkStart w:id="88" w:name="_Toc239336154"/>
+      <w:bookmarkStart w:id="88" w:name="_Toc239336692"/>
       <w:bookmarkEnd w:id="85"/>
       <w:r>
         <w:t>4.2. K</w:t>
@@ -49276,7 +49276,7 @@
         <w:pStyle w:val="Heading2"/>
       </w:pPr>
       <w:bookmarkStart w:id="95" w:name="X09b724f0b907c7f652c2569c27ef1d5728c277c"/>
-      <w:bookmarkStart w:id="96" w:name="_Toc239336155"/>
+      <w:bookmarkStart w:id="96" w:name="_Toc239336693"/>
       <w:bookmarkEnd w:id="87"/>
       <w:bookmarkEnd w:id="93"/>
       <w:r>
@@ -51548,7 +51548,7 @@
           <w:noProof/>
         </w:rPr>
         <w:drawing>
-          <wp:inline distT="0" distB="0" distL="0" distR="0" wp14:anchorId="461DD24E" wp14:editId="0119CAD0">
+          <wp:inline distT="0" distB="0" distL="0" distR="0" wp14:anchorId="18222CA0" wp14:editId="7216C219">
             <wp:extent cx="5334000" cy="2883855"/>
             <wp:effectExtent l="0" t="0" r="0" b="0"/>
             <wp:docPr id="108" name="Picture"/>
@@ -56571,7 +56571,7 @@
         <w:pStyle w:val="Heading2"/>
       </w:pPr>
       <w:bookmarkStart w:id="106" w:name="X0c205a3fd5474e5e1d380a3735df7543f97f059"/>
-      <w:bookmarkStart w:id="107" w:name="_Toc239336156"/>
+      <w:bookmarkStart w:id="107" w:name="_Toc239336694"/>
       <w:bookmarkEnd w:id="95"/>
       <w:bookmarkEnd w:id="104"/>
       <w:r>
@@ -59513,7 +59513,7 @@
         <w:pStyle w:val="Heading2"/>
       </w:pPr>
       <w:bookmarkStart w:id="113" w:name="X8f4b2c0e55e8764a0677cdfa39e96dbe6822859"/>
-      <w:bookmarkStart w:id="114" w:name="_Toc239336157"/>
+      <w:bookmarkStart w:id="114" w:name="_Toc239336695"/>
       <w:bookmarkEnd w:id="106"/>
       <w:bookmarkEnd w:id="112"/>
       <w:r>
@@ -62656,7 +62656,7 @@
         <w:pStyle w:val="Heading2"/>
       </w:pPr>
       <w:bookmarkStart w:id="120" w:name="X7468ed9f095dd0192ebc5de940dc44b5cd3e099"/>
-      <w:bookmarkStart w:id="121" w:name="_Toc239336158"/>
+      <w:bookmarkStart w:id="121" w:name="_Toc239336696"/>
       <w:bookmarkEnd w:id="113"/>
       <w:bookmarkEnd w:id="118"/>
       <w:r>
@@ -64517,7 +64517,7 @@
           <w:noProof/>
         </w:rPr>
         <w:drawing>
-          <wp:inline distT="0" distB="0" distL="0" distR="0" wp14:anchorId="5586442F" wp14:editId="1AF2A8E0">
+          <wp:inline distT="0" distB="0" distL="0" distR="0" wp14:anchorId="6E214053" wp14:editId="0CADAB1D">
             <wp:extent cx="5334000" cy="3317670"/>
             <wp:effectExtent l="0" t="0" r="0" b="0"/>
             <wp:docPr id="131" name="Picture"/>
@@ -65249,7 +65249,7 @@
         <w:pStyle w:val="Heading2"/>
       </w:pPr>
       <w:bookmarkStart w:id="124" w:name="X88e1c26a6581f7bd1dbdb2c85ae6116c5ba8393"/>
-      <w:bookmarkStart w:id="125" w:name="_Toc239336159"/>
+      <w:bookmarkStart w:id="125" w:name="_Toc239336697"/>
       <w:bookmarkEnd w:id="120"/>
       <w:r>
         <w:t>4.7. Các y</w:t>
@@ -67104,7 +67104,7 @@
         <w:pStyle w:val="Heading1"/>
       </w:pPr>
       <w:bookmarkStart w:id="127" w:name="chương-5-kết-luận-và-hướng-phát-triển"/>
-      <w:bookmarkStart w:id="128" w:name="_Toc239336160"/>
+      <w:bookmarkStart w:id="128" w:name="_Toc239336698"/>
       <w:bookmarkEnd w:id="83"/>
       <w:bookmarkEnd w:id="124"/>
       <w:r>
@@ -67141,7 +67141,7 @@
         <w:pStyle w:val="Heading2"/>
       </w:pPr>
       <w:bookmarkStart w:id="129" w:name="Xcefa088882d41b38c21b7b5b44c738cb5564fbb"/>
-      <w:bookmarkStart w:id="130" w:name="_Toc239336161"/>
+      <w:bookmarkStart w:id="130" w:name="_Toc239336699"/>
       <w:r>
         <w:t>5.1. K</w:t>
       </w:r>
@@ -68642,7 +68642,7 @@
         <w:pStyle w:val="Heading2"/>
       </w:pPr>
       <w:bookmarkStart w:id="132" w:name="Xe79f58ab8ce7b6f148c68a374118dd9eaec1a1c"/>
-      <w:bookmarkStart w:id="133" w:name="_Toc239336162"/>
+      <w:bookmarkStart w:id="133" w:name="_Toc239336700"/>
       <w:bookmarkEnd w:id="129"/>
       <w:r>
         <w:t>5.2. H</w:t>
@@ -68686,7 +68686,7 @@
       <w:bookmarkStart w:id="134" w:name="tbl-5-2"/>
       <w:bookmarkEnd w:id="134"/>
       <w:r>
-        <w:t xml:space="preserve"> Sáu h</w:t>
+        <w:t xml:space="preserve"> Năm h</w:t>
       </w:r>
       <w:r>
         <w:t>ạ</w:t>
@@ -68721,9 +68721,9 @@
       </w:tblPr>
       <w:tblGrid>
         <w:gridCol w:w="324"/>
-        <w:gridCol w:w="2905"/>
+        <w:gridCol w:w="2906"/>
         <w:gridCol w:w="878"/>
-        <w:gridCol w:w="5469"/>
+        <w:gridCol w:w="5468"/>
       </w:tblGrid>
       <w:tr>
         <w:trPr>
@@ -69608,103 +69608,94 @@
             </w:pPr>
             <w:r>
               <w:rPr>
-                <w:strike/>
+                <w:b/>
+                <w:bCs/>
               </w:rPr>
-              <w:t>Đ</w:t>
-            </w:r>
-            <w:r>
-              <w:rPr>
-                <w:strike/>
-              </w:rPr>
-              <w:t>ộ</w:t>
-            </w:r>
-            <w:r>
-              <w:rPr>
-                <w:strike/>
-              </w:rPr>
-              <w:t xml:space="preserve"> tr</w:t>
-            </w:r>
-            <w:r>
-              <w:rPr>
-                <w:strike/>
-              </w:rPr>
-              <w:t>ễ</w:t>
-            </w:r>
-            <w:r>
-              <w:rPr>
-                <w:strike/>
-              </w:rPr>
-              <w:t xml:space="preserve"> p95 ch</w:t>
-            </w:r>
-            <w:r>
-              <w:rPr>
-                <w:strike/>
-              </w:rPr>
-              <w:t>ỉ</w:t>
-            </w:r>
-            <w:r>
-              <w:rPr>
-                <w:strike/>
-              </w:rPr>
-              <w:t xml:space="preserve"> đ</w:t>
-            </w:r>
-            <w:r>
-              <w:rPr>
-                <w:strike/>
-              </w:rPr>
-              <w:t>ạ</w:t>
-            </w:r>
-            <w:r>
-              <w:rPr>
-                <w:strike/>
-              </w:rPr>
-              <w:t>t ngư</w:t>
-            </w:r>
-            <w:r>
-              <w:rPr>
-                <w:strike/>
-              </w:rPr>
-              <w:t>ỡ</w:t>
-            </w:r>
-            <w:r>
-              <w:rPr>
-                <w:strike/>
-              </w:rPr>
-              <w:t>ng t</w:t>
-            </w:r>
-            <w:r>
-              <w:rPr>
-                <w:strike/>
-              </w:rPr>
-              <w:t>ố</w:t>
-            </w:r>
-            <w:r>
-              <w:rPr>
-                <w:strike/>
-              </w:rPr>
-              <w:t>i thi</w:t>
-            </w:r>
-            <w:r>
-              <w:rPr>
-                <w:strike/>
-              </w:rPr>
-              <w:t>ể</w:t>
-            </w:r>
-            <w:r>
-              <w:rPr>
-                <w:strike/>
-              </w:rPr>
-              <w:t>u</w:t>
-            </w:r>
-            <w:r>
-              <w:t xml:space="preserve"> — </w:t>
+              <w:t>Bi</w:t>
             </w:r>
             <w:r>
               <w:rPr>
                 <w:b/>
                 <w:bCs/>
               </w:rPr>
-              <w:t>đã khép</w:t>
+              <w:t>ể</w:t>
+            </w:r>
+            <w:r>
+              <w:rPr>
+                <w:b/>
+                <w:bCs/>
+              </w:rPr>
+              <w:t>n đ</w:t>
+            </w:r>
+            <w:r>
+              <w:rPr>
+                <w:b/>
+                <w:bCs/>
+              </w:rPr>
+              <w:t>ỏ</w:t>
+            </w:r>
+            <w:r>
+              <w:rPr>
+                <w:b/>
+                <w:bCs/>
+              </w:rPr>
+              <w:t xml:space="preserve"> quân đ</w:t>
+            </w:r>
+            <w:r>
+              <w:rPr>
+                <w:b/>
+                <w:bCs/>
+              </w:rPr>
+              <w:t>ộ</w:t>
+            </w:r>
+            <w:r>
+              <w:rPr>
+                <w:b/>
+                <w:bCs/>
+              </w:rPr>
+              <w:t>i và bi</w:t>
+            </w:r>
+            <w:r>
+              <w:rPr>
+                <w:b/>
+                <w:bCs/>
+              </w:rPr>
+              <w:t>ể</w:t>
+            </w:r>
+            <w:r>
+              <w:rPr>
+                <w:b/>
+                <w:bCs/>
+              </w:rPr>
+              <w:t>n ngo</w:t>
+            </w:r>
+            <w:r>
+              <w:rPr>
+                <w:b/>
+                <w:bCs/>
+              </w:rPr>
+              <w:t>ạ</w:t>
+            </w:r>
+            <w:r>
+              <w:rPr>
+                <w:b/>
+                <w:bCs/>
+              </w:rPr>
+              <w:t>i giao không có m</w:t>
+            </w:r>
+            <w:r>
+              <w:rPr>
+                <w:b/>
+                <w:bCs/>
+              </w:rPr>
+              <w:t>ẫ</w:t>
+            </w:r>
+            <w:r>
+              <w:rPr>
+                <w:b/>
+                <w:bCs/>
+              </w:rPr>
+              <w:t>u đánh giá</w:t>
             </w:r>
           </w:p>
         </w:tc>
@@ -69718,13 +69709,7 @@
               <w:jc w:val="center"/>
             </w:pPr>
             <w:r>
-              <w:t>Th</w:t>
-            </w:r>
-            <w:r>
-              <w:t>ấ</w:t>
-            </w:r>
-            <w:r>
-              <w:t>p</w:t>
+              <w:t>Trung bình</w:t>
             </w:r>
           </w:p>
         </w:tc>
@@ -69737,214 +69722,6 @@
               <w:pStyle w:val="Compact"/>
             </w:pPr>
             <w:r>
-              <w:t xml:space="preserve">p95 nay </w:t>
-            </w:r>
-            <w:r>
-              <w:rPr>
-                <w:b/>
-                <w:bCs/>
-              </w:rPr>
-              <w:t>509,76 ms</w:t>
-            </w:r>
-            <w:r>
-              <w:t>, vư</w:t>
-            </w:r>
-            <w:r>
-              <w:t>ợ</w:t>
-            </w:r>
-            <w:r>
-              <w:t>t m</w:t>
-            </w:r>
-            <w:r>
-              <w:t>ụ</w:t>
-            </w:r>
-            <w:r>
-              <w:t>c tiêu 800 ms; b</w:t>
-            </w:r>
-            <w:r>
-              <w:t>ậ</w:t>
-            </w:r>
-            <w:r>
-              <w:t>c thang th</w:t>
-            </w:r>
-            <w:r>
-              <w:t>ử</w:t>
-            </w:r>
-            <w:r>
-              <w:t xml:space="preserve"> l</w:t>
-            </w:r>
-            <w:r>
-              <w:t>ạ</w:t>
-            </w:r>
-            <w:r>
-              <w:t>i v</w:t>
-            </w:r>
-            <w:r>
-              <w:t>ẫ</w:t>
-            </w:r>
-            <w:r>
-              <w:t>n gi</w:t>
-            </w:r>
-            <w:r>
-              <w:t>ữ</w:t>
-            </w:r>
-            <w:r>
-              <w:t xml:space="preserve"> cùng 34 bi</w:t>
-            </w:r>
-            <w:r>
-              <w:t>ể</w:t>
-            </w:r>
-            <w:r>
-              <w:t>n đ</w:t>
-            </w:r>
-            <w:r>
-              <w:t>ọ</w:t>
-            </w:r>
-            <w:r>
-              <w:t>c thêm</w:t>
-            </w:r>
-          </w:p>
-        </w:tc>
-      </w:tr>
-      <w:tr>
-        <w:tc>
-          <w:tcPr>
-            <w:tcW w:w="0" w:type="auto"/>
-          </w:tcPr>
-          <w:p>
-            <w:pPr>
-              <w:pStyle w:val="Compact"/>
-              <w:jc w:val="center"/>
-            </w:pPr>
-            <w:r>
-              <w:t>6</w:t>
-            </w:r>
-          </w:p>
-        </w:tc>
-        <w:tc>
-          <w:tcPr>
-            <w:tcW w:w="0" w:type="auto"/>
-          </w:tcPr>
-          <w:p>
-            <w:pPr>
-              <w:pStyle w:val="Compact"/>
-            </w:pPr>
-            <w:r>
-              <w:rPr>
-                <w:b/>
-                <w:bCs/>
-              </w:rPr>
-              <w:t>Bi</w:t>
-            </w:r>
-            <w:r>
-              <w:rPr>
-                <w:b/>
-                <w:bCs/>
-              </w:rPr>
-              <w:t>ể</w:t>
-            </w:r>
-            <w:r>
-              <w:rPr>
-                <w:b/>
-                <w:bCs/>
-              </w:rPr>
-              <w:t>n đ</w:t>
-            </w:r>
-            <w:r>
-              <w:rPr>
-                <w:b/>
-                <w:bCs/>
-              </w:rPr>
-              <w:t>ỏ</w:t>
-            </w:r>
-            <w:r>
-              <w:rPr>
-                <w:b/>
-                <w:bCs/>
-              </w:rPr>
-              <w:t xml:space="preserve"> quân đ</w:t>
-            </w:r>
-            <w:r>
-              <w:rPr>
-                <w:b/>
-                <w:bCs/>
-              </w:rPr>
-              <w:t>ộ</w:t>
-            </w:r>
-            <w:r>
-              <w:rPr>
-                <w:b/>
-                <w:bCs/>
-              </w:rPr>
-              <w:t>i và bi</w:t>
-            </w:r>
-            <w:r>
-              <w:rPr>
-                <w:b/>
-                <w:bCs/>
-              </w:rPr>
-              <w:t>ể</w:t>
-            </w:r>
-            <w:r>
-              <w:rPr>
-                <w:b/>
-                <w:bCs/>
-              </w:rPr>
-              <w:t>n ngo</w:t>
-            </w:r>
-            <w:r>
-              <w:rPr>
-                <w:b/>
-                <w:bCs/>
-              </w:rPr>
-              <w:t>ạ</w:t>
-            </w:r>
-            <w:r>
-              <w:rPr>
-                <w:b/>
-                <w:bCs/>
-              </w:rPr>
-              <w:t>i giao không có m</w:t>
-            </w:r>
-            <w:r>
-              <w:rPr>
-                <w:b/>
-                <w:bCs/>
-              </w:rPr>
-              <w:t>ẫ</w:t>
-            </w:r>
-            <w:r>
-              <w:rPr>
-                <w:b/>
-                <w:bCs/>
-              </w:rPr>
-              <w:t>u đánh giá</w:t>
-            </w:r>
-          </w:p>
-        </w:tc>
-        <w:tc>
-          <w:tcPr>
-            <w:tcW w:w="0" w:type="auto"/>
-          </w:tcPr>
-          <w:p>
-            <w:pPr>
-              <w:pStyle w:val="Compact"/>
-              <w:jc w:val="center"/>
-            </w:pPr>
-            <w:r>
-              <w:t>Trung bình</w:t>
-            </w:r>
-          </w:p>
-        </w:tc>
-        <w:tc>
-          <w:tcPr>
-            <w:tcW w:w="0" w:type="auto"/>
-          </w:tcPr>
-          <w:p>
-            <w:pPr>
-              <w:pStyle w:val="Compact"/>
-            </w:pPr>
-            <w:r>
               <w:t>B</w:t>
             </w:r>
             <w:r>
@@ -70079,7 +69856,7 @@
         <w:pStyle w:val="Heading2"/>
       </w:pPr>
       <w:bookmarkStart w:id="135" w:name="X66db71c9020c40cf46e490c5c37ad244e2b7594"/>
-      <w:bookmarkStart w:id="136" w:name="_Toc239336163"/>
+      <w:bookmarkStart w:id="136" w:name="_Toc239336701"/>
       <w:bookmarkEnd w:id="132"/>
       <w:r>
         <w:t>5.3. Hư</w:t>
@@ -70807,7 +70584,10 @@
               <w:t>đã làm</w:t>
             </w:r>
             <w:r>
-              <w:t xml:space="preserve"> và mua đư</w:t>
+              <w:t xml:space="preserve"> </w:t>
+            </w:r>
+            <w:r>
+              <w:t>và mua đư</w:t>
             </w:r>
             <w:r>
               <w:t>ợ</w:t>
@@ -71006,7 +70786,7 @@
               <w:jc w:val="center"/>
             </w:pPr>
             <w:r>
-              <w:t>2, 6</w:t>
+              <w:t>2, 5</w:t>
             </w:r>
           </w:p>
         </w:tc>
@@ -71573,7 +71353,7 @@
               <w:jc w:val="center"/>
             </w:pPr>
             <w:r>
-              <w:t>5</w:t>
+              <w:t>—</w:t>
             </w:r>
           </w:p>
         </w:tc>
@@ -71667,7 +71447,7 @@
         <w:pStyle w:val="Heading2"/>
       </w:pPr>
       <w:bookmarkStart w:id="138" w:name="Xe5a2fe3dfcd4681648271b7ddc344b106e48b3b"/>
-      <w:bookmarkStart w:id="139" w:name="_Toc239336164"/>
+      <w:bookmarkStart w:id="139" w:name="_Toc239336702"/>
       <w:bookmarkEnd w:id="135"/>
       <w:r>
         <w:t>5.4. K</w:t>
@@ -72535,10 +72315,7 @@
         <w:t>m</w:t>
       </w:r>
       <w:r>
-        <w:t xml:space="preserve"> </w:t>
-      </w:r>
-      <w:r>
-        <w:t>cho Tesseract. X</w:t>
+        <w:t xml:space="preserve"> cho Tesseract. X</w:t>
       </w:r>
       <w:r>
         <w:t>ử</w:t>
@@ -72593,7 +72370,7 @@
         <w:pStyle w:val="Heading1"/>
       </w:pPr>
       <w:bookmarkStart w:id="140" w:name="tài-liệu-tham-khảo"/>
-      <w:bookmarkStart w:id="141" w:name="_Toc239336165"/>
+      <w:bookmarkStart w:id="141" w:name="_Toc239336703"/>
       <w:bookmarkEnd w:id="127"/>
       <w:bookmarkEnd w:id="138"/>
       <w:r>
@@ -72689,10 +72466,7 @@
         </w:r>
       </w:hyperlink>
       <w:r>
-        <w:t xml:space="preserve"> </w:t>
-      </w:r>
-      <w:r>
-        <w:t>(truy c</w:t>
+        <w:t xml:space="preserve"> (truy c</w:t>
       </w:r>
       <w:r>
         <w:t>ậ</w:t>
@@ -73622,7 +73396,7 @@
         <w:pStyle w:val="Heading1"/>
       </w:pPr>
       <w:bookmarkStart w:id="142" w:name="phụ-lục"/>
-      <w:bookmarkStart w:id="143" w:name="_Toc239336166"/>
+      <w:bookmarkStart w:id="143" w:name="_Toc239336704"/>
       <w:bookmarkEnd w:id="140"/>
       <w:r>
         <w:t>PH</w:t>
@@ -73646,7 +73420,7 @@
         <w:pStyle w:val="Heading2"/>
       </w:pPr>
       <w:bookmarkStart w:id="144" w:name="phụ-lục-a-cấu-hình-và-siêu-tham-số"/>
-      <w:bookmarkStart w:id="145" w:name="_Toc239336167"/>
+      <w:bookmarkStart w:id="145" w:name="_Toc239336705"/>
       <w:r>
         <w:t>Ph</w:t>
       </w:r>
@@ -75866,7 +75640,7 @@
         <w:pStyle w:val="Heading2"/>
       </w:pPr>
       <w:bookmarkStart w:id="149" w:name="phụ-lục-b-hướng-dẫn-cài-đặt-và-chạy"/>
-      <w:bookmarkStart w:id="150" w:name="_Toc239336168"/>
+      <w:bookmarkStart w:id="150" w:name="_Toc239336706"/>
       <w:bookmarkEnd w:id="144"/>
       <w:bookmarkEnd w:id="148"/>
       <w:r>
@@ -77435,7 +77209,7 @@
   <w:abstractNum w:abstractNumId="0" w15:restartNumberingAfterBreak="0">
     <w:nsid w:val="0000A990"/>
     <w:multiLevelType w:val="multilevel"/>
-    <w:tmpl w:val="C15A0EFC"/>
+    <w:tmpl w:val="EF0430D8"/>
     <w:lvl w:ilvl="0">
       <w:numFmt w:val="bullet"/>
       <w:lvlText w:val=" "/>
@@ -77512,7 +77286,7 @@
   <w:abstractNum w:abstractNumId="1" w15:restartNumberingAfterBreak="0">
     <w:nsid w:val="0000A991"/>
     <w:multiLevelType w:val="multilevel"/>
-    <w:tmpl w:val="9942E758"/>
+    <w:tmpl w:val="D2A22CAE"/>
     <w:lvl w:ilvl="0">
       <w:numFmt w:val="bullet"/>
       <w:lvlText w:val=""/>
@@ -77616,7 +77390,7 @@
   <w:abstractNum w:abstractNumId="2" w15:restartNumberingAfterBreak="0">
     <w:nsid w:val="00A99411"/>
     <w:multiLevelType w:val="multilevel"/>
-    <w:tmpl w:val="112C253C"/>
+    <w:tmpl w:val="3738DC9A"/>
     <w:lvl w:ilvl="0">
       <w:start w:val="1"/>
       <w:numFmt w:val="decimal"/>
@@ -77699,10 +77473,10 @@
       </w:pPr>
     </w:lvl>
   </w:abstractNum>
-  <w:num w:numId="1" w16cid:durableId="1920405495">
+  <w:num w:numId="1" w16cid:durableId="2062752695">
     <w:abstractNumId w:val="0"/>
   </w:num>
-  <w:num w:numId="2" w16cid:durableId="821965933">
+  <w:num w:numId="2" w16cid:durableId="1744719261">
     <w:abstractNumId w:val="2"/>
     <w:lvlOverride w:ilvl="0">
       <w:startOverride w:val="1"/>
@@ -77732,22 +77506,22 @@
       <w:startOverride w:val="1"/>
     </w:lvlOverride>
   </w:num>
-  <w:num w:numId="3" w16cid:durableId="1534224667">
+  <w:num w:numId="3" w16cid:durableId="1375426251">
     <w:abstractNumId w:val="1"/>
   </w:num>
-  <w:num w:numId="4" w16cid:durableId="1992446712">
+  <w:num w:numId="4" w16cid:durableId="1488088381">
     <w:abstractNumId w:val="1"/>
   </w:num>
-  <w:num w:numId="5" w16cid:durableId="569117380">
+  <w:num w:numId="5" w16cid:durableId="1765952645">
     <w:abstractNumId w:val="1"/>
   </w:num>
-  <w:num w:numId="6" w16cid:durableId="1176074559">
+  <w:num w:numId="6" w16cid:durableId="314645436">
     <w:abstractNumId w:val="1"/>
   </w:num>
-  <w:num w:numId="7" w16cid:durableId="492182084">
+  <w:num w:numId="7" w16cid:durableId="545878590">
     <w:abstractNumId w:val="1"/>
   </w:num>
-  <w:num w:numId="8" w16cid:durableId="778649968">
+  <w:num w:numId="8" w16cid:durableId="279435">
     <w:abstractNumId w:val="2"/>
     <w:lvlOverride w:ilvl="0">
       <w:startOverride w:val="1"/>
@@ -77777,7 +77551,7 @@
       <w:startOverride w:val="1"/>
     </w:lvlOverride>
   </w:num>
-  <w:num w:numId="9" w16cid:durableId="549147985">
+  <w:num w:numId="9" w16cid:durableId="815026106">
     <w:abstractNumId w:val="1"/>
   </w:num>
 </w:numbering>
@@ -79014,7 +78788,7 @@
     <w:next w:val="Normal"/>
     <w:autoRedefine/>
     <w:uiPriority w:val="39"/>
-    <w:rsid w:val="00326B9B"/>
+    <w:rsid w:val="00167BC1"/>
     <w:pPr>
       <w:spacing w:after="100"/>
     </w:pPr>
@@ -79025,7 +78799,7 @@
     <w:next w:val="Normal"/>
     <w:autoRedefine/>
     <w:uiPriority w:val="39"/>
-    <w:rsid w:val="00326B9B"/>
+    <w:rsid w:val="00167BC1"/>
     <w:pPr>
       <w:spacing w:after="100"/>
       <w:ind w:left="240"/>

</xml_diff>

<commit_message>
docs(slide mon hoc): slide 13 bo tranh luan L->1, slide cuoi doi giong ket
Slide 13: cau "L->1 doan sai dich" de bi doi chieu voi Bang 4.6 (hang 1
L->1, 90 lan, "co — dung chieu"). Rut ve dung hai con so quyen cong bo:
bang hinh dang phu 2/10, bang ma tran phu 4/10 va +53 bien.
Slide cuoi: "Chua dat 0,7701 so voi nguong 0,85" -> "Diem nghen con lai:
bien hai dong (S1 = 0,7234)" — cung su that, dung cach dat van de cua
chuong 4.

Kiem: check_slides 16/0 loi; quyen khong doi (40 trang, xuat lai de giu
PAGEREF trong docx).
</commit_message>
<xml_diff>
--- a/docs/papers/mon-hoc/thesis-full.docx
+++ b/docs/papers/mon-hoc/thesis-full.docx
@@ -148,7 +148,7 @@
         <w:pStyle w:val="Heading1"/>
       </w:pPr>
       <w:bookmarkStart w:id="0" w:name="đồ-án-môn-học"/>
-      <w:bookmarkStart w:id="1" w:name="_Toc239336670"/>
+      <w:bookmarkStart w:id="1" w:name="_Toc239336970"/>
       <w:r>
         <w:t>Đ</w:t>
       </w:r>
@@ -220,7 +220,7 @@
         <w:pStyle w:val="Heading1"/>
       </w:pPr>
       <w:bookmarkStart w:id="4" w:name="Xbe958ce37c6a089ac9bdc99dada4ec5e2c0f7da"/>
-      <w:bookmarkStart w:id="5" w:name="_Toc239336671"/>
+      <w:bookmarkStart w:id="5" w:name="_Toc239336971"/>
       <w:bookmarkEnd w:id="0"/>
       <w:bookmarkEnd w:id="3"/>
       <w:r>
@@ -795,7 +795,7 @@
     </w:p>
     <w:p>
       <w:r>
-        <w:pict w14:anchorId="3462DBE1">
+        <w:pict w14:anchorId="32732907">
           <v:rect id="_x0000_i1025" style="width:0;height:1.5pt" o:hralign="center" o:hrstd="t" o:hr="t"/>
         </w:pict>
       </w:r>
@@ -805,7 +805,7 @@
         <w:pStyle w:val="Heading2"/>
       </w:pPr>
       <w:bookmarkStart w:id="6" w:name="mục-lục"/>
-      <w:bookmarkStart w:id="7" w:name="_Toc239336672"/>
+      <w:bookmarkStart w:id="7" w:name="_Toc239336972"/>
       <w:r>
         <w:t>M</w:t>
       </w:r>
@@ -845,7 +845,7 @@
       <w:r>
         <w:fldChar w:fldCharType="separate"/>
       </w:r>
-      <w:hyperlink w:anchor="_Toc239336670" w:history="1">
+      <w:hyperlink w:anchor="_Toc239336970" w:history="1">
         <w:r>
           <w:rPr>
             <w:rStyle w:val="Hyperlink"/>
@@ -872,7 +872,7 @@
             <w:noProof/>
             <w:webHidden/>
           </w:rPr>
-          <w:instrText xml:space="preserve"> PAGEREF _Toc239336670 \h </w:instrText>
+          <w:instrText xml:space="preserve"> PAGEREF _Toc239336970 \h </w:instrText>
         </w:r>
         <w:r>
           <w:rPr>
@@ -916,7 +916,7 @@
           <w14:ligatures w14:val="standardContextual"/>
         </w:rPr>
       </w:pPr>
-      <w:hyperlink w:anchor="_Toc239336671" w:history="1">
+      <w:hyperlink w:anchor="_Toc239336971" w:history="1">
         <w:r>
           <w:rPr>
             <w:rStyle w:val="Hyperlink"/>
@@ -943,7 +943,7 @@
             <w:noProof/>
             <w:webHidden/>
           </w:rPr>
-          <w:instrText xml:space="preserve"> PAGEREF _Toc239336671 \h </w:instrText>
+          <w:instrText xml:space="preserve"> PAGEREF _Toc239336971 \h </w:instrText>
         </w:r>
         <w:r>
           <w:rPr>
@@ -987,7 +987,7 @@
           <w14:ligatures w14:val="standardContextual"/>
         </w:rPr>
       </w:pPr>
-      <w:hyperlink w:anchor="_Toc239336672" w:history="1">
+      <w:hyperlink w:anchor="_Toc239336972" w:history="1">
         <w:r>
           <w:rPr>
             <w:rStyle w:val="Hyperlink"/>
@@ -1014,7 +1014,7 @@
             <w:noProof/>
             <w:webHidden/>
           </w:rPr>
-          <w:instrText xml:space="preserve"> PAGEREF _Toc239336672 \h </w:instrText>
+          <w:instrText xml:space="preserve"> PAGEREF _Toc239336972 \h </w:instrText>
         </w:r>
         <w:r>
           <w:rPr>
@@ -1058,7 +1058,7 @@
           <w14:ligatures w14:val="standardContextual"/>
         </w:rPr>
       </w:pPr>
-      <w:hyperlink w:anchor="_Toc239336673" w:history="1">
+      <w:hyperlink w:anchor="_Toc239336973" w:history="1">
         <w:r>
           <w:rPr>
             <w:rStyle w:val="Hyperlink"/>
@@ -1085,7 +1085,7 @@
             <w:noProof/>
             <w:webHidden/>
           </w:rPr>
-          <w:instrText xml:space="preserve"> PAGEREF _Toc239336673 \h </w:instrText>
+          <w:instrText xml:space="preserve"> PAGEREF _Toc239336973 \h </w:instrText>
         </w:r>
         <w:r>
           <w:rPr>
@@ -1129,7 +1129,7 @@
           <w14:ligatures w14:val="standardContextual"/>
         </w:rPr>
       </w:pPr>
-      <w:hyperlink w:anchor="_Toc239336674" w:history="1">
+      <w:hyperlink w:anchor="_Toc239336974" w:history="1">
         <w:r>
           <w:rPr>
             <w:rStyle w:val="Hyperlink"/>
@@ -1156,7 +1156,7 @@
             <w:noProof/>
             <w:webHidden/>
           </w:rPr>
-          <w:instrText xml:space="preserve"> PAGEREF _Toc239336674 \h </w:instrText>
+          <w:instrText xml:space="preserve"> PAGEREF _Toc239336974 \h </w:instrText>
         </w:r>
         <w:r>
           <w:rPr>
@@ -1200,7 +1200,7 @@
           <w14:ligatures w14:val="standardContextual"/>
         </w:rPr>
       </w:pPr>
-      <w:hyperlink w:anchor="_Toc239336675" w:history="1">
+      <w:hyperlink w:anchor="_Toc239336975" w:history="1">
         <w:r>
           <w:rPr>
             <w:rStyle w:val="Hyperlink"/>
@@ -1227,7 +1227,7 @@
             <w:noProof/>
             <w:webHidden/>
           </w:rPr>
-          <w:instrText xml:space="preserve"> PAGEREF _Toc239336675 \h </w:instrText>
+          <w:instrText xml:space="preserve"> PAGEREF _Toc239336975 \h </w:instrText>
         </w:r>
         <w:r>
           <w:rPr>
@@ -1271,7 +1271,7 @@
           <w14:ligatures w14:val="standardContextual"/>
         </w:rPr>
       </w:pPr>
-      <w:hyperlink w:anchor="_Toc239336676" w:history="1">
+      <w:hyperlink w:anchor="_Toc239336976" w:history="1">
         <w:r>
           <w:rPr>
             <w:rStyle w:val="Hyperlink"/>
@@ -1298,7 +1298,7 @@
             <w:noProof/>
             <w:webHidden/>
           </w:rPr>
-          <w:instrText xml:space="preserve"> PAGEREF _Toc239336676 \h </w:instrText>
+          <w:instrText xml:space="preserve"> PAGEREF _Toc239336976 \h </w:instrText>
         </w:r>
         <w:r>
           <w:rPr>
@@ -1342,7 +1342,7 @@
           <w14:ligatures w14:val="standardContextual"/>
         </w:rPr>
       </w:pPr>
-      <w:hyperlink w:anchor="_Toc239336677" w:history="1">
+      <w:hyperlink w:anchor="_Toc239336977" w:history="1">
         <w:r>
           <w:rPr>
             <w:rStyle w:val="Hyperlink"/>
@@ -1369,7 +1369,7 @@
             <w:noProof/>
             <w:webHidden/>
           </w:rPr>
-          <w:instrText xml:space="preserve"> PAGEREF _Toc239336677 \h </w:instrText>
+          <w:instrText xml:space="preserve"> PAGEREF _Toc239336977 \h </w:instrText>
         </w:r>
         <w:r>
           <w:rPr>
@@ -1413,7 +1413,7 @@
           <w14:ligatures w14:val="standardContextual"/>
         </w:rPr>
       </w:pPr>
-      <w:hyperlink w:anchor="_Toc239336678" w:history="1">
+      <w:hyperlink w:anchor="_Toc239336978" w:history="1">
         <w:r>
           <w:rPr>
             <w:rStyle w:val="Hyperlink"/>
@@ -1440,7 +1440,7 @@
             <w:noProof/>
             <w:webHidden/>
           </w:rPr>
-          <w:instrText xml:space="preserve"> PAGEREF _Toc239336678 \h </w:instrText>
+          <w:instrText xml:space="preserve"> PAGEREF _Toc239336978 \h </w:instrText>
         </w:r>
         <w:r>
           <w:rPr>
@@ -1484,7 +1484,7 @@
           <w14:ligatures w14:val="standardContextual"/>
         </w:rPr>
       </w:pPr>
-      <w:hyperlink w:anchor="_Toc239336679" w:history="1">
+      <w:hyperlink w:anchor="_Toc239336979" w:history="1">
         <w:r>
           <w:rPr>
             <w:rStyle w:val="Hyperlink"/>
@@ -1511,7 +1511,7 @@
             <w:noProof/>
             <w:webHidden/>
           </w:rPr>
-          <w:instrText xml:space="preserve"> PAGEREF _Toc239336679 \h </w:instrText>
+          <w:instrText xml:space="preserve"> PAGEREF _Toc239336979 \h </w:instrText>
         </w:r>
         <w:r>
           <w:rPr>
@@ -1555,7 +1555,7 @@
           <w14:ligatures w14:val="standardContextual"/>
         </w:rPr>
       </w:pPr>
-      <w:hyperlink w:anchor="_Toc239336680" w:history="1">
+      <w:hyperlink w:anchor="_Toc239336980" w:history="1">
         <w:r>
           <w:rPr>
             <w:rStyle w:val="Hyperlink"/>
@@ -1582,7 +1582,7 @@
             <w:noProof/>
             <w:webHidden/>
           </w:rPr>
-          <w:instrText xml:space="preserve"> PAGEREF _Toc239336680 \h </w:instrText>
+          <w:instrText xml:space="preserve"> PAGEREF _Toc239336980 \h </w:instrText>
         </w:r>
         <w:r>
           <w:rPr>
@@ -1626,7 +1626,7 @@
           <w14:ligatures w14:val="standardContextual"/>
         </w:rPr>
       </w:pPr>
-      <w:hyperlink w:anchor="_Toc239336681" w:history="1">
+      <w:hyperlink w:anchor="_Toc239336981" w:history="1">
         <w:r>
           <w:rPr>
             <w:rStyle w:val="Hyperlink"/>
@@ -1653,7 +1653,7 @@
             <w:noProof/>
             <w:webHidden/>
           </w:rPr>
-          <w:instrText xml:space="preserve"> PAGEREF _Toc239336681 \h </w:instrText>
+          <w:instrText xml:space="preserve"> PAGEREF _Toc239336981 \h </w:instrText>
         </w:r>
         <w:r>
           <w:rPr>
@@ -1697,7 +1697,7 @@
           <w14:ligatures w14:val="standardContextual"/>
         </w:rPr>
       </w:pPr>
-      <w:hyperlink w:anchor="_Toc239336682" w:history="1">
+      <w:hyperlink w:anchor="_Toc239336982" w:history="1">
         <w:r>
           <w:rPr>
             <w:rStyle w:val="Hyperlink"/>
@@ -1724,7 +1724,7 @@
             <w:noProof/>
             <w:webHidden/>
           </w:rPr>
-          <w:instrText xml:space="preserve"> PAGEREF _Toc239336682 \h </w:instrText>
+          <w:instrText xml:space="preserve"> PAGEREF _Toc239336982 \h </w:instrText>
         </w:r>
         <w:r>
           <w:rPr>
@@ -1768,7 +1768,7 @@
           <w14:ligatures w14:val="standardContextual"/>
         </w:rPr>
       </w:pPr>
-      <w:hyperlink w:anchor="_Toc239336683" w:history="1">
+      <w:hyperlink w:anchor="_Toc239336983" w:history="1">
         <w:r>
           <w:rPr>
             <w:rStyle w:val="Hyperlink"/>
@@ -1795,7 +1795,7 @@
             <w:noProof/>
             <w:webHidden/>
           </w:rPr>
-          <w:instrText xml:space="preserve"> PAGEREF _Toc239336683 \h </w:instrText>
+          <w:instrText xml:space="preserve"> PAGEREF _Toc239336983 \h </w:instrText>
         </w:r>
         <w:r>
           <w:rPr>
@@ -1839,7 +1839,7 @@
           <w14:ligatures w14:val="standardContextual"/>
         </w:rPr>
       </w:pPr>
-      <w:hyperlink w:anchor="_Toc239336684" w:history="1">
+      <w:hyperlink w:anchor="_Toc239336984" w:history="1">
         <w:r>
           <w:rPr>
             <w:rStyle w:val="Hyperlink"/>
@@ -1866,7 +1866,7 @@
             <w:noProof/>
             <w:webHidden/>
           </w:rPr>
-          <w:instrText xml:space="preserve"> PAGEREF _Toc239336684 \h </w:instrText>
+          <w:instrText xml:space="preserve"> PAGEREF _Toc239336984 \h </w:instrText>
         </w:r>
         <w:r>
           <w:rPr>
@@ -1910,7 +1910,7 @@
           <w14:ligatures w14:val="standardContextual"/>
         </w:rPr>
       </w:pPr>
-      <w:hyperlink w:anchor="_Toc239336685" w:history="1">
+      <w:hyperlink w:anchor="_Toc239336985" w:history="1">
         <w:r>
           <w:rPr>
             <w:rStyle w:val="Hyperlink"/>
@@ -1937,7 +1937,7 @@
             <w:noProof/>
             <w:webHidden/>
           </w:rPr>
-          <w:instrText xml:space="preserve"> PAGEREF _Toc239336685 \h </w:instrText>
+          <w:instrText xml:space="preserve"> PAGEREF _Toc239336985 \h </w:instrText>
         </w:r>
         <w:r>
           <w:rPr>
@@ -1981,7 +1981,7 @@
           <w14:ligatures w14:val="standardContextual"/>
         </w:rPr>
       </w:pPr>
-      <w:hyperlink w:anchor="_Toc239336686" w:history="1">
+      <w:hyperlink w:anchor="_Toc239336986" w:history="1">
         <w:r>
           <w:rPr>
             <w:rStyle w:val="Hyperlink"/>
@@ -2008,7 +2008,7 @@
             <w:noProof/>
             <w:webHidden/>
           </w:rPr>
-          <w:instrText xml:space="preserve"> PAGEREF _Toc239336686 \h </w:instrText>
+          <w:instrText xml:space="preserve"> PAGEREF _Toc239336986 \h </w:instrText>
         </w:r>
         <w:r>
           <w:rPr>
@@ -2052,7 +2052,7 @@
           <w14:ligatures w14:val="standardContextual"/>
         </w:rPr>
       </w:pPr>
-      <w:hyperlink w:anchor="_Toc239336687" w:history="1">
+      <w:hyperlink w:anchor="_Toc239336987" w:history="1">
         <w:r>
           <w:rPr>
             <w:rStyle w:val="Hyperlink"/>
@@ -2079,7 +2079,7 @@
             <w:noProof/>
             <w:webHidden/>
           </w:rPr>
-          <w:instrText xml:space="preserve"> PAGEREF _Toc239336687 \h </w:instrText>
+          <w:instrText xml:space="preserve"> PAGEREF _Toc239336987 \h </w:instrText>
         </w:r>
         <w:r>
           <w:rPr>
@@ -2123,7 +2123,7 @@
           <w14:ligatures w14:val="standardContextual"/>
         </w:rPr>
       </w:pPr>
-      <w:hyperlink w:anchor="_Toc239336688" w:history="1">
+      <w:hyperlink w:anchor="_Toc239336988" w:history="1">
         <w:r>
           <w:rPr>
             <w:rStyle w:val="Hyperlink"/>
@@ -2150,7 +2150,7 @@
             <w:noProof/>
             <w:webHidden/>
           </w:rPr>
-          <w:instrText xml:space="preserve"> PAGEREF _Toc239336688 \h </w:instrText>
+          <w:instrText xml:space="preserve"> PAGEREF _Toc239336988 \h </w:instrText>
         </w:r>
         <w:r>
           <w:rPr>
@@ -2194,7 +2194,7 @@
           <w14:ligatures w14:val="standardContextual"/>
         </w:rPr>
       </w:pPr>
-      <w:hyperlink w:anchor="_Toc239336689" w:history="1">
+      <w:hyperlink w:anchor="_Toc239336989" w:history="1">
         <w:r>
           <w:rPr>
             <w:rStyle w:val="Hyperlink"/>
@@ -2221,7 +2221,7 @@
             <w:noProof/>
             <w:webHidden/>
           </w:rPr>
-          <w:instrText xml:space="preserve"> PAGEREF _Toc239336689 \h </w:instrText>
+          <w:instrText xml:space="preserve"> PAGEREF _Toc239336989 \h </w:instrText>
         </w:r>
         <w:r>
           <w:rPr>
@@ -2265,7 +2265,7 @@
           <w14:ligatures w14:val="standardContextual"/>
         </w:rPr>
       </w:pPr>
-      <w:hyperlink w:anchor="_Toc239336690" w:history="1">
+      <w:hyperlink w:anchor="_Toc239336990" w:history="1">
         <w:r>
           <w:rPr>
             <w:rStyle w:val="Hyperlink"/>
@@ -2292,7 +2292,7 @@
             <w:noProof/>
             <w:webHidden/>
           </w:rPr>
-          <w:instrText xml:space="preserve"> PAGEREF _Toc239336690 \h </w:instrText>
+          <w:instrText xml:space="preserve"> PAGEREF _Toc239336990 \h </w:instrText>
         </w:r>
         <w:r>
           <w:rPr>
@@ -2336,7 +2336,7 @@
           <w14:ligatures w14:val="standardContextual"/>
         </w:rPr>
       </w:pPr>
-      <w:hyperlink w:anchor="_Toc239336691" w:history="1">
+      <w:hyperlink w:anchor="_Toc239336991" w:history="1">
         <w:r>
           <w:rPr>
             <w:rStyle w:val="Hyperlink"/>
@@ -2363,7 +2363,7 @@
             <w:noProof/>
             <w:webHidden/>
           </w:rPr>
-          <w:instrText xml:space="preserve"> PAGEREF _Toc239336691 \h </w:instrText>
+          <w:instrText xml:space="preserve"> PAGEREF _Toc239336991 \h </w:instrText>
         </w:r>
         <w:r>
           <w:rPr>
@@ -2407,7 +2407,7 @@
           <w14:ligatures w14:val="standardContextual"/>
         </w:rPr>
       </w:pPr>
-      <w:hyperlink w:anchor="_Toc239336692" w:history="1">
+      <w:hyperlink w:anchor="_Toc239336992" w:history="1">
         <w:r>
           <w:rPr>
             <w:rStyle w:val="Hyperlink"/>
@@ -2434,7 +2434,7 @@
             <w:noProof/>
             <w:webHidden/>
           </w:rPr>
-          <w:instrText xml:space="preserve"> PAGEREF _Toc239336692 \h </w:instrText>
+          <w:instrText xml:space="preserve"> PAGEREF _Toc239336992 \h </w:instrText>
         </w:r>
         <w:r>
           <w:rPr>
@@ -2478,7 +2478,7 @@
           <w14:ligatures w14:val="standardContextual"/>
         </w:rPr>
       </w:pPr>
-      <w:hyperlink w:anchor="_Toc239336693" w:history="1">
+      <w:hyperlink w:anchor="_Toc239336993" w:history="1">
         <w:r>
           <w:rPr>
             <w:rStyle w:val="Hyperlink"/>
@@ -2505,7 +2505,7 @@
             <w:noProof/>
             <w:webHidden/>
           </w:rPr>
-          <w:instrText xml:space="preserve"> PAGEREF _Toc239336693 \h </w:instrText>
+          <w:instrText xml:space="preserve"> PAGEREF _Toc239336993 \h </w:instrText>
         </w:r>
         <w:r>
           <w:rPr>
@@ -2549,7 +2549,7 @@
           <w14:ligatures w14:val="standardContextual"/>
         </w:rPr>
       </w:pPr>
-      <w:hyperlink w:anchor="_Toc239336694" w:history="1">
+      <w:hyperlink w:anchor="_Toc239336994" w:history="1">
         <w:r>
           <w:rPr>
             <w:rStyle w:val="Hyperlink"/>
@@ -2576,7 +2576,7 @@
             <w:noProof/>
             <w:webHidden/>
           </w:rPr>
-          <w:instrText xml:space="preserve"> PAGEREF _Toc239336694 \h </w:instrText>
+          <w:instrText xml:space="preserve"> PAGEREF _Toc239336994 \h </w:instrText>
         </w:r>
         <w:r>
           <w:rPr>
@@ -2620,7 +2620,7 @@
           <w14:ligatures w14:val="standardContextual"/>
         </w:rPr>
       </w:pPr>
-      <w:hyperlink w:anchor="_Toc239336695" w:history="1">
+      <w:hyperlink w:anchor="_Toc239336995" w:history="1">
         <w:r>
           <w:rPr>
             <w:rStyle w:val="Hyperlink"/>
@@ -2647,7 +2647,7 @@
             <w:noProof/>
             <w:webHidden/>
           </w:rPr>
-          <w:instrText xml:space="preserve"> PAGEREF _Toc239336695 \h </w:instrText>
+          <w:instrText xml:space="preserve"> PAGEREF _Toc239336995 \h </w:instrText>
         </w:r>
         <w:r>
           <w:rPr>
@@ -2691,7 +2691,7 @@
           <w14:ligatures w14:val="standardContextual"/>
         </w:rPr>
       </w:pPr>
-      <w:hyperlink w:anchor="_Toc239336696" w:history="1">
+      <w:hyperlink w:anchor="_Toc239336996" w:history="1">
         <w:r>
           <w:rPr>
             <w:rStyle w:val="Hyperlink"/>
@@ -2718,7 +2718,7 @@
             <w:noProof/>
             <w:webHidden/>
           </w:rPr>
-          <w:instrText xml:space="preserve"> PAGEREF _Toc239336696 \h </w:instrText>
+          <w:instrText xml:space="preserve"> PAGEREF _Toc239336996 \h </w:instrText>
         </w:r>
         <w:r>
           <w:rPr>
@@ -2762,7 +2762,7 @@
           <w14:ligatures w14:val="standardContextual"/>
         </w:rPr>
       </w:pPr>
-      <w:hyperlink w:anchor="_Toc239336697" w:history="1">
+      <w:hyperlink w:anchor="_Toc239336997" w:history="1">
         <w:r>
           <w:rPr>
             <w:rStyle w:val="Hyperlink"/>
@@ -2789,7 +2789,7 @@
             <w:noProof/>
             <w:webHidden/>
           </w:rPr>
-          <w:instrText xml:space="preserve"> PAGEREF _Toc239336697 \h </w:instrText>
+          <w:instrText xml:space="preserve"> PAGEREF _Toc239336997 \h </w:instrText>
         </w:r>
         <w:r>
           <w:rPr>
@@ -2833,7 +2833,7 @@
           <w14:ligatures w14:val="standardContextual"/>
         </w:rPr>
       </w:pPr>
-      <w:hyperlink w:anchor="_Toc239336698" w:history="1">
+      <w:hyperlink w:anchor="_Toc239336998" w:history="1">
         <w:r>
           <w:rPr>
             <w:rStyle w:val="Hyperlink"/>
@@ -2860,7 +2860,7 @@
             <w:noProof/>
             <w:webHidden/>
           </w:rPr>
-          <w:instrText xml:space="preserve"> PAGEREF _Toc239336698 \h </w:instrText>
+          <w:instrText xml:space="preserve"> PAGEREF _Toc239336998 \h </w:instrText>
         </w:r>
         <w:r>
           <w:rPr>
@@ -2904,7 +2904,7 @@
           <w14:ligatures w14:val="standardContextual"/>
         </w:rPr>
       </w:pPr>
-      <w:hyperlink w:anchor="_Toc239336699" w:history="1">
+      <w:hyperlink w:anchor="_Toc239336999" w:history="1">
         <w:r>
           <w:rPr>
             <w:rStyle w:val="Hyperlink"/>
@@ -2931,7 +2931,7 @@
             <w:noProof/>
             <w:webHidden/>
           </w:rPr>
-          <w:instrText xml:space="preserve"> PAGEREF _Toc239336699 \h </w:instrText>
+          <w:instrText xml:space="preserve"> PAGEREF _Toc239336999 \h </w:instrText>
         </w:r>
         <w:r>
           <w:rPr>
@@ -2975,7 +2975,7 @@
           <w14:ligatures w14:val="standardContextual"/>
         </w:rPr>
       </w:pPr>
-      <w:hyperlink w:anchor="_Toc239336700" w:history="1">
+      <w:hyperlink w:anchor="_Toc239337000" w:history="1">
         <w:r>
           <w:rPr>
             <w:rStyle w:val="Hyperlink"/>
@@ -3002,7 +3002,7 @@
             <w:noProof/>
             <w:webHidden/>
           </w:rPr>
-          <w:instrText xml:space="preserve"> PAGEREF _Toc239336700 \h </w:instrText>
+          <w:instrText xml:space="preserve"> PAGEREF _Toc239337000 \h </w:instrText>
         </w:r>
         <w:r>
           <w:rPr>
@@ -3046,7 +3046,7 @@
           <w14:ligatures w14:val="standardContextual"/>
         </w:rPr>
       </w:pPr>
-      <w:hyperlink w:anchor="_Toc239336701" w:history="1">
+      <w:hyperlink w:anchor="_Toc239337001" w:history="1">
         <w:r>
           <w:rPr>
             <w:rStyle w:val="Hyperlink"/>
@@ -3073,7 +3073,7 @@
             <w:noProof/>
             <w:webHidden/>
           </w:rPr>
-          <w:instrText xml:space="preserve"> PAGEREF _Toc239336701 \h </w:instrText>
+          <w:instrText xml:space="preserve"> PAGEREF _Toc239337001 \h </w:instrText>
         </w:r>
         <w:r>
           <w:rPr>
@@ -3117,7 +3117,7 @@
           <w14:ligatures w14:val="standardContextual"/>
         </w:rPr>
       </w:pPr>
-      <w:hyperlink w:anchor="_Toc239336702" w:history="1">
+      <w:hyperlink w:anchor="_Toc239337002" w:history="1">
         <w:r>
           <w:rPr>
             <w:rStyle w:val="Hyperlink"/>
@@ -3144,7 +3144,7 @@
             <w:noProof/>
             <w:webHidden/>
           </w:rPr>
-          <w:instrText xml:space="preserve"> PAGEREF _Toc239336702 \h </w:instrText>
+          <w:instrText xml:space="preserve"> PAGEREF _Toc239337002 \h </w:instrText>
         </w:r>
         <w:r>
           <w:rPr>
@@ -3188,7 +3188,7 @@
           <w14:ligatures w14:val="standardContextual"/>
         </w:rPr>
       </w:pPr>
-      <w:hyperlink w:anchor="_Toc239336703" w:history="1">
+      <w:hyperlink w:anchor="_Toc239337003" w:history="1">
         <w:r>
           <w:rPr>
             <w:rStyle w:val="Hyperlink"/>
@@ -3215,7 +3215,7 @@
             <w:noProof/>
             <w:webHidden/>
           </w:rPr>
-          <w:instrText xml:space="preserve"> PAGEREF _Toc239336703 \h </w:instrText>
+          <w:instrText xml:space="preserve"> PAGEREF _Toc239337003 \h </w:instrText>
         </w:r>
         <w:r>
           <w:rPr>
@@ -3259,7 +3259,7 @@
           <w14:ligatures w14:val="standardContextual"/>
         </w:rPr>
       </w:pPr>
-      <w:hyperlink w:anchor="_Toc239336704" w:history="1">
+      <w:hyperlink w:anchor="_Toc239337004" w:history="1">
         <w:r>
           <w:rPr>
             <w:rStyle w:val="Hyperlink"/>
@@ -3286,7 +3286,7 @@
             <w:noProof/>
             <w:webHidden/>
           </w:rPr>
-          <w:instrText xml:space="preserve"> PAGEREF _Toc239336704 \h </w:instrText>
+          <w:instrText xml:space="preserve"> PAGEREF _Toc239337004 \h </w:instrText>
         </w:r>
         <w:r>
           <w:rPr>
@@ -3330,7 +3330,7 @@
           <w14:ligatures w14:val="standardContextual"/>
         </w:rPr>
       </w:pPr>
-      <w:hyperlink w:anchor="_Toc239336705" w:history="1">
+      <w:hyperlink w:anchor="_Toc239337005" w:history="1">
         <w:r>
           <w:rPr>
             <w:rStyle w:val="Hyperlink"/>
@@ -3357,7 +3357,7 @@
             <w:noProof/>
             <w:webHidden/>
           </w:rPr>
-          <w:instrText xml:space="preserve"> PAGEREF _Toc239336705 \h </w:instrText>
+          <w:instrText xml:space="preserve"> PAGEREF _Toc239337005 \h </w:instrText>
         </w:r>
         <w:r>
           <w:rPr>
@@ -3401,7 +3401,7 @@
           <w14:ligatures w14:val="standardContextual"/>
         </w:rPr>
       </w:pPr>
-      <w:hyperlink w:anchor="_Toc239336706" w:history="1">
+      <w:hyperlink w:anchor="_Toc239337006" w:history="1">
         <w:r>
           <w:rPr>
             <w:rStyle w:val="Hyperlink"/>
@@ -3428,7 +3428,7 @@
             <w:noProof/>
             <w:webHidden/>
           </w:rPr>
-          <w:instrText xml:space="preserve"> PAGEREF _Toc239336706 \h </w:instrText>
+          <w:instrText xml:space="preserve"> PAGEREF _Toc239337006 \h </w:instrText>
         </w:r>
         <w:r>
           <w:rPr>
@@ -3474,7 +3474,7 @@
         <w:pStyle w:val="Heading1"/>
       </w:pPr>
       <w:bookmarkStart w:id="8" w:name="chương-1-giới-thiệu"/>
-      <w:bookmarkStart w:id="9" w:name="_Toc239336673"/>
+      <w:bookmarkStart w:id="9" w:name="_Toc239336973"/>
       <w:bookmarkEnd w:id="4"/>
       <w:bookmarkEnd w:id="6"/>
       <w:r>
@@ -3499,7 +3499,7 @@
         <w:pStyle w:val="Heading2"/>
       </w:pPr>
       <w:bookmarkStart w:id="10" w:name="X7d99df2d9d0c5141050eb9941026463f4c8ea2b"/>
-      <w:bookmarkStart w:id="11" w:name="_Toc239336674"/>
+      <w:bookmarkStart w:id="11" w:name="_Toc239336974"/>
       <w:r>
         <w:t>1.1. Đ</w:t>
       </w:r>
@@ -5349,7 +5349,7 @@
         <w:pStyle w:val="Heading2"/>
       </w:pPr>
       <w:bookmarkStart w:id="12" w:name="X60021b7b958505251ec70bd32e2bac9f8a0361c"/>
-      <w:bookmarkStart w:id="13" w:name="_Toc239336675"/>
+      <w:bookmarkStart w:id="13" w:name="_Toc239336975"/>
       <w:bookmarkEnd w:id="10"/>
       <w:r>
         <w:t>1.2. M</w:t>
@@ -7295,7 +7295,7 @@
         <w:pStyle w:val="Heading2"/>
       </w:pPr>
       <w:bookmarkStart w:id="17" w:name="X03724c88a1b7da9b434cf0a8db5356690a4bb71"/>
-      <w:bookmarkStart w:id="18" w:name="_Toc239336676"/>
+      <w:bookmarkStart w:id="18" w:name="_Toc239336976"/>
       <w:bookmarkEnd w:id="12"/>
       <w:bookmarkEnd w:id="16"/>
       <w:r>
@@ -9100,7 +9100,7 @@
         <w:pStyle w:val="Heading1"/>
       </w:pPr>
       <w:bookmarkStart w:id="20" w:name="chương-2-cơ-sở-lý-thuyết"/>
-      <w:bookmarkStart w:id="21" w:name="_Toc239336677"/>
+      <w:bookmarkStart w:id="21" w:name="_Toc239336977"/>
       <w:bookmarkEnd w:id="8"/>
       <w:bookmarkEnd w:id="17"/>
       <w:r>
@@ -9397,7 +9397,7 @@
         <w:pStyle w:val="Heading2"/>
       </w:pPr>
       <w:bookmarkStart w:id="22" w:name="X2256001523e16d112c59df938522f140b8b988e"/>
-      <w:bookmarkStart w:id="23" w:name="_Toc239336678"/>
+      <w:bookmarkStart w:id="23" w:name="_Toc239336978"/>
       <w:r>
         <w:t>2.1. Quy chu</w:t>
       </w:r>
@@ -14076,7 +14076,7 @@
         <w:pStyle w:val="Heading2"/>
       </w:pPr>
       <w:bookmarkStart w:id="30" w:name="Xb21b4f0690a73e92e2a35192cb39315a0956521"/>
-      <w:bookmarkStart w:id="31" w:name="_Toc239336679"/>
+      <w:bookmarkStart w:id="31" w:name="_Toc239336979"/>
       <w:bookmarkEnd w:id="22"/>
       <w:bookmarkEnd w:id="28"/>
       <w:r>
@@ -19316,7 +19316,7 @@
         <w:pStyle w:val="Heading2"/>
       </w:pPr>
       <w:bookmarkStart w:id="38" w:name="X8ff52f1334e3f0e382caf7ffa1b7096a981291c"/>
-      <w:bookmarkStart w:id="39" w:name="_Toc239336680"/>
+      <w:bookmarkStart w:id="39" w:name="_Toc239336980"/>
       <w:bookmarkEnd w:id="30"/>
       <w:bookmarkEnd w:id="37"/>
       <w:r>
@@ -19595,7 +19595,7 @@
           <w:noProof/>
         </w:rPr>
         <w:drawing>
-          <wp:inline distT="0" distB="0" distL="0" distR="0" wp14:anchorId="4F9A19FC" wp14:editId="65E3AAD1">
+          <wp:inline distT="0" distB="0" distL="0" distR="0" wp14:anchorId="06F9C372" wp14:editId="36CB8DFC">
             <wp:extent cx="5334000" cy="1435553"/>
             <wp:effectExtent l="0" t="0" r="0" b="0"/>
             <wp:docPr id="37" name="Picture"/>
@@ -21057,7 +21057,7 @@
         <w:pStyle w:val="Heading2"/>
       </w:pPr>
       <w:bookmarkStart w:id="43" w:name="X1a77f36e16d4ad267b00eabe7cf793e1dbe08e9"/>
-      <w:bookmarkStart w:id="44" w:name="_Toc239336681"/>
+      <w:bookmarkStart w:id="44" w:name="_Toc239336981"/>
       <w:bookmarkEnd w:id="38"/>
       <w:bookmarkEnd w:id="42"/>
       <w:r>
@@ -22227,7 +22227,7 @@
           <w:noProof/>
         </w:rPr>
         <w:drawing>
-          <wp:inline distT="0" distB="0" distL="0" distR="0" wp14:anchorId="6A1CFEB2" wp14:editId="7563ECA5">
+          <wp:inline distT="0" distB="0" distL="0" distR="0" wp14:anchorId="3A12BE69" wp14:editId="7C1F8F05">
             <wp:extent cx="5334000" cy="2884362"/>
             <wp:effectExtent l="0" t="0" r="0" b="0"/>
             <wp:docPr id="44" name="Picture"/>
@@ -22493,7 +22493,7 @@
           <w:noProof/>
         </w:rPr>
         <w:drawing>
-          <wp:inline distT="0" distB="0" distL="0" distR="0" wp14:anchorId="157A6B0F" wp14:editId="1469CE55">
+          <wp:inline distT="0" distB="0" distL="0" distR="0" wp14:anchorId="61BE9A97" wp14:editId="683D82B9">
             <wp:extent cx="5334000" cy="632732"/>
             <wp:effectExtent l="0" t="0" r="0" b="0"/>
             <wp:docPr id="49" name="Picture"/>
@@ -24396,7 +24396,7 @@
         <w:pStyle w:val="Heading1"/>
       </w:pPr>
       <w:bookmarkStart w:id="50" w:name="chương-3-thiết-kế-và-cài-đặt"/>
-      <w:bookmarkStart w:id="51" w:name="_Toc239336682"/>
+      <w:bookmarkStart w:id="51" w:name="_Toc239336982"/>
       <w:bookmarkEnd w:id="20"/>
       <w:bookmarkEnd w:id="43"/>
       <w:bookmarkEnd w:id="49"/>
@@ -24428,7 +24428,7 @@
         <w:pStyle w:val="Heading2"/>
       </w:pPr>
       <w:bookmarkStart w:id="52" w:name="X21a22cc9b66dca004f2960f37df13c53a04e97b"/>
-      <w:bookmarkStart w:id="53" w:name="_Toc239336683"/>
+      <w:bookmarkStart w:id="53" w:name="_Toc239336983"/>
       <w:r>
         <w:t>3.1. Ki</w:t>
       </w:r>
@@ -24520,7 +24520,7 @@
           <w:noProof/>
         </w:rPr>
         <w:drawing>
-          <wp:inline distT="0" distB="0" distL="0" distR="0" wp14:anchorId="3A1D48FA" wp14:editId="10857E35">
+          <wp:inline distT="0" distB="0" distL="0" distR="0" wp14:anchorId="1ACCD451" wp14:editId="3EF9EA7D">
             <wp:extent cx="5334000" cy="401410"/>
             <wp:effectExtent l="0" t="0" r="0" b="0"/>
             <wp:docPr id="57" name="Picture"/>
@@ -26189,7 +26189,7 @@
         <w:pStyle w:val="Heading2"/>
       </w:pPr>
       <w:bookmarkStart w:id="55" w:name="X1f307d8f8c73bce8db8683c986faea6c8ea66a3"/>
-      <w:bookmarkStart w:id="56" w:name="_Toc239336684"/>
+      <w:bookmarkStart w:id="56" w:name="_Toc239336984"/>
       <w:bookmarkEnd w:id="52"/>
       <w:r>
         <w:t>3.2. Xây d</w:t>
@@ -26256,7 +26256,7 @@
           <w:noProof/>
         </w:rPr>
         <w:drawing>
-          <wp:inline distT="0" distB="0" distL="0" distR="0" wp14:anchorId="6C47737E" wp14:editId="0C26AA7A">
+          <wp:inline distT="0" distB="0" distL="0" distR="0" wp14:anchorId="14A586B1" wp14:editId="2D2D0081">
             <wp:extent cx="5334000" cy="802821"/>
             <wp:effectExtent l="0" t="0" r="0" b="0"/>
             <wp:docPr id="62" name="Picture"/>
@@ -30368,7 +30368,7 @@
         <w:pStyle w:val="Heading2"/>
       </w:pPr>
       <w:bookmarkStart w:id="62" w:name="X6a397cb1739f1ec0a8c9714808f79a5ce1fbf6f"/>
-      <w:bookmarkStart w:id="63" w:name="_Toc239336685"/>
+      <w:bookmarkStart w:id="63" w:name="_Toc239336985"/>
       <w:bookmarkEnd w:id="55"/>
       <w:bookmarkEnd w:id="61"/>
       <w:r>
@@ -31934,7 +31934,7 @@
         <w:pStyle w:val="Heading2"/>
       </w:pPr>
       <w:bookmarkStart w:id="65" w:name="X9c2c9b365086d10c999a46e4942f14d73b6baa5"/>
-      <w:bookmarkStart w:id="66" w:name="_Toc239336686"/>
+      <w:bookmarkStart w:id="66" w:name="_Toc239336986"/>
       <w:bookmarkEnd w:id="62"/>
       <w:r>
         <w:t>3.4. Kh</w:t>
@@ -32718,7 +32718,7 @@
           <w:noProof/>
         </w:rPr>
         <w:drawing>
-          <wp:inline distT="0" distB="0" distL="0" distR="0" wp14:anchorId="4266CDFB" wp14:editId="7CF8F0D8">
+          <wp:inline distT="0" distB="0" distL="0" distR="0" wp14:anchorId="3279244A" wp14:editId="6C71F309">
             <wp:extent cx="5334000" cy="8969712"/>
             <wp:effectExtent l="0" t="0" r="0" b="0"/>
             <wp:docPr id="73" name="Picture"/>
@@ -38667,7 +38667,7 @@
         <w:pStyle w:val="Heading2"/>
       </w:pPr>
       <w:bookmarkStart w:id="75" w:name="Xb17945b5d9374e5087c2c96ace1685ff00e2e22"/>
-      <w:bookmarkStart w:id="76" w:name="_Toc239336687"/>
+      <w:bookmarkStart w:id="76" w:name="_Toc239336987"/>
       <w:bookmarkEnd w:id="65"/>
       <w:bookmarkEnd w:id="74"/>
       <w:r>
@@ -40037,7 +40037,7 @@
         <w:pStyle w:val="Heading2"/>
       </w:pPr>
       <w:bookmarkStart w:id="77" w:name="Xfad7df3f963ac0b8ebfe8cf87d7c64fa075f760"/>
-      <w:bookmarkStart w:id="78" w:name="_Toc239336688"/>
+      <w:bookmarkStart w:id="78" w:name="_Toc239336988"/>
       <w:bookmarkEnd w:id="75"/>
       <w:r>
         <w:t>3.6. B</w:t>
@@ -40083,7 +40083,7 @@
           <w:noProof/>
         </w:rPr>
         <w:drawing>
-          <wp:inline distT="0" distB="0" distL="0" distR="0" wp14:anchorId="753C866D" wp14:editId="2DFDFC75">
+          <wp:inline distT="0" distB="0" distL="0" distR="0" wp14:anchorId="6A859D66" wp14:editId="22F43915">
             <wp:extent cx="5334000" cy="1217839"/>
             <wp:effectExtent l="0" t="0" r="0" b="0"/>
             <wp:docPr id="86" name="Picture"/>
@@ -42864,7 +42864,7 @@
         <w:pStyle w:val="Heading2"/>
       </w:pPr>
       <w:bookmarkStart w:id="80" w:name="X9b5467225f237e4ee44d60f7d236cbdfdaa1e07"/>
-      <w:bookmarkStart w:id="81" w:name="_Toc239336689"/>
+      <w:bookmarkStart w:id="81" w:name="_Toc239336989"/>
       <w:bookmarkEnd w:id="77"/>
       <w:r>
         <w:t xml:space="preserve">3.7. </w:t>
@@ -42984,7 +42984,7 @@
           <w:noProof/>
         </w:rPr>
         <w:drawing>
-          <wp:inline distT="0" distB="0" distL="0" distR="0" wp14:anchorId="03CAEDE6" wp14:editId="1B15386B">
+          <wp:inline distT="0" distB="0" distL="0" distR="0" wp14:anchorId="0E3EAB1B" wp14:editId="1536E16F">
             <wp:extent cx="5334000" cy="5953125"/>
             <wp:effectExtent l="0" t="0" r="0" b="0"/>
             <wp:docPr id="91" name="Picture"/>
@@ -44094,7 +44094,7 @@
         <w:pStyle w:val="Heading1"/>
       </w:pPr>
       <w:bookmarkStart w:id="83" w:name="chương-4-thực-nghiệm-và-đánh-giá"/>
-      <w:bookmarkStart w:id="84" w:name="_Toc239336690"/>
+      <w:bookmarkStart w:id="84" w:name="_Toc239336990"/>
       <w:bookmarkEnd w:id="50"/>
       <w:bookmarkEnd w:id="80"/>
       <w:r>
@@ -44119,7 +44119,7 @@
         <w:pStyle w:val="Heading2"/>
       </w:pPr>
       <w:bookmarkStart w:id="85" w:name="X43cb4672f728ce1df4f211c1d18360135f0c40b"/>
-      <w:bookmarkStart w:id="86" w:name="_Toc239336691"/>
+      <w:bookmarkStart w:id="86" w:name="_Toc239336991"/>
       <w:r>
         <w:t>4.1. Môi trư</w:t>
       </w:r>
@@ -45741,7 +45741,7 @@
         <w:pStyle w:val="Heading2"/>
       </w:pPr>
       <w:bookmarkStart w:id="87" w:name="Xe48430b60e6d2b1022368eb4316c1fe9f53411f"/>
-      <w:bookmarkStart w:id="88" w:name="_Toc239336692"/>
+      <w:bookmarkStart w:id="88" w:name="_Toc239336992"/>
       <w:bookmarkEnd w:id="85"/>
       <w:r>
         <w:t>4.2. K</w:t>
@@ -49276,7 +49276,7 @@
         <w:pStyle w:val="Heading2"/>
       </w:pPr>
       <w:bookmarkStart w:id="95" w:name="X09b724f0b907c7f652c2569c27ef1d5728c277c"/>
-      <w:bookmarkStart w:id="96" w:name="_Toc239336693"/>
+      <w:bookmarkStart w:id="96" w:name="_Toc239336993"/>
       <w:bookmarkEnd w:id="87"/>
       <w:bookmarkEnd w:id="93"/>
       <w:r>
@@ -51548,7 +51548,7 @@
           <w:noProof/>
         </w:rPr>
         <w:drawing>
-          <wp:inline distT="0" distB="0" distL="0" distR="0" wp14:anchorId="18222CA0" wp14:editId="7216C219">
+          <wp:inline distT="0" distB="0" distL="0" distR="0" wp14:anchorId="757322C2" wp14:editId="5D095899">
             <wp:extent cx="5334000" cy="2883855"/>
             <wp:effectExtent l="0" t="0" r="0" b="0"/>
             <wp:docPr id="108" name="Picture"/>
@@ -56571,7 +56571,7 @@
         <w:pStyle w:val="Heading2"/>
       </w:pPr>
       <w:bookmarkStart w:id="106" w:name="X0c205a3fd5474e5e1d380a3735df7543f97f059"/>
-      <w:bookmarkStart w:id="107" w:name="_Toc239336694"/>
+      <w:bookmarkStart w:id="107" w:name="_Toc239336994"/>
       <w:bookmarkEnd w:id="95"/>
       <w:bookmarkEnd w:id="104"/>
       <w:r>
@@ -59513,7 +59513,7 @@
         <w:pStyle w:val="Heading2"/>
       </w:pPr>
       <w:bookmarkStart w:id="113" w:name="X8f4b2c0e55e8764a0677cdfa39e96dbe6822859"/>
-      <w:bookmarkStart w:id="114" w:name="_Toc239336695"/>
+      <w:bookmarkStart w:id="114" w:name="_Toc239336995"/>
       <w:bookmarkEnd w:id="106"/>
       <w:bookmarkEnd w:id="112"/>
       <w:r>
@@ -62656,7 +62656,7 @@
         <w:pStyle w:val="Heading2"/>
       </w:pPr>
       <w:bookmarkStart w:id="120" w:name="X7468ed9f095dd0192ebc5de940dc44b5cd3e099"/>
-      <w:bookmarkStart w:id="121" w:name="_Toc239336696"/>
+      <w:bookmarkStart w:id="121" w:name="_Toc239336996"/>
       <w:bookmarkEnd w:id="113"/>
       <w:bookmarkEnd w:id="118"/>
       <w:r>
@@ -64517,7 +64517,7 @@
           <w:noProof/>
         </w:rPr>
         <w:drawing>
-          <wp:inline distT="0" distB="0" distL="0" distR="0" wp14:anchorId="6E214053" wp14:editId="0CADAB1D">
+          <wp:inline distT="0" distB="0" distL="0" distR="0" wp14:anchorId="4A98C39E" wp14:editId="61955CAA">
             <wp:extent cx="5334000" cy="3317670"/>
             <wp:effectExtent l="0" t="0" r="0" b="0"/>
             <wp:docPr id="131" name="Picture"/>
@@ -65249,7 +65249,7 @@
         <w:pStyle w:val="Heading2"/>
       </w:pPr>
       <w:bookmarkStart w:id="124" w:name="X88e1c26a6581f7bd1dbdb2c85ae6116c5ba8393"/>
-      <w:bookmarkStart w:id="125" w:name="_Toc239336697"/>
+      <w:bookmarkStart w:id="125" w:name="_Toc239336997"/>
       <w:bookmarkEnd w:id="120"/>
       <w:r>
         <w:t>4.7. Các y</w:t>
@@ -67104,7 +67104,7 @@
         <w:pStyle w:val="Heading1"/>
       </w:pPr>
       <w:bookmarkStart w:id="127" w:name="chương-5-kết-luận-và-hướng-phát-triển"/>
-      <w:bookmarkStart w:id="128" w:name="_Toc239336698"/>
+      <w:bookmarkStart w:id="128" w:name="_Toc239336998"/>
       <w:bookmarkEnd w:id="83"/>
       <w:bookmarkEnd w:id="124"/>
       <w:r>
@@ -67141,7 +67141,7 @@
         <w:pStyle w:val="Heading2"/>
       </w:pPr>
       <w:bookmarkStart w:id="129" w:name="Xcefa088882d41b38c21b7b5b44c738cb5564fbb"/>
-      <w:bookmarkStart w:id="130" w:name="_Toc239336699"/>
+      <w:bookmarkStart w:id="130" w:name="_Toc239336999"/>
       <w:r>
         <w:t>5.1. K</w:t>
       </w:r>
@@ -68642,7 +68642,7 @@
         <w:pStyle w:val="Heading2"/>
       </w:pPr>
       <w:bookmarkStart w:id="132" w:name="Xe79f58ab8ce7b6f148c68a374118dd9eaec1a1c"/>
-      <w:bookmarkStart w:id="133" w:name="_Toc239336700"/>
+      <w:bookmarkStart w:id="133" w:name="_Toc239337000"/>
       <w:bookmarkEnd w:id="129"/>
       <w:r>
         <w:t>5.2. H</w:t>
@@ -69856,7 +69856,7 @@
         <w:pStyle w:val="Heading2"/>
       </w:pPr>
       <w:bookmarkStart w:id="135" w:name="X66db71c9020c40cf46e490c5c37ad244e2b7594"/>
-      <w:bookmarkStart w:id="136" w:name="_Toc239336701"/>
+      <w:bookmarkStart w:id="136" w:name="_Toc239337001"/>
       <w:bookmarkEnd w:id="132"/>
       <w:r>
         <w:t>5.3. Hư</w:t>
@@ -71447,7 +71447,7 @@
         <w:pStyle w:val="Heading2"/>
       </w:pPr>
       <w:bookmarkStart w:id="138" w:name="Xe5a2fe3dfcd4681648271b7ddc344b106e48b3b"/>
-      <w:bookmarkStart w:id="139" w:name="_Toc239336702"/>
+      <w:bookmarkStart w:id="139" w:name="_Toc239337002"/>
       <w:bookmarkEnd w:id="135"/>
       <w:r>
         <w:t>5.4. K</w:t>
@@ -72370,7 +72370,7 @@
         <w:pStyle w:val="Heading1"/>
       </w:pPr>
       <w:bookmarkStart w:id="140" w:name="tài-liệu-tham-khảo"/>
-      <w:bookmarkStart w:id="141" w:name="_Toc239336703"/>
+      <w:bookmarkStart w:id="141" w:name="_Toc239337003"/>
       <w:bookmarkEnd w:id="127"/>
       <w:bookmarkEnd w:id="138"/>
       <w:r>
@@ -73396,7 +73396,7 @@
         <w:pStyle w:val="Heading1"/>
       </w:pPr>
       <w:bookmarkStart w:id="142" w:name="phụ-lục"/>
-      <w:bookmarkStart w:id="143" w:name="_Toc239336704"/>
+      <w:bookmarkStart w:id="143" w:name="_Toc239337004"/>
       <w:bookmarkEnd w:id="140"/>
       <w:r>
         <w:t>PH</w:t>
@@ -73420,7 +73420,7 @@
         <w:pStyle w:val="Heading2"/>
       </w:pPr>
       <w:bookmarkStart w:id="144" w:name="phụ-lục-a-cấu-hình-và-siêu-tham-số"/>
-      <w:bookmarkStart w:id="145" w:name="_Toc239336705"/>
+      <w:bookmarkStart w:id="145" w:name="_Toc239337005"/>
       <w:r>
         <w:t>Ph</w:t>
       </w:r>
@@ -75640,7 +75640,7 @@
         <w:pStyle w:val="Heading2"/>
       </w:pPr>
       <w:bookmarkStart w:id="149" w:name="phụ-lục-b-hướng-dẫn-cài-đặt-và-chạy"/>
-      <w:bookmarkStart w:id="150" w:name="_Toc239336706"/>
+      <w:bookmarkStart w:id="150" w:name="_Toc239337006"/>
       <w:bookmarkEnd w:id="144"/>
       <w:bookmarkEnd w:id="148"/>
       <w:r>
@@ -77209,7 +77209,7 @@
   <w:abstractNum w:abstractNumId="0" w15:restartNumberingAfterBreak="0">
     <w:nsid w:val="0000A990"/>
     <w:multiLevelType w:val="multilevel"/>
-    <w:tmpl w:val="EF0430D8"/>
+    <w:tmpl w:val="77B271FE"/>
     <w:lvl w:ilvl="0">
       <w:numFmt w:val="bullet"/>
       <w:lvlText w:val=" "/>
@@ -77286,7 +77286,7 @@
   <w:abstractNum w:abstractNumId="1" w15:restartNumberingAfterBreak="0">
     <w:nsid w:val="0000A991"/>
     <w:multiLevelType w:val="multilevel"/>
-    <w:tmpl w:val="D2A22CAE"/>
+    <w:tmpl w:val="A27CFDDE"/>
     <w:lvl w:ilvl="0">
       <w:numFmt w:val="bullet"/>
       <w:lvlText w:val=""/>
@@ -77390,7 +77390,7 @@
   <w:abstractNum w:abstractNumId="2" w15:restartNumberingAfterBreak="0">
     <w:nsid w:val="00A99411"/>
     <w:multiLevelType w:val="multilevel"/>
-    <w:tmpl w:val="3738DC9A"/>
+    <w:tmpl w:val="36282240"/>
     <w:lvl w:ilvl="0">
       <w:start w:val="1"/>
       <w:numFmt w:val="decimal"/>
@@ -77473,10 +77473,10 @@
       </w:pPr>
     </w:lvl>
   </w:abstractNum>
-  <w:num w:numId="1" w16cid:durableId="2062752695">
+  <w:num w:numId="1" w16cid:durableId="1773620871">
     <w:abstractNumId w:val="0"/>
   </w:num>
-  <w:num w:numId="2" w16cid:durableId="1744719261">
+  <w:num w:numId="2" w16cid:durableId="1289816139">
     <w:abstractNumId w:val="2"/>
     <w:lvlOverride w:ilvl="0">
       <w:startOverride w:val="1"/>
@@ -77506,22 +77506,22 @@
       <w:startOverride w:val="1"/>
     </w:lvlOverride>
   </w:num>
-  <w:num w:numId="3" w16cid:durableId="1375426251">
+  <w:num w:numId="3" w16cid:durableId="1968462483">
     <w:abstractNumId w:val="1"/>
   </w:num>
-  <w:num w:numId="4" w16cid:durableId="1488088381">
+  <w:num w:numId="4" w16cid:durableId="1775205192">
     <w:abstractNumId w:val="1"/>
   </w:num>
-  <w:num w:numId="5" w16cid:durableId="1765952645">
+  <w:num w:numId="5" w16cid:durableId="904878420">
     <w:abstractNumId w:val="1"/>
   </w:num>
-  <w:num w:numId="6" w16cid:durableId="314645436">
+  <w:num w:numId="6" w16cid:durableId="1132746065">
     <w:abstractNumId w:val="1"/>
   </w:num>
-  <w:num w:numId="7" w16cid:durableId="545878590">
+  <w:num w:numId="7" w16cid:durableId="505168589">
     <w:abstractNumId w:val="1"/>
   </w:num>
-  <w:num w:numId="8" w16cid:durableId="279435">
+  <w:num w:numId="8" w16cid:durableId="1573546059">
     <w:abstractNumId w:val="2"/>
     <w:lvlOverride w:ilvl="0">
       <w:startOverride w:val="1"/>
@@ -77551,7 +77551,7 @@
       <w:startOverride w:val="1"/>
     </w:lvlOverride>
   </w:num>
-  <w:num w:numId="9" w16cid:durableId="815026106">
+  <w:num w:numId="9" w16cid:durableId="637805752">
     <w:abstractNumId w:val="1"/>
   </w:num>
 </w:numbering>
@@ -78788,7 +78788,7 @@
     <w:next w:val="Normal"/>
     <w:autoRedefine/>
     <w:uiPriority w:val="39"/>
-    <w:rsid w:val="00167BC1"/>
+    <w:rsid w:val="00452C52"/>
     <w:pPr>
       <w:spacing w:after="100"/>
     </w:pPr>
@@ -78799,7 +78799,7 @@
     <w:next w:val="Normal"/>
     <w:autoRedefine/>
     <w:uiPriority w:val="39"/>
-    <w:rsid w:val="00167BC1"/>
+    <w:rsid w:val="00452C52"/>
     <w:pPr>
       <w:spacing w:after="100"/>
       <w:ind w:left="240"/>

</xml_diff>

<commit_message>
docs(mon-hoc): TLTK [7] trang tong hop -> gop ve [4] Cong bao; slide 9 ghi ro S1
Chi tiet 2: [7] la trang tong hop phap luat (thuviennhadat.vn) trich cho
"8 ma tinh khong duoc gan" — thay bang van ban goc. Kiem tra web: Cong bao
Chinh phu co TT 51/2025/TT-BCA (Bo Cong an, ban hanh 30/06/2025, hieu luc
01/07/2025, Cong bao so 887+888 ngay 15/07/2025); trang HTML cua Bo Cong an
tra 404 nen dung Cong bao. Phat hien [4] von da la chinh thong tu nay, nen
KHONG them muc moi ma gop: [4] bo sung day du chi tiet + URL da kiem chung,
ch2 trich [7] -> [4], xoa [7], danh lai [8]-[17] -> [7]-[16] bang mot luot
thay theo bang anh xa (12 trich dan o ch1/ch2/ch4). Kiem: 16 muc lien tuc,
moi muc deu duoc trich, khong trich muc ma, refs 0 chet.

Chi tiet 1: slide 9 cau dan them "sau hau xu ly" sau 0,9541 de khong bi hoi
lai S0 hay S1; check_slides 16 slide 0 loi.

Kiem san pham: PDF 40 trang, TLTK ket thuc [16], khong con [17]/thuviennhadat,
PAGEREF 37/37, mailto 0.
</commit_message>
<xml_diff>
--- a/docs/papers/mon-hoc/thesis-full.docx
+++ b/docs/papers/mon-hoc/thesis-full.docx
@@ -148,7 +148,7 @@
         <w:pStyle w:val="Heading1"/>
       </w:pPr>
       <w:bookmarkStart w:id="0" w:name="đồ-án-môn-học"/>
-      <w:bookmarkStart w:id="1" w:name="_Toc239336970"/>
+      <w:bookmarkStart w:id="1" w:name="_Toc239337436"/>
       <w:r>
         <w:t>Đ</w:t>
       </w:r>
@@ -220,7 +220,7 @@
         <w:pStyle w:val="Heading1"/>
       </w:pPr>
       <w:bookmarkStart w:id="4" w:name="Xbe958ce37c6a089ac9bdc99dada4ec5e2c0f7da"/>
-      <w:bookmarkStart w:id="5" w:name="_Toc239336971"/>
+      <w:bookmarkStart w:id="5" w:name="_Toc239337437"/>
       <w:bookmarkEnd w:id="0"/>
       <w:bookmarkEnd w:id="3"/>
       <w:r>
@@ -795,7 +795,7 @@
     </w:p>
     <w:p>
       <w:r>
-        <w:pict w14:anchorId="32732907">
+        <w:pict w14:anchorId="0AB19EA1">
           <v:rect id="_x0000_i1025" style="width:0;height:1.5pt" o:hralign="center" o:hrstd="t" o:hr="t"/>
         </w:pict>
       </w:r>
@@ -805,7 +805,7 @@
         <w:pStyle w:val="Heading2"/>
       </w:pPr>
       <w:bookmarkStart w:id="6" w:name="mục-lục"/>
-      <w:bookmarkStart w:id="7" w:name="_Toc239336972"/>
+      <w:bookmarkStart w:id="7" w:name="_Toc239337438"/>
       <w:r>
         <w:t>M</w:t>
       </w:r>
@@ -845,7 +845,7 @@
       <w:r>
         <w:fldChar w:fldCharType="separate"/>
       </w:r>
-      <w:hyperlink w:anchor="_Toc239336970" w:history="1">
+      <w:hyperlink w:anchor="_Toc239337436" w:history="1">
         <w:r>
           <w:rPr>
             <w:rStyle w:val="Hyperlink"/>
@@ -872,7 +872,7 @@
             <w:noProof/>
             <w:webHidden/>
           </w:rPr>
-          <w:instrText xml:space="preserve"> PAGEREF _Toc239336970 \h </w:instrText>
+          <w:instrText xml:space="preserve"> PAGEREF _Toc239337436 \h </w:instrText>
         </w:r>
         <w:r>
           <w:rPr>
@@ -916,7 +916,7 @@
           <w14:ligatures w14:val="standardContextual"/>
         </w:rPr>
       </w:pPr>
-      <w:hyperlink w:anchor="_Toc239336971" w:history="1">
+      <w:hyperlink w:anchor="_Toc239337437" w:history="1">
         <w:r>
           <w:rPr>
             <w:rStyle w:val="Hyperlink"/>
@@ -943,7 +943,7 @@
             <w:noProof/>
             <w:webHidden/>
           </w:rPr>
-          <w:instrText xml:space="preserve"> PAGEREF _Toc239336971 \h </w:instrText>
+          <w:instrText xml:space="preserve"> PAGEREF _Toc239337437 \h </w:instrText>
         </w:r>
         <w:r>
           <w:rPr>
@@ -987,7 +987,7 @@
           <w14:ligatures w14:val="standardContextual"/>
         </w:rPr>
       </w:pPr>
-      <w:hyperlink w:anchor="_Toc239336972" w:history="1">
+      <w:hyperlink w:anchor="_Toc239337438" w:history="1">
         <w:r>
           <w:rPr>
             <w:rStyle w:val="Hyperlink"/>
@@ -1014,7 +1014,7 @@
             <w:noProof/>
             <w:webHidden/>
           </w:rPr>
-          <w:instrText xml:space="preserve"> PAGEREF _Toc239336972 \h </w:instrText>
+          <w:instrText xml:space="preserve"> PAGEREF _Toc239337438 \h </w:instrText>
         </w:r>
         <w:r>
           <w:rPr>
@@ -1058,7 +1058,7 @@
           <w14:ligatures w14:val="standardContextual"/>
         </w:rPr>
       </w:pPr>
-      <w:hyperlink w:anchor="_Toc239336973" w:history="1">
+      <w:hyperlink w:anchor="_Toc239337439" w:history="1">
         <w:r>
           <w:rPr>
             <w:rStyle w:val="Hyperlink"/>
@@ -1085,7 +1085,7 @@
             <w:noProof/>
             <w:webHidden/>
           </w:rPr>
-          <w:instrText xml:space="preserve"> PAGEREF _Toc239336973 \h </w:instrText>
+          <w:instrText xml:space="preserve"> PAGEREF _Toc239337439 \h </w:instrText>
         </w:r>
         <w:r>
           <w:rPr>
@@ -1129,7 +1129,7 @@
           <w14:ligatures w14:val="standardContextual"/>
         </w:rPr>
       </w:pPr>
-      <w:hyperlink w:anchor="_Toc239336974" w:history="1">
+      <w:hyperlink w:anchor="_Toc239337440" w:history="1">
         <w:r>
           <w:rPr>
             <w:rStyle w:val="Hyperlink"/>
@@ -1156,7 +1156,7 @@
             <w:noProof/>
             <w:webHidden/>
           </w:rPr>
-          <w:instrText xml:space="preserve"> PAGEREF _Toc239336974 \h </w:instrText>
+          <w:instrText xml:space="preserve"> PAGEREF _Toc239337440 \h </w:instrText>
         </w:r>
         <w:r>
           <w:rPr>
@@ -1200,7 +1200,7 @@
           <w14:ligatures w14:val="standardContextual"/>
         </w:rPr>
       </w:pPr>
-      <w:hyperlink w:anchor="_Toc239336975" w:history="1">
+      <w:hyperlink w:anchor="_Toc239337441" w:history="1">
         <w:r>
           <w:rPr>
             <w:rStyle w:val="Hyperlink"/>
@@ -1227,7 +1227,7 @@
             <w:noProof/>
             <w:webHidden/>
           </w:rPr>
-          <w:instrText xml:space="preserve"> PAGEREF _Toc239336975 \h </w:instrText>
+          <w:instrText xml:space="preserve"> PAGEREF _Toc239337441 \h </w:instrText>
         </w:r>
         <w:r>
           <w:rPr>
@@ -1271,7 +1271,7 @@
           <w14:ligatures w14:val="standardContextual"/>
         </w:rPr>
       </w:pPr>
-      <w:hyperlink w:anchor="_Toc239336976" w:history="1">
+      <w:hyperlink w:anchor="_Toc239337442" w:history="1">
         <w:r>
           <w:rPr>
             <w:rStyle w:val="Hyperlink"/>
@@ -1298,7 +1298,7 @@
             <w:noProof/>
             <w:webHidden/>
           </w:rPr>
-          <w:instrText xml:space="preserve"> PAGEREF _Toc239336976 \h </w:instrText>
+          <w:instrText xml:space="preserve"> PAGEREF _Toc239337442 \h </w:instrText>
         </w:r>
         <w:r>
           <w:rPr>
@@ -1342,7 +1342,7 @@
           <w14:ligatures w14:val="standardContextual"/>
         </w:rPr>
       </w:pPr>
-      <w:hyperlink w:anchor="_Toc239336977" w:history="1">
+      <w:hyperlink w:anchor="_Toc239337443" w:history="1">
         <w:r>
           <w:rPr>
             <w:rStyle w:val="Hyperlink"/>
@@ -1369,7 +1369,7 @@
             <w:noProof/>
             <w:webHidden/>
           </w:rPr>
-          <w:instrText xml:space="preserve"> PAGEREF _Toc239336977 \h </w:instrText>
+          <w:instrText xml:space="preserve"> PAGEREF _Toc239337443 \h </w:instrText>
         </w:r>
         <w:r>
           <w:rPr>
@@ -1413,7 +1413,7 @@
           <w14:ligatures w14:val="standardContextual"/>
         </w:rPr>
       </w:pPr>
-      <w:hyperlink w:anchor="_Toc239336978" w:history="1">
+      <w:hyperlink w:anchor="_Toc239337444" w:history="1">
         <w:r>
           <w:rPr>
             <w:rStyle w:val="Hyperlink"/>
@@ -1440,7 +1440,7 @@
             <w:noProof/>
             <w:webHidden/>
           </w:rPr>
-          <w:instrText xml:space="preserve"> PAGEREF _Toc239336978 \h </w:instrText>
+          <w:instrText xml:space="preserve"> PAGEREF _Toc239337444 \h </w:instrText>
         </w:r>
         <w:r>
           <w:rPr>
@@ -1484,7 +1484,7 @@
           <w14:ligatures w14:val="standardContextual"/>
         </w:rPr>
       </w:pPr>
-      <w:hyperlink w:anchor="_Toc239336979" w:history="1">
+      <w:hyperlink w:anchor="_Toc239337445" w:history="1">
         <w:r>
           <w:rPr>
             <w:rStyle w:val="Hyperlink"/>
@@ -1511,7 +1511,7 @@
             <w:noProof/>
             <w:webHidden/>
           </w:rPr>
-          <w:instrText xml:space="preserve"> PAGEREF _Toc239336979 \h </w:instrText>
+          <w:instrText xml:space="preserve"> PAGEREF _Toc239337445 \h </w:instrText>
         </w:r>
         <w:r>
           <w:rPr>
@@ -1555,7 +1555,7 @@
           <w14:ligatures w14:val="standardContextual"/>
         </w:rPr>
       </w:pPr>
-      <w:hyperlink w:anchor="_Toc239336980" w:history="1">
+      <w:hyperlink w:anchor="_Toc239337446" w:history="1">
         <w:r>
           <w:rPr>
             <w:rStyle w:val="Hyperlink"/>
@@ -1582,7 +1582,7 @@
             <w:noProof/>
             <w:webHidden/>
           </w:rPr>
-          <w:instrText xml:space="preserve"> PAGEREF _Toc239336980 \h </w:instrText>
+          <w:instrText xml:space="preserve"> PAGEREF _Toc239337446 \h </w:instrText>
         </w:r>
         <w:r>
           <w:rPr>
@@ -1626,7 +1626,7 @@
           <w14:ligatures w14:val="standardContextual"/>
         </w:rPr>
       </w:pPr>
-      <w:hyperlink w:anchor="_Toc239336981" w:history="1">
+      <w:hyperlink w:anchor="_Toc239337447" w:history="1">
         <w:r>
           <w:rPr>
             <w:rStyle w:val="Hyperlink"/>
@@ -1653,7 +1653,7 @@
             <w:noProof/>
             <w:webHidden/>
           </w:rPr>
-          <w:instrText xml:space="preserve"> PAGEREF _Toc239336981 \h </w:instrText>
+          <w:instrText xml:space="preserve"> PAGEREF _Toc239337447 \h </w:instrText>
         </w:r>
         <w:r>
           <w:rPr>
@@ -1697,7 +1697,7 @@
           <w14:ligatures w14:val="standardContextual"/>
         </w:rPr>
       </w:pPr>
-      <w:hyperlink w:anchor="_Toc239336982" w:history="1">
+      <w:hyperlink w:anchor="_Toc239337448" w:history="1">
         <w:r>
           <w:rPr>
             <w:rStyle w:val="Hyperlink"/>
@@ -1724,7 +1724,7 @@
             <w:noProof/>
             <w:webHidden/>
           </w:rPr>
-          <w:instrText xml:space="preserve"> PAGEREF _Toc239336982 \h </w:instrText>
+          <w:instrText xml:space="preserve"> PAGEREF _Toc239337448 \h </w:instrText>
         </w:r>
         <w:r>
           <w:rPr>
@@ -1768,7 +1768,7 @@
           <w14:ligatures w14:val="standardContextual"/>
         </w:rPr>
       </w:pPr>
-      <w:hyperlink w:anchor="_Toc239336983" w:history="1">
+      <w:hyperlink w:anchor="_Toc239337449" w:history="1">
         <w:r>
           <w:rPr>
             <w:rStyle w:val="Hyperlink"/>
@@ -1795,7 +1795,7 @@
             <w:noProof/>
             <w:webHidden/>
           </w:rPr>
-          <w:instrText xml:space="preserve"> PAGEREF _Toc239336983 \h </w:instrText>
+          <w:instrText xml:space="preserve"> PAGEREF _Toc239337449 \h </w:instrText>
         </w:r>
         <w:r>
           <w:rPr>
@@ -1839,7 +1839,7 @@
           <w14:ligatures w14:val="standardContextual"/>
         </w:rPr>
       </w:pPr>
-      <w:hyperlink w:anchor="_Toc239336984" w:history="1">
+      <w:hyperlink w:anchor="_Toc239337450" w:history="1">
         <w:r>
           <w:rPr>
             <w:rStyle w:val="Hyperlink"/>
@@ -1866,7 +1866,7 @@
             <w:noProof/>
             <w:webHidden/>
           </w:rPr>
-          <w:instrText xml:space="preserve"> PAGEREF _Toc239336984 \h </w:instrText>
+          <w:instrText xml:space="preserve"> PAGEREF _Toc239337450 \h </w:instrText>
         </w:r>
         <w:r>
           <w:rPr>
@@ -1910,7 +1910,7 @@
           <w14:ligatures w14:val="standardContextual"/>
         </w:rPr>
       </w:pPr>
-      <w:hyperlink w:anchor="_Toc239336985" w:history="1">
+      <w:hyperlink w:anchor="_Toc239337451" w:history="1">
         <w:r>
           <w:rPr>
             <w:rStyle w:val="Hyperlink"/>
@@ -1937,7 +1937,7 @@
             <w:noProof/>
             <w:webHidden/>
           </w:rPr>
-          <w:instrText xml:space="preserve"> PAGEREF _Toc239336985 \h </w:instrText>
+          <w:instrText xml:space="preserve"> PAGEREF _Toc239337451 \h </w:instrText>
         </w:r>
         <w:r>
           <w:rPr>
@@ -1981,7 +1981,7 @@
           <w14:ligatures w14:val="standardContextual"/>
         </w:rPr>
       </w:pPr>
-      <w:hyperlink w:anchor="_Toc239336986" w:history="1">
+      <w:hyperlink w:anchor="_Toc239337452" w:history="1">
         <w:r>
           <w:rPr>
             <w:rStyle w:val="Hyperlink"/>
@@ -2008,7 +2008,7 @@
             <w:noProof/>
             <w:webHidden/>
           </w:rPr>
-          <w:instrText xml:space="preserve"> PAGEREF _Toc239336986 \h </w:instrText>
+          <w:instrText xml:space="preserve"> PAGEREF _Toc239337452 \h </w:instrText>
         </w:r>
         <w:r>
           <w:rPr>
@@ -2052,7 +2052,7 @@
           <w14:ligatures w14:val="standardContextual"/>
         </w:rPr>
       </w:pPr>
-      <w:hyperlink w:anchor="_Toc239336987" w:history="1">
+      <w:hyperlink w:anchor="_Toc239337453" w:history="1">
         <w:r>
           <w:rPr>
             <w:rStyle w:val="Hyperlink"/>
@@ -2079,7 +2079,7 @@
             <w:noProof/>
             <w:webHidden/>
           </w:rPr>
-          <w:instrText xml:space="preserve"> PAGEREF _Toc239336987 \h </w:instrText>
+          <w:instrText xml:space="preserve"> PAGEREF _Toc239337453 \h </w:instrText>
         </w:r>
         <w:r>
           <w:rPr>
@@ -2123,7 +2123,7 @@
           <w14:ligatures w14:val="standardContextual"/>
         </w:rPr>
       </w:pPr>
-      <w:hyperlink w:anchor="_Toc239336988" w:history="1">
+      <w:hyperlink w:anchor="_Toc239337454" w:history="1">
         <w:r>
           <w:rPr>
             <w:rStyle w:val="Hyperlink"/>
@@ -2150,7 +2150,7 @@
             <w:noProof/>
             <w:webHidden/>
           </w:rPr>
-          <w:instrText xml:space="preserve"> PAGEREF _Toc239336988 \h </w:instrText>
+          <w:instrText xml:space="preserve"> PAGEREF _Toc239337454 \h </w:instrText>
         </w:r>
         <w:r>
           <w:rPr>
@@ -2194,7 +2194,7 @@
           <w14:ligatures w14:val="standardContextual"/>
         </w:rPr>
       </w:pPr>
-      <w:hyperlink w:anchor="_Toc239336989" w:history="1">
+      <w:hyperlink w:anchor="_Toc239337455" w:history="1">
         <w:r>
           <w:rPr>
             <w:rStyle w:val="Hyperlink"/>
@@ -2221,7 +2221,7 @@
             <w:noProof/>
             <w:webHidden/>
           </w:rPr>
-          <w:instrText xml:space="preserve"> PAGEREF _Toc239336989 \h </w:instrText>
+          <w:instrText xml:space="preserve"> PAGEREF _Toc239337455 \h </w:instrText>
         </w:r>
         <w:r>
           <w:rPr>
@@ -2265,7 +2265,7 @@
           <w14:ligatures w14:val="standardContextual"/>
         </w:rPr>
       </w:pPr>
-      <w:hyperlink w:anchor="_Toc239336990" w:history="1">
+      <w:hyperlink w:anchor="_Toc239337456" w:history="1">
         <w:r>
           <w:rPr>
             <w:rStyle w:val="Hyperlink"/>
@@ -2292,7 +2292,7 @@
             <w:noProof/>
             <w:webHidden/>
           </w:rPr>
-          <w:instrText xml:space="preserve"> PAGEREF _Toc239336990 \h </w:instrText>
+          <w:instrText xml:space="preserve"> PAGEREF _Toc239337456 \h </w:instrText>
         </w:r>
         <w:r>
           <w:rPr>
@@ -2336,7 +2336,7 @@
           <w14:ligatures w14:val="standardContextual"/>
         </w:rPr>
       </w:pPr>
-      <w:hyperlink w:anchor="_Toc239336991" w:history="1">
+      <w:hyperlink w:anchor="_Toc239337457" w:history="1">
         <w:r>
           <w:rPr>
             <w:rStyle w:val="Hyperlink"/>
@@ -2363,7 +2363,7 @@
             <w:noProof/>
             <w:webHidden/>
           </w:rPr>
-          <w:instrText xml:space="preserve"> PAGEREF _Toc239336991 \h </w:instrText>
+          <w:instrText xml:space="preserve"> PAGEREF _Toc239337457 \h </w:instrText>
         </w:r>
         <w:r>
           <w:rPr>
@@ -2407,7 +2407,7 @@
           <w14:ligatures w14:val="standardContextual"/>
         </w:rPr>
       </w:pPr>
-      <w:hyperlink w:anchor="_Toc239336992" w:history="1">
+      <w:hyperlink w:anchor="_Toc239337458" w:history="1">
         <w:r>
           <w:rPr>
             <w:rStyle w:val="Hyperlink"/>
@@ -2434,7 +2434,7 @@
             <w:noProof/>
             <w:webHidden/>
           </w:rPr>
-          <w:instrText xml:space="preserve"> PAGEREF _Toc239336992 \h </w:instrText>
+          <w:instrText xml:space="preserve"> PAGEREF _Toc239337458 \h </w:instrText>
         </w:r>
         <w:r>
           <w:rPr>
@@ -2478,7 +2478,7 @@
           <w14:ligatures w14:val="standardContextual"/>
         </w:rPr>
       </w:pPr>
-      <w:hyperlink w:anchor="_Toc239336993" w:history="1">
+      <w:hyperlink w:anchor="_Toc239337459" w:history="1">
         <w:r>
           <w:rPr>
             <w:rStyle w:val="Hyperlink"/>
@@ -2505,7 +2505,7 @@
             <w:noProof/>
             <w:webHidden/>
           </w:rPr>
-          <w:instrText xml:space="preserve"> PAGEREF _Toc239336993 \h </w:instrText>
+          <w:instrText xml:space="preserve"> PAGEREF _Toc239337459 \h </w:instrText>
         </w:r>
         <w:r>
           <w:rPr>
@@ -2549,7 +2549,7 @@
           <w14:ligatures w14:val="standardContextual"/>
         </w:rPr>
       </w:pPr>
-      <w:hyperlink w:anchor="_Toc239336994" w:history="1">
+      <w:hyperlink w:anchor="_Toc239337460" w:history="1">
         <w:r>
           <w:rPr>
             <w:rStyle w:val="Hyperlink"/>
@@ -2576,7 +2576,7 @@
             <w:noProof/>
             <w:webHidden/>
           </w:rPr>
-          <w:instrText xml:space="preserve"> PAGEREF _Toc239336994 \h </w:instrText>
+          <w:instrText xml:space="preserve"> PAGEREF _Toc239337460 \h </w:instrText>
         </w:r>
         <w:r>
           <w:rPr>
@@ -2620,7 +2620,7 @@
           <w14:ligatures w14:val="standardContextual"/>
         </w:rPr>
       </w:pPr>
-      <w:hyperlink w:anchor="_Toc239336995" w:history="1">
+      <w:hyperlink w:anchor="_Toc239337461" w:history="1">
         <w:r>
           <w:rPr>
             <w:rStyle w:val="Hyperlink"/>
@@ -2647,7 +2647,7 @@
             <w:noProof/>
             <w:webHidden/>
           </w:rPr>
-          <w:instrText xml:space="preserve"> PAGEREF _Toc239336995 \h </w:instrText>
+          <w:instrText xml:space="preserve"> PAGEREF _Toc239337461 \h </w:instrText>
         </w:r>
         <w:r>
           <w:rPr>
@@ -2691,7 +2691,7 @@
           <w14:ligatures w14:val="standardContextual"/>
         </w:rPr>
       </w:pPr>
-      <w:hyperlink w:anchor="_Toc239336996" w:history="1">
+      <w:hyperlink w:anchor="_Toc239337462" w:history="1">
         <w:r>
           <w:rPr>
             <w:rStyle w:val="Hyperlink"/>
@@ -2718,7 +2718,7 @@
             <w:noProof/>
             <w:webHidden/>
           </w:rPr>
-          <w:instrText xml:space="preserve"> PAGEREF _Toc239336996 \h </w:instrText>
+          <w:instrText xml:space="preserve"> PAGEREF _Toc239337462 \h </w:instrText>
         </w:r>
         <w:r>
           <w:rPr>
@@ -2762,7 +2762,7 @@
           <w14:ligatures w14:val="standardContextual"/>
         </w:rPr>
       </w:pPr>
-      <w:hyperlink w:anchor="_Toc239336997" w:history="1">
+      <w:hyperlink w:anchor="_Toc239337463" w:history="1">
         <w:r>
           <w:rPr>
             <w:rStyle w:val="Hyperlink"/>
@@ -2789,7 +2789,7 @@
             <w:noProof/>
             <w:webHidden/>
           </w:rPr>
-          <w:instrText xml:space="preserve"> PAGEREF _Toc239336997 \h </w:instrText>
+          <w:instrText xml:space="preserve"> PAGEREF _Toc239337463 \h </w:instrText>
         </w:r>
         <w:r>
           <w:rPr>
@@ -2833,7 +2833,7 @@
           <w14:ligatures w14:val="standardContextual"/>
         </w:rPr>
       </w:pPr>
-      <w:hyperlink w:anchor="_Toc239336998" w:history="1">
+      <w:hyperlink w:anchor="_Toc239337464" w:history="1">
         <w:r>
           <w:rPr>
             <w:rStyle w:val="Hyperlink"/>
@@ -2860,7 +2860,7 @@
             <w:noProof/>
             <w:webHidden/>
           </w:rPr>
-          <w:instrText xml:space="preserve"> PAGEREF _Toc239336998 \h </w:instrText>
+          <w:instrText xml:space="preserve"> PAGEREF _Toc239337464 \h </w:instrText>
         </w:r>
         <w:r>
           <w:rPr>
@@ -2904,7 +2904,7 @@
           <w14:ligatures w14:val="standardContextual"/>
         </w:rPr>
       </w:pPr>
-      <w:hyperlink w:anchor="_Toc239336999" w:history="1">
+      <w:hyperlink w:anchor="_Toc239337465" w:history="1">
         <w:r>
           <w:rPr>
             <w:rStyle w:val="Hyperlink"/>
@@ -2931,7 +2931,7 @@
             <w:noProof/>
             <w:webHidden/>
           </w:rPr>
-          <w:instrText xml:space="preserve"> PAGEREF _Toc239336999 \h </w:instrText>
+          <w:instrText xml:space="preserve"> PAGEREF _Toc239337465 \h </w:instrText>
         </w:r>
         <w:r>
           <w:rPr>
@@ -2975,7 +2975,7 @@
           <w14:ligatures w14:val="standardContextual"/>
         </w:rPr>
       </w:pPr>
-      <w:hyperlink w:anchor="_Toc239337000" w:history="1">
+      <w:hyperlink w:anchor="_Toc239337466" w:history="1">
         <w:r>
           <w:rPr>
             <w:rStyle w:val="Hyperlink"/>
@@ -3002,7 +3002,7 @@
             <w:noProof/>
             <w:webHidden/>
           </w:rPr>
-          <w:instrText xml:space="preserve"> PAGEREF _Toc239337000 \h </w:instrText>
+          <w:instrText xml:space="preserve"> PAGEREF _Toc239337466 \h </w:instrText>
         </w:r>
         <w:r>
           <w:rPr>
@@ -3046,7 +3046,7 @@
           <w14:ligatures w14:val="standardContextual"/>
         </w:rPr>
       </w:pPr>
-      <w:hyperlink w:anchor="_Toc239337001" w:history="1">
+      <w:hyperlink w:anchor="_Toc239337467" w:history="1">
         <w:r>
           <w:rPr>
             <w:rStyle w:val="Hyperlink"/>
@@ -3073,7 +3073,7 @@
             <w:noProof/>
             <w:webHidden/>
           </w:rPr>
-          <w:instrText xml:space="preserve"> PAGEREF _Toc239337001 \h </w:instrText>
+          <w:instrText xml:space="preserve"> PAGEREF _Toc239337467 \h </w:instrText>
         </w:r>
         <w:r>
           <w:rPr>
@@ -3117,7 +3117,7 @@
           <w14:ligatures w14:val="standardContextual"/>
         </w:rPr>
       </w:pPr>
-      <w:hyperlink w:anchor="_Toc239337002" w:history="1">
+      <w:hyperlink w:anchor="_Toc239337468" w:history="1">
         <w:r>
           <w:rPr>
             <w:rStyle w:val="Hyperlink"/>
@@ -3144,7 +3144,7 @@
             <w:noProof/>
             <w:webHidden/>
           </w:rPr>
-          <w:instrText xml:space="preserve"> PAGEREF _Toc239337002 \h </w:instrText>
+          <w:instrText xml:space="preserve"> PAGEREF _Toc239337468 \h </w:instrText>
         </w:r>
         <w:r>
           <w:rPr>
@@ -3188,7 +3188,7 @@
           <w14:ligatures w14:val="standardContextual"/>
         </w:rPr>
       </w:pPr>
-      <w:hyperlink w:anchor="_Toc239337003" w:history="1">
+      <w:hyperlink w:anchor="_Toc239337469" w:history="1">
         <w:r>
           <w:rPr>
             <w:rStyle w:val="Hyperlink"/>
@@ -3215,7 +3215,7 @@
             <w:noProof/>
             <w:webHidden/>
           </w:rPr>
-          <w:instrText xml:space="preserve"> PAGEREF _Toc239337003 \h </w:instrText>
+          <w:instrText xml:space="preserve"> PAGEREF _Toc239337469 \h </w:instrText>
         </w:r>
         <w:r>
           <w:rPr>
@@ -3259,7 +3259,7 @@
           <w14:ligatures w14:val="standardContextual"/>
         </w:rPr>
       </w:pPr>
-      <w:hyperlink w:anchor="_Toc239337004" w:history="1">
+      <w:hyperlink w:anchor="_Toc239337470" w:history="1">
         <w:r>
           <w:rPr>
             <w:rStyle w:val="Hyperlink"/>
@@ -3286,7 +3286,7 @@
             <w:noProof/>
             <w:webHidden/>
           </w:rPr>
-          <w:instrText xml:space="preserve"> PAGEREF _Toc239337004 \h </w:instrText>
+          <w:instrText xml:space="preserve"> PAGEREF _Toc239337470 \h </w:instrText>
         </w:r>
         <w:r>
           <w:rPr>
@@ -3330,7 +3330,7 @@
           <w14:ligatures w14:val="standardContextual"/>
         </w:rPr>
       </w:pPr>
-      <w:hyperlink w:anchor="_Toc239337005" w:history="1">
+      <w:hyperlink w:anchor="_Toc239337471" w:history="1">
         <w:r>
           <w:rPr>
             <w:rStyle w:val="Hyperlink"/>
@@ -3357,7 +3357,7 @@
             <w:noProof/>
             <w:webHidden/>
           </w:rPr>
-          <w:instrText xml:space="preserve"> PAGEREF _Toc239337005 \h </w:instrText>
+          <w:instrText xml:space="preserve"> PAGEREF _Toc239337471 \h </w:instrText>
         </w:r>
         <w:r>
           <w:rPr>
@@ -3401,7 +3401,7 @@
           <w14:ligatures w14:val="standardContextual"/>
         </w:rPr>
       </w:pPr>
-      <w:hyperlink w:anchor="_Toc239337006" w:history="1">
+      <w:hyperlink w:anchor="_Toc239337472" w:history="1">
         <w:r>
           <w:rPr>
             <w:rStyle w:val="Hyperlink"/>
@@ -3428,7 +3428,7 @@
             <w:noProof/>
             <w:webHidden/>
           </w:rPr>
-          <w:instrText xml:space="preserve"> PAGEREF _Toc239337006 \h </w:instrText>
+          <w:instrText xml:space="preserve"> PAGEREF _Toc239337472 \h </w:instrText>
         </w:r>
         <w:r>
           <w:rPr>
@@ -3474,7 +3474,7 @@
         <w:pStyle w:val="Heading1"/>
       </w:pPr>
       <w:bookmarkStart w:id="8" w:name="chương-1-giới-thiệu"/>
-      <w:bookmarkStart w:id="9" w:name="_Toc239336973"/>
+      <w:bookmarkStart w:id="9" w:name="_Toc239337439"/>
       <w:bookmarkEnd w:id="4"/>
       <w:bookmarkEnd w:id="6"/>
       <w:r>
@@ -3499,7 +3499,7 @@
         <w:pStyle w:val="Heading2"/>
       </w:pPr>
       <w:bookmarkStart w:id="10" w:name="X7d99df2d9d0c5141050eb9941026463f4c8ea2b"/>
-      <w:bookmarkStart w:id="11" w:name="_Toc239336974"/>
+      <w:bookmarkStart w:id="11" w:name="_Toc239337440"/>
       <w:r>
         <w:t>1.1. Đ</w:t>
       </w:r>
@@ -5349,7 +5349,7 @@
         <w:pStyle w:val="Heading2"/>
       </w:pPr>
       <w:bookmarkStart w:id="12" w:name="X60021b7b958505251ec70bd32e2bac9f8a0361c"/>
-      <w:bookmarkStart w:id="13" w:name="_Toc239336975"/>
+      <w:bookmarkStart w:id="13" w:name="_Toc239337441"/>
       <w:bookmarkEnd w:id="10"/>
       <w:r>
         <w:t>1.2. M</w:t>
@@ -7295,7 +7295,7 @@
         <w:pStyle w:val="Heading2"/>
       </w:pPr>
       <w:bookmarkStart w:id="17" w:name="X03724c88a1b7da9b434cf0a8db5356690a4bb71"/>
-      <w:bookmarkStart w:id="18" w:name="_Toc239336976"/>
+      <w:bookmarkStart w:id="18" w:name="_Toc239337442"/>
       <w:bookmarkEnd w:id="12"/>
       <w:bookmarkEnd w:id="16"/>
       <w:r>
@@ -7757,7 +7757,7 @@
               <w:t>OpenCV</w:t>
             </w:r>
             <w:r>
-              <w:t xml:space="preserve"> [17]</w:t>
+              <w:t xml:space="preserve"> [16]</w:t>
             </w:r>
           </w:p>
         </w:tc>
@@ -7945,7 +7945,7 @@
               <w:t>YOLO11n</w:t>
             </w:r>
             <w:r>
-              <w:t xml:space="preserve"> [8]</w:t>
+              <w:t xml:space="preserve"> [7]</w:t>
             </w:r>
           </w:p>
         </w:tc>
@@ -8218,7 +8218,7 @@
               <w:t>PaddleOCR PP-OCRv5 mobile</w:t>
             </w:r>
             <w:r>
-              <w:t xml:space="preserve"> [9]</w:t>
+              <w:t xml:space="preserve"> [8]</w:t>
             </w:r>
           </w:p>
         </w:tc>
@@ -9100,7 +9100,7 @@
         <w:pStyle w:val="Heading1"/>
       </w:pPr>
       <w:bookmarkStart w:id="20" w:name="chương-2-cơ-sở-lý-thuyết"/>
-      <w:bookmarkStart w:id="21" w:name="_Toc239336977"/>
+      <w:bookmarkStart w:id="21" w:name="_Toc239337443"/>
       <w:bookmarkEnd w:id="8"/>
       <w:bookmarkEnd w:id="17"/>
       <w:r>
@@ -9397,7 +9397,7 @@
         <w:pStyle w:val="Heading2"/>
       </w:pPr>
       <w:bookmarkStart w:id="22" w:name="X2256001523e16d112c59df938522f140b8b988e"/>
-      <w:bookmarkStart w:id="23" w:name="_Toc239336978"/>
+      <w:bookmarkStart w:id="23" w:name="_Toc239337444"/>
       <w:r>
         <w:t>2.1. Quy chu</w:t>
       </w:r>
@@ -10001,7 +10001,7 @@
         <w:t>ợ</w:t>
       </w:r>
       <w:r>
-        <w:t>c gán [7]. Ki</w:t>
+        <w:t>c gán [4]. Ki</w:t>
       </w:r>
       <w:r>
         <w:t>ể</w:t>
@@ -14076,7 +14076,7 @@
         <w:pStyle w:val="Heading2"/>
       </w:pPr>
       <w:bookmarkStart w:id="30" w:name="Xb21b4f0690a73e92e2a35192cb39315a0956521"/>
-      <w:bookmarkStart w:id="31" w:name="_Toc239336979"/>
+      <w:bookmarkStart w:id="31" w:name="_Toc239337445"/>
       <w:bookmarkEnd w:id="22"/>
       <w:bookmarkEnd w:id="28"/>
       <w:r>
@@ -15267,7 +15267,7 @@
         <w:t>CLAHE</w:t>
       </w:r>
       <w:r>
-        <w:t xml:space="preserve"> [11] kh</w:t>
+        <w:t xml:space="preserve"> [10] kh</w:t>
       </w:r>
       <w:r>
         <w:t>ắ</w:t>
@@ -15680,7 +15680,7 @@
         <w:t>ả</w:t>
       </w:r>
       <w:r>
-        <w:t xml:space="preserve"> trong chính bài toán ALPR [10].</w:t>
+        <w:t xml:space="preserve"> trong chính bài toán ALPR [9].</w:t>
       </w:r>
     </w:p>
     <w:p>
@@ -16223,7 +16223,7 @@
         <w:t>c song phương</w:t>
       </w:r>
       <w:r>
-        <w:t xml:space="preserve"> [12] nhân thêm m</w:t>
+        <w:t xml:space="preserve"> [11] nhân thêm m</w:t>
       </w:r>
       <w:r>
         <w:t>ộ</w:t>
@@ -18769,7 +18769,7 @@
         <w:t>c (pHash)</w:t>
       </w:r>
       <w:r>
-        <w:t xml:space="preserve"> [15] ho</w:t>
+        <w:t xml:space="preserve"> [14] ho</w:t>
       </w:r>
       <w:r>
         <w:t>ạ</w:t>
@@ -19316,7 +19316,7 @@
         <w:pStyle w:val="Heading2"/>
       </w:pPr>
       <w:bookmarkStart w:id="38" w:name="X8ff52f1334e3f0e382caf7ffa1b7096a981291c"/>
-      <w:bookmarkStart w:id="39" w:name="_Toc239336980"/>
+      <w:bookmarkStart w:id="39" w:name="_Toc239337446"/>
       <w:bookmarkEnd w:id="30"/>
       <w:bookmarkEnd w:id="37"/>
       <w:r>
@@ -19595,7 +19595,7 @@
           <w:noProof/>
         </w:rPr>
         <w:drawing>
-          <wp:inline distT="0" distB="0" distL="0" distR="0" wp14:anchorId="06F9C372" wp14:editId="36CB8DFC">
+          <wp:inline distT="0" distB="0" distL="0" distR="0" wp14:anchorId="5B1F3EE8" wp14:editId="58BD41DE">
             <wp:extent cx="5334000" cy="1435553"/>
             <wp:effectExtent l="0" t="0" r="0" b="0"/>
             <wp:docPr id="37" name="Picture"/>
@@ -19676,7 +19676,7 @@
           <w:i/>
           <w:iCs/>
         </w:rPr>
-        <w:t>(theo [8])</w:t>
+        <w:t>(theo [7])</w:t>
       </w:r>
     </w:p>
     <w:p>
@@ -20114,7 +20114,7 @@
         <w:t>ấ</w:t>
       </w:r>
       <w:r>
-        <w:t>t [8].</w:t>
+        <w:t>t [7].</w:t>
       </w:r>
     </w:p>
     <w:p>
@@ -21057,7 +21057,7 @@
         <w:pStyle w:val="Heading2"/>
       </w:pPr>
       <w:bookmarkStart w:id="43" w:name="X1a77f36e16d4ad267b00eabe7cf793e1dbe08e9"/>
-      <w:bookmarkStart w:id="44" w:name="_Toc239336981"/>
+      <w:bookmarkStart w:id="44" w:name="_Toc239337447"/>
       <w:bookmarkEnd w:id="38"/>
       <w:bookmarkEnd w:id="42"/>
       <w:r>
@@ -21134,7 +21134,7 @@
         <w:t>CRNN</w:t>
       </w:r>
       <w:r>
-        <w:t xml:space="preserve"> [14] g</w:t>
+        <w:t xml:space="preserve"> [13] g</w:t>
       </w:r>
       <w:r>
         <w:t>ồ</w:t>
@@ -21423,7 +21423,7 @@
         <w:t>t mát CTC</w:t>
       </w:r>
       <w:r>
-        <w:t xml:space="preserve"> [13] gi</w:t>
+        <w:t xml:space="preserve"> [12] gi</w:t>
       </w:r>
       <w:r>
         <w:t>ả</w:t>
@@ -22227,7 +22227,7 @@
           <w:noProof/>
         </w:rPr>
         <w:drawing>
-          <wp:inline distT="0" distB="0" distL="0" distR="0" wp14:anchorId="3A12BE69" wp14:editId="7C1F8F05">
+          <wp:inline distT="0" distB="0" distL="0" distR="0" wp14:anchorId="6F94B797" wp14:editId="375402CF">
             <wp:extent cx="5334000" cy="2884362"/>
             <wp:effectExtent l="0" t="0" r="0" b="0"/>
             <wp:docPr id="44" name="Picture"/>
@@ -22493,7 +22493,7 @@
           <w:noProof/>
         </w:rPr>
         <w:drawing>
-          <wp:inline distT="0" distB="0" distL="0" distR="0" wp14:anchorId="61BE9A97" wp14:editId="683D82B9">
+          <wp:inline distT="0" distB="0" distL="0" distR="0" wp14:anchorId="2CFC88DB" wp14:editId="6F1B023D">
             <wp:extent cx="5334000" cy="632732"/>
             <wp:effectExtent l="0" t="0" r="0" b="0"/>
             <wp:docPr id="49" name="Picture"/>
@@ -24396,7 +24396,7 @@
         <w:pStyle w:val="Heading1"/>
       </w:pPr>
       <w:bookmarkStart w:id="50" w:name="chương-3-thiết-kế-và-cài-đặt"/>
-      <w:bookmarkStart w:id="51" w:name="_Toc239336982"/>
+      <w:bookmarkStart w:id="51" w:name="_Toc239337448"/>
       <w:bookmarkEnd w:id="20"/>
       <w:bookmarkEnd w:id="43"/>
       <w:bookmarkEnd w:id="49"/>
@@ -24428,7 +24428,7 @@
         <w:pStyle w:val="Heading2"/>
       </w:pPr>
       <w:bookmarkStart w:id="52" w:name="X21a22cc9b66dca004f2960f37df13c53a04e97b"/>
-      <w:bookmarkStart w:id="53" w:name="_Toc239336983"/>
+      <w:bookmarkStart w:id="53" w:name="_Toc239337449"/>
       <w:r>
         <w:t>3.1. Ki</w:t>
       </w:r>
@@ -24520,7 +24520,7 @@
           <w:noProof/>
         </w:rPr>
         <w:drawing>
-          <wp:inline distT="0" distB="0" distL="0" distR="0" wp14:anchorId="1ACCD451" wp14:editId="3EF9EA7D">
+          <wp:inline distT="0" distB="0" distL="0" distR="0" wp14:anchorId="7A31BF57" wp14:editId="61865D12">
             <wp:extent cx="5334000" cy="401410"/>
             <wp:effectExtent l="0" t="0" r="0" b="0"/>
             <wp:docPr id="57" name="Picture"/>
@@ -26189,7 +26189,7 @@
         <w:pStyle w:val="Heading2"/>
       </w:pPr>
       <w:bookmarkStart w:id="55" w:name="X1f307d8f8c73bce8db8683c986faea6c8ea66a3"/>
-      <w:bookmarkStart w:id="56" w:name="_Toc239336984"/>
+      <w:bookmarkStart w:id="56" w:name="_Toc239337450"/>
       <w:bookmarkEnd w:id="52"/>
       <w:r>
         <w:t>3.2. Xây d</w:t>
@@ -26256,7 +26256,7 @@
           <w:noProof/>
         </w:rPr>
         <w:drawing>
-          <wp:inline distT="0" distB="0" distL="0" distR="0" wp14:anchorId="14A586B1" wp14:editId="2D2D0081">
+          <wp:inline distT="0" distB="0" distL="0" distR="0" wp14:anchorId="7AAD6E1A" wp14:editId="6A65D13B">
             <wp:extent cx="5334000" cy="802821"/>
             <wp:effectExtent l="0" t="0" r="0" b="0"/>
             <wp:docPr id="62" name="Picture"/>
@@ -30368,7 +30368,7 @@
         <w:pStyle w:val="Heading2"/>
       </w:pPr>
       <w:bookmarkStart w:id="62" w:name="X6a397cb1739f1ec0a8c9714808f79a5ce1fbf6f"/>
-      <w:bookmarkStart w:id="63" w:name="_Toc239336985"/>
+      <w:bookmarkStart w:id="63" w:name="_Toc239337451"/>
       <w:bookmarkEnd w:id="55"/>
       <w:bookmarkEnd w:id="61"/>
       <w:r>
@@ -31934,7 +31934,7 @@
         <w:pStyle w:val="Heading2"/>
       </w:pPr>
       <w:bookmarkStart w:id="65" w:name="X9c2c9b365086d10c999a46e4942f14d73b6baa5"/>
-      <w:bookmarkStart w:id="66" w:name="_Toc239336986"/>
+      <w:bookmarkStart w:id="66" w:name="_Toc239337452"/>
       <w:bookmarkEnd w:id="62"/>
       <w:r>
         <w:t>3.4. Kh</w:t>
@@ -32718,7 +32718,7 @@
           <w:noProof/>
         </w:rPr>
         <w:drawing>
-          <wp:inline distT="0" distB="0" distL="0" distR="0" wp14:anchorId="3279244A" wp14:editId="6C71F309">
+          <wp:inline distT="0" distB="0" distL="0" distR="0" wp14:anchorId="5F18B2F4" wp14:editId="51961168">
             <wp:extent cx="5334000" cy="8969712"/>
             <wp:effectExtent l="0" t="0" r="0" b="0"/>
             <wp:docPr id="73" name="Picture"/>
@@ -38667,7 +38667,7 @@
         <w:pStyle w:val="Heading2"/>
       </w:pPr>
       <w:bookmarkStart w:id="75" w:name="Xb17945b5d9374e5087c2c96ace1685ff00e2e22"/>
-      <w:bookmarkStart w:id="76" w:name="_Toc239336987"/>
+      <w:bookmarkStart w:id="76" w:name="_Toc239337453"/>
       <w:bookmarkEnd w:id="65"/>
       <w:bookmarkEnd w:id="74"/>
       <w:r>
@@ -40037,7 +40037,7 @@
         <w:pStyle w:val="Heading2"/>
       </w:pPr>
       <w:bookmarkStart w:id="77" w:name="Xfad7df3f963ac0b8ebfe8cf87d7c64fa075f760"/>
-      <w:bookmarkStart w:id="78" w:name="_Toc239336988"/>
+      <w:bookmarkStart w:id="78" w:name="_Toc239337454"/>
       <w:bookmarkEnd w:id="75"/>
       <w:r>
         <w:t>3.6. B</w:t>
@@ -40083,7 +40083,7 @@
           <w:noProof/>
         </w:rPr>
         <w:drawing>
-          <wp:inline distT="0" distB="0" distL="0" distR="0" wp14:anchorId="6A859D66" wp14:editId="22F43915">
+          <wp:inline distT="0" distB="0" distL="0" distR="0" wp14:anchorId="0526A9A9" wp14:editId="37477AEF">
             <wp:extent cx="5334000" cy="1217839"/>
             <wp:effectExtent l="0" t="0" r="0" b="0"/>
             <wp:docPr id="86" name="Picture"/>
@@ -42864,7 +42864,7 @@
         <w:pStyle w:val="Heading2"/>
       </w:pPr>
       <w:bookmarkStart w:id="80" w:name="X9b5467225f237e4ee44d60f7d236cbdfdaa1e07"/>
-      <w:bookmarkStart w:id="81" w:name="_Toc239336989"/>
+      <w:bookmarkStart w:id="81" w:name="_Toc239337455"/>
       <w:bookmarkEnd w:id="77"/>
       <w:r>
         <w:t xml:space="preserve">3.7. </w:t>
@@ -42984,7 +42984,7 @@
           <w:noProof/>
         </w:rPr>
         <w:drawing>
-          <wp:inline distT="0" distB="0" distL="0" distR="0" wp14:anchorId="0E3EAB1B" wp14:editId="1536E16F">
+          <wp:inline distT="0" distB="0" distL="0" distR="0" wp14:anchorId="4C43E1B0" wp14:editId="633605FC">
             <wp:extent cx="5334000" cy="5953125"/>
             <wp:effectExtent l="0" t="0" r="0" b="0"/>
             <wp:docPr id="91" name="Picture"/>
@@ -44094,7 +44094,7 @@
         <w:pStyle w:val="Heading1"/>
       </w:pPr>
       <w:bookmarkStart w:id="83" w:name="chương-4-thực-nghiệm-và-đánh-giá"/>
-      <w:bookmarkStart w:id="84" w:name="_Toc239336990"/>
+      <w:bookmarkStart w:id="84" w:name="_Toc239337456"/>
       <w:bookmarkEnd w:id="50"/>
       <w:bookmarkEnd w:id="80"/>
       <w:r>
@@ -44119,7 +44119,7 @@
         <w:pStyle w:val="Heading2"/>
       </w:pPr>
       <w:bookmarkStart w:id="85" w:name="X43cb4672f728ce1df4f211c1d18360135f0c40b"/>
-      <w:bookmarkStart w:id="86" w:name="_Toc239336991"/>
+      <w:bookmarkStart w:id="86" w:name="_Toc239337457"/>
       <w:r>
         <w:t>4.1. Môi trư</w:t>
       </w:r>
@@ -45741,7 +45741,7 @@
         <w:pStyle w:val="Heading2"/>
       </w:pPr>
       <w:bookmarkStart w:id="87" w:name="Xe48430b60e6d2b1022368eb4316c1fe9f53411f"/>
-      <w:bookmarkStart w:id="88" w:name="_Toc239336992"/>
+      <w:bookmarkStart w:id="88" w:name="_Toc239337458"/>
       <w:bookmarkEnd w:id="85"/>
       <w:r>
         <w:t>4.2. K</w:t>
@@ -49276,7 +49276,7 @@
         <w:pStyle w:val="Heading2"/>
       </w:pPr>
       <w:bookmarkStart w:id="95" w:name="X09b724f0b907c7f652c2569c27ef1d5728c277c"/>
-      <w:bookmarkStart w:id="96" w:name="_Toc239336993"/>
+      <w:bookmarkStart w:id="96" w:name="_Toc239337459"/>
       <w:bookmarkEnd w:id="87"/>
       <w:bookmarkEnd w:id="93"/>
       <w:r>
@@ -51548,7 +51548,7 @@
           <w:noProof/>
         </w:rPr>
         <w:drawing>
-          <wp:inline distT="0" distB="0" distL="0" distR="0" wp14:anchorId="757322C2" wp14:editId="5D095899">
+          <wp:inline distT="0" distB="0" distL="0" distR="0" wp14:anchorId="2A9087B7" wp14:editId="05B331EE">
             <wp:extent cx="5334000" cy="2883855"/>
             <wp:effectExtent l="0" t="0" r="0" b="0"/>
             <wp:docPr id="108" name="Picture"/>
@@ -56571,7 +56571,7 @@
         <w:pStyle w:val="Heading2"/>
       </w:pPr>
       <w:bookmarkStart w:id="106" w:name="X0c205a3fd5474e5e1d380a3735df7543f97f059"/>
-      <w:bookmarkStart w:id="107" w:name="_Toc239336994"/>
+      <w:bookmarkStart w:id="107" w:name="_Toc239337460"/>
       <w:bookmarkEnd w:id="95"/>
       <w:bookmarkEnd w:id="104"/>
       <w:r>
@@ -58512,7 +58512,7 @@
         <w:t>ạ</w:t>
       </w:r>
       <w:r>
-        <w:t>ng FSRCNN [16], dành cho vùng bi</w:t>
+        <w:t>ng FSRCNN [15], dành cho vùng bi</w:t>
       </w:r>
       <w:r>
         <w:t>ể</w:t>
@@ -59513,7 +59513,7 @@
         <w:pStyle w:val="Heading2"/>
       </w:pPr>
       <w:bookmarkStart w:id="113" w:name="X8f4b2c0e55e8764a0677cdfa39e96dbe6822859"/>
-      <w:bookmarkStart w:id="114" w:name="_Toc239336995"/>
+      <w:bookmarkStart w:id="114" w:name="_Toc239337461"/>
       <w:bookmarkEnd w:id="106"/>
       <w:bookmarkEnd w:id="112"/>
       <w:r>
@@ -62656,7 +62656,7 @@
         <w:pStyle w:val="Heading2"/>
       </w:pPr>
       <w:bookmarkStart w:id="120" w:name="X7468ed9f095dd0192ebc5de940dc44b5cd3e099"/>
-      <w:bookmarkStart w:id="121" w:name="_Toc239336996"/>
+      <w:bookmarkStart w:id="121" w:name="_Toc239337462"/>
       <w:bookmarkEnd w:id="113"/>
       <w:bookmarkEnd w:id="118"/>
       <w:r>
@@ -64517,7 +64517,7 @@
           <w:noProof/>
         </w:rPr>
         <w:drawing>
-          <wp:inline distT="0" distB="0" distL="0" distR="0" wp14:anchorId="4A98C39E" wp14:editId="61955CAA">
+          <wp:inline distT="0" distB="0" distL="0" distR="0" wp14:anchorId="468F1EA6" wp14:editId="7B97A011">
             <wp:extent cx="5334000" cy="3317670"/>
             <wp:effectExtent l="0" t="0" r="0" b="0"/>
             <wp:docPr id="131" name="Picture"/>
@@ -65249,7 +65249,7 @@
         <w:pStyle w:val="Heading2"/>
       </w:pPr>
       <w:bookmarkStart w:id="124" w:name="X88e1c26a6581f7bd1dbdb2c85ae6116c5ba8393"/>
-      <w:bookmarkStart w:id="125" w:name="_Toc239336997"/>
+      <w:bookmarkStart w:id="125" w:name="_Toc239337463"/>
       <w:bookmarkEnd w:id="120"/>
       <w:r>
         <w:t>4.7. Các y</w:t>
@@ -67104,7 +67104,7 @@
         <w:pStyle w:val="Heading1"/>
       </w:pPr>
       <w:bookmarkStart w:id="127" w:name="chương-5-kết-luận-và-hướng-phát-triển"/>
-      <w:bookmarkStart w:id="128" w:name="_Toc239336998"/>
+      <w:bookmarkStart w:id="128" w:name="_Toc239337464"/>
       <w:bookmarkEnd w:id="83"/>
       <w:bookmarkEnd w:id="124"/>
       <w:r>
@@ -67141,7 +67141,7 @@
         <w:pStyle w:val="Heading2"/>
       </w:pPr>
       <w:bookmarkStart w:id="129" w:name="Xcefa088882d41b38c21b7b5b44c738cb5564fbb"/>
-      <w:bookmarkStart w:id="130" w:name="_Toc239336999"/>
+      <w:bookmarkStart w:id="130" w:name="_Toc239337465"/>
       <w:r>
         <w:t>5.1. K</w:t>
       </w:r>
@@ -68642,7 +68642,7 @@
         <w:pStyle w:val="Heading2"/>
       </w:pPr>
       <w:bookmarkStart w:id="132" w:name="Xe79f58ab8ce7b6f148c68a374118dd9eaec1a1c"/>
-      <w:bookmarkStart w:id="133" w:name="_Toc239337000"/>
+      <w:bookmarkStart w:id="133" w:name="_Toc239337466"/>
       <w:bookmarkEnd w:id="129"/>
       <w:r>
         <w:t>5.2. H</w:t>
@@ -69856,7 +69856,7 @@
         <w:pStyle w:val="Heading2"/>
       </w:pPr>
       <w:bookmarkStart w:id="135" w:name="X66db71c9020c40cf46e490c5c37ad244e2b7594"/>
-      <w:bookmarkStart w:id="136" w:name="_Toc239337001"/>
+      <w:bookmarkStart w:id="136" w:name="_Toc239337467"/>
       <w:bookmarkEnd w:id="132"/>
       <w:r>
         <w:t>5.3. Hư</w:t>
@@ -71447,7 +71447,7 @@
         <w:pStyle w:val="Heading2"/>
       </w:pPr>
       <w:bookmarkStart w:id="138" w:name="Xe5a2fe3dfcd4681648271b7ddc344b106e48b3b"/>
-      <w:bookmarkStart w:id="139" w:name="_Toc239337002"/>
+      <w:bookmarkStart w:id="139" w:name="_Toc239337468"/>
       <w:bookmarkEnd w:id="135"/>
       <w:r>
         <w:t>5.4. K</w:t>
@@ -72370,7 +72370,7 @@
         <w:pStyle w:val="Heading1"/>
       </w:pPr>
       <w:bookmarkStart w:id="140" w:name="tài-liệu-tham-khảo"/>
-      <w:bookmarkStart w:id="141" w:name="_Toc239337003"/>
+      <w:bookmarkStart w:id="141" w:name="_Toc239337469"/>
       <w:bookmarkEnd w:id="127"/>
       <w:bookmarkEnd w:id="138"/>
       <w:r>
@@ -72714,37 +72714,79 @@
         <w:t>ố</w:t>
       </w:r>
       <w:r>
-        <w:t xml:space="preserve"> 79/2024/TT-BCA đã đư</w:t>
-      </w:r>
-      <w:r>
-        <w:t>ợ</w:t>
-      </w:r>
-      <w:r>
-        <w:t>c s</w:t>
-      </w:r>
-      <w:r>
-        <w:t>ử</w:t>
-      </w:r>
-      <w:r>
-        <w:t>a đ</w:t>
-      </w:r>
-      <w:r>
-        <w:t>ổ</w:t>
-      </w:r>
-      <w:r>
-        <w:t>i t</w:t>
-      </w:r>
-      <w:r>
-        <w:t>ạ</w:t>
-      </w:r>
-      <w:r>
-        <w:t>i Thông tư s</w:t>
+        <w:t xml:space="preserve"> 79/2024/TT-BCA quy đ</w:t>
+      </w:r>
+      <w:r>
+        <w:t>ị</w:t>
+      </w:r>
+      <w:r>
+        <w:t>nh v</w:t>
+      </w:r>
+      <w:r>
+        <w:t>ề</w:t>
+      </w:r>
+      <w:r>
+        <w:t xml:space="preserve"> c</w:t>
+      </w:r>
+      <w:r>
+        <w:t>ấ</w:t>
+      </w:r>
+      <w:r>
+        <w:t>p, thu h</w:t>
+      </w:r>
+      <w:r>
+        <w:t>ồ</w:t>
+      </w:r>
+      <w:r>
+        <w:t>i ch</w:t>
+      </w:r>
+      <w:r>
+        <w:t>ứ</w:t>
+      </w:r>
+      <w:r>
+        <w:t>ng nh</w:t>
+      </w:r>
+      <w:r>
+        <w:t>ậ</w:t>
+      </w:r>
+      <w:r>
+        <w:t>n đăng ký xe, bi</w:t>
+      </w:r>
+      <w:r>
+        <w:t>ể</w:t>
+      </w:r>
+      <w:r>
+        <w:t>n s</w:t>
       </w:r>
       <w:r>
         <w:t>ố</w:t>
       </w:r>
       <w:r>
-        <w:t xml:space="preserve"> 13/2025/TT-BCA," 2025. [Tr</w:t>
+        <w:t xml:space="preserve"> xe cơ gi</w:t>
+      </w:r>
+      <w:r>
+        <w:t>ớ</w:t>
+      </w:r>
+      <w:r>
+        <w:t>i, xe máy chuyên dùng," ban hành 30/06/2025, hi</w:t>
+      </w:r>
+      <w:r>
+        <w:t>ệ</w:t>
+      </w:r>
+      <w:r>
+        <w:t>u l</w:t>
+      </w:r>
+      <w:r>
+        <w:t>ự</w:t>
+      </w:r>
+      <w:r>
+        <w:t>c 01/07/2025, Công báo s</w:t>
+      </w:r>
+      <w:r>
+        <w:t>ố</w:t>
+      </w:r>
+      <w:r>
+        <w:t xml:space="preserve"> 887+888 ngày 15/07/2025. [Tr</w:t>
       </w:r>
       <w:r>
         <w:t>ự</w:t>
@@ -72775,7 +72817,7 @@
           <w:rPr>
             <w:rStyle w:val="Hyperlink"/>
           </w:rPr>
-          <w:t>https://congbao.chinhphu.vn/van-ban/thong-tu-so-51-2025-tt-bca-45356.htm</w:t>
+          <w:t>https://congbao.chinhphu.vn/van-ban/thong-tu-so-51-2025-tt-bca-45356/57302.htm</w:t>
         </w:r>
       </w:hyperlink>
       <w:r>
@@ -72785,7 +72827,7 @@
         <w:t>ậ</w:t>
       </w:r>
       <w:r>
-        <w:t>p ngày 2026-07-19).</w:t>
+        <w:t>p ngày 2026-09-03).</w:t>
       </w:r>
     </w:p>
     <w:p>
@@ -73029,142 +73071,33 @@
         <w:pStyle w:val="BodyText"/>
       </w:pPr>
       <w:r>
-        <w:t>[7] Thư vi</w:t>
-      </w:r>
-      <w:r>
-        <w:t>ệ</w:t>
-      </w:r>
-      <w:r>
-        <w:t>n Nhà đ</w:t>
-      </w:r>
-      <w:r>
-        <w:t>ấ</w:t>
-      </w:r>
-      <w:r>
-        <w:t>t, "Chính th</w:t>
-      </w:r>
-      <w:r>
-        <w:t>ứ</w:t>
-      </w:r>
-      <w:r>
-        <w:t>c ký hi</w:t>
-      </w:r>
-      <w:r>
-        <w:t>ệ</w:t>
-      </w:r>
-      <w:r>
-        <w:t>u bi</w:t>
-      </w:r>
-      <w:r>
-        <w:t>ể</w:t>
-      </w:r>
-      <w:r>
-        <w:t>n s</w:t>
-      </w:r>
-      <w:r>
-        <w:t>ố</w:t>
-      </w:r>
-      <w:r>
-        <w:t xml:space="preserve"> xe 34 t</w:t>
+        <w:t>[7] G. Jocher, J. Qiu, "Ultralytics YOLO11," Ultralytics, 2024. [Tr</w:t>
+      </w:r>
+      <w:r>
+        <w:t>ự</w:t>
+      </w:r>
+      <w:r>
+        <w:t>c tuy</w:t>
+      </w:r>
+      <w:r>
+        <w:t>ế</w:t>
+      </w:r>
+      <w:r>
+        <w:t>n]. Đ</w:t>
+      </w:r>
+      <w:r>
+        <w:t>ị</w:t>
+      </w:r>
+      <w:r>
+        <w:t>a ch</w:t>
       </w:r>
       <w:r>
         <w:t>ỉ</w:t>
       </w:r>
       <w:r>
-        <w:t>nh thành sau sáp nh</w:t>
-      </w:r>
-      <w:r>
-        <w:t>ậ</w:t>
-      </w:r>
-      <w:r>
-        <w:t>p theo Thông tư 51/2025/TT-BCA," Thư vi</w:t>
-      </w:r>
-      <w:r>
-        <w:t>ệ</w:t>
-      </w:r>
-      <w:r>
-        <w:t>n Nhà đ</w:t>
-      </w:r>
-      <w:r>
-        <w:t>ấ</w:t>
-      </w:r>
-      <w:r>
-        <w:t>t, 2025. [Tr</w:t>
-      </w:r>
-      <w:r>
-        <w:t>ự</w:t>
-      </w:r>
-      <w:r>
-        <w:t>c tuy</w:t>
-      </w:r>
-      <w:r>
-        <w:t>ế</w:t>
-      </w:r>
-      <w:r>
-        <w:t>n]. Đ</w:t>
-      </w:r>
-      <w:r>
-        <w:t>ị</w:t>
-      </w:r>
-      <w:r>
-        <w:t>a ch</w:t>
-      </w:r>
-      <w:r>
-        <w:t>ỉ</w:t>
-      </w:r>
-      <w:r>
         <w:t xml:space="preserve">: </w:t>
       </w:r>
       <w:hyperlink r:id="rId21">
-        <w:r>
-          <w:rPr>
-            <w:rStyle w:val="Hyperlink"/>
-          </w:rPr>
-          <w:t>https://thuviennhadat.vn/phap-luat/chinh-thuc-ky-hieu-bien-so-xe-34-tinh-thanh-sau-sap-nhap-theo-thong-tu-51-2025-tt-bca-690227.html</w:t>
-        </w:r>
-      </w:hyperlink>
-      <w:r>
-        <w:t xml:space="preserve"> (truy c</w:t>
-      </w:r>
-      <w:r>
-        <w:t>ậ</w:t>
-      </w:r>
-      <w:r>
-        <w:t>p ngày 2026-07-19).</w:t>
-      </w:r>
-    </w:p>
-    <w:p>
-      <w:pPr>
-        <w:pStyle w:val="BodyText"/>
-      </w:pPr>
-      <w:r>
-        <w:t>[8] G. Jocher, J. Qiu, "Ultralytics YOLO11," Ultralytics, 2024. [Tr</w:t>
-      </w:r>
-      <w:r>
-        <w:t>ự</w:t>
-      </w:r>
-      <w:r>
-        <w:t>c tuy</w:t>
-      </w:r>
-      <w:r>
-        <w:t>ế</w:t>
-      </w:r>
-      <w:r>
-        <w:t>n]. Đ</w:t>
-      </w:r>
-      <w:r>
-        <w:t>ị</w:t>
-      </w:r>
-      <w:r>
-        <w:t>a ch</w:t>
-      </w:r>
-      <w:r>
-        <w:t>ỉ</w:t>
-      </w:r>
-      <w:r>
-        <w:t xml:space="preserve">: </w:t>
-      </w:r>
-      <w:hyperlink r:id="rId22">
         <w:r>
           <w:rPr>
             <w:rStyle w:val="Hyperlink"/>
@@ -73173,10 +73106,7 @@
         </w:r>
       </w:hyperlink>
       <w:r>
-        <w:t xml:space="preserve"> </w:t>
-      </w:r>
-      <w:r>
-        <w:t>(truy c</w:t>
+        <w:t xml:space="preserve"> (truy c</w:t>
       </w:r>
       <w:r>
         <w:t>ậ</w:t>
@@ -73190,7 +73120,7 @@
         <w:pStyle w:val="BodyText"/>
       </w:pPr>
       <w:r>
-        <w:t xml:space="preserve">[9] C. Cui, "PP-OCRv5: A Specialized 5M-Parameter Model Rivaling Billion-Parameter Vision-Language Models on OCR Tasks," </w:t>
+        <w:t xml:space="preserve">[8] C. Cui, "PP-OCRv5: A Specialized 5M-Parameter Model Rivaling Billion-Parameter Vision-Language Models on OCR Tasks," </w:t>
       </w:r>
       <w:r>
         <w:rPr>
@@ -73226,7 +73156,7 @@
       <w:r>
         <w:t xml:space="preserve">: </w:t>
       </w:r>
-      <w:hyperlink r:id="rId23">
+      <w:hyperlink r:id="rId22">
         <w:r>
           <w:rPr>
             <w:rStyle w:val="Hyperlink"/>
@@ -73249,7 +73179,7 @@
         <w:pStyle w:val="BodyText"/>
       </w:pPr>
       <w:r>
-        <w:t>[10] Sutikno, A. Sugiharto, R. Kusumaningrum, "Enhanced Automatic License Plate Detection and Recognition using CLAHE and YOLOv11," 2025.</w:t>
+        <w:t>[9] Sutikno, A. Sugiharto, R. Kusumaningrum, "Enhanced Automatic License Plate Detection and Recognition using CLAHE and YOLOv11," 2025.</w:t>
       </w:r>
     </w:p>
     <w:p>
@@ -73257,7 +73187,7 @@
         <w:pStyle w:val="BodyText"/>
       </w:pPr>
       <w:r>
-        <w:t xml:space="preserve">[11] K. Zuiderveld, "Contrast Limited Adaptive Histogram Equalization," trong </w:t>
+        <w:t xml:space="preserve">[10] K. Zuiderveld, "Contrast Limited Adaptive Histogram Equalization," trong </w:t>
       </w:r>
       <w:r>
         <w:rPr>
@@ -73281,7 +73211,7 @@
         <w:pStyle w:val="BodyText"/>
       </w:pPr>
       <w:r>
-        <w:t xml:space="preserve">[12] C. Tomasi, R. Manduchi, "Bilateral Filtering for Gray and Color Images," trong </w:t>
+        <w:t xml:space="preserve">[11] C. Tomasi, R. Manduchi, "Bilateral Filtering for Gray and Color Images," trong </w:t>
       </w:r>
       <w:r>
         <w:rPr>
@@ -73299,7 +73229,7 @@
         <w:pStyle w:val="BodyText"/>
       </w:pPr>
       <w:r>
-        <w:t xml:space="preserve">[13] A. Graves, S. Fernández, F. Gomez, J. Schmidhuber, "Connectionist Temporal Classification: Labelling Unsegmented Sequence Data with Recurrent Neural Networks," trong </w:t>
+        <w:t xml:space="preserve">[12] A. Graves, S. Fernández, F. Gomez, J. Schmidhuber, "Connectionist Temporal Classification: Labelling Unsegmented Sequence Data with Recurrent Neural Networks," trong </w:t>
       </w:r>
       <w:r>
         <w:rPr>
@@ -73317,7 +73247,7 @@
         <w:pStyle w:val="BodyText"/>
       </w:pPr>
       <w:r>
-        <w:t xml:space="preserve">[14] B. Shi, X. Bai, C. Yao, "An End-to-End Trainable Neural Network for Image-Based Sequence Recognition and Its Application to Scene Text Recognition," </w:t>
+        <w:t xml:space="preserve">[13] B. Shi, X. Bai, C. Yao, "An End-to-End Trainable Neural Network for Image-Based Sequence Recognition and Its Application to Scene Text Recognition," </w:t>
       </w:r>
       <w:r>
         <w:rPr>
@@ -73335,7 +73265,7 @@
         <w:pStyle w:val="BodyText"/>
       </w:pPr>
       <w:r>
-        <w:t>[15] C. Zauner, "Implementation and Benchmarking of Perceptual Image Hash Functions," Lu</w:t>
+        <w:t>[14] C. Zauner, "Implementation and Benchmarking of Perceptual Image Hash Functions," Lu</w:t>
       </w:r>
       <w:r>
         <w:t>ậ</w:t>
@@ -73355,7 +73285,7 @@
         <w:pStyle w:val="BodyText"/>
       </w:pPr>
       <w:r>
-        <w:t xml:space="preserve">[16] C. Dong, C. C. Loy, X. Tang, "Accelerating the Super-Resolution Convolutional Neural Network," trong </w:t>
+        <w:t xml:space="preserve">[15] C. Dong, C. C. Loy, X. Tang, "Accelerating the Super-Resolution Convolutional Neural Network," trong </w:t>
       </w:r>
       <w:r>
         <w:rPr>
@@ -73373,7 +73303,7 @@
         <w:pStyle w:val="BodyText"/>
       </w:pPr>
       <w:r>
-        <w:t xml:space="preserve">[17] G. Bradski, "The OpenCV Library," </w:t>
+        <w:t xml:space="preserve">[16] G. Bradski, "The OpenCV Library," </w:t>
       </w:r>
       <w:r>
         <w:rPr>
@@ -73396,7 +73326,7 @@
         <w:pStyle w:val="Heading1"/>
       </w:pPr>
       <w:bookmarkStart w:id="142" w:name="phụ-lục"/>
-      <w:bookmarkStart w:id="143" w:name="_Toc239337004"/>
+      <w:bookmarkStart w:id="143" w:name="_Toc239337470"/>
       <w:bookmarkEnd w:id="140"/>
       <w:r>
         <w:t>PH</w:t>
@@ -73420,7 +73350,7 @@
         <w:pStyle w:val="Heading2"/>
       </w:pPr>
       <w:bookmarkStart w:id="144" w:name="phụ-lục-a-cấu-hình-và-siêu-tham-số"/>
-      <w:bookmarkStart w:id="145" w:name="_Toc239337005"/>
+      <w:bookmarkStart w:id="145" w:name="_Toc239337471"/>
       <w:r>
         <w:t>Ph</w:t>
       </w:r>
@@ -75640,7 +75570,7 @@
         <w:pStyle w:val="Heading2"/>
       </w:pPr>
       <w:bookmarkStart w:id="149" w:name="phụ-lục-b-hướng-dẫn-cài-đặt-và-chạy"/>
-      <w:bookmarkStart w:id="150" w:name="_Toc239337006"/>
+      <w:bookmarkStart w:id="150" w:name="_Toc239337472"/>
       <w:bookmarkEnd w:id="144"/>
       <w:bookmarkEnd w:id="148"/>
       <w:r>
@@ -75824,7 +75754,7 @@
       <w:r>
         <w:t xml:space="preserve">n web: </w:t>
       </w:r>
-      <w:hyperlink r:id="rId24">
+      <w:hyperlink r:id="rId23">
         <w:r>
           <w:rPr>
             <w:rStyle w:val="Hyperlink"/>
@@ -75856,7 +75786,7 @@
       <w:r>
         <w:t xml:space="preserve"> sinh: </w:t>
       </w:r>
-      <w:hyperlink r:id="rId25">
+      <w:hyperlink r:id="rId24">
         <w:r>
           <w:rPr>
             <w:rStyle w:val="Hyperlink"/>
@@ -77209,7 +77139,7 @@
   <w:abstractNum w:abstractNumId="0" w15:restartNumberingAfterBreak="0">
     <w:nsid w:val="0000A990"/>
     <w:multiLevelType w:val="multilevel"/>
-    <w:tmpl w:val="77B271FE"/>
+    <w:tmpl w:val="57EA36F8"/>
     <w:lvl w:ilvl="0">
       <w:numFmt w:val="bullet"/>
       <w:lvlText w:val=" "/>
@@ -77286,7 +77216,7 @@
   <w:abstractNum w:abstractNumId="1" w15:restartNumberingAfterBreak="0">
     <w:nsid w:val="0000A991"/>
     <w:multiLevelType w:val="multilevel"/>
-    <w:tmpl w:val="A27CFDDE"/>
+    <w:tmpl w:val="7F0EC5BC"/>
     <w:lvl w:ilvl="0">
       <w:numFmt w:val="bullet"/>
       <w:lvlText w:val=""/>
@@ -77390,7 +77320,7 @@
   <w:abstractNum w:abstractNumId="2" w15:restartNumberingAfterBreak="0">
     <w:nsid w:val="00A99411"/>
     <w:multiLevelType w:val="multilevel"/>
-    <w:tmpl w:val="36282240"/>
+    <w:tmpl w:val="B47CAD72"/>
     <w:lvl w:ilvl="0">
       <w:start w:val="1"/>
       <w:numFmt w:val="decimal"/>
@@ -77473,10 +77403,10 @@
       </w:pPr>
     </w:lvl>
   </w:abstractNum>
-  <w:num w:numId="1" w16cid:durableId="1773620871">
+  <w:num w:numId="1" w16cid:durableId="510146821">
     <w:abstractNumId w:val="0"/>
   </w:num>
-  <w:num w:numId="2" w16cid:durableId="1289816139">
+  <w:num w:numId="2" w16cid:durableId="1534534046">
     <w:abstractNumId w:val="2"/>
     <w:lvlOverride w:ilvl="0">
       <w:startOverride w:val="1"/>
@@ -77506,22 +77436,22 @@
       <w:startOverride w:val="1"/>
     </w:lvlOverride>
   </w:num>
-  <w:num w:numId="3" w16cid:durableId="1968462483">
+  <w:num w:numId="3" w16cid:durableId="1241865451">
     <w:abstractNumId w:val="1"/>
   </w:num>
-  <w:num w:numId="4" w16cid:durableId="1775205192">
+  <w:num w:numId="4" w16cid:durableId="972321504">
     <w:abstractNumId w:val="1"/>
   </w:num>
-  <w:num w:numId="5" w16cid:durableId="904878420">
+  <w:num w:numId="5" w16cid:durableId="836310513">
     <w:abstractNumId w:val="1"/>
   </w:num>
-  <w:num w:numId="6" w16cid:durableId="1132746065">
+  <w:num w:numId="6" w16cid:durableId="1736776127">
     <w:abstractNumId w:val="1"/>
   </w:num>
-  <w:num w:numId="7" w16cid:durableId="505168589">
+  <w:num w:numId="7" w16cid:durableId="2024630075">
     <w:abstractNumId w:val="1"/>
   </w:num>
-  <w:num w:numId="8" w16cid:durableId="1573546059">
+  <w:num w:numId="8" w16cid:durableId="2068264043">
     <w:abstractNumId w:val="2"/>
     <w:lvlOverride w:ilvl="0">
       <w:startOverride w:val="1"/>
@@ -77551,7 +77481,7 @@
       <w:startOverride w:val="1"/>
     </w:lvlOverride>
   </w:num>
-  <w:num w:numId="9" w16cid:durableId="637805752">
+  <w:num w:numId="9" w16cid:durableId="1933202889">
     <w:abstractNumId w:val="1"/>
   </w:num>
 </w:numbering>
@@ -78788,7 +78718,7 @@
     <w:next w:val="Normal"/>
     <w:autoRedefine/>
     <w:uiPriority w:val="39"/>
-    <w:rsid w:val="00452C52"/>
+    <w:rsid w:val="00712532"/>
     <w:pPr>
       <w:spacing w:after="100"/>
     </w:pPr>
@@ -78799,7 +78729,7 @@
     <w:next w:val="Normal"/>
     <w:autoRedefine/>
     <w:uiPriority w:val="39"/>
-    <w:rsid w:val="00452C52"/>
+    <w:rsid w:val="00712532"/>
     <w:pPr>
       <w:spacing w:after="100"/>
       <w:ind w:left="240"/>

</xml_diff>

<commit_message>
docs(mon-hoc): them Phu luc C — Phan cong cong viec cua bon thanh vien
Bang bon thanh vien kem MSSV va phan viec chinh, dat sau Phu luc B (huong
dan cai dat), theo dung phan cong nguoi thuc hien cung cap. Them mot cau
noi ro day la PHAN VIEC CHINH chu khong phai ranh gioi tuyet doi: cac
quyet dinh anh huong so lieu cong bo do ca nhom thong nhat — de hoi dong
khong hieu nham rang mot nguoi tu chot nguong hay tu bac luot fine-tune.

Kem: B.4 rut hai lenh dung lai quyen ve dang khong tham so (mac dinh tren
nhanh nay da tro ban mon hoc), them cau chi cach truyen --src / -Nguon khi
muon dung ban khac. Dang cu bi Word ngat giua tu "mon-ho / c" trong khoi ma.

Kiem: refs 0 chet, PDF 40 trang (Phu luc C vua trong trang cuoi), 4 MSSV
xuat hien dung 2 lan moi ma (bia + phu luc C), PAGEREF 37/37, patch kieu du.
</commit_message>
<xml_diff>
--- a/docs/papers/mon-hoc/thesis-full.docx
+++ b/docs/papers/mon-hoc/thesis-full.docx
@@ -148,7 +148,7 @@
         <w:pStyle w:val="Heading1"/>
       </w:pPr>
       <w:bookmarkStart w:id="0" w:name="đồ-án-môn-học"/>
-      <w:bookmarkStart w:id="1" w:name="_Toc239338137"/>
+      <w:bookmarkStart w:id="1" w:name="_Toc239339230"/>
       <w:r>
         <w:t>Đ</w:t>
       </w:r>
@@ -220,7 +220,7 @@
         <w:pStyle w:val="Heading1"/>
       </w:pPr>
       <w:bookmarkStart w:id="4" w:name="Xbe958ce37c6a089ac9bdc99dada4ec5e2c0f7da"/>
-      <w:bookmarkStart w:id="5" w:name="_Toc239338138"/>
+      <w:bookmarkStart w:id="5" w:name="_Toc239339231"/>
       <w:bookmarkEnd w:id="0"/>
       <w:bookmarkEnd w:id="3"/>
       <w:r>
@@ -795,7 +795,7 @@
     </w:p>
     <w:p>
       <w:r>
-        <w:pict w14:anchorId="2FB35551">
+        <w:pict w14:anchorId="3D767D60">
           <v:rect id="_x0000_i1025" style="width:0;height:1.5pt" o:hralign="center" o:hrstd="t" o:hr="t"/>
         </w:pict>
       </w:r>
@@ -805,7 +805,7 @@
         <w:pStyle w:val="Heading2"/>
       </w:pPr>
       <w:bookmarkStart w:id="6" w:name="mục-lục"/>
-      <w:bookmarkStart w:id="7" w:name="_Toc239338139"/>
+      <w:bookmarkStart w:id="7" w:name="_Toc239339232"/>
       <w:r>
         <w:t>M</w:t>
       </w:r>
@@ -845,7 +845,7 @@
       <w:r>
         <w:fldChar w:fldCharType="separate"/>
       </w:r>
-      <w:hyperlink w:anchor="_Toc239338137" w:history="1">
+      <w:hyperlink w:anchor="_Toc239339230" w:history="1">
         <w:r>
           <w:rPr>
             <w:rStyle w:val="Hyperlink"/>
@@ -872,7 +872,7 @@
             <w:noProof/>
             <w:webHidden/>
           </w:rPr>
-          <w:instrText xml:space="preserve"> PAGEREF _Toc239338137 \h </w:instrText>
+          <w:instrText xml:space="preserve"> PAGEREF _Toc239339230 \h </w:instrText>
         </w:r>
         <w:r>
           <w:rPr>
@@ -916,7 +916,7 @@
           <w14:ligatures w14:val="standardContextual"/>
         </w:rPr>
       </w:pPr>
-      <w:hyperlink w:anchor="_Toc239338138" w:history="1">
+      <w:hyperlink w:anchor="_Toc239339231" w:history="1">
         <w:r>
           <w:rPr>
             <w:rStyle w:val="Hyperlink"/>
@@ -943,7 +943,7 @@
             <w:noProof/>
             <w:webHidden/>
           </w:rPr>
-          <w:instrText xml:space="preserve"> PAGEREF _Toc239338138 \h </w:instrText>
+          <w:instrText xml:space="preserve"> PAGEREF _Toc239339231 \h </w:instrText>
         </w:r>
         <w:r>
           <w:rPr>
@@ -987,7 +987,7 @@
           <w14:ligatures w14:val="standardContextual"/>
         </w:rPr>
       </w:pPr>
-      <w:hyperlink w:anchor="_Toc239338139" w:history="1">
+      <w:hyperlink w:anchor="_Toc239339232" w:history="1">
         <w:r>
           <w:rPr>
             <w:rStyle w:val="Hyperlink"/>
@@ -1014,7 +1014,7 @@
             <w:noProof/>
             <w:webHidden/>
           </w:rPr>
-          <w:instrText xml:space="preserve"> PAGEREF _Toc239338139 \h </w:instrText>
+          <w:instrText xml:space="preserve"> PAGEREF _Toc239339232 \h </w:instrText>
         </w:r>
         <w:r>
           <w:rPr>
@@ -1058,7 +1058,7 @@
           <w14:ligatures w14:val="standardContextual"/>
         </w:rPr>
       </w:pPr>
-      <w:hyperlink w:anchor="_Toc239338140" w:history="1">
+      <w:hyperlink w:anchor="_Toc239339233" w:history="1">
         <w:r>
           <w:rPr>
             <w:rStyle w:val="Hyperlink"/>
@@ -1085,7 +1085,7 @@
             <w:noProof/>
             <w:webHidden/>
           </w:rPr>
-          <w:instrText xml:space="preserve"> PAGEREF _Toc239338140 \h </w:instrText>
+          <w:instrText xml:space="preserve"> PAGEREF _Toc239339233 \h </w:instrText>
         </w:r>
         <w:r>
           <w:rPr>
@@ -1129,7 +1129,7 @@
           <w14:ligatures w14:val="standardContextual"/>
         </w:rPr>
       </w:pPr>
-      <w:hyperlink w:anchor="_Toc239338141" w:history="1">
+      <w:hyperlink w:anchor="_Toc239339234" w:history="1">
         <w:r>
           <w:rPr>
             <w:rStyle w:val="Hyperlink"/>
@@ -1156,7 +1156,7 @@
             <w:noProof/>
             <w:webHidden/>
           </w:rPr>
-          <w:instrText xml:space="preserve"> PAGEREF _Toc239338141 \h </w:instrText>
+          <w:instrText xml:space="preserve"> PAGEREF _Toc239339234 \h </w:instrText>
         </w:r>
         <w:r>
           <w:rPr>
@@ -1200,7 +1200,7 @@
           <w14:ligatures w14:val="standardContextual"/>
         </w:rPr>
       </w:pPr>
-      <w:hyperlink w:anchor="_Toc239338142" w:history="1">
+      <w:hyperlink w:anchor="_Toc239339235" w:history="1">
         <w:r>
           <w:rPr>
             <w:rStyle w:val="Hyperlink"/>
@@ -1227,7 +1227,7 @@
             <w:noProof/>
             <w:webHidden/>
           </w:rPr>
-          <w:instrText xml:space="preserve"> PAGEREF _Toc239338142 \h </w:instrText>
+          <w:instrText xml:space="preserve"> PAGEREF _Toc239339235 \h </w:instrText>
         </w:r>
         <w:r>
           <w:rPr>
@@ -1271,7 +1271,7 @@
           <w14:ligatures w14:val="standardContextual"/>
         </w:rPr>
       </w:pPr>
-      <w:hyperlink w:anchor="_Toc239338143" w:history="1">
+      <w:hyperlink w:anchor="_Toc239339236" w:history="1">
         <w:r>
           <w:rPr>
             <w:rStyle w:val="Hyperlink"/>
@@ -1298,7 +1298,7 @@
             <w:noProof/>
             <w:webHidden/>
           </w:rPr>
-          <w:instrText xml:space="preserve"> PAGEREF _Toc239338143 \h </w:instrText>
+          <w:instrText xml:space="preserve"> PAGEREF _Toc239339236 \h </w:instrText>
         </w:r>
         <w:r>
           <w:rPr>
@@ -1342,7 +1342,7 @@
           <w14:ligatures w14:val="standardContextual"/>
         </w:rPr>
       </w:pPr>
-      <w:hyperlink w:anchor="_Toc239338144" w:history="1">
+      <w:hyperlink w:anchor="_Toc239339237" w:history="1">
         <w:r>
           <w:rPr>
             <w:rStyle w:val="Hyperlink"/>
@@ -1369,7 +1369,7 @@
             <w:noProof/>
             <w:webHidden/>
           </w:rPr>
-          <w:instrText xml:space="preserve"> PAGEREF _Toc239338144 \h </w:instrText>
+          <w:instrText xml:space="preserve"> PAGEREF _Toc239339237 \h </w:instrText>
         </w:r>
         <w:r>
           <w:rPr>
@@ -1413,7 +1413,7 @@
           <w14:ligatures w14:val="standardContextual"/>
         </w:rPr>
       </w:pPr>
-      <w:hyperlink w:anchor="_Toc239338145" w:history="1">
+      <w:hyperlink w:anchor="_Toc239339238" w:history="1">
         <w:r>
           <w:rPr>
             <w:rStyle w:val="Hyperlink"/>
@@ -1440,7 +1440,7 @@
             <w:noProof/>
             <w:webHidden/>
           </w:rPr>
-          <w:instrText xml:space="preserve"> PAGEREF _Toc239338145 \h </w:instrText>
+          <w:instrText xml:space="preserve"> PAGEREF _Toc239339238 \h </w:instrText>
         </w:r>
         <w:r>
           <w:rPr>
@@ -1484,7 +1484,7 @@
           <w14:ligatures w14:val="standardContextual"/>
         </w:rPr>
       </w:pPr>
-      <w:hyperlink w:anchor="_Toc239338146" w:history="1">
+      <w:hyperlink w:anchor="_Toc239339239" w:history="1">
         <w:r>
           <w:rPr>
             <w:rStyle w:val="Hyperlink"/>
@@ -1511,7 +1511,7 @@
             <w:noProof/>
             <w:webHidden/>
           </w:rPr>
-          <w:instrText xml:space="preserve"> PAGEREF _Toc239338146 \h </w:instrText>
+          <w:instrText xml:space="preserve"> PAGEREF _Toc239339239 \h </w:instrText>
         </w:r>
         <w:r>
           <w:rPr>
@@ -1555,7 +1555,7 @@
           <w14:ligatures w14:val="standardContextual"/>
         </w:rPr>
       </w:pPr>
-      <w:hyperlink w:anchor="_Toc239338147" w:history="1">
+      <w:hyperlink w:anchor="_Toc239339240" w:history="1">
         <w:r>
           <w:rPr>
             <w:rStyle w:val="Hyperlink"/>
@@ -1582,7 +1582,7 @@
             <w:noProof/>
             <w:webHidden/>
           </w:rPr>
-          <w:instrText xml:space="preserve"> PAGEREF _Toc239338147 \h </w:instrText>
+          <w:instrText xml:space="preserve"> PAGEREF _Toc239339240 \h </w:instrText>
         </w:r>
         <w:r>
           <w:rPr>
@@ -1626,7 +1626,7 @@
           <w14:ligatures w14:val="standardContextual"/>
         </w:rPr>
       </w:pPr>
-      <w:hyperlink w:anchor="_Toc239338148" w:history="1">
+      <w:hyperlink w:anchor="_Toc239339241" w:history="1">
         <w:r>
           <w:rPr>
             <w:rStyle w:val="Hyperlink"/>
@@ -1653,7 +1653,7 @@
             <w:noProof/>
             <w:webHidden/>
           </w:rPr>
-          <w:instrText xml:space="preserve"> PAGEREF _Toc239338148 \h </w:instrText>
+          <w:instrText xml:space="preserve"> PAGEREF _Toc239339241 \h </w:instrText>
         </w:r>
         <w:r>
           <w:rPr>
@@ -1697,7 +1697,7 @@
           <w14:ligatures w14:val="standardContextual"/>
         </w:rPr>
       </w:pPr>
-      <w:hyperlink w:anchor="_Toc239338149" w:history="1">
+      <w:hyperlink w:anchor="_Toc239339242" w:history="1">
         <w:r>
           <w:rPr>
             <w:rStyle w:val="Hyperlink"/>
@@ -1724,7 +1724,7 @@
             <w:noProof/>
             <w:webHidden/>
           </w:rPr>
-          <w:instrText xml:space="preserve"> PAGEREF _Toc239338149 \h </w:instrText>
+          <w:instrText xml:space="preserve"> PAGEREF _Toc239339242 \h </w:instrText>
         </w:r>
         <w:r>
           <w:rPr>
@@ -1768,7 +1768,7 @@
           <w14:ligatures w14:val="standardContextual"/>
         </w:rPr>
       </w:pPr>
-      <w:hyperlink w:anchor="_Toc239338150" w:history="1">
+      <w:hyperlink w:anchor="_Toc239339243" w:history="1">
         <w:r>
           <w:rPr>
             <w:rStyle w:val="Hyperlink"/>
@@ -1795,7 +1795,7 @@
             <w:noProof/>
             <w:webHidden/>
           </w:rPr>
-          <w:instrText xml:space="preserve"> PAGEREF _Toc239338150 \h </w:instrText>
+          <w:instrText xml:space="preserve"> PAGEREF _Toc239339243 \h </w:instrText>
         </w:r>
         <w:r>
           <w:rPr>
@@ -1839,7 +1839,7 @@
           <w14:ligatures w14:val="standardContextual"/>
         </w:rPr>
       </w:pPr>
-      <w:hyperlink w:anchor="_Toc239338151" w:history="1">
+      <w:hyperlink w:anchor="_Toc239339244" w:history="1">
         <w:r>
           <w:rPr>
             <w:rStyle w:val="Hyperlink"/>
@@ -1866,7 +1866,7 @@
             <w:noProof/>
             <w:webHidden/>
           </w:rPr>
-          <w:instrText xml:space="preserve"> PAGEREF _Toc239338151 \h </w:instrText>
+          <w:instrText xml:space="preserve"> PAGEREF _Toc239339244 \h </w:instrText>
         </w:r>
         <w:r>
           <w:rPr>
@@ -1910,7 +1910,7 @@
           <w14:ligatures w14:val="standardContextual"/>
         </w:rPr>
       </w:pPr>
-      <w:hyperlink w:anchor="_Toc239338152" w:history="1">
+      <w:hyperlink w:anchor="_Toc239339245" w:history="1">
         <w:r>
           <w:rPr>
             <w:rStyle w:val="Hyperlink"/>
@@ -1937,7 +1937,7 @@
             <w:noProof/>
             <w:webHidden/>
           </w:rPr>
-          <w:instrText xml:space="preserve"> PAGEREF _Toc239338152 \h </w:instrText>
+          <w:instrText xml:space="preserve"> PAGEREF _Toc239339245 \h </w:instrText>
         </w:r>
         <w:r>
           <w:rPr>
@@ -1981,7 +1981,7 @@
           <w14:ligatures w14:val="standardContextual"/>
         </w:rPr>
       </w:pPr>
-      <w:hyperlink w:anchor="_Toc239338153" w:history="1">
+      <w:hyperlink w:anchor="_Toc239339246" w:history="1">
         <w:r>
           <w:rPr>
             <w:rStyle w:val="Hyperlink"/>
@@ -2008,7 +2008,7 @@
             <w:noProof/>
             <w:webHidden/>
           </w:rPr>
-          <w:instrText xml:space="preserve"> PAGEREF _Toc239338153 \h </w:instrText>
+          <w:instrText xml:space="preserve"> PAGEREF _Toc239339246 \h </w:instrText>
         </w:r>
         <w:r>
           <w:rPr>
@@ -2052,7 +2052,7 @@
           <w14:ligatures w14:val="standardContextual"/>
         </w:rPr>
       </w:pPr>
-      <w:hyperlink w:anchor="_Toc239338154" w:history="1">
+      <w:hyperlink w:anchor="_Toc239339247" w:history="1">
         <w:r>
           <w:rPr>
             <w:rStyle w:val="Hyperlink"/>
@@ -2079,7 +2079,7 @@
             <w:noProof/>
             <w:webHidden/>
           </w:rPr>
-          <w:instrText xml:space="preserve"> PAGEREF _Toc239338154 \h </w:instrText>
+          <w:instrText xml:space="preserve"> PAGEREF _Toc239339247 \h </w:instrText>
         </w:r>
         <w:r>
           <w:rPr>
@@ -2123,7 +2123,7 @@
           <w14:ligatures w14:val="standardContextual"/>
         </w:rPr>
       </w:pPr>
-      <w:hyperlink w:anchor="_Toc239338155" w:history="1">
+      <w:hyperlink w:anchor="_Toc239339248" w:history="1">
         <w:r>
           <w:rPr>
             <w:rStyle w:val="Hyperlink"/>
@@ -2150,7 +2150,7 @@
             <w:noProof/>
             <w:webHidden/>
           </w:rPr>
-          <w:instrText xml:space="preserve"> PAGEREF _Toc239338155 \h </w:instrText>
+          <w:instrText xml:space="preserve"> PAGEREF _Toc239339248 \h </w:instrText>
         </w:r>
         <w:r>
           <w:rPr>
@@ -2194,7 +2194,7 @@
           <w14:ligatures w14:val="standardContextual"/>
         </w:rPr>
       </w:pPr>
-      <w:hyperlink w:anchor="_Toc239338156" w:history="1">
+      <w:hyperlink w:anchor="_Toc239339249" w:history="1">
         <w:r>
           <w:rPr>
             <w:rStyle w:val="Hyperlink"/>
@@ -2221,7 +2221,7 @@
             <w:noProof/>
             <w:webHidden/>
           </w:rPr>
-          <w:instrText xml:space="preserve"> PAGEREF _Toc239338156 \h </w:instrText>
+          <w:instrText xml:space="preserve"> PAGEREF _Toc239339249 \h </w:instrText>
         </w:r>
         <w:r>
           <w:rPr>
@@ -2265,7 +2265,7 @@
           <w14:ligatures w14:val="standardContextual"/>
         </w:rPr>
       </w:pPr>
-      <w:hyperlink w:anchor="_Toc239338157" w:history="1">
+      <w:hyperlink w:anchor="_Toc239339250" w:history="1">
         <w:r>
           <w:rPr>
             <w:rStyle w:val="Hyperlink"/>
@@ -2292,7 +2292,7 @@
             <w:noProof/>
             <w:webHidden/>
           </w:rPr>
-          <w:instrText xml:space="preserve"> PAGEREF _Toc239338157 \h </w:instrText>
+          <w:instrText xml:space="preserve"> PAGEREF _Toc239339250 \h </w:instrText>
         </w:r>
         <w:r>
           <w:rPr>
@@ -2336,7 +2336,7 @@
           <w14:ligatures w14:val="standardContextual"/>
         </w:rPr>
       </w:pPr>
-      <w:hyperlink w:anchor="_Toc239338158" w:history="1">
+      <w:hyperlink w:anchor="_Toc239339251" w:history="1">
         <w:r>
           <w:rPr>
             <w:rStyle w:val="Hyperlink"/>
@@ -2363,7 +2363,7 @@
             <w:noProof/>
             <w:webHidden/>
           </w:rPr>
-          <w:instrText xml:space="preserve"> PAGEREF _Toc239338158 \h </w:instrText>
+          <w:instrText xml:space="preserve"> PAGEREF _Toc239339251 \h </w:instrText>
         </w:r>
         <w:r>
           <w:rPr>
@@ -2407,7 +2407,7 @@
           <w14:ligatures w14:val="standardContextual"/>
         </w:rPr>
       </w:pPr>
-      <w:hyperlink w:anchor="_Toc239338159" w:history="1">
+      <w:hyperlink w:anchor="_Toc239339252" w:history="1">
         <w:r>
           <w:rPr>
             <w:rStyle w:val="Hyperlink"/>
@@ -2434,7 +2434,7 @@
             <w:noProof/>
             <w:webHidden/>
           </w:rPr>
-          <w:instrText xml:space="preserve"> PAGEREF _Toc239338159 \h </w:instrText>
+          <w:instrText xml:space="preserve"> PAGEREF _Toc239339252 \h </w:instrText>
         </w:r>
         <w:r>
           <w:rPr>
@@ -2478,7 +2478,7 @@
           <w14:ligatures w14:val="standardContextual"/>
         </w:rPr>
       </w:pPr>
-      <w:hyperlink w:anchor="_Toc239338160" w:history="1">
+      <w:hyperlink w:anchor="_Toc239339253" w:history="1">
         <w:r>
           <w:rPr>
             <w:rStyle w:val="Hyperlink"/>
@@ -2505,7 +2505,7 @@
             <w:noProof/>
             <w:webHidden/>
           </w:rPr>
-          <w:instrText xml:space="preserve"> PAGEREF _Toc239338160 \h </w:instrText>
+          <w:instrText xml:space="preserve"> PAGEREF _Toc239339253 \h </w:instrText>
         </w:r>
         <w:r>
           <w:rPr>
@@ -2549,7 +2549,7 @@
           <w14:ligatures w14:val="standardContextual"/>
         </w:rPr>
       </w:pPr>
-      <w:hyperlink w:anchor="_Toc239338161" w:history="1">
+      <w:hyperlink w:anchor="_Toc239339254" w:history="1">
         <w:r>
           <w:rPr>
             <w:rStyle w:val="Hyperlink"/>
@@ -2576,7 +2576,7 @@
             <w:noProof/>
             <w:webHidden/>
           </w:rPr>
-          <w:instrText xml:space="preserve"> PAGEREF _Toc239338161 \h </w:instrText>
+          <w:instrText xml:space="preserve"> PAGEREF _Toc239339254 \h </w:instrText>
         </w:r>
         <w:r>
           <w:rPr>
@@ -2620,7 +2620,7 @@
           <w14:ligatures w14:val="standardContextual"/>
         </w:rPr>
       </w:pPr>
-      <w:hyperlink w:anchor="_Toc239338162" w:history="1">
+      <w:hyperlink w:anchor="_Toc239339255" w:history="1">
         <w:r>
           <w:rPr>
             <w:rStyle w:val="Hyperlink"/>
@@ -2647,7 +2647,7 @@
             <w:noProof/>
             <w:webHidden/>
           </w:rPr>
-          <w:instrText xml:space="preserve"> PAGEREF _Toc239338162 \h </w:instrText>
+          <w:instrText xml:space="preserve"> PAGEREF _Toc239339255 \h </w:instrText>
         </w:r>
         <w:r>
           <w:rPr>
@@ -2691,7 +2691,7 @@
           <w14:ligatures w14:val="standardContextual"/>
         </w:rPr>
       </w:pPr>
-      <w:hyperlink w:anchor="_Toc239338163" w:history="1">
+      <w:hyperlink w:anchor="_Toc239339256" w:history="1">
         <w:r>
           <w:rPr>
             <w:rStyle w:val="Hyperlink"/>
@@ -2718,7 +2718,7 @@
             <w:noProof/>
             <w:webHidden/>
           </w:rPr>
-          <w:instrText xml:space="preserve"> PAGEREF _Toc239338163 \h </w:instrText>
+          <w:instrText xml:space="preserve"> PAGEREF _Toc239339256 \h </w:instrText>
         </w:r>
         <w:r>
           <w:rPr>
@@ -2762,7 +2762,7 @@
           <w14:ligatures w14:val="standardContextual"/>
         </w:rPr>
       </w:pPr>
-      <w:hyperlink w:anchor="_Toc239338164" w:history="1">
+      <w:hyperlink w:anchor="_Toc239339257" w:history="1">
         <w:r>
           <w:rPr>
             <w:rStyle w:val="Hyperlink"/>
@@ -2789,7 +2789,7 @@
             <w:noProof/>
             <w:webHidden/>
           </w:rPr>
-          <w:instrText xml:space="preserve"> PAGEREF _Toc239338164 \h </w:instrText>
+          <w:instrText xml:space="preserve"> PAGEREF _Toc239339257 \h </w:instrText>
         </w:r>
         <w:r>
           <w:rPr>
@@ -2833,7 +2833,7 @@
           <w14:ligatures w14:val="standardContextual"/>
         </w:rPr>
       </w:pPr>
-      <w:hyperlink w:anchor="_Toc239338165" w:history="1">
+      <w:hyperlink w:anchor="_Toc239339258" w:history="1">
         <w:r>
           <w:rPr>
             <w:rStyle w:val="Hyperlink"/>
@@ -2860,7 +2860,7 @@
             <w:noProof/>
             <w:webHidden/>
           </w:rPr>
-          <w:instrText xml:space="preserve"> PAGEREF _Toc239338165 \h </w:instrText>
+          <w:instrText xml:space="preserve"> PAGEREF _Toc239339258 \h </w:instrText>
         </w:r>
         <w:r>
           <w:rPr>
@@ -2904,7 +2904,7 @@
           <w14:ligatures w14:val="standardContextual"/>
         </w:rPr>
       </w:pPr>
-      <w:hyperlink w:anchor="_Toc239338166" w:history="1">
+      <w:hyperlink w:anchor="_Toc239339259" w:history="1">
         <w:r>
           <w:rPr>
             <w:rStyle w:val="Hyperlink"/>
@@ -2931,7 +2931,7 @@
             <w:noProof/>
             <w:webHidden/>
           </w:rPr>
-          <w:instrText xml:space="preserve"> PAGEREF _Toc239338166 \h </w:instrText>
+          <w:instrText xml:space="preserve"> PAGEREF _Toc239339259 \h </w:instrText>
         </w:r>
         <w:r>
           <w:rPr>
@@ -2975,7 +2975,7 @@
           <w14:ligatures w14:val="standardContextual"/>
         </w:rPr>
       </w:pPr>
-      <w:hyperlink w:anchor="_Toc239338167" w:history="1">
+      <w:hyperlink w:anchor="_Toc239339260" w:history="1">
         <w:r>
           <w:rPr>
             <w:rStyle w:val="Hyperlink"/>
@@ -3002,7 +3002,7 @@
             <w:noProof/>
             <w:webHidden/>
           </w:rPr>
-          <w:instrText xml:space="preserve"> PAGEREF _Toc239338167 \h </w:instrText>
+          <w:instrText xml:space="preserve"> PAGEREF _Toc239339260 \h </w:instrText>
         </w:r>
         <w:r>
           <w:rPr>
@@ -3046,7 +3046,7 @@
           <w14:ligatures w14:val="standardContextual"/>
         </w:rPr>
       </w:pPr>
-      <w:hyperlink w:anchor="_Toc239338168" w:history="1">
+      <w:hyperlink w:anchor="_Toc239339261" w:history="1">
         <w:r>
           <w:rPr>
             <w:rStyle w:val="Hyperlink"/>
@@ -3073,7 +3073,7 @@
             <w:noProof/>
             <w:webHidden/>
           </w:rPr>
-          <w:instrText xml:space="preserve"> PAGEREF _Toc239338168 \h </w:instrText>
+          <w:instrText xml:space="preserve"> PAGEREF _Toc239339261 \h </w:instrText>
         </w:r>
         <w:r>
           <w:rPr>
@@ -3117,7 +3117,7 @@
           <w14:ligatures w14:val="standardContextual"/>
         </w:rPr>
       </w:pPr>
-      <w:hyperlink w:anchor="_Toc239338169" w:history="1">
+      <w:hyperlink w:anchor="_Toc239339262" w:history="1">
         <w:r>
           <w:rPr>
             <w:rStyle w:val="Hyperlink"/>
@@ -3144,7 +3144,7 @@
             <w:noProof/>
             <w:webHidden/>
           </w:rPr>
-          <w:instrText xml:space="preserve"> PAGEREF _Toc239338169 \h </w:instrText>
+          <w:instrText xml:space="preserve"> PAGEREF _Toc239339262 \h </w:instrText>
         </w:r>
         <w:r>
           <w:rPr>
@@ -3188,7 +3188,7 @@
           <w14:ligatures w14:val="standardContextual"/>
         </w:rPr>
       </w:pPr>
-      <w:hyperlink w:anchor="_Toc239338170" w:history="1">
+      <w:hyperlink w:anchor="_Toc239339263" w:history="1">
         <w:r>
           <w:rPr>
             <w:rStyle w:val="Hyperlink"/>
@@ -3215,7 +3215,7 @@
             <w:noProof/>
             <w:webHidden/>
           </w:rPr>
-          <w:instrText xml:space="preserve"> PAGEREF _Toc239338170 \h </w:instrText>
+          <w:instrText xml:space="preserve"> PAGEREF _Toc239339263 \h </w:instrText>
         </w:r>
         <w:r>
           <w:rPr>
@@ -3259,7 +3259,7 @@
           <w14:ligatures w14:val="standardContextual"/>
         </w:rPr>
       </w:pPr>
-      <w:hyperlink w:anchor="_Toc239338171" w:history="1">
+      <w:hyperlink w:anchor="_Toc239339264" w:history="1">
         <w:r>
           <w:rPr>
             <w:rStyle w:val="Hyperlink"/>
@@ -3286,7 +3286,7 @@
             <w:noProof/>
             <w:webHidden/>
           </w:rPr>
-          <w:instrText xml:space="preserve"> PAGEREF _Toc239338171 \h </w:instrText>
+          <w:instrText xml:space="preserve"> PAGEREF _Toc239339264 \h </w:instrText>
         </w:r>
         <w:r>
           <w:rPr>
@@ -3330,7 +3330,7 @@
           <w14:ligatures w14:val="standardContextual"/>
         </w:rPr>
       </w:pPr>
-      <w:hyperlink w:anchor="_Toc239338172" w:history="1">
+      <w:hyperlink w:anchor="_Toc239339265" w:history="1">
         <w:r>
           <w:rPr>
             <w:rStyle w:val="Hyperlink"/>
@@ -3357,7 +3357,7 @@
             <w:noProof/>
             <w:webHidden/>
           </w:rPr>
-          <w:instrText xml:space="preserve"> PAGEREF _Toc239338172 \h </w:instrText>
+          <w:instrText xml:space="preserve"> PAGEREF _Toc239339265 \h </w:instrText>
         </w:r>
         <w:r>
           <w:rPr>
@@ -3401,7 +3401,7 @@
           <w14:ligatures w14:val="standardContextual"/>
         </w:rPr>
       </w:pPr>
-      <w:hyperlink w:anchor="_Toc239338173" w:history="1">
+      <w:hyperlink w:anchor="_Toc239339266" w:history="1">
         <w:r>
           <w:rPr>
             <w:rStyle w:val="Hyperlink"/>
@@ -3428,7 +3428,7 @@
             <w:noProof/>
             <w:webHidden/>
           </w:rPr>
-          <w:instrText xml:space="preserve"> PAGEREF _Toc239338173 \h </w:instrText>
+          <w:instrText xml:space="preserve"> PAGEREF _Toc239339266 \h </w:instrText>
         </w:r>
         <w:r>
           <w:rPr>
@@ -3460,6 +3460,77 @@
       </w:hyperlink>
     </w:p>
     <w:p>
+      <w:pPr>
+        <w:pStyle w:val="TOC2"/>
+        <w:tabs>
+          <w:tab w:val="right" w:leader="dot" w:pos="9350"/>
+        </w:tabs>
+        <w:rPr>
+          <w:noProof/>
+          <w:kern w:val="2"/>
+          <w:lang w:eastAsia="en-US"/>
+          <w14:ligatures w14:val="standardContextual"/>
+        </w:rPr>
+      </w:pPr>
+      <w:hyperlink w:anchor="_Toc239339267" w:history="1">
+        <w:r>
+          <w:rPr>
+            <w:rStyle w:val="Hyperlink"/>
+            <w:noProof/>
+          </w:rPr>
+          <w:t>Phụ lục C. Phân công công việc</w:t>
+        </w:r>
+        <w:r>
+          <w:rPr>
+            <w:noProof/>
+            <w:webHidden/>
+          </w:rPr>
+          <w:tab/>
+        </w:r>
+        <w:r>
+          <w:rPr>
+            <w:noProof/>
+            <w:webHidden/>
+          </w:rPr>
+          <w:fldChar w:fldCharType="begin"/>
+        </w:r>
+        <w:r>
+          <w:rPr>
+            <w:noProof/>
+            <w:webHidden/>
+          </w:rPr>
+          <w:instrText xml:space="preserve"> PAGEREF _Toc239339267 \h </w:instrText>
+        </w:r>
+        <w:r>
+          <w:rPr>
+            <w:noProof/>
+            <w:webHidden/>
+          </w:rPr>
+        </w:r>
+        <w:r>
+          <w:rPr>
+            <w:noProof/>
+            <w:webHidden/>
+          </w:rPr>
+          <w:fldChar w:fldCharType="separate"/>
+        </w:r>
+        <w:r>
+          <w:rPr>
+            <w:noProof/>
+            <w:webHidden/>
+          </w:rPr>
+          <w:t>40</w:t>
+        </w:r>
+        <w:r>
+          <w:rPr>
+            <w:noProof/>
+            <w:webHidden/>
+          </w:rPr>
+          <w:fldChar w:fldCharType="end"/>
+        </w:r>
+      </w:hyperlink>
+    </w:p>
+    <w:p>
       <w:r>
         <w:fldChar w:fldCharType="end"/>
       </w:r>
@@ -3474,7 +3545,7 @@
         <w:pStyle w:val="Heading1"/>
       </w:pPr>
       <w:bookmarkStart w:id="8" w:name="chương-1-giới-thiệu"/>
-      <w:bookmarkStart w:id="9" w:name="_Toc239338140"/>
+      <w:bookmarkStart w:id="9" w:name="_Toc239339233"/>
       <w:bookmarkEnd w:id="4"/>
       <w:bookmarkEnd w:id="6"/>
       <w:r>
@@ -3499,7 +3570,7 @@
         <w:pStyle w:val="Heading2"/>
       </w:pPr>
       <w:bookmarkStart w:id="10" w:name="X7d99df2d9d0c5141050eb9941026463f4c8ea2b"/>
-      <w:bookmarkStart w:id="11" w:name="_Toc239338141"/>
+      <w:bookmarkStart w:id="11" w:name="_Toc239339234"/>
       <w:r>
         <w:t>1.1. Đ</w:t>
       </w:r>
@@ -5349,7 +5420,7 @@
         <w:pStyle w:val="Heading2"/>
       </w:pPr>
       <w:bookmarkStart w:id="12" w:name="X60021b7b958505251ec70bd32e2bac9f8a0361c"/>
-      <w:bookmarkStart w:id="13" w:name="_Toc239338142"/>
+      <w:bookmarkStart w:id="13" w:name="_Toc239339235"/>
       <w:bookmarkEnd w:id="10"/>
       <w:r>
         <w:t>1.2. M</w:t>
@@ -7295,7 +7366,7 @@
         <w:pStyle w:val="Heading2"/>
       </w:pPr>
       <w:bookmarkStart w:id="17" w:name="X03724c88a1b7da9b434cf0a8db5356690a4bb71"/>
-      <w:bookmarkStart w:id="18" w:name="_Toc239338143"/>
+      <w:bookmarkStart w:id="18" w:name="_Toc239339236"/>
       <w:bookmarkEnd w:id="12"/>
       <w:bookmarkEnd w:id="16"/>
       <w:r>
@@ -9100,7 +9171,7 @@
         <w:pStyle w:val="Heading1"/>
       </w:pPr>
       <w:bookmarkStart w:id="20" w:name="chương-2-cơ-sở-lý-thuyết"/>
-      <w:bookmarkStart w:id="21" w:name="_Toc239338144"/>
+      <w:bookmarkStart w:id="21" w:name="_Toc239339237"/>
       <w:bookmarkEnd w:id="8"/>
       <w:bookmarkEnd w:id="17"/>
       <w:r>
@@ -9397,7 +9468,7 @@
         <w:pStyle w:val="Heading2"/>
       </w:pPr>
       <w:bookmarkStart w:id="22" w:name="X2256001523e16d112c59df938522f140b8b988e"/>
-      <w:bookmarkStart w:id="23" w:name="_Toc239338145"/>
+      <w:bookmarkStart w:id="23" w:name="_Toc239339238"/>
       <w:r>
         <w:t>2.1. Quy chu</w:t>
       </w:r>
@@ -14076,7 +14147,7 @@
         <w:pStyle w:val="Heading2"/>
       </w:pPr>
       <w:bookmarkStart w:id="30" w:name="Xb21b4f0690a73e92e2a35192cb39315a0956521"/>
-      <w:bookmarkStart w:id="31" w:name="_Toc239338146"/>
+      <w:bookmarkStart w:id="31" w:name="_Toc239339239"/>
       <w:bookmarkEnd w:id="22"/>
       <w:bookmarkEnd w:id="28"/>
       <w:r>
@@ -19316,7 +19387,7 @@
         <w:pStyle w:val="Heading2"/>
       </w:pPr>
       <w:bookmarkStart w:id="38" w:name="X8ff52f1334e3f0e382caf7ffa1b7096a981291c"/>
-      <w:bookmarkStart w:id="39" w:name="_Toc239338147"/>
+      <w:bookmarkStart w:id="39" w:name="_Toc239339240"/>
       <w:bookmarkEnd w:id="30"/>
       <w:bookmarkEnd w:id="37"/>
       <w:r>
@@ -19595,7 +19666,7 @@
           <w:noProof/>
         </w:rPr>
         <w:drawing>
-          <wp:inline distT="0" distB="0" distL="0" distR="0" wp14:anchorId="0DDCE22A" wp14:editId="6DDD21A6">
+          <wp:inline distT="0" distB="0" distL="0" distR="0" wp14:anchorId="05B49ED3" wp14:editId="7D3DBB0C">
             <wp:extent cx="5334000" cy="1435553"/>
             <wp:effectExtent l="0" t="0" r="0" b="0"/>
             <wp:docPr id="37" name="Picture"/>
@@ -21057,7 +21128,7 @@
         <w:pStyle w:val="Heading2"/>
       </w:pPr>
       <w:bookmarkStart w:id="43" w:name="X1a77f36e16d4ad267b00eabe7cf793e1dbe08e9"/>
-      <w:bookmarkStart w:id="44" w:name="_Toc239338148"/>
+      <w:bookmarkStart w:id="44" w:name="_Toc239339241"/>
       <w:bookmarkEnd w:id="38"/>
       <w:bookmarkEnd w:id="42"/>
       <w:r>
@@ -22227,7 +22298,7 @@
           <w:noProof/>
         </w:rPr>
         <w:drawing>
-          <wp:inline distT="0" distB="0" distL="0" distR="0" wp14:anchorId="5760C694" wp14:editId="36AEFD8C">
+          <wp:inline distT="0" distB="0" distL="0" distR="0" wp14:anchorId="443DB69E" wp14:editId="0E939D99">
             <wp:extent cx="5334000" cy="2884362"/>
             <wp:effectExtent l="0" t="0" r="0" b="0"/>
             <wp:docPr id="44" name="Picture"/>
@@ -22493,7 +22564,7 @@
           <w:noProof/>
         </w:rPr>
         <w:drawing>
-          <wp:inline distT="0" distB="0" distL="0" distR="0" wp14:anchorId="7241BF45" wp14:editId="5F53AAFB">
+          <wp:inline distT="0" distB="0" distL="0" distR="0" wp14:anchorId="5011B406" wp14:editId="523421EC">
             <wp:extent cx="5334000" cy="632732"/>
             <wp:effectExtent l="0" t="0" r="0" b="0"/>
             <wp:docPr id="49" name="Picture"/>
@@ -24396,7 +24467,7 @@
         <w:pStyle w:val="Heading1"/>
       </w:pPr>
       <w:bookmarkStart w:id="50" w:name="chương-3-thiết-kế-và-cài-đặt"/>
-      <w:bookmarkStart w:id="51" w:name="_Toc239338149"/>
+      <w:bookmarkStart w:id="51" w:name="_Toc239339242"/>
       <w:bookmarkEnd w:id="20"/>
       <w:bookmarkEnd w:id="43"/>
       <w:bookmarkEnd w:id="49"/>
@@ -24428,7 +24499,7 @@
         <w:pStyle w:val="Heading2"/>
       </w:pPr>
       <w:bookmarkStart w:id="52" w:name="X21a22cc9b66dca004f2960f37df13c53a04e97b"/>
-      <w:bookmarkStart w:id="53" w:name="_Toc239338150"/>
+      <w:bookmarkStart w:id="53" w:name="_Toc239339243"/>
       <w:r>
         <w:t>3.1. Ki</w:t>
       </w:r>
@@ -24520,7 +24591,7 @@
           <w:noProof/>
         </w:rPr>
         <w:drawing>
-          <wp:inline distT="0" distB="0" distL="0" distR="0" wp14:anchorId="27D35533" wp14:editId="71783C39">
+          <wp:inline distT="0" distB="0" distL="0" distR="0" wp14:anchorId="3506291C" wp14:editId="4863F0DC">
             <wp:extent cx="5334000" cy="401410"/>
             <wp:effectExtent l="0" t="0" r="0" b="0"/>
             <wp:docPr id="57" name="Picture"/>
@@ -26189,7 +26260,7 @@
         <w:pStyle w:val="Heading2"/>
       </w:pPr>
       <w:bookmarkStart w:id="55" w:name="X1f307d8f8c73bce8db8683c986faea6c8ea66a3"/>
-      <w:bookmarkStart w:id="56" w:name="_Toc239338151"/>
+      <w:bookmarkStart w:id="56" w:name="_Toc239339244"/>
       <w:bookmarkEnd w:id="52"/>
       <w:r>
         <w:t>3.2. Xây d</w:t>
@@ -26256,7 +26327,7 @@
           <w:noProof/>
         </w:rPr>
         <w:drawing>
-          <wp:inline distT="0" distB="0" distL="0" distR="0" wp14:anchorId="2CAB477A" wp14:editId="41E1D508">
+          <wp:inline distT="0" distB="0" distL="0" distR="0" wp14:anchorId="3D1C1205" wp14:editId="78EC2B72">
             <wp:extent cx="5334000" cy="802821"/>
             <wp:effectExtent l="0" t="0" r="0" b="0"/>
             <wp:docPr id="62" name="Picture"/>
@@ -30368,7 +30439,7 @@
         <w:pStyle w:val="Heading2"/>
       </w:pPr>
       <w:bookmarkStart w:id="62" w:name="X6a397cb1739f1ec0a8c9714808f79a5ce1fbf6f"/>
-      <w:bookmarkStart w:id="63" w:name="_Toc239338152"/>
+      <w:bookmarkStart w:id="63" w:name="_Toc239339245"/>
       <w:bookmarkEnd w:id="55"/>
       <w:bookmarkEnd w:id="61"/>
       <w:r>
@@ -31934,7 +32005,7 @@
         <w:pStyle w:val="Heading2"/>
       </w:pPr>
       <w:bookmarkStart w:id="65" w:name="X9c2c9b365086d10c999a46e4942f14d73b6baa5"/>
-      <w:bookmarkStart w:id="66" w:name="_Toc239338153"/>
+      <w:bookmarkStart w:id="66" w:name="_Toc239339246"/>
       <w:bookmarkEnd w:id="62"/>
       <w:r>
         <w:t>3.4. Kh</w:t>
@@ -32718,7 +32789,7 @@
           <w:noProof/>
         </w:rPr>
         <w:drawing>
-          <wp:inline distT="0" distB="0" distL="0" distR="0" wp14:anchorId="0FB67936" wp14:editId="6654D645">
+          <wp:inline distT="0" distB="0" distL="0" distR="0" wp14:anchorId="174BA842" wp14:editId="4C82988F">
             <wp:extent cx="5334000" cy="8969712"/>
             <wp:effectExtent l="0" t="0" r="0" b="0"/>
             <wp:docPr id="73" name="Picture"/>
@@ -38667,7 +38738,7 @@
         <w:pStyle w:val="Heading2"/>
       </w:pPr>
       <w:bookmarkStart w:id="75" w:name="Xb17945b5d9374e5087c2c96ace1685ff00e2e22"/>
-      <w:bookmarkStart w:id="76" w:name="_Toc239338154"/>
+      <w:bookmarkStart w:id="76" w:name="_Toc239339247"/>
       <w:bookmarkEnd w:id="65"/>
       <w:bookmarkEnd w:id="74"/>
       <w:r>
@@ -40037,7 +40108,7 @@
         <w:pStyle w:val="Heading2"/>
       </w:pPr>
       <w:bookmarkStart w:id="77" w:name="Xfad7df3f963ac0b8ebfe8cf87d7c64fa075f760"/>
-      <w:bookmarkStart w:id="78" w:name="_Toc239338155"/>
+      <w:bookmarkStart w:id="78" w:name="_Toc239339248"/>
       <w:bookmarkEnd w:id="75"/>
       <w:r>
         <w:t>3.6. B</w:t>
@@ -40083,7 +40154,7 @@
           <w:noProof/>
         </w:rPr>
         <w:drawing>
-          <wp:inline distT="0" distB="0" distL="0" distR="0" wp14:anchorId="5FAD041C" wp14:editId="0B83875B">
+          <wp:inline distT="0" distB="0" distL="0" distR="0" wp14:anchorId="492382B6" wp14:editId="725A5502">
             <wp:extent cx="5334000" cy="1217839"/>
             <wp:effectExtent l="0" t="0" r="0" b="0"/>
             <wp:docPr id="86" name="Picture"/>
@@ -42864,7 +42935,7 @@
         <w:pStyle w:val="Heading2"/>
       </w:pPr>
       <w:bookmarkStart w:id="80" w:name="X9b5467225f237e4ee44d60f7d236cbdfdaa1e07"/>
-      <w:bookmarkStart w:id="81" w:name="_Toc239338156"/>
+      <w:bookmarkStart w:id="81" w:name="_Toc239339249"/>
       <w:bookmarkEnd w:id="77"/>
       <w:r>
         <w:t xml:space="preserve">3.7. </w:t>
@@ -42984,7 +43055,7 @@
           <w:noProof/>
         </w:rPr>
         <w:drawing>
-          <wp:inline distT="0" distB="0" distL="0" distR="0" wp14:anchorId="4FEC7816" wp14:editId="3DC7CF84">
+          <wp:inline distT="0" distB="0" distL="0" distR="0" wp14:anchorId="0E7C2637" wp14:editId="4BD2C274">
             <wp:extent cx="5334000" cy="5953125"/>
             <wp:effectExtent l="0" t="0" r="0" b="0"/>
             <wp:docPr id="91" name="Picture"/>
@@ -44094,7 +44165,7 @@
         <w:pStyle w:val="Heading1"/>
       </w:pPr>
       <w:bookmarkStart w:id="83" w:name="chương-4-thực-nghiệm-và-đánh-giá"/>
-      <w:bookmarkStart w:id="84" w:name="_Toc239338157"/>
+      <w:bookmarkStart w:id="84" w:name="_Toc239339250"/>
       <w:bookmarkEnd w:id="50"/>
       <w:bookmarkEnd w:id="80"/>
       <w:r>
@@ -44119,7 +44190,7 @@
         <w:pStyle w:val="Heading2"/>
       </w:pPr>
       <w:bookmarkStart w:id="85" w:name="X43cb4672f728ce1df4f211c1d18360135f0c40b"/>
-      <w:bookmarkStart w:id="86" w:name="_Toc239338158"/>
+      <w:bookmarkStart w:id="86" w:name="_Toc239339251"/>
       <w:r>
         <w:t>4.1. Môi trư</w:t>
       </w:r>
@@ -45741,7 +45812,7 @@
         <w:pStyle w:val="Heading2"/>
       </w:pPr>
       <w:bookmarkStart w:id="87" w:name="Xe48430b60e6d2b1022368eb4316c1fe9f53411f"/>
-      <w:bookmarkStart w:id="88" w:name="_Toc239338159"/>
+      <w:bookmarkStart w:id="88" w:name="_Toc239339252"/>
       <w:bookmarkEnd w:id="85"/>
       <w:r>
         <w:t>4.2. K</w:t>
@@ -49276,7 +49347,7 @@
         <w:pStyle w:val="Heading2"/>
       </w:pPr>
       <w:bookmarkStart w:id="95" w:name="X09b724f0b907c7f652c2569c27ef1d5728c277c"/>
-      <w:bookmarkStart w:id="96" w:name="_Toc239338160"/>
+      <w:bookmarkStart w:id="96" w:name="_Toc239339253"/>
       <w:bookmarkEnd w:id="87"/>
       <w:bookmarkEnd w:id="93"/>
       <w:r>
@@ -51548,7 +51619,7 @@
           <w:noProof/>
         </w:rPr>
         <w:drawing>
-          <wp:inline distT="0" distB="0" distL="0" distR="0" wp14:anchorId="3570C788" wp14:editId="42A3784F">
+          <wp:inline distT="0" distB="0" distL="0" distR="0" wp14:anchorId="6F7AB800" wp14:editId="51F1CC5D">
             <wp:extent cx="5334000" cy="2883855"/>
             <wp:effectExtent l="0" t="0" r="0" b="0"/>
             <wp:docPr id="108" name="Picture"/>
@@ -56571,7 +56642,7 @@
         <w:pStyle w:val="Heading2"/>
       </w:pPr>
       <w:bookmarkStart w:id="106" w:name="X0c205a3fd5474e5e1d380a3735df7543f97f059"/>
-      <w:bookmarkStart w:id="107" w:name="_Toc239338161"/>
+      <w:bookmarkStart w:id="107" w:name="_Toc239339254"/>
       <w:bookmarkEnd w:id="95"/>
       <w:bookmarkEnd w:id="104"/>
       <w:r>
@@ -59579,7 +59650,7 @@
         <w:pStyle w:val="Heading2"/>
       </w:pPr>
       <w:bookmarkStart w:id="113" w:name="X8f4b2c0e55e8764a0677cdfa39e96dbe6822859"/>
-      <w:bookmarkStart w:id="114" w:name="_Toc239338162"/>
+      <w:bookmarkStart w:id="114" w:name="_Toc239339255"/>
       <w:bookmarkEnd w:id="106"/>
       <w:bookmarkEnd w:id="112"/>
       <w:r>
@@ -62737,7 +62808,7 @@
         <w:pStyle w:val="Heading2"/>
       </w:pPr>
       <w:bookmarkStart w:id="120" w:name="X7468ed9f095dd0192ebc5de940dc44b5cd3e099"/>
-      <w:bookmarkStart w:id="121" w:name="_Toc239338163"/>
+      <w:bookmarkStart w:id="121" w:name="_Toc239339256"/>
       <w:bookmarkEnd w:id="113"/>
       <w:bookmarkEnd w:id="118"/>
       <w:r>
@@ -64595,7 +64666,7 @@
           <w:noProof/>
         </w:rPr>
         <w:drawing>
-          <wp:inline distT="0" distB="0" distL="0" distR="0" wp14:anchorId="144B489E" wp14:editId="272D87AD">
+          <wp:inline distT="0" distB="0" distL="0" distR="0" wp14:anchorId="4439E912" wp14:editId="7CAF36D8">
             <wp:extent cx="5334000" cy="3317670"/>
             <wp:effectExtent l="0" t="0" r="0" b="0"/>
             <wp:docPr id="131" name="Picture"/>
@@ -65327,7 +65398,7 @@
         <w:pStyle w:val="Heading2"/>
       </w:pPr>
       <w:bookmarkStart w:id="124" w:name="X88e1c26a6581f7bd1dbdb2c85ae6116c5ba8393"/>
-      <w:bookmarkStart w:id="125" w:name="_Toc239338164"/>
+      <w:bookmarkStart w:id="125" w:name="_Toc239339257"/>
       <w:bookmarkEnd w:id="120"/>
       <w:r>
         <w:t>4.7. Các y</w:t>
@@ -67182,7 +67253,7 @@
         <w:pStyle w:val="Heading1"/>
       </w:pPr>
       <w:bookmarkStart w:id="127" w:name="chương-5-kết-luận-và-hướng-phát-triển"/>
-      <w:bookmarkStart w:id="128" w:name="_Toc239338165"/>
+      <w:bookmarkStart w:id="128" w:name="_Toc239339258"/>
       <w:bookmarkEnd w:id="83"/>
       <w:bookmarkEnd w:id="124"/>
       <w:r>
@@ -67219,7 +67290,7 @@
         <w:pStyle w:val="Heading2"/>
       </w:pPr>
       <w:bookmarkStart w:id="129" w:name="Xcefa088882d41b38c21b7b5b44c738cb5564fbb"/>
-      <w:bookmarkStart w:id="130" w:name="_Toc239338166"/>
+      <w:bookmarkStart w:id="130" w:name="_Toc239339259"/>
       <w:r>
         <w:t>5.1. K</w:t>
       </w:r>
@@ -68720,7 +68791,7 @@
         <w:pStyle w:val="Heading2"/>
       </w:pPr>
       <w:bookmarkStart w:id="132" w:name="Xe79f58ab8ce7b6f148c68a374118dd9eaec1a1c"/>
-      <w:bookmarkStart w:id="133" w:name="_Toc239338167"/>
+      <w:bookmarkStart w:id="133" w:name="_Toc239339260"/>
       <w:bookmarkEnd w:id="129"/>
       <w:r>
         <w:t>5.2. H</w:t>
@@ -69934,7 +70005,7 @@
         <w:pStyle w:val="Heading2"/>
       </w:pPr>
       <w:bookmarkStart w:id="135" w:name="X66db71c9020c40cf46e490c5c37ad244e2b7594"/>
-      <w:bookmarkStart w:id="136" w:name="_Toc239338168"/>
+      <w:bookmarkStart w:id="136" w:name="_Toc239339261"/>
       <w:bookmarkEnd w:id="132"/>
       <w:r>
         <w:t>5.3. Hư</w:t>
@@ -71525,7 +71596,7 @@
         <w:pStyle w:val="Heading2"/>
       </w:pPr>
       <w:bookmarkStart w:id="138" w:name="Xe5a2fe3dfcd4681648271b7ddc344b106e48b3b"/>
-      <w:bookmarkStart w:id="139" w:name="_Toc239338169"/>
+      <w:bookmarkStart w:id="139" w:name="_Toc239339262"/>
       <w:bookmarkEnd w:id="135"/>
       <w:r>
         <w:t>5.4. K</w:t>
@@ -72448,7 +72519,7 @@
         <w:pStyle w:val="Heading1"/>
       </w:pPr>
       <w:bookmarkStart w:id="140" w:name="tài-liệu-tham-khảo"/>
-      <w:bookmarkStart w:id="141" w:name="_Toc239338170"/>
+      <w:bookmarkStart w:id="141" w:name="_Toc239339263"/>
       <w:bookmarkEnd w:id="127"/>
       <w:bookmarkEnd w:id="138"/>
       <w:r>
@@ -73404,7 +73475,7 @@
         <w:pStyle w:val="Heading1"/>
       </w:pPr>
       <w:bookmarkStart w:id="142" w:name="phụ-lục"/>
-      <w:bookmarkStart w:id="143" w:name="_Toc239338171"/>
+      <w:bookmarkStart w:id="143" w:name="_Toc239339264"/>
       <w:bookmarkEnd w:id="140"/>
       <w:r>
         <w:t>PH</w:t>
@@ -73428,7 +73499,7 @@
         <w:pStyle w:val="Heading2"/>
       </w:pPr>
       <w:bookmarkStart w:id="144" w:name="phụ-lục-a-cấu-hình-và-siêu-tham-số"/>
-      <w:bookmarkStart w:id="145" w:name="_Toc239338172"/>
+      <w:bookmarkStart w:id="145" w:name="_Toc239339265"/>
       <w:r>
         <w:t>Ph</w:t>
       </w:r>
@@ -75648,7 +75719,7 @@
         <w:pStyle w:val="Heading2"/>
       </w:pPr>
       <w:bookmarkStart w:id="149" w:name="phụ-lục-b-hướng-dẫn-cài-đặt-và-chạy"/>
-      <w:bookmarkStart w:id="150" w:name="_Toc239338173"/>
+      <w:bookmarkStart w:id="150" w:name="_Toc239339266"/>
       <w:bookmarkEnd w:id="144"/>
       <w:bookmarkEnd w:id="148"/>
       <w:r>
@@ -77045,7 +77116,7 @@
         <w:rPr>
           <w:rStyle w:val="VerbatimChar"/>
         </w:rPr>
-        <w:t>backend/.venv/Scripts/python scripts/build_thesis.py --src docs/papers/mon-hoc</w:t>
+        <w:t>backend/.venv/Scripts/python scripts/build_thesis.py</w:t>
       </w:r>
       <w:r>
         <w:br/>
@@ -77054,7 +77125,7 @@
         <w:rPr>
           <w:rStyle w:val="VerbatimChar"/>
         </w:rPr>
-        <w:t>powershell -File scripts/export_thesis_pdf.ps1 -Nguon docs/papers/mon-hoc/thesis-full.docx -Dich docs/papers/mon-hoc/thesis-full.pdf</w:t>
+        <w:t>powershell -File scripts/export_thesis_pdf.ps1</w:t>
       </w:r>
     </w:p>
     <w:p>
@@ -77194,11 +77265,895 @@
         <w:t>ụ</w:t>
       </w:r>
       <w:r>
-        <w:t>c.</w:t>
-      </w:r>
-      <w:bookmarkEnd w:id="142"/>
+        <w:t>c. C</w:t>
+      </w:r>
+      <w:r>
+        <w:t>ả</w:t>
+      </w:r>
+      <w:r>
+        <w:t xml:space="preserve"> hai đã đ</w:t>
+      </w:r>
+      <w:r>
+        <w:t>ặ</w:t>
+      </w:r>
+      <w:r>
+        <w:t>t s</w:t>
+      </w:r>
+      <w:r>
+        <w:t>ẵ</w:t>
+      </w:r>
+      <w:r>
+        <w:t>n b</w:t>
+      </w:r>
+      <w:r>
+        <w:t>ả</w:t>
+      </w:r>
+      <w:r>
+        <w:t>n đ</w:t>
+      </w:r>
+      <w:r>
+        <w:t>ồ</w:t>
+      </w:r>
+      <w:r>
+        <w:t xml:space="preserve"> án môn h</w:t>
+      </w:r>
+      <w:r>
+        <w:t>ọ</w:t>
+      </w:r>
+      <w:r>
+        <w:t>c làm m</w:t>
+      </w:r>
+      <w:r>
+        <w:t>ặ</w:t>
+      </w:r>
+      <w:r>
+        <w:t>c đ</w:t>
+      </w:r>
+      <w:r>
+        <w:t>ị</w:t>
+      </w:r>
+      <w:r>
+        <w:t>nh nên không c</w:t>
+      </w:r>
+      <w:r>
+        <w:t>ầ</w:t>
+      </w:r>
+      <w:r>
+        <w:t>n tham s</w:t>
+      </w:r>
+      <w:r>
+        <w:t>ố</w:t>
+      </w:r>
+      <w:r>
+        <w:t>; mu</w:t>
+      </w:r>
+      <w:r>
+        <w:t>ố</w:t>
+      </w:r>
+      <w:r>
+        <w:t>n d</w:t>
+      </w:r>
+      <w:r>
+        <w:t>ự</w:t>
+      </w:r>
+      <w:r>
+        <w:t>ng b</w:t>
+      </w:r>
+      <w:r>
+        <w:t>ả</w:t>
+      </w:r>
+      <w:r>
+        <w:t>n khác thì truy</w:t>
+      </w:r>
+      <w:r>
+        <w:t>ề</w:t>
+      </w:r>
+      <w:r>
+        <w:t xml:space="preserve">n </w:t>
+      </w:r>
+      <w:r>
+        <w:rPr>
+          <w:rStyle w:val="VerbatimChar"/>
+        </w:rPr>
+        <w:t>--src</w:t>
+      </w:r>
+      <w:r>
+        <w:t xml:space="preserve"> cho l</w:t>
+      </w:r>
+      <w:r>
+        <w:t>ệ</w:t>
+      </w:r>
+      <w:r>
+        <w:t>nh đ</w:t>
+      </w:r>
+      <w:r>
+        <w:t>ầ</w:t>
+      </w:r>
+      <w:r>
+        <w:t xml:space="preserve">u và </w:t>
+      </w:r>
+      <w:r>
+        <w:rPr>
+          <w:rStyle w:val="VerbatimChar"/>
+        </w:rPr>
+        <w:t>-Nguon</w:t>
+      </w:r>
+      <w:r>
+        <w:t xml:space="preserve"> cho l</w:t>
+      </w:r>
+      <w:r>
+        <w:t>ệ</w:t>
+      </w:r>
+      <w:r>
+        <w:t>nh hai.</w:t>
+      </w:r>
+    </w:p>
+    <w:p>
+      <w:pPr>
+        <w:pStyle w:val="Heading2"/>
+      </w:pPr>
+      <w:bookmarkStart w:id="155" w:name="phụ-lục-c-phân-công-công-việc"/>
+      <w:bookmarkStart w:id="156" w:name="_Toc239339267"/>
       <w:bookmarkEnd w:id="149"/>
       <w:bookmarkEnd w:id="154"/>
+      <w:r>
+        <w:t>Ph</w:t>
+      </w:r>
+      <w:r>
+        <w:t>ụ</w:t>
+      </w:r>
+      <w:r>
+        <w:t xml:space="preserve"> l</w:t>
+      </w:r>
+      <w:r>
+        <w:t>ụ</w:t>
+      </w:r>
+      <w:r>
+        <w:t>c C. Phân công công vi</w:t>
+      </w:r>
+      <w:r>
+        <w:t>ệ</w:t>
+      </w:r>
+      <w:r>
+        <w:t>c</w:t>
+      </w:r>
+      <w:bookmarkEnd w:id="156"/>
+    </w:p>
+    <w:tbl>
+      <w:tblPr>
+        <w:tblStyle w:val="Table"/>
+        <w:tblW w:w="0" w:type="auto"/>
+        <w:tblLook w:val="0020" w:firstRow="1" w:lastRow="0" w:firstColumn="0" w:lastColumn="0" w:noHBand="0" w:noVBand="0"/>
+      </w:tblPr>
+      <w:tblGrid>
+        <w:gridCol w:w="2141"/>
+        <w:gridCol w:w="1071"/>
+        <w:gridCol w:w="6364"/>
+      </w:tblGrid>
+      <w:tr>
+        <w:trPr>
+          <w:cnfStyle w:val="100000000000" w:firstRow="1" w:lastRow="0" w:firstColumn="0" w:lastColumn="0" w:oddVBand="0" w:evenVBand="0" w:oddHBand="0" w:evenHBand="0" w:firstRowFirstColumn="0" w:firstRowLastColumn="0" w:lastRowFirstColumn="0" w:lastRowLastColumn="0"/>
+          <w:tblHeader/>
+        </w:trPr>
+        <w:tc>
+          <w:tcPr>
+            <w:tcW w:w="0" w:type="auto"/>
+          </w:tcPr>
+          <w:p>
+            <w:pPr>
+              <w:pStyle w:val="Compact"/>
+            </w:pPr>
+            <w:r>
+              <w:t>Thành viên</w:t>
+            </w:r>
+          </w:p>
+        </w:tc>
+        <w:tc>
+          <w:tcPr>
+            <w:tcW w:w="0" w:type="auto"/>
+          </w:tcPr>
+          <w:p>
+            <w:pPr>
+              <w:pStyle w:val="Compact"/>
+              <w:jc w:val="center"/>
+            </w:pPr>
+            <w:r>
+              <w:t>MSSV</w:t>
+            </w:r>
+          </w:p>
+        </w:tc>
+        <w:tc>
+          <w:tcPr>
+            <w:tcW w:w="0" w:type="auto"/>
+          </w:tcPr>
+          <w:p>
+            <w:pPr>
+              <w:pStyle w:val="Compact"/>
+            </w:pPr>
+            <w:r>
+              <w:t>Công vi</w:t>
+            </w:r>
+            <w:r>
+              <w:t>ệ</w:t>
+            </w:r>
+            <w:r>
+              <w:t>c chính</w:t>
+            </w:r>
+          </w:p>
+        </w:tc>
+      </w:tr>
+      <w:tr>
+        <w:tc>
+          <w:tcPr>
+            <w:tcW w:w="0" w:type="auto"/>
+          </w:tcPr>
+          <w:p>
+            <w:pPr>
+              <w:pStyle w:val="Compact"/>
+            </w:pPr>
+            <w:r>
+              <w:t>Ph</w:t>
+            </w:r>
+            <w:r>
+              <w:t>ạ</w:t>
+            </w:r>
+            <w:r>
+              <w:t>m Nguy</w:t>
+            </w:r>
+            <w:r>
+              <w:t>ễ</w:t>
+            </w:r>
+            <w:r>
+              <w:t>n Th</w:t>
+            </w:r>
+            <w:r>
+              <w:t>ế</w:t>
+            </w:r>
+            <w:r>
+              <w:t xml:space="preserve"> Châu</w:t>
+            </w:r>
+          </w:p>
+        </w:tc>
+        <w:tc>
+          <w:tcPr>
+            <w:tcW w:w="0" w:type="auto"/>
+          </w:tcPr>
+          <w:p>
+            <w:pPr>
+              <w:pStyle w:val="Compact"/>
+              <w:jc w:val="center"/>
+            </w:pPr>
+            <w:r>
+              <w:t>25410004</w:t>
+            </w:r>
+          </w:p>
+        </w:tc>
+        <w:tc>
+          <w:tcPr>
+            <w:tcW w:w="0" w:type="auto"/>
+          </w:tcPr>
+          <w:p>
+            <w:pPr>
+              <w:pStyle w:val="Compact"/>
+            </w:pPr>
+            <w:r>
+              <w:t>Thu th</w:t>
+            </w:r>
+            <w:r>
+              <w:t>ậ</w:t>
+            </w:r>
+            <w:r>
+              <w:t>p d</w:t>
+            </w:r>
+            <w:r>
+              <w:t>ữ</w:t>
+            </w:r>
+            <w:r>
+              <w:t xml:space="preserve"> li</w:t>
+            </w:r>
+            <w:r>
+              <w:t>ệ</w:t>
+            </w:r>
+            <w:r>
+              <w:t>u, hu</w:t>
+            </w:r>
+            <w:r>
+              <w:t>ấ</w:t>
+            </w:r>
+            <w:r>
+              <w:t>n luy</w:t>
+            </w:r>
+            <w:r>
+              <w:t>ệ</w:t>
+            </w:r>
+            <w:r>
+              <w:t>n YOLO11n, đánh giá b</w:t>
+            </w:r>
+            <w:r>
+              <w:t>ộ</w:t>
+            </w:r>
+            <w:r>
+              <w:t xml:space="preserve"> phát hi</w:t>
+            </w:r>
+            <w:r>
+              <w:t>ệ</w:t>
+            </w:r>
+            <w:r>
+              <w:t>n</w:t>
+            </w:r>
+          </w:p>
+        </w:tc>
+      </w:tr>
+      <w:tr>
+        <w:tc>
+          <w:tcPr>
+            <w:tcW w:w="0" w:type="auto"/>
+          </w:tcPr>
+          <w:p>
+            <w:pPr>
+              <w:pStyle w:val="Compact"/>
+            </w:pPr>
+            <w:r>
+              <w:t>Nguy</w:t>
+            </w:r>
+            <w:r>
+              <w:t>ễ</w:t>
+            </w:r>
+            <w:r>
+              <w:t>n Công H</w:t>
+            </w:r>
+            <w:r>
+              <w:t>ậ</w:t>
+            </w:r>
+            <w:r>
+              <w:t>u</w:t>
+            </w:r>
+          </w:p>
+        </w:tc>
+        <w:tc>
+          <w:tcPr>
+            <w:tcW w:w="0" w:type="auto"/>
+          </w:tcPr>
+          <w:p>
+            <w:pPr>
+              <w:pStyle w:val="Compact"/>
+              <w:jc w:val="center"/>
+            </w:pPr>
+            <w:r>
+              <w:t>25410006</w:t>
+            </w:r>
+          </w:p>
+        </w:tc>
+        <w:tc>
+          <w:tcPr>
+            <w:tcW w:w="0" w:type="auto"/>
+          </w:tcPr>
+          <w:p>
+            <w:pPr>
+              <w:pStyle w:val="Compact"/>
+            </w:pPr>
+            <w:r>
+              <w:t>Xây d</w:t>
+            </w:r>
+            <w:r>
+              <w:t>ự</w:t>
+            </w:r>
+            <w:r>
+              <w:t>ng giao di</w:t>
+            </w:r>
+            <w:r>
+              <w:t>ệ</w:t>
+            </w:r>
+            <w:r>
+              <w:t>n React, FastAPI, Docker, ki</w:t>
+            </w:r>
+            <w:r>
+              <w:t>ể</w:t>
+            </w:r>
+            <w:r>
+              <w:t>m th</w:t>
+            </w:r>
+            <w:r>
+              <w:t>ử</w:t>
+            </w:r>
+            <w:r>
+              <w:t xml:space="preserve"> tích h</w:t>
+            </w:r>
+            <w:r>
+              <w:t>ợ</w:t>
+            </w:r>
+            <w:r>
+              <w:t>p</w:t>
+            </w:r>
+          </w:p>
+        </w:tc>
+      </w:tr>
+      <w:tr>
+        <w:tc>
+          <w:tcPr>
+            <w:tcW w:w="0" w:type="auto"/>
+          </w:tcPr>
+          <w:p>
+            <w:pPr>
+              <w:pStyle w:val="Compact"/>
+            </w:pPr>
+            <w:r>
+              <w:t>Nguy</w:t>
+            </w:r>
+            <w:r>
+              <w:t>ễ</w:t>
+            </w:r>
+            <w:r>
+              <w:t>n Minh Hi</w:t>
+            </w:r>
+            <w:r>
+              <w:t>ế</w:t>
+            </w:r>
+            <w:r>
+              <w:t>u</w:t>
+            </w:r>
+          </w:p>
+        </w:tc>
+        <w:tc>
+          <w:tcPr>
+            <w:tcW w:w="0" w:type="auto"/>
+          </w:tcPr>
+          <w:p>
+            <w:pPr>
+              <w:pStyle w:val="Compact"/>
+              <w:jc w:val="center"/>
+            </w:pPr>
+            <w:r>
+              <w:t>25410007</w:t>
+            </w:r>
+          </w:p>
+        </w:tc>
+        <w:tc>
+          <w:tcPr>
+            <w:tcW w:w="0" w:type="auto"/>
+          </w:tcPr>
+          <w:p>
+            <w:pPr>
+              <w:pStyle w:val="Compact"/>
+            </w:pPr>
+            <w:r>
+              <w:t>Thi</w:t>
+            </w:r>
+            <w:r>
+              <w:t>ế</w:t>
+            </w:r>
+            <w:r>
+              <w:t>t k</w:t>
+            </w:r>
+            <w:r>
+              <w:t>ế</w:t>
+            </w:r>
+            <w:r>
+              <w:t xml:space="preserve"> đư</w:t>
+            </w:r>
+            <w:r>
+              <w:t>ờ</w:t>
+            </w:r>
+            <w:r>
+              <w:t xml:space="preserve">ng </w:t>
+            </w:r>
+            <w:r>
+              <w:t>ố</w:t>
+            </w:r>
+            <w:r>
+              <w:t>ng x</w:t>
+            </w:r>
+            <w:r>
+              <w:t>ử</w:t>
+            </w:r>
+            <w:r>
+              <w:t xml:space="preserve"> lý </w:t>
+            </w:r>
+            <w:r>
+              <w:t>ả</w:t>
+            </w:r>
+            <w:r>
+              <w:t>nh, h</w:t>
+            </w:r>
+            <w:r>
+              <w:t>ậ</w:t>
+            </w:r>
+            <w:r>
+              <w:t>u x</w:t>
+            </w:r>
+            <w:r>
+              <w:t>ử</w:t>
+            </w:r>
+            <w:r>
+              <w:t xml:space="preserve"> lý bi</w:t>
+            </w:r>
+            <w:r>
+              <w:t>ể</w:t>
+            </w:r>
+            <w:r>
+              <w:t>n s</w:t>
+            </w:r>
+            <w:r>
+              <w:t>ố</w:t>
+            </w:r>
+            <w:r>
+              <w:t>, th</w:t>
+            </w:r>
+            <w:r>
+              <w:t>ự</w:t>
+            </w:r>
+            <w:r>
+              <w:t>c nghi</w:t>
+            </w:r>
+            <w:r>
+              <w:t>ệ</w:t>
+            </w:r>
+            <w:r>
+              <w:t>m OCR, vi</w:t>
+            </w:r>
+            <w:r>
+              <w:t>ế</w:t>
+            </w:r>
+            <w:r>
+              <w:t>t báo cáo</w:t>
+            </w:r>
+          </w:p>
+        </w:tc>
+      </w:tr>
+      <w:tr>
+        <w:tc>
+          <w:tcPr>
+            <w:tcW w:w="0" w:type="auto"/>
+          </w:tcPr>
+          <w:p>
+            <w:pPr>
+              <w:pStyle w:val="Compact"/>
+            </w:pPr>
+            <w:r>
+              <w:t>Ph</w:t>
+            </w:r>
+            <w:r>
+              <w:t>ạ</w:t>
+            </w:r>
+            <w:r>
+              <w:t>m Công Thành</w:t>
+            </w:r>
+          </w:p>
+        </w:tc>
+        <w:tc>
+          <w:tcPr>
+            <w:tcW w:w="0" w:type="auto"/>
+          </w:tcPr>
+          <w:p>
+            <w:pPr>
+              <w:pStyle w:val="Compact"/>
+              <w:jc w:val="center"/>
+            </w:pPr>
+            <w:r>
+              <w:t>25410013</w:t>
+            </w:r>
+          </w:p>
+        </w:tc>
+        <w:tc>
+          <w:tcPr>
+            <w:tcW w:w="0" w:type="auto"/>
+          </w:tcPr>
+          <w:p>
+            <w:pPr>
+              <w:pStyle w:val="Compact"/>
+            </w:pPr>
+            <w:r>
+              <w:t>Xây d</w:t>
+            </w:r>
+            <w:r>
+              <w:t>ự</w:t>
+            </w:r>
+            <w:r>
+              <w:t>ng b</w:t>
+            </w:r>
+            <w:r>
+              <w:t>ộ</w:t>
+            </w:r>
+            <w:r>
+              <w:t xml:space="preserve"> d</w:t>
+            </w:r>
+            <w:r>
+              <w:t>ữ</w:t>
+            </w:r>
+            <w:r>
+              <w:t xml:space="preserve"> li</w:t>
+            </w:r>
+            <w:r>
+              <w:t>ệ</w:t>
+            </w:r>
+            <w:r>
+              <w:t>u, kh</w:t>
+            </w:r>
+            <w:r>
+              <w:t>ử</w:t>
+            </w:r>
+            <w:r>
+              <w:t xml:space="preserve"> trùng l</w:t>
+            </w:r>
+            <w:r>
+              <w:t>ặ</w:t>
+            </w:r>
+            <w:r>
+              <w:t>p, đánh giá và phân tích k</w:t>
+            </w:r>
+            <w:r>
+              <w:t>ế</w:t>
+            </w:r>
+            <w:r>
+              <w:t>t qu</w:t>
+            </w:r>
+            <w:r>
+              <w:t>ả</w:t>
+            </w:r>
+          </w:p>
+        </w:tc>
+      </w:tr>
+    </w:tbl>
+    <w:p>
+      <w:pPr>
+        <w:pStyle w:val="BodyText"/>
+      </w:pPr>
+      <w:r>
+        <w:t>Các h</w:t>
+      </w:r>
+      <w:r>
+        <w:t>ạ</w:t>
+      </w:r>
+      <w:r>
+        <w:t>ng m</w:t>
+      </w:r>
+      <w:r>
+        <w:t>ụ</w:t>
+      </w:r>
+      <w:r>
+        <w:t xml:space="preserve">c trên là </w:t>
+      </w:r>
+      <w:r>
+        <w:rPr>
+          <w:b/>
+          <w:bCs/>
+        </w:rPr>
+        <w:t>ph</w:t>
+      </w:r>
+      <w:r>
+        <w:rPr>
+          <w:b/>
+          <w:bCs/>
+        </w:rPr>
+        <w:t>ầ</w:t>
+      </w:r>
+      <w:r>
+        <w:rPr>
+          <w:b/>
+          <w:bCs/>
+        </w:rPr>
+        <w:t>n vi</w:t>
+      </w:r>
+      <w:r>
+        <w:rPr>
+          <w:b/>
+          <w:bCs/>
+        </w:rPr>
+        <w:t>ệ</w:t>
+      </w:r>
+      <w:r>
+        <w:rPr>
+          <w:b/>
+          <w:bCs/>
+        </w:rPr>
+        <w:t>c chính</w:t>
+      </w:r>
+      <w:r>
+        <w:t xml:space="preserve"> </w:t>
+      </w:r>
+      <w:r>
+        <w:t>c</w:t>
+      </w:r>
+      <w:r>
+        <w:t>ủ</w:t>
+      </w:r>
+      <w:r>
+        <w:t>a t</w:t>
+      </w:r>
+      <w:r>
+        <w:t>ừ</w:t>
+      </w:r>
+      <w:r>
+        <w:t>ng thành viên, không ph</w:t>
+      </w:r>
+      <w:r>
+        <w:t>ả</w:t>
+      </w:r>
+      <w:r>
+        <w:t>i ranh gi</w:t>
+      </w:r>
+      <w:r>
+        <w:t>ớ</w:t>
+      </w:r>
+      <w:r>
+        <w:t>i tuy</w:t>
+      </w:r>
+      <w:r>
+        <w:t>ệ</w:t>
+      </w:r>
+      <w:r>
+        <w:t>t đ</w:t>
+      </w:r>
+      <w:r>
+        <w:t>ố</w:t>
+      </w:r>
+      <w:r>
+        <w:t>i: nh</w:t>
+      </w:r>
+      <w:r>
+        <w:t>ữ</w:t>
+      </w:r>
+      <w:r>
+        <w:t>ng quy</w:t>
+      </w:r>
+      <w:r>
+        <w:t>ế</w:t>
+      </w:r>
+      <w:r>
+        <w:t>t đ</w:t>
+      </w:r>
+      <w:r>
+        <w:t>ị</w:t>
+      </w:r>
+      <w:r>
+        <w:t xml:space="preserve">nh </w:t>
+      </w:r>
+      <w:r>
+        <w:t>ả</w:t>
+      </w:r>
+      <w:r>
+        <w:t>nh hư</w:t>
+      </w:r>
+      <w:r>
+        <w:t>ở</w:t>
+      </w:r>
+      <w:r>
+        <w:t>ng t</w:t>
+      </w:r>
+      <w:r>
+        <w:t>ớ</w:t>
+      </w:r>
+      <w:r>
+        <w:t>i s</w:t>
+      </w:r>
+      <w:r>
+        <w:t>ố</w:t>
+      </w:r>
+      <w:r>
+        <w:t xml:space="preserve"> li</w:t>
+      </w:r>
+      <w:r>
+        <w:t>ệ</w:t>
+      </w:r>
+      <w:r>
+        <w:t>u công b</w:t>
+      </w:r>
+      <w:r>
+        <w:t>ố</w:t>
+      </w:r>
+      <w:r>
+        <w:t xml:space="preserve"> — ch</w:t>
+      </w:r>
+      <w:r>
+        <w:t>ọ</w:t>
+      </w:r>
+      <w:r>
+        <w:t>n ngư</w:t>
+      </w:r>
+      <w:r>
+        <w:t>ỡ</w:t>
+      </w:r>
+      <w:r>
+        <w:t>ng phân lo</w:t>
+      </w:r>
+      <w:r>
+        <w:t>ạ</w:t>
+      </w:r>
+      <w:r>
+        <w:t>i b</w:t>
+      </w:r>
+      <w:r>
+        <w:t>ố</w:t>
+      </w:r>
+      <w:r>
+        <w:t xml:space="preserve"> c</w:t>
+      </w:r>
+      <w:r>
+        <w:t>ụ</w:t>
+      </w:r>
+      <w:r>
+        <w:t>c (m</w:t>
+      </w:r>
+      <w:r>
+        <w:t>ụ</w:t>
+      </w:r>
+      <w:r>
+        <w:t>c 3.4.3), d</w:t>
+      </w:r>
+      <w:r>
+        <w:t>ừ</w:t>
+      </w:r>
+      <w:r>
+        <w:t>ng lư</w:t>
+      </w:r>
+      <w:r>
+        <w:t>ợ</w:t>
+      </w:r>
+      <w:r>
+        <w:t>t tinh ch</w:t>
+      </w:r>
+      <w:r>
+        <w:t>ỉ</w:t>
+      </w:r>
+      <w:r>
+        <w:t>nh b</w:t>
+      </w:r>
+      <w:r>
+        <w:t>ộ</w:t>
+      </w:r>
+      <w:r>
+        <w:t xml:space="preserve"> nh</w:t>
+      </w:r>
+      <w:r>
+        <w:t>ậ</w:t>
+      </w:r>
+      <w:r>
+        <w:t>n d</w:t>
+      </w:r>
+      <w:r>
+        <w:t>ạ</w:t>
+      </w:r>
+      <w:r>
+        <w:t>ng, ch</w:t>
+      </w:r>
+      <w:r>
+        <w:t>ố</w:t>
+      </w:r>
+      <w:r>
+        <w:t>t c</w:t>
+      </w:r>
+      <w:r>
+        <w:t>ấ</w:t>
+      </w:r>
+      <w:r>
+        <w:t>u hình bàn giao — đ</w:t>
+      </w:r>
+      <w:r>
+        <w:t>ề</w:t>
+      </w:r>
+      <w:r>
+        <w:t>u do c</w:t>
+      </w:r>
+      <w:r>
+        <w:t>ả</w:t>
+      </w:r>
+      <w:r>
+        <w:t xml:space="preserve"> nhóm th</w:t>
+      </w:r>
+      <w:r>
+        <w:t>ố</w:t>
+      </w:r>
+      <w:r>
+        <w:t>ng nh</w:t>
+      </w:r>
+      <w:r>
+        <w:t>ấ</w:t>
+      </w:r>
+      <w:r>
+        <w:t>t.</w:t>
+      </w:r>
+      <w:bookmarkEnd w:id="142"/>
+      <w:bookmarkEnd w:id="155"/>
     </w:p>
     <w:sectPr>
       <w:footnotePr>
@@ -77217,7 +78172,7 @@
   <w:abstractNum w:abstractNumId="0" w15:restartNumberingAfterBreak="0">
     <w:nsid w:val="0000A990"/>
     <w:multiLevelType w:val="multilevel"/>
-    <w:tmpl w:val="ECBEC4C2"/>
+    <w:tmpl w:val="B1545256"/>
     <w:lvl w:ilvl="0">
       <w:numFmt w:val="bullet"/>
       <w:lvlText w:val=" "/>
@@ -77294,7 +78249,7 @@
   <w:abstractNum w:abstractNumId="1" w15:restartNumberingAfterBreak="0">
     <w:nsid w:val="0000A991"/>
     <w:multiLevelType w:val="multilevel"/>
-    <w:tmpl w:val="6FFEDE80"/>
+    <w:tmpl w:val="69CAC8BC"/>
     <w:lvl w:ilvl="0">
       <w:numFmt w:val="bullet"/>
       <w:lvlText w:val=""/>
@@ -77398,7 +78353,7 @@
   <w:abstractNum w:abstractNumId="2" w15:restartNumberingAfterBreak="0">
     <w:nsid w:val="00A99411"/>
     <w:multiLevelType w:val="multilevel"/>
-    <w:tmpl w:val="72A47792"/>
+    <w:tmpl w:val="4078B742"/>
     <w:lvl w:ilvl="0">
       <w:start w:val="1"/>
       <w:numFmt w:val="decimal"/>
@@ -77481,10 +78436,10 @@
       </w:pPr>
     </w:lvl>
   </w:abstractNum>
-  <w:num w:numId="1" w16cid:durableId="861937233">
+  <w:num w:numId="1" w16cid:durableId="1262177761">
     <w:abstractNumId w:val="0"/>
   </w:num>
-  <w:num w:numId="2" w16cid:durableId="1358964097">
+  <w:num w:numId="2" w16cid:durableId="1905068047">
     <w:abstractNumId w:val="2"/>
     <w:lvlOverride w:ilvl="0">
       <w:startOverride w:val="1"/>
@@ -77514,22 +78469,22 @@
       <w:startOverride w:val="1"/>
     </w:lvlOverride>
   </w:num>
-  <w:num w:numId="3" w16cid:durableId="1416975678">
+  <w:num w:numId="3" w16cid:durableId="1168250144">
     <w:abstractNumId w:val="1"/>
   </w:num>
-  <w:num w:numId="4" w16cid:durableId="520050956">
+  <w:num w:numId="4" w16cid:durableId="656542802">
     <w:abstractNumId w:val="1"/>
   </w:num>
-  <w:num w:numId="5" w16cid:durableId="494566323">
+  <w:num w:numId="5" w16cid:durableId="1103376608">
     <w:abstractNumId w:val="1"/>
   </w:num>
-  <w:num w:numId="6" w16cid:durableId="217939371">
+  <w:num w:numId="6" w16cid:durableId="1056122415">
     <w:abstractNumId w:val="1"/>
   </w:num>
-  <w:num w:numId="7" w16cid:durableId="1593273105">
+  <w:num w:numId="7" w16cid:durableId="1958414272">
     <w:abstractNumId w:val="1"/>
   </w:num>
-  <w:num w:numId="8" w16cid:durableId="1728646256">
+  <w:num w:numId="8" w16cid:durableId="1942108696">
     <w:abstractNumId w:val="2"/>
     <w:lvlOverride w:ilvl="0">
       <w:startOverride w:val="1"/>
@@ -77559,7 +78514,7 @@
       <w:startOverride w:val="1"/>
     </w:lvlOverride>
   </w:num>
-  <w:num w:numId="9" w16cid:durableId="2066753219">
+  <w:num w:numId="9" w16cid:durableId="58016883">
     <w:abstractNumId w:val="1"/>
   </w:num>
 </w:numbering>
@@ -78796,7 +79751,7 @@
     <w:next w:val="Normal"/>
     <w:autoRedefine/>
     <w:uiPriority w:val="39"/>
-    <w:rsid w:val="003F76A2"/>
+    <w:rsid w:val="001C2A55"/>
     <w:pPr>
       <w:spacing w:after="100"/>
     </w:pPr>
@@ -78807,7 +79762,7 @@
     <w:next w:val="Normal"/>
     <w:autoRedefine/>
     <w:uiPriority w:val="39"/>
-    <w:rsid w:val="003F76A2"/>
+    <w:rsid w:val="001C2A55"/>
     <w:pPr>
       <w:spacing w:after="100"/>
       <w:ind w:left="240"/>

</xml_diff>